<commit_message>
docs:se hace un ajuste al README.md dónde se especifican los cambios del equipo al ingresar un nuevo integrante y se modifican las tareas asignadas
</commit_message>
<xml_diff>
--- a/informe de requisitos.docx
+++ b/informe de requisitos.docx
@@ -47,46 +47,213 @@
     </w:p>
     <w:p>
       <w:pPr>
+        <w:shd w:val="clear" w:color="auto" w:fill="F8FAFD"/>
+        <w:spacing w:after="0" w:line="240" w:lineRule="auto"/>
+        <w:rPr>
+          <w:rFonts w:ascii="Roboto" w:eastAsia="Times New Roman" w:hAnsi="Roboto" w:cs="Times New Roman"/>
+          <w:color w:val="1F1F1F"/>
+          <w:kern w:val="0"/>
+          <w:sz w:val="20"/>
+          <w:szCs w:val="20"/>
+          <w:lang w:val="es-MX" w:eastAsia="es-MX"/>
+          <w14:ligatures w14:val="none"/>
+        </w:rPr>
+      </w:pPr>
+    </w:p>
+    <w:tbl>
+      <w:tblPr>
+        <w:tblW w:w="21600" w:type="dxa"/>
+        <w:tblCellSpacing w:w="0" w:type="dxa"/>
+        <w:tblBorders>
+          <w:top w:val="single" w:sz="6" w:space="0" w:color="C4C7C5"/>
+        </w:tblBorders>
+        <w:shd w:val="clear" w:color="auto" w:fill="F8FAFD"/>
+        <w:tblCellMar>
+          <w:left w:w="0" w:type="dxa"/>
+          <w:right w:w="840" w:type="dxa"/>
+        </w:tblCellMar>
+        <w:tblLook w:val="04A0" w:firstRow="1" w:lastRow="0" w:firstColumn="1" w:lastColumn="0" w:noHBand="0" w:noVBand="1"/>
+      </w:tblPr>
+      <w:tblGrid>
+        <w:gridCol w:w="901"/>
+        <w:gridCol w:w="901"/>
+        <w:gridCol w:w="1755"/>
+        <w:gridCol w:w="16899"/>
+        <w:gridCol w:w="1144"/>
+      </w:tblGrid>
+      <w:tr>
+        <w:trPr>
+          <w:tblCellSpacing w:w="0" w:type="dxa"/>
+        </w:trPr>
+        <w:tc>
+          <w:tcPr>
+            <w:tcW w:w="720" w:type="dxa"/>
+            <w:shd w:val="clear" w:color="auto" w:fill="F8FAFD"/>
+            <w:vAlign w:val="center"/>
+            <w:hideMark/>
+          </w:tcPr>
+          <w:p>
+            <w:pPr>
+              <w:spacing w:before="15" w:after="0" w:line="0" w:lineRule="auto"/>
+              <w:rPr>
+                <w:rFonts w:ascii="Times New Roman" w:eastAsia="Times New Roman" w:hAnsi="Times New Roman" w:cs="Times New Roman"/>
+                <w:kern w:val="0"/>
+                <w:lang w:val="es-MX" w:eastAsia="es-MX"/>
+                <w14:ligatures w14:val="none"/>
+              </w:rPr>
+            </w:pPr>
+            <w:r>
+              <w:rPr>
+                <w:rFonts w:ascii="Times New Roman" w:eastAsia="Times New Roman" w:hAnsi="Times New Roman" w:cs="Times New Roman"/>
+                <w:kern w:val="0"/>
+                <w:lang w:val="es-MX" w:eastAsia="es-MX"/>
+                <w14:ligatures w14:val="none"/>
+              </w:rPr>
+              <w:t> </w:t>
+            </w:r>
+          </w:p>
+        </w:tc>
+        <w:tc>
+          <w:tcPr>
+            <w:tcW w:w="240" w:type="dxa"/>
+            <w:shd w:val="clear" w:color="auto" w:fill="F8FAFD"/>
+            <w:vAlign w:val="center"/>
+            <w:hideMark/>
+          </w:tcPr>
+          <w:p>
+            <w:pPr>
+              <w:spacing w:before="15" w:after="0" w:line="0" w:lineRule="auto"/>
+              <w:rPr>
+                <w:rFonts w:ascii="Times New Roman" w:eastAsia="Times New Roman" w:hAnsi="Times New Roman" w:cs="Times New Roman"/>
+                <w:kern w:val="0"/>
+                <w:lang w:val="es-MX" w:eastAsia="es-MX"/>
+                <w14:ligatures w14:val="none"/>
+              </w:rPr>
+            </w:pPr>
+          </w:p>
+        </w:tc>
+        <w:tc>
+          <w:tcPr>
+            <w:tcW w:w="1755" w:type="dxa"/>
+            <w:shd w:val="clear" w:color="auto" w:fill="F8FAFD"/>
+            <w:vAlign w:val="bottom"/>
+            <w:hideMark/>
+          </w:tcPr>
+          <w:p>
+            <w:pPr>
+              <w:spacing w:before="15" w:after="0" w:line="0" w:lineRule="auto"/>
+              <w:rPr>
+                <w:rFonts w:ascii="Times New Roman" w:eastAsia="Times New Roman" w:hAnsi="Times New Roman" w:cs="Times New Roman"/>
+                <w:kern w:val="0"/>
+                <w:sz w:val="20"/>
+                <w:szCs w:val="20"/>
+                <w:lang w:val="es-MX" w:eastAsia="es-MX"/>
+                <w14:ligatures w14:val="none"/>
+              </w:rPr>
+            </w:pPr>
+          </w:p>
+        </w:tc>
+        <w:tc>
+          <w:tcPr>
+            <w:tcW w:w="0" w:type="auto"/>
+            <w:shd w:val="clear" w:color="auto" w:fill="F8FAFD"/>
+            <w:vAlign w:val="center"/>
+            <w:hideMark/>
+          </w:tcPr>
+          <w:p>
+            <w:pPr>
+              <w:spacing w:before="15" w:after="0" w:line="0" w:lineRule="auto"/>
+              <w:rPr>
+                <w:rFonts w:ascii="Times New Roman" w:eastAsia="Times New Roman" w:hAnsi="Times New Roman" w:cs="Times New Roman"/>
+                <w:kern w:val="0"/>
+                <w:sz w:val="20"/>
+                <w:szCs w:val="20"/>
+                <w:lang w:val="es-MX" w:eastAsia="es-MX"/>
+                <w14:ligatures w14:val="none"/>
+              </w:rPr>
+            </w:pPr>
+          </w:p>
+        </w:tc>
+        <w:tc>
+          <w:tcPr>
+            <w:tcW w:w="0" w:type="auto"/>
+            <w:shd w:val="clear" w:color="auto" w:fill="F8FAFD"/>
+            <w:tcMar>
+              <w:top w:w="0" w:type="dxa"/>
+              <w:left w:w="0" w:type="dxa"/>
+              <w:bottom w:w="0" w:type="dxa"/>
+              <w:right w:w="0" w:type="dxa"/>
+            </w:tcMar>
+            <w:vAlign w:val="center"/>
+            <w:hideMark/>
+          </w:tcPr>
+          <w:p>
+            <w:pPr>
+              <w:spacing w:before="15" w:after="0" w:line="0" w:lineRule="auto"/>
+              <w:rPr>
+                <w:rFonts w:ascii="Times New Roman" w:eastAsia="Times New Roman" w:hAnsi="Times New Roman" w:cs="Times New Roman"/>
+                <w:kern w:val="0"/>
+                <w:sz w:val="20"/>
+                <w:szCs w:val="20"/>
+                <w:lang w:val="es-MX" w:eastAsia="es-MX"/>
+                <w14:ligatures w14:val="none"/>
+              </w:rPr>
+            </w:pPr>
+          </w:p>
+        </w:tc>
+      </w:tr>
+    </w:tbl>
+    <w:p>
+      <w:pPr>
+        <w:shd w:val="clear" w:color="auto" w:fill="FFFFFF"/>
+        <w:spacing w:after="0" w:line="240" w:lineRule="auto"/>
+        <w:jc w:val="center"/>
+        <w:rPr>
+          <w:rFonts w:ascii="docs-Calibri" w:eastAsia="Times New Roman" w:hAnsi="docs-Calibri" w:cs="Calibri"/>
+          <w:color w:val="000000"/>
+          <w:kern w:val="0"/>
+          <w:sz w:val="23"/>
+          <w:szCs w:val="23"/>
+          <w:lang w:val="es-MX" w:eastAsia="es-MX"/>
+          <w14:ligatures w14:val="none"/>
+        </w:rPr>
+      </w:pPr>
+      <w:r>
+        <w:rPr>
+          <w:rFonts w:ascii="docs-Calibri" w:eastAsia="Times New Roman" w:hAnsi="docs-Calibri" w:cs="Calibri"/>
+          <w:color w:val="000000"/>
+          <w:kern w:val="0"/>
+          <w:sz w:val="23"/>
+          <w:szCs w:val="23"/>
+          <w:lang w:val="es-MX" w:eastAsia="es-MX"/>
+          <w14:ligatures w14:val="none"/>
+        </w:rPr>
+        <w:t>Juan Felipe Isaza Vásquez</w:t>
+      </w:r>
+    </w:p>
+    <w:p>
+      <w:pPr>
         <w:jc w:val="center"/>
         <w:rPr>
           <w:rFonts w:ascii="Times New Roman" w:hAnsi="Times New Roman" w:cs="Times New Roman"/>
           <w:color w:val="000000" w:themeColor="text1"/>
         </w:rPr>
       </w:pPr>
+      <w:proofErr w:type="spellStart"/>
       <w:r>
         <w:rPr>
           <w:rFonts w:ascii="Times New Roman" w:hAnsi="Times New Roman" w:cs="Times New Roman"/>
           <w:color w:val="000000" w:themeColor="text1"/>
         </w:rPr>
-        <w:t>Estefanía Muñoz Tob</w:t>
-      </w:r>
+        <w:t>Stiven</w:t>
+      </w:r>
+      <w:proofErr w:type="spellEnd"/>
       <w:r>
         <w:rPr>
           <w:rFonts w:ascii="Times New Roman" w:hAnsi="Times New Roman" w:cs="Times New Roman"/>
           <w:color w:val="000000" w:themeColor="text1"/>
         </w:rPr>
-        <w:t>ó</w:t>
-      </w:r>
-      <w:r>
-        <w:rPr>
-          <w:rFonts w:ascii="Times New Roman" w:hAnsi="Times New Roman" w:cs="Times New Roman"/>
-          <w:color w:val="000000" w:themeColor="text1"/>
-        </w:rPr>
-        <w:t>n</w:t>
-      </w:r>
-      <w:r>
-        <w:rPr>
-          <w:rFonts w:ascii="Times New Roman" w:hAnsi="Times New Roman" w:cs="Times New Roman"/>
-          <w:color w:val="000000" w:themeColor="text1"/>
-        </w:rPr>
-        <w:br/>
-      </w:r>
-      <w:r>
-        <w:rPr>
-          <w:rFonts w:ascii="Times New Roman" w:hAnsi="Times New Roman" w:cs="Times New Roman"/>
-          <w:color w:val="000000" w:themeColor="text1"/>
-        </w:rPr>
-        <w:t>Stiven Martínez Piedrahíta</w:t>
+        <w:t xml:space="preserve"> Martínez Piedrahíta</w:t>
       </w:r>
       <w:r>
         <w:rPr>
@@ -344,7 +511,7 @@
     <w:sdt>
       <w:sdtPr>
         <w:rPr>
-          <w:rFonts w:eastAsiaTheme="minorHAnsi" w:cs="Times New Roman"/>
+          <w:rFonts w:asciiTheme="minorHAnsi" w:eastAsiaTheme="minorHAnsi" w:hAnsiTheme="minorHAnsi" w:cs="Times New Roman"/>
           <w:b w:val="0"/>
           <w:color w:val="auto"/>
           <w:kern w:val="2"/>

</xml_diff>

<commit_message>
docs:se redacta laa introducción del informe especificando el contenido del mismo y explicando la manera en que se puede mover dentro de el
</commit_message>
<xml_diff>
--- a/informe de requisitos.docx
+++ b/informe de requisitos.docx
@@ -58,34 +58,14 @@
           <w:rFonts w:ascii="Times New Roman" w:hAnsi="Times New Roman" w:cs="Times New Roman"/>
           <w:color w:val="000000" w:themeColor="text1"/>
         </w:rPr>
-        <w:t>Estefanía Muñoz Tob</w:t>
+        <w:t>Estefanía Muñoz Tobón</w:t>
       </w:r>
       <w:r>
         <w:rPr>
           <w:rFonts w:ascii="Times New Roman" w:hAnsi="Times New Roman" w:cs="Times New Roman"/>
           <w:color w:val="000000" w:themeColor="text1"/>
         </w:rPr>
-        <w:t>ó</w:t>
-      </w:r>
-      <w:r>
-        <w:rPr>
-          <w:rFonts w:ascii="Times New Roman" w:hAnsi="Times New Roman" w:cs="Times New Roman"/>
-          <w:color w:val="000000" w:themeColor="text1"/>
-        </w:rPr>
-        <w:t>n</w:t>
-      </w:r>
-      <w:r>
-        <w:rPr>
-          <w:rFonts w:ascii="Times New Roman" w:hAnsi="Times New Roman" w:cs="Times New Roman"/>
-          <w:color w:val="000000" w:themeColor="text1"/>
-        </w:rPr>
         <w:br/>
-      </w:r>
-      <w:r>
-        <w:rPr>
-          <w:rFonts w:ascii="Times New Roman" w:hAnsi="Times New Roman" w:cs="Times New Roman"/>
-          <w:color w:val="000000" w:themeColor="text1"/>
-        </w:rPr>
         <w:t>Stiven Martínez Piedrahíta</w:t>
       </w:r>
       <w:r>
@@ -344,7 +324,7 @@
     <w:sdt>
       <w:sdtPr>
         <w:rPr>
-          <w:rFonts w:eastAsiaTheme="minorHAnsi" w:cs="Times New Roman"/>
+          <w:rFonts w:asciiTheme="minorHAnsi" w:eastAsiaTheme="minorHAnsi" w:hAnsiTheme="minorHAnsi" w:cs="Times New Roman"/>
           <w:b w:val="0"/>
           <w:color w:val="auto"/>
           <w:kern w:val="2"/>
@@ -1712,13 +1692,47 @@
         <w:ind w:firstLine="720"/>
         <w:rPr>
           <w:rFonts w:ascii="Times New Roman" w:hAnsi="Times New Roman" w:cs="Times New Roman"/>
-        </w:rPr>
-      </w:pPr>
-      <w:r>
-        <w:rPr>
-          <w:rFonts w:ascii="Times New Roman" w:hAnsi="Times New Roman" w:cs="Times New Roman"/>
-        </w:rPr>
-        <w:t>Este documento presenta el informe de requisitos para el desarrollo de la nueva aplicación de la barbería. El propósito de este texto es servir como la carta de navegación principal para todas las personas involucradas en el proyecto, asegurando que tengamos una visión clara, estructurada y unificada antes de iniciar cualquier fase de diseño o programación.</w:t>
+          <w:lang w:val="es-MX"/>
+        </w:rPr>
+      </w:pPr>
+      <w:r>
+        <w:rPr>
+          <w:rFonts w:ascii="Times New Roman" w:hAnsi="Times New Roman" w:cs="Times New Roman"/>
+          <w:lang w:val="es-MX"/>
+        </w:rPr>
+        <w:t xml:space="preserve">El presente Documento de Especificación de Requisitos de Software (SRS) detalla los aspectos técnicos, funcionales y de diseño asignados de manera exclusiva a la </w:t>
+      </w:r>
+      <w:r>
+        <w:rPr>
+          <w:rFonts w:ascii="Times New Roman" w:hAnsi="Times New Roman" w:cs="Times New Roman"/>
+          <w:b/>
+          <w:bCs/>
+          <w:lang w:val="es-MX"/>
+        </w:rPr>
+        <w:t>Célula 6: Comunidad y Valoraciones</w:t>
+      </w:r>
+      <w:r>
+        <w:rPr>
+          <w:rFonts w:ascii="Times New Roman" w:hAnsi="Times New Roman" w:cs="Times New Roman"/>
+          <w:lang w:val="es-MX"/>
+        </w:rPr>
+        <w:t xml:space="preserve">, dentro del marco del proyecto integral </w:t>
+      </w:r>
+      <w:r>
+        <w:rPr>
+          <w:rFonts w:ascii="Times New Roman" w:hAnsi="Times New Roman" w:cs="Times New Roman"/>
+          <w:b/>
+          <w:bCs/>
+          <w:lang w:val="es-MX"/>
+        </w:rPr>
+        <w:t>Sazón</w:t>
+      </w:r>
+      <w:r>
+        <w:rPr>
+          <w:rFonts w:ascii="Times New Roman" w:hAnsi="Times New Roman" w:cs="Times New Roman"/>
+          <w:lang w:val="es-MX"/>
+        </w:rPr>
+        <w:t>. Mientras que el proyecto macro abarca la gestión global del catálogo, usuarios e infraestructura, este informe se centra de manera especializada en el motor de interacción social, retroalimentación y evaluación de recetas por parte de los usuarios.</w:t>
       </w:r>
     </w:p>
     <w:p>
@@ -1727,13 +1741,31 @@
         <w:ind w:firstLine="720"/>
         <w:rPr>
           <w:rFonts w:ascii="Times New Roman" w:hAnsi="Times New Roman" w:cs="Times New Roman"/>
-        </w:rPr>
-      </w:pPr>
-      <w:r>
-        <w:rPr>
-          <w:rFonts w:ascii="Times New Roman" w:hAnsi="Times New Roman" w:cs="Times New Roman"/>
-        </w:rPr>
-        <w:t>A lo largo de este informe encontrarás una serie de secciones organizadas para ir de lo general a lo específico. En primer lugar, se exponen los problemas actuales que enfrenta la barbería en su operación diaria, los cuales justifican la necesidad de este software. A partir de allí, se plantean los objetivos generales y específicos que el sistema debe cumplir para darle solución a dichas problemáticas.</w:t>
+          <w:lang w:val="es-MX"/>
+        </w:rPr>
+      </w:pPr>
+      <w:r>
+        <w:rPr>
+          <w:rFonts w:ascii="Times New Roman" w:hAnsi="Times New Roman" w:cs="Times New Roman"/>
+          <w:lang w:val="es-MX"/>
+        </w:rPr>
+        <w:t xml:space="preserve">A lo largo de este informe, se guiará al lector a través de la justificación funcional de la célula, sus objetivos redactados bajo la taxonomía de Bloom, el alcance detallado delimitando inclusiones y exclusiones específicas del módulo, la arquitectura tecnológica del </w:t>
+      </w:r>
+      <w:proofErr w:type="spellStart"/>
+      <w:r>
+        <w:rPr>
+          <w:rFonts w:ascii="Times New Roman" w:hAnsi="Times New Roman" w:cs="Times New Roman"/>
+          <w:lang w:val="es-MX"/>
+        </w:rPr>
+        <w:t>stack</w:t>
+      </w:r>
+      <w:proofErr w:type="spellEnd"/>
+      <w:r>
+        <w:rPr>
+          <w:rFonts w:ascii="Times New Roman" w:hAnsi="Times New Roman" w:cs="Times New Roman"/>
+          <w:lang w:val="es-MX"/>
+        </w:rPr>
+        <w:t xml:space="preserve"> seleccionado, el modelado relacional de datos de comunidad, la lista exhaustiva de requisitos funcionales y no funcionales, la reglamentación legal del desarrollo formativo y las conclusiones obtenidas por el equipo durante la fase de análisis.</w:t>
       </w:r>
     </w:p>
     <w:p>
@@ -1748,29 +1780,7 @@
         <w:rPr>
           <w:rFonts w:ascii="Times New Roman" w:hAnsi="Times New Roman" w:cs="Times New Roman"/>
         </w:rPr>
-        <w:t>Para hacer que la información técnica y operativa sea mucho más fácil de entender, el contenido de este documento se apoya en distintos recursos visuales. Encontrarás diversas ilustraciones que ayudan a visualizar cómo interactuarán los usuarios con el sistema, así como tablas detalladas que organizan los requerimientos puntuales, categorizando de forma exacta qué debe hacer la aplicación y cómo debe comportarse.</w:t>
-      </w:r>
-    </w:p>
-    <w:p>
-      <w:pPr>
-        <w:spacing w:line="480" w:lineRule="auto"/>
-        <w:ind w:firstLine="720"/>
-        <w:rPr>
-          <w:rFonts w:ascii="Times New Roman" w:hAnsi="Times New Roman" w:cs="Times New Roman"/>
-        </w:rPr>
-      </w:pPr>
-      <w:r>
-        <w:rPr>
-          <w:rFonts w:ascii="Times New Roman" w:hAnsi="Times New Roman" w:cs="Times New Roman"/>
-        </w:rPr>
-        <w:t xml:space="preserve">Por último, se incluye un glosario de términos. Esta sección está pensada para alinear el vocabulario técnico con el lenguaje del día a día de la barbería, evitando confusiones a lo largo del desarrollo. En resumen, en las siguientes páginas está plasmada </w:t>
-      </w:r>
-      <w:r>
-        <w:rPr>
-          <w:rFonts w:ascii="Times New Roman" w:hAnsi="Times New Roman" w:cs="Times New Roman"/>
-        </w:rPr>
-        <w:lastRenderedPageBreak/>
-        <w:t>toda la base teórica y visual necesaria para arrancar con la construcción del proyecto de manera organizada.</w:t>
+        <w:t>.</w:t>
       </w:r>
     </w:p>
     <w:p>
@@ -5159,7 +5169,6 @@
   <w:style w:type="character" w:default="1" w:styleId="Fuentedeprrafopredeter">
     <w:name w:val="Default Paragraph Font"/>
     <w:uiPriority w:val="1"/>
-    <w:semiHidden/>
     <w:unhideWhenUsed/>
   </w:style>
   <w:style w:type="table" w:default="1" w:styleId="Tablanormal">

</xml_diff>

<commit_message>
docs: se redacta el planteamiento del sistema
</commit_message>
<xml_diff>
--- a/informe de requisitos.docx
+++ b/informe de requisitos.docx
@@ -2029,24 +2029,23 @@
     </w:p>
     <w:p>
       <w:pPr>
-        <w:rPr>
-          <w:rFonts w:ascii="Times New Roman" w:hAnsi="Times New Roman" w:cs="Times New Roman"/>
-        </w:rPr>
-      </w:pPr>
-    </w:p>
-    <w:p>
-      <w:pPr>
         <w:spacing w:line="480" w:lineRule="auto"/>
         <w:ind w:firstLine="720"/>
         <w:rPr>
           <w:rFonts w:ascii="Times New Roman" w:hAnsi="Times New Roman" w:cs="Times New Roman"/>
-        </w:rPr>
-      </w:pPr>
-      <w:r>
-        <w:rPr>
-          <w:rFonts w:ascii="Times New Roman" w:hAnsi="Times New Roman" w:cs="Times New Roman"/>
-        </w:rPr>
-        <w:t>Actualmente, la barbería gestiona sus citas de manera manual mediante mensajes y llamadas, lo que genera cruces de horarios, interrupciones constantes durante el servicio y un alto índice de inasistencias al no tener un seguimiento adecuado. Al analizar este flujo de trabajo diario, identificamos que la dependencia de la comunicación manual para agendar es el principal cuello de botella operativo y quita tiempo valioso. Para solucionar esto, desarrollaremos una aplicación de gestión centralizada que traslade esta carga a un sistema automatizado, permitiendo a los clientes reservar su propio espacio según la disponibilidad en tiempo real y recibir recordatorios automáticos, mientras los barberos cuentan con un panel administrativo que organiza sus horarios y el historial de cada cliente, eliminando por completo el uso de agendas físicas y chats desorganizados.</w:t>
+          <w:b/>
+          <w:bCs/>
+          <w:lang w:val="es-MX"/>
+        </w:rPr>
+      </w:pPr>
+      <w:r>
+        <w:rPr>
+          <w:rFonts w:ascii="Times New Roman" w:hAnsi="Times New Roman" w:cs="Times New Roman"/>
+          <w:b/>
+          <w:bCs/>
+          <w:lang w:val="es-MX"/>
+        </w:rPr>
+        <w:t>1. Necesidad</w:t>
       </w:r>
     </w:p>
     <w:p>
@@ -2055,6 +2054,148 @@
         <w:ind w:firstLine="720"/>
         <w:rPr>
           <w:rFonts w:ascii="Times New Roman" w:hAnsi="Times New Roman" w:cs="Times New Roman"/>
+          <w:lang w:val="es-MX"/>
+        </w:rPr>
+      </w:pPr>
+      <w:r>
+        <w:rPr>
+          <w:rFonts w:ascii="Times New Roman" w:hAnsi="Times New Roman" w:cs="Times New Roman"/>
+          <w:lang w:val="es-MX"/>
+        </w:rPr>
+        <w:t>Dentro de una plataforma gastronómica moderna, la simple consulta de ingredientes y pasos resulta insuficiente para generar fidelización. Los usuarios requieren conocer la experiencia real de otras personas al preparar un platillo (tiempo real empleado, posibles sustituciones de ingredientes y nivel de dificultad percibido). Sin un módulo de comunidad y valoraciones, la plataforma carece de "prueba social", lo que disminuye la confianza del usuario al momento de seleccionar una receta.</w:t>
+      </w:r>
+    </w:p>
+    <w:p>
+      <w:pPr>
+        <w:spacing w:line="480" w:lineRule="auto"/>
+        <w:ind w:firstLine="720"/>
+        <w:rPr>
+          <w:rFonts w:ascii="Times New Roman" w:hAnsi="Times New Roman" w:cs="Times New Roman"/>
+          <w:b/>
+          <w:bCs/>
+          <w:lang w:val="es-MX"/>
+        </w:rPr>
+      </w:pPr>
+      <w:r>
+        <w:rPr>
+          <w:rFonts w:ascii="Times New Roman" w:hAnsi="Times New Roman" w:cs="Times New Roman"/>
+          <w:b/>
+          <w:bCs/>
+          <w:lang w:val="es-MX"/>
+        </w:rPr>
+        <w:t>2. Manejo Actual</w:t>
+      </w:r>
+    </w:p>
+    <w:p>
+      <w:pPr>
+        <w:spacing w:line="480" w:lineRule="auto"/>
+        <w:ind w:firstLine="720"/>
+        <w:rPr>
+          <w:rFonts w:ascii="Times New Roman" w:hAnsi="Times New Roman" w:cs="Times New Roman"/>
+          <w:lang w:val="es-MX"/>
+        </w:rPr>
+      </w:pPr>
+      <w:r>
+        <w:rPr>
+          <w:rFonts w:ascii="Times New Roman" w:hAnsi="Times New Roman" w:cs="Times New Roman"/>
+          <w:lang w:val="es-MX"/>
+        </w:rPr>
+        <w:t xml:space="preserve">En la versión base de </w:t>
+      </w:r>
+      <w:r>
+        <w:rPr>
+          <w:rFonts w:ascii="Times New Roman" w:hAnsi="Times New Roman" w:cs="Times New Roman"/>
+          <w:b/>
+          <w:bCs/>
+          <w:lang w:val="es-MX"/>
+        </w:rPr>
+        <w:t>Sazón</w:t>
+      </w:r>
+      <w:r>
+        <w:rPr>
+          <w:rFonts w:ascii="Times New Roman" w:hAnsi="Times New Roman" w:cs="Times New Roman"/>
+          <w:lang w:val="es-MX"/>
+        </w:rPr>
+        <w:t xml:space="preserve"> (y en blogs culinarios estáticos), el contenido fluye en una sola dirección: de la plataforma hacia el lector. Los usuarios consumen la </w:t>
+      </w:r>
+      <w:proofErr w:type="gramStart"/>
+      <w:r>
+        <w:rPr>
+          <w:rFonts w:ascii="Times New Roman" w:hAnsi="Times New Roman" w:cs="Times New Roman"/>
+          <w:lang w:val="es-MX"/>
+        </w:rPr>
+        <w:t>receta</w:t>
+      </w:r>
+      <w:proofErr w:type="gramEnd"/>
+      <w:r>
+        <w:rPr>
+          <w:rFonts w:ascii="Times New Roman" w:hAnsi="Times New Roman" w:cs="Times New Roman"/>
+          <w:lang w:val="es-MX"/>
+        </w:rPr>
+        <w:t xml:space="preserve"> pero no tienen un canal para calificar su precisión, sugerir mejoras, subir evidencias fotográficas o consultar opiniones de otros cocineros antes de preparar el alimento.</w:t>
+      </w:r>
+    </w:p>
+    <w:p>
+      <w:pPr>
+        <w:spacing w:line="480" w:lineRule="auto"/>
+        <w:ind w:firstLine="720"/>
+        <w:rPr>
+          <w:rFonts w:ascii="Times New Roman" w:hAnsi="Times New Roman" w:cs="Times New Roman"/>
+          <w:b/>
+          <w:bCs/>
+          <w:lang w:val="es-MX"/>
+        </w:rPr>
+      </w:pPr>
+      <w:r>
+        <w:rPr>
+          <w:rFonts w:ascii="Times New Roman" w:hAnsi="Times New Roman" w:cs="Times New Roman"/>
+          <w:b/>
+          <w:bCs/>
+          <w:lang w:val="es-MX"/>
+        </w:rPr>
+        <w:t>3. Solución Propuesta (Célula 6)</w:t>
+      </w:r>
+    </w:p>
+    <w:p>
+      <w:pPr>
+        <w:spacing w:line="480" w:lineRule="auto"/>
+        <w:ind w:firstLine="720"/>
+        <w:rPr>
+          <w:rFonts w:ascii="Times New Roman" w:hAnsi="Times New Roman" w:cs="Times New Roman"/>
+          <w:lang w:val="es-MX"/>
+        </w:rPr>
+      </w:pPr>
+      <w:r>
+        <w:rPr>
+          <w:rFonts w:ascii="Times New Roman" w:hAnsi="Times New Roman" w:cs="Times New Roman"/>
+          <w:lang w:val="es-MX"/>
+        </w:rPr>
+        <w:t xml:space="preserve">La Célula 6 implementará un </w:t>
+      </w:r>
+      <w:r>
+        <w:rPr>
+          <w:rFonts w:ascii="Times New Roman" w:hAnsi="Times New Roman" w:cs="Times New Roman"/>
+          <w:b/>
+          <w:bCs/>
+          <w:lang w:val="es-MX"/>
+        </w:rPr>
+        <w:t>Módulo de Comunidad y Valoraciones</w:t>
+      </w:r>
+      <w:r>
+        <w:rPr>
+          <w:rFonts w:ascii="Times New Roman" w:hAnsi="Times New Roman" w:cs="Times New Roman"/>
+          <w:lang w:val="es-MX"/>
+        </w:rPr>
+        <w:t xml:space="preserve"> integrado de forma transparente en la plataforma. Esta solución permitirá a los usuarios registrados calificar las recetas mediante una escala de 1 a 5 estrellas, redactar reseñas con comentarios constructivos, responder a las opiniones de otros miembros y visualizar estadísticas agregadas (promedios de valoración y número de reseñas) en cada ficha de receta, fomentando un ecosistema culinario participativo.</w:t>
+      </w:r>
+    </w:p>
+    <w:p>
+      <w:pPr>
+        <w:spacing w:line="480" w:lineRule="auto"/>
+        <w:ind w:firstLine="720"/>
+        <w:rPr>
+          <w:rFonts w:ascii="Times New Roman" w:hAnsi="Times New Roman" w:cs="Times New Roman"/>
+          <w:lang w:val="es-MX"/>
         </w:rPr>
       </w:pPr>
     </w:p>

</xml_diff>

<commit_message>
docs: se cambio el listado tablas, obejtivos, Alcance con inclusiones y exclusiones.
</commit_message>
<xml_diff>
--- a/informe de requisitos.docx
+++ b/informe de requisitos.docx
@@ -1,6 +1,6 @@
 
 <file path=word/document.xml><?xml version="1.0" encoding="utf-8"?>
-<w:document xmlns:wpc="http://schemas.microsoft.com/office/word/2010/wordprocessingCanvas" xmlns:cx="http://schemas.microsoft.com/office/drawing/2014/chartex" xmlns:cx1="http://schemas.microsoft.com/office/drawing/2015/9/8/chartex" xmlns:cx2="http://schemas.microsoft.com/office/drawing/2015/10/21/chartex" xmlns:cx3="http://schemas.microsoft.com/office/drawing/2016/5/9/chartex" xmlns:cx4="http://schemas.microsoft.com/office/drawing/2016/5/10/chartex" xmlns:cx5="http://schemas.microsoft.com/office/drawing/2016/5/11/chartex" xmlns:cx6="http://schemas.microsoft.com/office/drawing/2016/5/12/chartex" xmlns:cx7="http://schemas.microsoft.com/office/drawing/2016/5/13/chartex" xmlns:cx8="http://schemas.microsoft.com/office/drawing/2016/5/14/chartex" xmlns:mc="http://schemas.openxmlformats.org/markup-compatibility/2006" xmlns:aink="http://schemas.microsoft.com/office/drawing/2016/ink" xmlns:am3d="http://schemas.microsoft.com/office/drawing/2017/model3d" xmlns:o="urn:schemas-microsoft-com:office:office" xmlns:oel="http://schemas.microsoft.com/office/2019/extlst" xmlns:r="http://schemas.openxmlformats.org/officeDocument/2006/relationships" xmlns:m="http://schemas.openxmlformats.org/officeDocument/2006/math" xmlns:v="urn:schemas-microsoft-com:vml" xmlns:wp14="http://schemas.microsoft.com/office/word/2010/wordprocessingDrawing" xmlns:wp="http://schemas.openxmlformats.org/drawingml/2006/wordprocessingDrawing" xmlns:w10="urn:schemas-microsoft-com:office:word" xmlns:w="http://schemas.openxmlformats.org/wordprocessingml/2006/main" xmlns:w14="http://schemas.microsoft.com/office/word/2010/wordml" xmlns:w15="http://schemas.microsoft.com/office/word/2012/wordml" xmlns:w16cex="http://schemas.microsoft.com/office/word/2018/wordml/cex" xmlns:w16cid="http://schemas.microsoft.com/office/word/2016/wordml/cid" xmlns:w16="http://schemas.microsoft.com/office/word/2018/wordml" xmlns:w16du="http://schemas.microsoft.com/office/word/2023/wordml/word16du" xmlns:w16sdtdh="http://schemas.microsoft.com/office/word/2020/wordml/sdtdatahash" xmlns:w16se="http://schemas.microsoft.com/office/word/2015/wordml/symex" xmlns:wpg="http://schemas.microsoft.com/office/word/2010/wordprocessingGroup" xmlns:wpi="http://schemas.microsoft.com/office/word/2010/wordprocessingInk" xmlns:wne="http://schemas.microsoft.com/office/word/2006/wordml" xmlns:wps="http://schemas.microsoft.com/office/word/2010/wordprocessingShape" mc:Ignorable="w14 w15 w16se w16cid w16 w16cex w16sdtdh w16du wp14">
+<w:document xmlns:wpc="http://schemas.microsoft.com/office/word/2010/wordprocessingCanvas" xmlns:cx="http://schemas.microsoft.com/office/drawing/2014/chartex" xmlns:cx1="http://schemas.microsoft.com/office/drawing/2015/9/8/chartex" xmlns:cx2="http://schemas.microsoft.com/office/drawing/2015/10/21/chartex" xmlns:cx3="http://schemas.microsoft.com/office/drawing/2016/5/9/chartex" xmlns:cx4="http://schemas.microsoft.com/office/drawing/2016/5/10/chartex" xmlns:cx5="http://schemas.microsoft.com/office/drawing/2016/5/11/chartex" xmlns:cx6="http://schemas.microsoft.com/office/drawing/2016/5/12/chartex" xmlns:cx7="http://schemas.microsoft.com/office/drawing/2016/5/13/chartex" xmlns:cx8="http://schemas.microsoft.com/office/drawing/2016/5/14/chartex" xmlns:mc="http://schemas.openxmlformats.org/markup-compatibility/2006" xmlns:aink="http://schemas.microsoft.com/office/drawing/2016/ink" xmlns:am3d="http://schemas.microsoft.com/office/drawing/2017/model3d" xmlns:o="urn:schemas-microsoft-com:office:office" xmlns:r="http://schemas.openxmlformats.org/officeDocument/2006/relationships" xmlns:m="http://schemas.openxmlformats.org/officeDocument/2006/math" xmlns:v="urn:schemas-microsoft-com:vml" xmlns:wp14="http://schemas.microsoft.com/office/word/2010/wordprocessingDrawing" xmlns:wp="http://schemas.openxmlformats.org/drawingml/2006/wordprocessingDrawing" xmlns:w10="urn:schemas-microsoft-com:office:word" xmlns:w="http://schemas.openxmlformats.org/wordprocessingml/2006/main" xmlns:w14="http://schemas.microsoft.com/office/word/2010/wordml" xmlns:w15="http://schemas.microsoft.com/office/word/2012/wordml" xmlns:w16cex="http://schemas.microsoft.com/office/word/2018/wordml/cex" xmlns:w16cid="http://schemas.microsoft.com/office/word/2016/wordml/cid" xmlns:w16="http://schemas.microsoft.com/office/word/2018/wordml" xmlns:w16sdtdh="http://schemas.microsoft.com/office/word/2020/wordml/sdtdatahash" xmlns:w16se="http://schemas.microsoft.com/office/word/2015/wordml/symex" xmlns:wpg="http://schemas.microsoft.com/office/word/2010/wordprocessingGroup" xmlns:wpi="http://schemas.microsoft.com/office/word/2010/wordprocessingInk" xmlns:wne="http://schemas.microsoft.com/office/word/2006/wordml" xmlns:wps="http://schemas.microsoft.com/office/word/2010/wordprocessingShape" mc:Ignorable="w14 w15 w16se w16cid w16 w16cex w16sdtdh wp14">
   <w:body>
     <w:p>
       <w:pPr>
@@ -47,213 +47,26 @@
     </w:p>
     <w:p>
       <w:pPr>
-        <w:shd w:val="clear" w:color="auto" w:fill="F8FAFD"/>
-        <w:spacing w:after="0" w:line="240" w:lineRule="auto"/>
-        <w:rPr>
-          <w:rFonts w:ascii="Roboto" w:eastAsia="Times New Roman" w:hAnsi="Roboto" w:cs="Times New Roman"/>
-          <w:color w:val="1F1F1F"/>
-          <w:kern w:val="0"/>
-          <w:sz w:val="20"/>
-          <w:szCs w:val="20"/>
-          <w:lang w:val="es-MX" w:eastAsia="es-MX"/>
-          <w14:ligatures w14:val="none"/>
-        </w:rPr>
-      </w:pPr>
-    </w:p>
-    <w:tbl>
-      <w:tblPr>
-        <w:tblW w:w="21600" w:type="dxa"/>
-        <w:tblCellSpacing w:w="0" w:type="dxa"/>
-        <w:tblBorders>
-          <w:top w:val="single" w:sz="6" w:space="0" w:color="C4C7C5"/>
-        </w:tblBorders>
-        <w:shd w:val="clear" w:color="auto" w:fill="F8FAFD"/>
-        <w:tblCellMar>
-          <w:left w:w="0" w:type="dxa"/>
-          <w:right w:w="840" w:type="dxa"/>
-        </w:tblCellMar>
-        <w:tblLook w:val="04A0" w:firstRow="1" w:lastRow="0" w:firstColumn="1" w:lastColumn="0" w:noHBand="0" w:noVBand="1"/>
-      </w:tblPr>
-      <w:tblGrid>
-        <w:gridCol w:w="901"/>
-        <w:gridCol w:w="901"/>
-        <w:gridCol w:w="1755"/>
-        <w:gridCol w:w="16899"/>
-        <w:gridCol w:w="1144"/>
-      </w:tblGrid>
-      <w:tr>
-        <w:trPr>
-          <w:tblCellSpacing w:w="0" w:type="dxa"/>
-        </w:trPr>
-        <w:tc>
-          <w:tcPr>
-            <w:tcW w:w="720" w:type="dxa"/>
-            <w:shd w:val="clear" w:color="auto" w:fill="F8FAFD"/>
-            <w:vAlign w:val="center"/>
-            <w:hideMark/>
-          </w:tcPr>
-          <w:p>
-            <w:pPr>
-              <w:spacing w:before="15" w:after="0" w:line="0" w:lineRule="auto"/>
-              <w:rPr>
-                <w:rFonts w:ascii="Times New Roman" w:eastAsia="Times New Roman" w:hAnsi="Times New Roman" w:cs="Times New Roman"/>
-                <w:kern w:val="0"/>
-                <w:lang w:val="es-MX" w:eastAsia="es-MX"/>
-                <w14:ligatures w14:val="none"/>
-              </w:rPr>
-            </w:pPr>
-            <w:r>
-              <w:rPr>
-                <w:rFonts w:ascii="Times New Roman" w:eastAsia="Times New Roman" w:hAnsi="Times New Roman" w:cs="Times New Roman"/>
-                <w:kern w:val="0"/>
-                <w:lang w:val="es-MX" w:eastAsia="es-MX"/>
-                <w14:ligatures w14:val="none"/>
-              </w:rPr>
-              <w:t> </w:t>
-            </w:r>
-          </w:p>
-        </w:tc>
-        <w:tc>
-          <w:tcPr>
-            <w:tcW w:w="240" w:type="dxa"/>
-            <w:shd w:val="clear" w:color="auto" w:fill="F8FAFD"/>
-            <w:vAlign w:val="center"/>
-            <w:hideMark/>
-          </w:tcPr>
-          <w:p>
-            <w:pPr>
-              <w:spacing w:before="15" w:after="0" w:line="0" w:lineRule="auto"/>
-              <w:rPr>
-                <w:rFonts w:ascii="Times New Roman" w:eastAsia="Times New Roman" w:hAnsi="Times New Roman" w:cs="Times New Roman"/>
-                <w:kern w:val="0"/>
-                <w:lang w:val="es-MX" w:eastAsia="es-MX"/>
-                <w14:ligatures w14:val="none"/>
-              </w:rPr>
-            </w:pPr>
-          </w:p>
-        </w:tc>
-        <w:tc>
-          <w:tcPr>
-            <w:tcW w:w="1755" w:type="dxa"/>
-            <w:shd w:val="clear" w:color="auto" w:fill="F8FAFD"/>
-            <w:vAlign w:val="bottom"/>
-            <w:hideMark/>
-          </w:tcPr>
-          <w:p>
-            <w:pPr>
-              <w:spacing w:before="15" w:after="0" w:line="0" w:lineRule="auto"/>
-              <w:rPr>
-                <w:rFonts w:ascii="Times New Roman" w:eastAsia="Times New Roman" w:hAnsi="Times New Roman" w:cs="Times New Roman"/>
-                <w:kern w:val="0"/>
-                <w:sz w:val="20"/>
-                <w:szCs w:val="20"/>
-                <w:lang w:val="es-MX" w:eastAsia="es-MX"/>
-                <w14:ligatures w14:val="none"/>
-              </w:rPr>
-            </w:pPr>
-          </w:p>
-        </w:tc>
-        <w:tc>
-          <w:tcPr>
-            <w:tcW w:w="0" w:type="auto"/>
-            <w:shd w:val="clear" w:color="auto" w:fill="F8FAFD"/>
-            <w:vAlign w:val="center"/>
-            <w:hideMark/>
-          </w:tcPr>
-          <w:p>
-            <w:pPr>
-              <w:spacing w:before="15" w:after="0" w:line="0" w:lineRule="auto"/>
-              <w:rPr>
-                <w:rFonts w:ascii="Times New Roman" w:eastAsia="Times New Roman" w:hAnsi="Times New Roman" w:cs="Times New Roman"/>
-                <w:kern w:val="0"/>
-                <w:sz w:val="20"/>
-                <w:szCs w:val="20"/>
-                <w:lang w:val="es-MX" w:eastAsia="es-MX"/>
-                <w14:ligatures w14:val="none"/>
-              </w:rPr>
-            </w:pPr>
-          </w:p>
-        </w:tc>
-        <w:tc>
-          <w:tcPr>
-            <w:tcW w:w="0" w:type="auto"/>
-            <w:shd w:val="clear" w:color="auto" w:fill="F8FAFD"/>
-            <w:tcMar>
-              <w:top w:w="0" w:type="dxa"/>
-              <w:left w:w="0" w:type="dxa"/>
-              <w:bottom w:w="0" w:type="dxa"/>
-              <w:right w:w="0" w:type="dxa"/>
-            </w:tcMar>
-            <w:vAlign w:val="center"/>
-            <w:hideMark/>
-          </w:tcPr>
-          <w:p>
-            <w:pPr>
-              <w:spacing w:before="15" w:after="0" w:line="0" w:lineRule="auto"/>
-              <w:rPr>
-                <w:rFonts w:ascii="Times New Roman" w:eastAsia="Times New Roman" w:hAnsi="Times New Roman" w:cs="Times New Roman"/>
-                <w:kern w:val="0"/>
-                <w:sz w:val="20"/>
-                <w:szCs w:val="20"/>
-                <w:lang w:val="es-MX" w:eastAsia="es-MX"/>
-                <w14:ligatures w14:val="none"/>
-              </w:rPr>
-            </w:pPr>
-          </w:p>
-        </w:tc>
-      </w:tr>
-    </w:tbl>
-    <w:p>
-      <w:pPr>
-        <w:shd w:val="clear" w:color="auto" w:fill="FFFFFF"/>
-        <w:spacing w:after="0" w:line="240" w:lineRule="auto"/>
-        <w:jc w:val="center"/>
-        <w:rPr>
-          <w:rFonts w:ascii="docs-Calibri" w:eastAsia="Times New Roman" w:hAnsi="docs-Calibri" w:cs="Calibri"/>
-          <w:color w:val="000000"/>
-          <w:kern w:val="0"/>
-          <w:sz w:val="23"/>
-          <w:szCs w:val="23"/>
-          <w:lang w:val="es-MX" w:eastAsia="es-MX"/>
-          <w14:ligatures w14:val="none"/>
-        </w:rPr>
-      </w:pPr>
-      <w:r>
-        <w:rPr>
-          <w:rFonts w:ascii="docs-Calibri" w:eastAsia="Times New Roman" w:hAnsi="docs-Calibri" w:cs="Calibri"/>
-          <w:color w:val="000000"/>
-          <w:kern w:val="0"/>
-          <w:sz w:val="23"/>
-          <w:szCs w:val="23"/>
-          <w:lang w:val="es-MX" w:eastAsia="es-MX"/>
-          <w14:ligatures w14:val="none"/>
-        </w:rPr>
-        <w:t>Juan Felipe Isaza Vásquez</w:t>
-      </w:r>
-    </w:p>
-    <w:p>
-      <w:pPr>
         <w:jc w:val="center"/>
         <w:rPr>
           <w:rFonts w:ascii="Times New Roman" w:hAnsi="Times New Roman" w:cs="Times New Roman"/>
           <w:color w:val="000000" w:themeColor="text1"/>
         </w:rPr>
       </w:pPr>
-      <w:proofErr w:type="spellStart"/>
       <w:r>
         <w:rPr>
           <w:rFonts w:ascii="Times New Roman" w:hAnsi="Times New Roman" w:cs="Times New Roman"/>
           <w:color w:val="000000" w:themeColor="text1"/>
         </w:rPr>
-        <w:t>Stiven</w:t>
-      </w:r>
-      <w:proofErr w:type="spellEnd"/>
+        <w:t>Estefanía Muñoz Tobón</w:t>
+      </w:r>
       <w:r>
         <w:rPr>
           <w:rFonts w:ascii="Times New Roman" w:hAnsi="Times New Roman" w:cs="Times New Roman"/>
           <w:color w:val="000000" w:themeColor="text1"/>
         </w:rPr>
-        <w:t xml:space="preserve"> Martínez Piedrahíta</w:t>
+        <w:br/>
+        <w:t>Stiven Martínez Piedrahíta</w:t>
       </w:r>
       <w:r>
         <w:rPr>
@@ -1652,11 +1465,130 @@
     </w:p>
     <w:p>
       <w:pPr>
-        <w:rPr>
-          <w:rFonts w:ascii="Times New Roman" w:hAnsi="Times New Roman" w:cs="Times New Roman"/>
-          <w:lang w:val="en-US"/>
-        </w:rPr>
-      </w:pPr>
+        <w:spacing w:after="0"/>
+      </w:pPr>
+      <w:r>
+        <w:t>Tabla 1.</w:t>
+      </w:r>
+    </w:p>
+    <w:p>
+      <w:pPr>
+        <w:spacing w:after="0"/>
+      </w:pPr>
+      <w:r>
+        <w:t xml:space="preserve">Colecciones Descripción: Permite almacenar las colecciones creadas por los usuarios. </w:t>
+      </w:r>
+    </w:p>
+    <w:p>
+      <w:pPr>
+        <w:spacing w:after="0"/>
+      </w:pPr>
+    </w:p>
+    <w:p>
+      <w:pPr>
+        <w:spacing w:after="0"/>
+      </w:pPr>
+      <w:r>
+        <w:t xml:space="preserve">Tabla 2. </w:t>
+      </w:r>
+    </w:p>
+    <w:p>
+      <w:pPr>
+        <w:spacing w:after="0"/>
+      </w:pPr>
+      <w:r>
+        <w:t xml:space="preserve">Favoritos Descripción: Registra las recetas guardadas por cada usuario. </w:t>
+      </w:r>
+    </w:p>
+    <w:p>
+      <w:pPr>
+        <w:spacing w:after="0"/>
+      </w:pPr>
+    </w:p>
+    <w:p>
+      <w:pPr>
+        <w:spacing w:after="0"/>
+      </w:pPr>
+      <w:r>
+        <w:t>Tabla 3.</w:t>
+      </w:r>
+    </w:p>
+    <w:p>
+      <w:pPr>
+        <w:spacing w:after="0"/>
+      </w:pPr>
+      <w:r>
+        <w:t xml:space="preserve">Comentarios Descripción: Almacena comentarios realizados sobre las recetas. </w:t>
+      </w:r>
+    </w:p>
+    <w:p>
+      <w:pPr>
+        <w:spacing w:after="0"/>
+      </w:pPr>
+    </w:p>
+    <w:p>
+      <w:pPr>
+        <w:spacing w:after="0"/>
+      </w:pPr>
+      <w:r>
+        <w:t>Tabla 4.</w:t>
+      </w:r>
+    </w:p>
+    <w:p>
+      <w:pPr>
+        <w:spacing w:after="0"/>
+      </w:pPr>
+      <w:r>
+        <w:t xml:space="preserve">Reportes Descripción: Registra reportes de contenido realizados por los usuarios. </w:t>
+      </w:r>
+    </w:p>
+    <w:p>
+      <w:pPr>
+        <w:spacing w:after="0"/>
+      </w:pPr>
+    </w:p>
+    <w:p>
+      <w:pPr>
+        <w:spacing w:after="0"/>
+      </w:pPr>
+      <w:r>
+        <w:t>Tabla 5.</w:t>
+      </w:r>
+    </w:p>
+    <w:p>
+      <w:pPr>
+        <w:spacing w:after="0"/>
+      </w:pPr>
+      <w:r>
+        <w:t xml:space="preserve">Calificaciones Descripción: Guarda las puntuaciones asignadas a las recetas. </w:t>
+      </w:r>
+    </w:p>
+    <w:p>
+      <w:pPr>
+        <w:spacing w:after="0"/>
+      </w:pPr>
+    </w:p>
+    <w:p>
+      <w:pPr>
+        <w:spacing w:after="0"/>
+      </w:pPr>
+      <w:r>
+        <w:t>Tabla 6.</w:t>
+      </w:r>
+    </w:p>
+    <w:p>
+      <w:pPr>
+        <w:spacing w:after="0"/>
+      </w:pPr>
+      <w:r>
+        <w:t>Favoritos</w:t>
+      </w:r>
+      <w:r>
+        <w:t xml:space="preserve"> </w:t>
+      </w:r>
+      <w:r>
+        <w:t>colecciones Descripción: Relaciona recetas favoritas con colecciones.</w:t>
+      </w:r>
       <w:r>
         <w:rPr>
           <w:rFonts w:ascii="Times New Roman" w:hAnsi="Times New Roman" w:cs="Times New Roman"/>
@@ -1879,13 +1811,47 @@
         <w:ind w:firstLine="720"/>
         <w:rPr>
           <w:rFonts w:ascii="Times New Roman" w:hAnsi="Times New Roman" w:cs="Times New Roman"/>
-        </w:rPr>
-      </w:pPr>
-      <w:r>
-        <w:rPr>
-          <w:rFonts w:ascii="Times New Roman" w:hAnsi="Times New Roman" w:cs="Times New Roman"/>
-        </w:rPr>
-        <w:t>Este documento presenta el informe de requisitos para el desarrollo de la nueva aplicación de la barbería. El propósito de este texto es servir como la carta de navegación principal para todas las personas involucradas en el proyecto, asegurando que tengamos una visión clara, estructurada y unificada antes de iniciar cualquier fase de diseño o programación.</w:t>
+          <w:lang w:val="es-MX"/>
+        </w:rPr>
+      </w:pPr>
+      <w:r>
+        <w:rPr>
+          <w:rFonts w:ascii="Times New Roman" w:hAnsi="Times New Roman" w:cs="Times New Roman"/>
+          <w:lang w:val="es-MX"/>
+        </w:rPr>
+        <w:t xml:space="preserve">El presente Documento de Especificación de Requisitos de Software (SRS) detalla los aspectos técnicos, funcionales y de diseño asignados de manera exclusiva a la </w:t>
+      </w:r>
+      <w:r>
+        <w:rPr>
+          <w:rFonts w:ascii="Times New Roman" w:hAnsi="Times New Roman" w:cs="Times New Roman"/>
+          <w:b/>
+          <w:bCs/>
+          <w:lang w:val="es-MX"/>
+        </w:rPr>
+        <w:t>Célula 6: Comunidad y Valoraciones</w:t>
+      </w:r>
+      <w:r>
+        <w:rPr>
+          <w:rFonts w:ascii="Times New Roman" w:hAnsi="Times New Roman" w:cs="Times New Roman"/>
+          <w:lang w:val="es-MX"/>
+        </w:rPr>
+        <w:t xml:space="preserve">, dentro del marco del proyecto integral </w:t>
+      </w:r>
+      <w:r>
+        <w:rPr>
+          <w:rFonts w:ascii="Times New Roman" w:hAnsi="Times New Roman" w:cs="Times New Roman"/>
+          <w:b/>
+          <w:bCs/>
+          <w:lang w:val="es-MX"/>
+        </w:rPr>
+        <w:t>Sazón</w:t>
+      </w:r>
+      <w:r>
+        <w:rPr>
+          <w:rFonts w:ascii="Times New Roman" w:hAnsi="Times New Roman" w:cs="Times New Roman"/>
+          <w:lang w:val="es-MX"/>
+        </w:rPr>
+        <w:t>. Mientras que el proyecto macro abarca la gestión global del catálogo, usuarios e infraestructura, este informe se centra de manera especializada en el motor de interacción social, retroalimentación y evaluación de recetas por parte de los usuarios.</w:t>
       </w:r>
     </w:p>
     <w:p>
@@ -1894,13 +1860,15 @@
         <w:ind w:firstLine="720"/>
         <w:rPr>
           <w:rFonts w:ascii="Times New Roman" w:hAnsi="Times New Roman" w:cs="Times New Roman"/>
-        </w:rPr>
-      </w:pPr>
-      <w:r>
-        <w:rPr>
-          <w:rFonts w:ascii="Times New Roman" w:hAnsi="Times New Roman" w:cs="Times New Roman"/>
-        </w:rPr>
-        <w:t>A lo largo de este informe encontrarás una serie de secciones organizadas para ir de lo general a lo específico. En primer lugar, se exponen los problemas actuales que enfrenta la barbería en su operación diaria, los cuales justifican la necesidad de este software. A partir de allí, se plantean los objetivos generales y específicos que el sistema debe cumplir para darle solución a dichas problemáticas.</w:t>
+          <w:lang w:val="es-MX"/>
+        </w:rPr>
+      </w:pPr>
+      <w:r>
+        <w:rPr>
+          <w:rFonts w:ascii="Times New Roman" w:hAnsi="Times New Roman" w:cs="Times New Roman"/>
+          <w:lang w:val="es-MX"/>
+        </w:rPr>
+        <w:t>A lo largo de este informe, se guiará al lector a través de la justificación funcional de la célula, sus objetivos redactados bajo la taxonomía de Bloom, el alcance detallado delimitando inclusiones y exclusiones específicas del módulo, la arquitectura tecnológica del stack seleccionado, el modelado relacional de datos de comunidad, la lista exhaustiva de requisitos funcionales y no funcionales, la reglamentación legal del desarrollo formativo y las conclusiones obtenidas por el equipo durante la fase de análisis.</w:t>
       </w:r>
     </w:p>
     <w:p>
@@ -1915,155 +1883,749 @@
         <w:rPr>
           <w:rFonts w:ascii="Times New Roman" w:hAnsi="Times New Roman" w:cs="Times New Roman"/>
         </w:rPr>
-        <w:t>Para hacer que la información técnica y operativa sea mucho más fácil de entender, el contenido de este documento se apoya en distintos recursos visuales. Encontrarás diversas ilustraciones que ayudan a visualizar cómo interactuarán los usuarios con el sistema, así como tablas detalladas que organizan los requerimientos puntuales, categorizando de forma exacta qué debe hacer la aplicación y cómo debe comportarse.</w:t>
-      </w:r>
-    </w:p>
-    <w:p>
-      <w:pPr>
+        <w:t>.</w:t>
+      </w:r>
+    </w:p>
+    <w:p>
+      <w:pPr>
+        <w:rPr>
+          <w:rFonts w:ascii="Times New Roman" w:hAnsi="Times New Roman" w:cs="Times New Roman"/>
+        </w:rPr>
+      </w:pPr>
+    </w:p>
+    <w:p>
+      <w:pPr>
+        <w:rPr>
+          <w:rFonts w:ascii="Times New Roman" w:hAnsi="Times New Roman" w:cs="Times New Roman"/>
+        </w:rPr>
+      </w:pPr>
+      <w:r>
+        <w:rPr>
+          <w:rFonts w:ascii="Times New Roman" w:hAnsi="Times New Roman" w:cs="Times New Roman"/>
+        </w:rPr>
+        <w:br w:type="page"/>
+      </w:r>
+    </w:p>
+    <w:p>
+      <w:pPr>
+        <w:pStyle w:val="Ttulo1"/>
         <w:spacing w:line="480" w:lineRule="auto"/>
-        <w:ind w:firstLine="720"/>
-        <w:rPr>
-          <w:rFonts w:ascii="Times New Roman" w:hAnsi="Times New Roman" w:cs="Times New Roman"/>
-        </w:rPr>
-      </w:pPr>
-      <w:r>
-        <w:rPr>
-          <w:rFonts w:ascii="Times New Roman" w:hAnsi="Times New Roman" w:cs="Times New Roman"/>
-        </w:rPr>
-        <w:t xml:space="preserve">Por último, se incluye un glosario de términos. Esta sección está pensada para alinear el vocabulario técnico con el lenguaje del día a día de la barbería, evitando confusiones a lo largo del desarrollo. En resumen, en las siguientes páginas está plasmada </w:t>
-      </w:r>
-      <w:r>
-        <w:rPr>
-          <w:rFonts w:ascii="Times New Roman" w:hAnsi="Times New Roman" w:cs="Times New Roman"/>
-        </w:rPr>
+      </w:pPr>
+      <w:r>
         <w:lastRenderedPageBreak/>
-        <w:t>toda la base teórica y visual necesaria para arrancar con la construcción del proyecto de manera organizada.</w:t>
-      </w:r>
-    </w:p>
-    <w:p>
-      <w:pPr>
-        <w:rPr>
-          <w:rFonts w:ascii="Times New Roman" w:hAnsi="Times New Roman" w:cs="Times New Roman"/>
-        </w:rPr>
-      </w:pPr>
-    </w:p>
-    <w:p>
-      <w:pPr>
-        <w:rPr>
-          <w:rFonts w:ascii="Times New Roman" w:hAnsi="Times New Roman" w:cs="Times New Roman"/>
-        </w:rPr>
-      </w:pPr>
-      <w:r>
-        <w:rPr>
-          <w:rFonts w:ascii="Times New Roman" w:hAnsi="Times New Roman" w:cs="Times New Roman"/>
-        </w:rPr>
-        <w:br w:type="page"/>
-      </w:r>
-    </w:p>
-    <w:p>
-      <w:pPr>
-        <w:pStyle w:val="Ttulo1"/>
-        <w:rPr>
-          <w:rFonts w:cs="Times New Roman"/>
-          <w:szCs w:val="24"/>
-        </w:rPr>
-      </w:pPr>
-      <w:bookmarkStart w:id="3" w:name="_Toc241702557"/>
-      <w:r>
-        <w:rPr>
-          <w:rFonts w:cs="Times New Roman"/>
-          <w:szCs w:val="24"/>
-        </w:rPr>
-        <w:lastRenderedPageBreak/>
-        <w:t>Objetivos</w:t>
-      </w:r>
-      <w:bookmarkEnd w:id="3"/>
-    </w:p>
-    <w:p>
-      <w:pPr>
-        <w:rPr>
-          <w:rFonts w:ascii="Times New Roman" w:hAnsi="Times New Roman" w:cs="Times New Roman"/>
-        </w:rPr>
-      </w:pPr>
-    </w:p>
-    <w:p>
-      <w:pPr>
-        <w:rPr>
-          <w:rFonts w:ascii="Times New Roman" w:hAnsi="Times New Roman" w:cs="Times New Roman"/>
-        </w:rPr>
-      </w:pPr>
-    </w:p>
-    <w:p>
-      <w:pPr>
-        <w:rPr>
-          <w:rFonts w:ascii="Times New Roman" w:hAnsi="Times New Roman" w:cs="Times New Roman"/>
-        </w:rPr>
-      </w:pPr>
+        <w:t>1. Objetivos</w:t>
+      </w:r>
     </w:p>
     <w:p>
       <w:pPr>
         <w:pStyle w:val="Ttulo2"/>
-        <w:rPr>
-          <w:rFonts w:cs="Times New Roman"/>
-          <w:szCs w:val="24"/>
-        </w:rPr>
-      </w:pPr>
-      <w:bookmarkStart w:id="4" w:name="_Toc241702558"/>
-      <w:r>
-        <w:rPr>
-          <w:rFonts w:cs="Times New Roman"/>
-          <w:szCs w:val="24"/>
-        </w:rPr>
-        <w:t>Objetivo General</w:t>
-      </w:r>
-      <w:bookmarkEnd w:id="4"/>
-    </w:p>
-    <w:p>
-      <w:pPr>
         <w:spacing w:line="480" w:lineRule="auto"/>
-        <w:ind w:firstLine="720"/>
-        <w:rPr>
-          <w:rFonts w:ascii="Times New Roman" w:hAnsi="Times New Roman" w:cs="Times New Roman"/>
-        </w:rPr>
-      </w:pPr>
-      <w:r>
-        <w:rPr>
-          <w:rFonts w:ascii="Times New Roman" w:hAnsi="Times New Roman" w:cs="Times New Roman"/>
-        </w:rPr>
-        <w:t>Diseñar y desarrollar una aplicación para la gestión integral de la barbería, que centralice la reserva de citas, el control de los servicios y la administración de los clientes, con el fin de optimizar el tiempo de operación diaria y mejorar la experiencia de servicio.</w:t>
-      </w:r>
-    </w:p>
-    <w:p>
-      <w:pPr>
-        <w:rPr>
-          <w:rFonts w:ascii="Times New Roman" w:hAnsi="Times New Roman" w:cs="Times New Roman"/>
-        </w:rPr>
-      </w:pPr>
+      </w:pPr>
+      <w:r>
+        <w:t>1.1 Objetivo general</w:t>
+      </w:r>
+    </w:p>
+    <w:p>
+      <w:pPr>
+        <w:spacing w:line="480" w:lineRule="auto"/>
+      </w:pPr>
+      <w:r>
+        <w:t>Desarrollar un módulo de comunidad para el sistema Sazón que permita gestionar las interacciones de los usuarios con las recetas mediante calificaciones, comentarios, favoritos, colecciones y reportes, con el propósito de fortalecer la participación, organización y cuidado del contenido dentro de la plataforma.</w:t>
+      </w:r>
     </w:p>
     <w:p>
       <w:pPr>
         <w:pStyle w:val="Ttulo2"/>
-        <w:rPr>
-          <w:rFonts w:cs="Times New Roman"/>
-          <w:szCs w:val="24"/>
-        </w:rPr>
-      </w:pPr>
-      <w:bookmarkStart w:id="5" w:name="_Toc241702559"/>
-      <w:r>
-        <w:rPr>
-          <w:rFonts w:cs="Times New Roman"/>
-          <w:szCs w:val="24"/>
-        </w:rPr>
-        <w:t>Objetivos específicos</w:t>
-      </w:r>
-      <w:bookmarkEnd w:id="5"/>
-    </w:p>
-    <w:p>
-      <w:pPr>
-        <w:rPr>
-          <w:rFonts w:ascii="Times New Roman" w:hAnsi="Times New Roman" w:cs="Times New Roman"/>
-        </w:rPr>
-      </w:pPr>
+        <w:spacing w:line="480" w:lineRule="auto"/>
+      </w:pPr>
+      <w:r>
+        <w:t>1.2 Objetivos específicos</w:t>
+      </w:r>
+    </w:p>
+    <w:p>
+      <w:pPr>
+        <w:pStyle w:val="Listaconvietas"/>
+        <w:spacing w:line="480" w:lineRule="auto"/>
+      </w:pPr>
+      <w:proofErr w:type="spellStart"/>
+      <w:r>
+        <w:t>Identificar</w:t>
+      </w:r>
+      <w:proofErr w:type="spellEnd"/>
+      <w:r>
+        <w:t xml:space="preserve"> las </w:t>
+      </w:r>
+      <w:proofErr w:type="spellStart"/>
+      <w:r>
+        <w:t>principales</w:t>
+      </w:r>
+      <w:proofErr w:type="spellEnd"/>
+      <w:r>
+        <w:t xml:space="preserve"> </w:t>
+      </w:r>
+      <w:proofErr w:type="spellStart"/>
+      <w:r>
+        <w:t>interacciones</w:t>
+      </w:r>
+      <w:proofErr w:type="spellEnd"/>
+      <w:r>
+        <w:t xml:space="preserve"> que los </w:t>
+      </w:r>
+      <w:proofErr w:type="spellStart"/>
+      <w:r>
+        <w:t>usuarios</w:t>
+      </w:r>
+      <w:proofErr w:type="spellEnd"/>
+      <w:r>
+        <w:t xml:space="preserve"> </w:t>
+      </w:r>
+      <w:proofErr w:type="spellStart"/>
+      <w:r>
+        <w:t>pueden</w:t>
+      </w:r>
+      <w:proofErr w:type="spellEnd"/>
+      <w:r>
+        <w:t xml:space="preserve"> </w:t>
+      </w:r>
+      <w:proofErr w:type="spellStart"/>
+      <w:r>
+        <w:t>realizar</w:t>
+      </w:r>
+      <w:proofErr w:type="spellEnd"/>
+      <w:r>
+        <w:t xml:space="preserve"> </w:t>
+      </w:r>
+      <w:proofErr w:type="spellStart"/>
+      <w:r>
+        <w:t>sobre</w:t>
+      </w:r>
+      <w:proofErr w:type="spellEnd"/>
+      <w:r>
+        <w:t xml:space="preserve"> las </w:t>
+      </w:r>
+      <w:proofErr w:type="spellStart"/>
+      <w:r>
+        <w:t>recetas</w:t>
+      </w:r>
+      <w:proofErr w:type="spellEnd"/>
+      <w:r>
+        <w:t xml:space="preserve"> dentro de la </w:t>
+      </w:r>
+      <w:proofErr w:type="spellStart"/>
+      <w:r>
+        <w:t>comunidad</w:t>
+      </w:r>
+      <w:proofErr w:type="spellEnd"/>
+      <w:r>
+        <w:t xml:space="preserve"> de </w:t>
+      </w:r>
+      <w:proofErr w:type="spellStart"/>
+      <w:r>
+        <w:t>Sazón</w:t>
+      </w:r>
+      <w:proofErr w:type="spellEnd"/>
+      <w:r>
+        <w:t>.</w:t>
+      </w:r>
+    </w:p>
+    <w:p>
+      <w:pPr>
+        <w:pStyle w:val="Listaconvietas"/>
+        <w:spacing w:line="480" w:lineRule="auto"/>
+      </w:pPr>
+      <w:proofErr w:type="spellStart"/>
+      <w:r>
+        <w:t>Diseñar</w:t>
+      </w:r>
+      <w:proofErr w:type="spellEnd"/>
+      <w:r>
+        <w:t xml:space="preserve"> la </w:t>
+      </w:r>
+      <w:proofErr w:type="spellStart"/>
+      <w:r>
+        <w:t>estructura</w:t>
+      </w:r>
+      <w:proofErr w:type="spellEnd"/>
+      <w:r>
+        <w:t xml:space="preserve"> de </w:t>
+      </w:r>
+      <w:proofErr w:type="spellStart"/>
+      <w:r>
+        <w:t>datos</w:t>
+      </w:r>
+      <w:proofErr w:type="spellEnd"/>
+      <w:r>
+        <w:t xml:space="preserve"> </w:t>
+      </w:r>
+      <w:proofErr w:type="spellStart"/>
+      <w:r>
+        <w:t>necesaria</w:t>
+      </w:r>
+      <w:proofErr w:type="spellEnd"/>
+      <w:r>
+        <w:t xml:space="preserve"> para registrar </w:t>
+      </w:r>
+      <w:proofErr w:type="spellStart"/>
+      <w:r>
+        <w:t>calificaciones</w:t>
+      </w:r>
+      <w:proofErr w:type="spellEnd"/>
+      <w:r>
+        <w:t xml:space="preserve">, </w:t>
+      </w:r>
+      <w:proofErr w:type="spellStart"/>
+      <w:r>
+        <w:t>comentarios</w:t>
+      </w:r>
+      <w:proofErr w:type="spellEnd"/>
+      <w:r>
+        <w:t xml:space="preserve">, </w:t>
+      </w:r>
+      <w:proofErr w:type="spellStart"/>
+      <w:r>
+        <w:t>favoritos</w:t>
+      </w:r>
+      <w:proofErr w:type="spellEnd"/>
+      <w:r>
+        <w:t xml:space="preserve">, </w:t>
+      </w:r>
+      <w:proofErr w:type="spellStart"/>
+      <w:r>
+        <w:t>colecciones</w:t>
+      </w:r>
+      <w:proofErr w:type="spellEnd"/>
+      <w:r>
+        <w:t xml:space="preserve"> y </w:t>
+      </w:r>
+      <w:proofErr w:type="spellStart"/>
+      <w:r>
+        <w:t>reportes</w:t>
+      </w:r>
+      <w:proofErr w:type="spellEnd"/>
+      <w:r>
+        <w:t xml:space="preserve"> </w:t>
+      </w:r>
+      <w:proofErr w:type="spellStart"/>
+      <w:r>
+        <w:t>realizados</w:t>
+      </w:r>
+      <w:proofErr w:type="spellEnd"/>
+      <w:r>
+        <w:t xml:space="preserve"> por los </w:t>
+      </w:r>
+      <w:proofErr w:type="spellStart"/>
+      <w:r>
+        <w:t>usuarios</w:t>
+      </w:r>
+      <w:proofErr w:type="spellEnd"/>
+      <w:r>
+        <w:t>.</w:t>
+      </w:r>
+    </w:p>
+    <w:p>
+      <w:pPr>
+        <w:pStyle w:val="Listaconvietas"/>
+        <w:spacing w:line="480" w:lineRule="auto"/>
+      </w:pPr>
+      <w:proofErr w:type="spellStart"/>
+      <w:r>
+        <w:t>Implementar</w:t>
+      </w:r>
+      <w:proofErr w:type="spellEnd"/>
+      <w:r>
+        <w:t xml:space="preserve"> las </w:t>
+      </w:r>
+      <w:proofErr w:type="spellStart"/>
+      <w:r>
+        <w:t>relaciones</w:t>
+      </w:r>
+      <w:proofErr w:type="spellEnd"/>
+      <w:r>
+        <w:t xml:space="preserve"> entre las </w:t>
+      </w:r>
+      <w:proofErr w:type="spellStart"/>
+      <w:r>
+        <w:t>entidades</w:t>
+      </w:r>
+      <w:proofErr w:type="spellEnd"/>
+      <w:r>
+        <w:t xml:space="preserve"> que </w:t>
+      </w:r>
+      <w:proofErr w:type="spellStart"/>
+      <w:r>
+        <w:t>conforman</w:t>
+      </w:r>
+      <w:proofErr w:type="spellEnd"/>
+      <w:r>
+        <w:t xml:space="preserve"> </w:t>
+      </w:r>
+      <w:proofErr w:type="spellStart"/>
+      <w:r>
+        <w:t>el</w:t>
+      </w:r>
+      <w:proofErr w:type="spellEnd"/>
+      <w:r>
+        <w:t xml:space="preserve"> </w:t>
+      </w:r>
+      <w:proofErr w:type="spellStart"/>
+      <w:r>
+        <w:t>módulo</w:t>
+      </w:r>
+      <w:proofErr w:type="spellEnd"/>
+      <w:r>
+        <w:t xml:space="preserve"> de </w:t>
+      </w:r>
+      <w:proofErr w:type="spellStart"/>
+      <w:r>
+        <w:t>comunidad</w:t>
+      </w:r>
+      <w:proofErr w:type="spellEnd"/>
+      <w:r>
+        <w:t xml:space="preserve">, </w:t>
+      </w:r>
+      <w:proofErr w:type="spellStart"/>
+      <w:r>
+        <w:t>permitiendo</w:t>
+      </w:r>
+      <w:proofErr w:type="spellEnd"/>
+      <w:r>
+        <w:t xml:space="preserve"> </w:t>
+      </w:r>
+      <w:proofErr w:type="spellStart"/>
+      <w:r>
+        <w:t>almacenar</w:t>
+      </w:r>
+      <w:proofErr w:type="spellEnd"/>
+      <w:r>
+        <w:t xml:space="preserve"> y </w:t>
+      </w:r>
+      <w:proofErr w:type="spellStart"/>
+      <w:r>
+        <w:t>consultar</w:t>
+      </w:r>
+      <w:proofErr w:type="spellEnd"/>
+      <w:r>
+        <w:t xml:space="preserve"> la </w:t>
+      </w:r>
+      <w:proofErr w:type="spellStart"/>
+      <w:r>
+        <w:t>información</w:t>
+      </w:r>
+      <w:proofErr w:type="spellEnd"/>
+      <w:r>
+        <w:t xml:space="preserve"> </w:t>
+      </w:r>
+      <w:proofErr w:type="spellStart"/>
+      <w:r>
+        <w:t>generada</w:t>
+      </w:r>
+      <w:proofErr w:type="spellEnd"/>
+      <w:r>
+        <w:t xml:space="preserve"> por las </w:t>
+      </w:r>
+      <w:proofErr w:type="spellStart"/>
+      <w:r>
+        <w:t>interacciones</w:t>
+      </w:r>
+      <w:proofErr w:type="spellEnd"/>
+      <w:r>
+        <w:t xml:space="preserve"> de los </w:t>
+      </w:r>
+      <w:proofErr w:type="spellStart"/>
+      <w:r>
+        <w:t>usuarios</w:t>
+      </w:r>
+      <w:proofErr w:type="spellEnd"/>
+      <w:r>
+        <w:t>.</w:t>
+      </w:r>
+    </w:p>
+    <w:p>
+      <w:pPr>
+        <w:pStyle w:val="Listaconvietas"/>
+        <w:spacing w:line="480" w:lineRule="auto"/>
+      </w:pPr>
+      <w:proofErr w:type="spellStart"/>
+      <w:r>
+        <w:t>Gestionar</w:t>
+      </w:r>
+      <w:proofErr w:type="spellEnd"/>
+      <w:r>
+        <w:t xml:space="preserve"> las </w:t>
+      </w:r>
+      <w:proofErr w:type="spellStart"/>
+      <w:r>
+        <w:t>calificaciones</w:t>
+      </w:r>
+      <w:proofErr w:type="spellEnd"/>
+      <w:r>
+        <w:t xml:space="preserve"> </w:t>
+      </w:r>
+      <w:proofErr w:type="spellStart"/>
+      <w:r>
+        <w:t>realizadas</w:t>
+      </w:r>
+      <w:proofErr w:type="spellEnd"/>
+      <w:r>
+        <w:t xml:space="preserve"> </w:t>
+      </w:r>
+      <w:proofErr w:type="spellStart"/>
+      <w:r>
+        <w:t>sobre</w:t>
+      </w:r>
+      <w:proofErr w:type="spellEnd"/>
+      <w:r>
+        <w:t xml:space="preserve"> las </w:t>
+      </w:r>
+      <w:proofErr w:type="spellStart"/>
+      <w:r>
+        <w:t>recetas</w:t>
+      </w:r>
+      <w:proofErr w:type="spellEnd"/>
+      <w:r>
+        <w:t xml:space="preserve"> para registrar la </w:t>
+      </w:r>
+      <w:proofErr w:type="spellStart"/>
+      <w:r>
+        <w:t>valoración</w:t>
+      </w:r>
+      <w:proofErr w:type="spellEnd"/>
+      <w:r>
+        <w:t xml:space="preserve"> de los </w:t>
+      </w:r>
+      <w:proofErr w:type="spellStart"/>
+      <w:r>
+        <w:t>usuarios</w:t>
+      </w:r>
+      <w:proofErr w:type="spellEnd"/>
+      <w:r>
+        <w:t xml:space="preserve"> y </w:t>
+      </w:r>
+      <w:proofErr w:type="spellStart"/>
+      <w:r>
+        <w:t>contribuir</w:t>
+      </w:r>
+      <w:proofErr w:type="spellEnd"/>
+      <w:r>
+        <w:t xml:space="preserve"> a la </w:t>
+      </w:r>
+      <w:proofErr w:type="spellStart"/>
+      <w:r>
+        <w:t>organización</w:t>
+      </w:r>
+      <w:proofErr w:type="spellEnd"/>
+      <w:r>
+        <w:t xml:space="preserve"> de la </w:t>
+      </w:r>
+      <w:proofErr w:type="spellStart"/>
+      <w:r>
+        <w:t>información</w:t>
+      </w:r>
+      <w:proofErr w:type="spellEnd"/>
+      <w:r>
+        <w:t xml:space="preserve"> del </w:t>
+      </w:r>
+      <w:proofErr w:type="spellStart"/>
+      <w:r>
+        <w:t>recetario</w:t>
+      </w:r>
+      <w:proofErr w:type="spellEnd"/>
+      <w:r>
+        <w:t>.</w:t>
+      </w:r>
+    </w:p>
+    <w:p>
+      <w:pPr>
+        <w:pStyle w:val="Listaconvietas"/>
+        <w:spacing w:line="480" w:lineRule="auto"/>
+      </w:pPr>
+      <w:r>
+        <w:t xml:space="preserve">Registrar los </w:t>
+      </w:r>
+      <w:proofErr w:type="spellStart"/>
+      <w:r>
+        <w:t>comentarios</w:t>
+      </w:r>
+      <w:proofErr w:type="spellEnd"/>
+      <w:r>
+        <w:t xml:space="preserve"> </w:t>
+      </w:r>
+      <w:proofErr w:type="spellStart"/>
+      <w:r>
+        <w:t>realizados</w:t>
+      </w:r>
+      <w:proofErr w:type="spellEnd"/>
+      <w:r>
+        <w:t xml:space="preserve"> por los </w:t>
+      </w:r>
+      <w:proofErr w:type="spellStart"/>
+      <w:r>
+        <w:t>usuarios</w:t>
+      </w:r>
+      <w:proofErr w:type="spellEnd"/>
+      <w:r>
+        <w:t xml:space="preserve"> </w:t>
+      </w:r>
+      <w:proofErr w:type="spellStart"/>
+      <w:r>
+        <w:t>sobre</w:t>
+      </w:r>
+      <w:proofErr w:type="spellEnd"/>
+      <w:r>
+        <w:t xml:space="preserve"> las </w:t>
+      </w:r>
+      <w:proofErr w:type="spellStart"/>
+      <w:r>
+        <w:t>recetas</w:t>
+      </w:r>
+      <w:proofErr w:type="spellEnd"/>
+      <w:r>
+        <w:t xml:space="preserve">, </w:t>
+      </w:r>
+      <w:proofErr w:type="spellStart"/>
+      <w:r>
+        <w:t>conservando</w:t>
+      </w:r>
+      <w:proofErr w:type="spellEnd"/>
+      <w:r>
+        <w:t xml:space="preserve"> </w:t>
+      </w:r>
+      <w:proofErr w:type="spellStart"/>
+      <w:r>
+        <w:t>información</w:t>
+      </w:r>
+      <w:proofErr w:type="spellEnd"/>
+      <w:r>
+        <w:t xml:space="preserve"> </w:t>
+      </w:r>
+      <w:proofErr w:type="spellStart"/>
+      <w:r>
+        <w:t>relacionada</w:t>
+      </w:r>
+      <w:proofErr w:type="spellEnd"/>
+      <w:r>
+        <w:t xml:space="preserve"> con </w:t>
+      </w:r>
+      <w:proofErr w:type="spellStart"/>
+      <w:r>
+        <w:t>su</w:t>
+      </w:r>
+      <w:proofErr w:type="spellEnd"/>
+      <w:r>
+        <w:t xml:space="preserve"> </w:t>
+      </w:r>
+      <w:proofErr w:type="spellStart"/>
+      <w:r>
+        <w:t>autor</w:t>
+      </w:r>
+      <w:proofErr w:type="spellEnd"/>
+      <w:r>
+        <w:t xml:space="preserve">, </w:t>
+      </w:r>
+      <w:proofErr w:type="spellStart"/>
+      <w:r>
+        <w:t>fecha</w:t>
+      </w:r>
+      <w:proofErr w:type="spellEnd"/>
+      <w:r>
+        <w:t xml:space="preserve"> y </w:t>
+      </w:r>
+      <w:proofErr w:type="spellStart"/>
+      <w:r>
+        <w:t>contenido</w:t>
+      </w:r>
+      <w:proofErr w:type="spellEnd"/>
+      <w:r>
+        <w:t>.</w:t>
+      </w:r>
+    </w:p>
+    <w:p>
+      <w:pPr>
+        <w:pStyle w:val="Listaconvietas"/>
+        <w:spacing w:line="480" w:lineRule="auto"/>
+      </w:pPr>
+      <w:proofErr w:type="spellStart"/>
+      <w:r>
+        <w:t>Organizar</w:t>
+      </w:r>
+      <w:proofErr w:type="spellEnd"/>
+      <w:r>
+        <w:t xml:space="preserve"> las </w:t>
+      </w:r>
+      <w:proofErr w:type="spellStart"/>
+      <w:r>
+        <w:t>recetas</w:t>
+      </w:r>
+      <w:proofErr w:type="spellEnd"/>
+      <w:r>
+        <w:t xml:space="preserve"> </w:t>
+      </w:r>
+      <w:proofErr w:type="spellStart"/>
+      <w:r>
+        <w:t>favoritas</w:t>
+      </w:r>
+      <w:proofErr w:type="spellEnd"/>
+      <w:r>
+        <w:t xml:space="preserve"> de los </w:t>
+      </w:r>
+      <w:proofErr w:type="spellStart"/>
+      <w:r>
+        <w:t>usuarios</w:t>
+      </w:r>
+      <w:proofErr w:type="spellEnd"/>
+      <w:r>
+        <w:t xml:space="preserve"> </w:t>
+      </w:r>
+      <w:proofErr w:type="spellStart"/>
+      <w:r>
+        <w:t>mediante</w:t>
+      </w:r>
+      <w:proofErr w:type="spellEnd"/>
+      <w:r>
+        <w:t xml:space="preserve"> </w:t>
+      </w:r>
+      <w:proofErr w:type="spellStart"/>
+      <w:r>
+        <w:t>colecciones</w:t>
+      </w:r>
+      <w:proofErr w:type="spellEnd"/>
+      <w:r>
+        <w:t xml:space="preserve"> que </w:t>
+      </w:r>
+      <w:proofErr w:type="spellStart"/>
+      <w:r>
+        <w:t>permitan</w:t>
+      </w:r>
+      <w:proofErr w:type="spellEnd"/>
+      <w:r>
+        <w:t xml:space="preserve"> </w:t>
+      </w:r>
+      <w:proofErr w:type="spellStart"/>
+      <w:r>
+        <w:t>agrupar</w:t>
+      </w:r>
+      <w:proofErr w:type="spellEnd"/>
+      <w:r>
+        <w:t xml:space="preserve"> y </w:t>
+      </w:r>
+      <w:proofErr w:type="spellStart"/>
+      <w:r>
+        <w:t>administrar</w:t>
+      </w:r>
+      <w:proofErr w:type="spellEnd"/>
+      <w:r>
+        <w:t xml:space="preserve"> </w:t>
+      </w:r>
+      <w:proofErr w:type="spellStart"/>
+      <w:r>
+        <w:t>diferentes</w:t>
+      </w:r>
+      <w:proofErr w:type="spellEnd"/>
+      <w:r>
+        <w:t xml:space="preserve"> </w:t>
+      </w:r>
+      <w:proofErr w:type="spellStart"/>
+      <w:r>
+        <w:t>recetas</w:t>
+      </w:r>
+      <w:proofErr w:type="spellEnd"/>
+      <w:r>
+        <w:t>.</w:t>
+      </w:r>
+    </w:p>
+    <w:p>
+      <w:pPr>
+        <w:pStyle w:val="Listaconvietas"/>
+        <w:spacing w:line="480" w:lineRule="auto"/>
+      </w:pPr>
+      <w:proofErr w:type="spellStart"/>
+      <w:r>
+        <w:t>Gestionar</w:t>
+      </w:r>
+      <w:proofErr w:type="spellEnd"/>
+      <w:r>
+        <w:t xml:space="preserve"> los </w:t>
+      </w:r>
+      <w:proofErr w:type="spellStart"/>
+      <w:r>
+        <w:t>reportes</w:t>
+      </w:r>
+      <w:proofErr w:type="spellEnd"/>
+      <w:r>
+        <w:t xml:space="preserve"> </w:t>
+      </w:r>
+      <w:proofErr w:type="spellStart"/>
+      <w:r>
+        <w:t>realizados</w:t>
+      </w:r>
+      <w:proofErr w:type="spellEnd"/>
+      <w:r>
+        <w:t xml:space="preserve"> por los </w:t>
+      </w:r>
+      <w:proofErr w:type="spellStart"/>
+      <w:r>
+        <w:t>usuarios</w:t>
+      </w:r>
+      <w:proofErr w:type="spellEnd"/>
+      <w:r>
+        <w:t xml:space="preserve"> </w:t>
+      </w:r>
+      <w:proofErr w:type="spellStart"/>
+      <w:r>
+        <w:t>sobre</w:t>
+      </w:r>
+      <w:proofErr w:type="spellEnd"/>
+      <w:r>
+        <w:t xml:space="preserve"> </w:t>
+      </w:r>
+      <w:proofErr w:type="spellStart"/>
+      <w:r>
+        <w:t>contenido</w:t>
+      </w:r>
+      <w:proofErr w:type="spellEnd"/>
+      <w:r>
+        <w:t xml:space="preserve"> que </w:t>
+      </w:r>
+      <w:proofErr w:type="spellStart"/>
+      <w:r>
+        <w:t>pueda</w:t>
+      </w:r>
+      <w:proofErr w:type="spellEnd"/>
+      <w:r>
+        <w:t xml:space="preserve"> </w:t>
+      </w:r>
+      <w:proofErr w:type="spellStart"/>
+      <w:r>
+        <w:t>afectar</w:t>
+      </w:r>
+      <w:proofErr w:type="spellEnd"/>
+      <w:r>
+        <w:t xml:space="preserve"> la </w:t>
+      </w:r>
+      <w:proofErr w:type="spellStart"/>
+      <w:r>
+        <w:t>calidad</w:t>
+      </w:r>
+      <w:proofErr w:type="spellEnd"/>
+      <w:r>
+        <w:t xml:space="preserve"> o </w:t>
+      </w:r>
+      <w:proofErr w:type="spellStart"/>
+      <w:r>
+        <w:t>convivencia</w:t>
+      </w:r>
+      <w:proofErr w:type="spellEnd"/>
+      <w:r>
+        <w:t xml:space="preserve"> de la </w:t>
+      </w:r>
+      <w:proofErr w:type="spellStart"/>
+      <w:r>
+        <w:t>comunidad</w:t>
+      </w:r>
+      <w:proofErr w:type="spellEnd"/>
+      <w:r>
+        <w:t>.</w:t>
+      </w:r>
     </w:p>
     <w:p>
       <w:pPr>
@@ -2082,72 +2644,6 @@
         <w:rPr>
           <w:rFonts w:ascii="Times New Roman" w:hAnsi="Times New Roman" w:cs="Times New Roman"/>
         </w:rPr>
-        <w:t>Implementar un módulo de agendamiento en línea que permita a los clientes reservar, modificar o cancelar sus citas en tiempo real, basándose en la disponibilidad de cada barbero.</w:t>
-      </w:r>
-    </w:p>
-    <w:p>
-      <w:pPr>
-        <w:pStyle w:val="Prrafodelista"/>
-        <w:numPr>
-          <w:ilvl w:val="0"/>
-          <w:numId w:val="4"/>
-        </w:numPr>
-        <w:spacing w:line="480" w:lineRule="auto"/>
-        <w:ind w:left="1077" w:hanging="357"/>
-        <w:rPr>
-          <w:rFonts w:ascii="Times New Roman" w:hAnsi="Times New Roman" w:cs="Times New Roman"/>
-        </w:rPr>
-      </w:pPr>
-      <w:r>
-        <w:rPr>
-          <w:rFonts w:ascii="Times New Roman" w:hAnsi="Times New Roman" w:cs="Times New Roman"/>
-        </w:rPr>
-        <w:t>Crear un sistema de perfiles para registrar el historial de los clientes, incluyendo sus cortes frecuentes, preferencias y datos de contacto, facilitando un servicio más personalizado.</w:t>
-      </w:r>
-    </w:p>
-    <w:p>
-      <w:pPr>
-        <w:pStyle w:val="Prrafodelista"/>
-        <w:numPr>
-          <w:ilvl w:val="0"/>
-          <w:numId w:val="4"/>
-        </w:numPr>
-        <w:spacing w:line="480" w:lineRule="auto"/>
-        <w:ind w:left="1077" w:hanging="357"/>
-        <w:rPr>
-          <w:rFonts w:ascii="Times New Roman" w:hAnsi="Times New Roman" w:cs="Times New Roman"/>
-        </w:rPr>
-      </w:pPr>
-      <w:r>
-        <w:rPr>
-          <w:rFonts w:ascii="Times New Roman" w:hAnsi="Times New Roman" w:cs="Times New Roman"/>
-        </w:rPr>
-        <w:t>Desarrollar un panel de administración interno para que los barberos puedan gestionar sus horarios, visualizar las citas del día y registrar los servicios que ya completaron.</w:t>
-      </w:r>
-    </w:p>
-    <w:p>
-      <w:pPr>
-        <w:pStyle w:val="Prrafodelista"/>
-        <w:numPr>
-          <w:ilvl w:val="0"/>
-          <w:numId w:val="4"/>
-        </w:numPr>
-        <w:spacing w:line="480" w:lineRule="auto"/>
-        <w:ind w:left="1077" w:hanging="357"/>
-        <w:rPr>
-          <w:rFonts w:ascii="Times New Roman" w:hAnsi="Times New Roman" w:cs="Times New Roman"/>
-        </w:rPr>
-      </w:pPr>
-      <w:r>
-        <w:rPr>
-          <w:rFonts w:ascii="Times New Roman" w:hAnsi="Times New Roman" w:cs="Times New Roman"/>
-        </w:rPr>
-        <w:t>Integrar un sistema de notificaciones automáticas que envíe recordatorios a los clientes antes de sus citas programadas, para reducir los tiempos muertos y las inasistencias.</w:t>
-      </w:r>
-      <w:r>
-        <w:rPr>
-          <w:rFonts w:ascii="Times New Roman" w:hAnsi="Times New Roman" w:cs="Times New Roman"/>
-        </w:rPr>
         <w:br w:type="page"/>
       </w:r>
     </w:p>
@@ -2159,7 +2655,7 @@
           <w:szCs w:val="24"/>
         </w:rPr>
       </w:pPr>
-      <w:bookmarkStart w:id="6" w:name="_Toc241702560"/>
+      <w:bookmarkStart w:id="3" w:name="_Toc241702560"/>
       <w:r>
         <w:rPr>
           <w:rFonts w:cs="Times New Roman"/>
@@ -2168,14 +2664,7 @@
         <w:lastRenderedPageBreak/>
         <w:t>Planteamiento del problema</w:t>
       </w:r>
-      <w:bookmarkEnd w:id="6"/>
-    </w:p>
-    <w:p>
-      <w:pPr>
-        <w:rPr>
-          <w:rFonts w:ascii="Times New Roman" w:hAnsi="Times New Roman" w:cs="Times New Roman"/>
-        </w:rPr>
-      </w:pPr>
+      <w:bookmarkEnd w:id="3"/>
     </w:p>
     <w:p>
       <w:pPr>
@@ -2197,13 +2686,19 @@
         <w:ind w:firstLine="720"/>
         <w:rPr>
           <w:rFonts w:ascii="Times New Roman" w:hAnsi="Times New Roman" w:cs="Times New Roman"/>
-        </w:rPr>
-      </w:pPr>
-      <w:r>
-        <w:rPr>
-          <w:rFonts w:ascii="Times New Roman" w:hAnsi="Times New Roman" w:cs="Times New Roman"/>
-        </w:rPr>
-        <w:t>Actualmente, la barbería gestiona sus citas de manera manual mediante mensajes y llamadas, lo que genera cruces de horarios, interrupciones constantes durante el servicio y un alto índice de inasistencias al no tener un seguimiento adecuado. Al analizar este flujo de trabajo diario, identificamos que la dependencia de la comunicación manual para agendar es el principal cuello de botella operativo y quita tiempo valioso. Para solucionar esto, desarrollaremos una aplicación de gestión centralizada que traslade esta carga a un sistema automatizado, permitiendo a los clientes reservar su propio espacio según la disponibilidad en tiempo real y recibir recordatorios automáticos, mientras los barberos cuentan con un panel administrativo que organiza sus horarios y el historial de cada cliente, eliminando por completo el uso de agendas físicas y chats desorganizados.</w:t>
+          <w:b/>
+          <w:bCs/>
+          <w:lang w:val="es-MX"/>
+        </w:rPr>
+      </w:pPr>
+      <w:r>
+        <w:rPr>
+          <w:rFonts w:ascii="Times New Roman" w:hAnsi="Times New Roman" w:cs="Times New Roman"/>
+          <w:b/>
+          <w:bCs/>
+          <w:lang w:val="es-MX"/>
+        </w:rPr>
+        <w:t>1. Necesidad</w:t>
       </w:r>
     </w:p>
     <w:p>
@@ -2212,6 +2707,148 @@
         <w:ind w:firstLine="720"/>
         <w:rPr>
           <w:rFonts w:ascii="Times New Roman" w:hAnsi="Times New Roman" w:cs="Times New Roman"/>
+          <w:lang w:val="es-MX"/>
+        </w:rPr>
+      </w:pPr>
+      <w:r>
+        <w:rPr>
+          <w:rFonts w:ascii="Times New Roman" w:hAnsi="Times New Roman" w:cs="Times New Roman"/>
+          <w:lang w:val="es-MX"/>
+        </w:rPr>
+        <w:t>Dentro de una plataforma gastronómica moderna, la simple consulta de ingredientes y pasos resulta insuficiente para generar fidelización. Los usuarios requieren conocer la experiencia real de otras personas al preparar un platillo (tiempo real empleado, posibles sustituciones de ingredientes y nivel de dificultad percibido). Sin un módulo de comunidad y valoraciones, la plataforma carece de "prueba social", lo que disminuye la confianza del usuario al momento de seleccionar una receta.</w:t>
+      </w:r>
+    </w:p>
+    <w:p>
+      <w:pPr>
+        <w:spacing w:line="480" w:lineRule="auto"/>
+        <w:ind w:firstLine="720"/>
+        <w:rPr>
+          <w:rFonts w:ascii="Times New Roman" w:hAnsi="Times New Roman" w:cs="Times New Roman"/>
+          <w:b/>
+          <w:bCs/>
+          <w:lang w:val="es-MX"/>
+        </w:rPr>
+      </w:pPr>
+      <w:r>
+        <w:rPr>
+          <w:rFonts w:ascii="Times New Roman" w:hAnsi="Times New Roman" w:cs="Times New Roman"/>
+          <w:b/>
+          <w:bCs/>
+          <w:lang w:val="es-MX"/>
+        </w:rPr>
+        <w:t>2. Manejo Actual</w:t>
+      </w:r>
+    </w:p>
+    <w:p>
+      <w:pPr>
+        <w:spacing w:line="480" w:lineRule="auto"/>
+        <w:ind w:firstLine="720"/>
+        <w:rPr>
+          <w:rFonts w:ascii="Times New Roman" w:hAnsi="Times New Roman" w:cs="Times New Roman"/>
+          <w:lang w:val="es-MX"/>
+        </w:rPr>
+      </w:pPr>
+      <w:r>
+        <w:rPr>
+          <w:rFonts w:ascii="Times New Roman" w:hAnsi="Times New Roman" w:cs="Times New Roman"/>
+          <w:lang w:val="es-MX"/>
+        </w:rPr>
+        <w:t xml:space="preserve">En la versión base de </w:t>
+      </w:r>
+      <w:r>
+        <w:rPr>
+          <w:rFonts w:ascii="Times New Roman" w:hAnsi="Times New Roman" w:cs="Times New Roman"/>
+          <w:b/>
+          <w:bCs/>
+          <w:lang w:val="es-MX"/>
+        </w:rPr>
+        <w:t>Sazón</w:t>
+      </w:r>
+      <w:r>
+        <w:rPr>
+          <w:rFonts w:ascii="Times New Roman" w:hAnsi="Times New Roman" w:cs="Times New Roman"/>
+          <w:lang w:val="es-MX"/>
+        </w:rPr>
+        <w:t xml:space="preserve"> (y en blogs culinarios estáticos), el contenido fluye en una sola dirección: de la plataforma hacia el lector. Los usuarios consumen la </w:t>
+      </w:r>
+      <w:proofErr w:type="gramStart"/>
+      <w:r>
+        <w:rPr>
+          <w:rFonts w:ascii="Times New Roman" w:hAnsi="Times New Roman" w:cs="Times New Roman"/>
+          <w:lang w:val="es-MX"/>
+        </w:rPr>
+        <w:t>receta</w:t>
+      </w:r>
+      <w:proofErr w:type="gramEnd"/>
+      <w:r>
+        <w:rPr>
+          <w:rFonts w:ascii="Times New Roman" w:hAnsi="Times New Roman" w:cs="Times New Roman"/>
+          <w:lang w:val="es-MX"/>
+        </w:rPr>
+        <w:t xml:space="preserve"> pero no tienen un canal para calificar su precisión, sugerir mejoras, subir evidencias fotográficas o consultar opiniones de otros cocineros antes de preparar el alimento.</w:t>
+      </w:r>
+    </w:p>
+    <w:p>
+      <w:pPr>
+        <w:spacing w:line="480" w:lineRule="auto"/>
+        <w:ind w:firstLine="720"/>
+        <w:rPr>
+          <w:rFonts w:ascii="Times New Roman" w:hAnsi="Times New Roman" w:cs="Times New Roman"/>
+          <w:b/>
+          <w:bCs/>
+          <w:lang w:val="es-MX"/>
+        </w:rPr>
+      </w:pPr>
+      <w:r>
+        <w:rPr>
+          <w:rFonts w:ascii="Times New Roman" w:hAnsi="Times New Roman" w:cs="Times New Roman"/>
+          <w:b/>
+          <w:bCs/>
+          <w:lang w:val="es-MX"/>
+        </w:rPr>
+        <w:t>3. Solución Propuesta (Célula 6)</w:t>
+      </w:r>
+    </w:p>
+    <w:p>
+      <w:pPr>
+        <w:spacing w:line="480" w:lineRule="auto"/>
+        <w:ind w:firstLine="720"/>
+        <w:rPr>
+          <w:rFonts w:ascii="Times New Roman" w:hAnsi="Times New Roman" w:cs="Times New Roman"/>
+          <w:lang w:val="es-MX"/>
+        </w:rPr>
+      </w:pPr>
+      <w:r>
+        <w:rPr>
+          <w:rFonts w:ascii="Times New Roman" w:hAnsi="Times New Roman" w:cs="Times New Roman"/>
+          <w:lang w:val="es-MX"/>
+        </w:rPr>
+        <w:t xml:space="preserve">La Célula 6 implementará un </w:t>
+      </w:r>
+      <w:r>
+        <w:rPr>
+          <w:rFonts w:ascii="Times New Roman" w:hAnsi="Times New Roman" w:cs="Times New Roman"/>
+          <w:b/>
+          <w:bCs/>
+          <w:lang w:val="es-MX"/>
+        </w:rPr>
+        <w:t>Módulo de Comunidad y Valoraciones</w:t>
+      </w:r>
+      <w:r>
+        <w:rPr>
+          <w:rFonts w:ascii="Times New Roman" w:hAnsi="Times New Roman" w:cs="Times New Roman"/>
+          <w:lang w:val="es-MX"/>
+        </w:rPr>
+        <w:t xml:space="preserve"> integrado de forma transparente en la plataforma. Esta solución permitirá a los usuarios registrados calificar las recetas mediante una escala de 1 a 5 estrellas, redactar reseñas con comentarios constructivos, responder a las opiniones de otros miembros y visualizar estadísticas agregadas (promedios de valoración y número de reseñas) en cada ficha de receta, fomentando un ecosistema culinario participativo.</w:t>
+      </w:r>
+    </w:p>
+    <w:p>
+      <w:pPr>
+        <w:spacing w:line="480" w:lineRule="auto"/>
+        <w:ind w:firstLine="720"/>
+        <w:rPr>
+          <w:rFonts w:ascii="Times New Roman" w:hAnsi="Times New Roman" w:cs="Times New Roman"/>
+          <w:lang w:val="es-MX"/>
         </w:rPr>
       </w:pPr>
     </w:p>
@@ -2225,7 +2862,7 @@
           <w:szCs w:val="24"/>
         </w:rPr>
       </w:pPr>
-      <w:bookmarkStart w:id="7" w:name="_Toc241140091"/>
+      <w:bookmarkStart w:id="4" w:name="_Toc241140091"/>
       <w:r>
         <w:rPr>
           <w:rFonts w:ascii="Times New Roman" w:hAnsi="Times New Roman" w:cs="Times New Roman"/>
@@ -2283,7 +2920,7 @@
         </w:rPr>
         <w:t xml:space="preserve"> - Comparativa</w:t>
       </w:r>
-      <w:bookmarkEnd w:id="7"/>
+      <w:bookmarkEnd w:id="4"/>
     </w:p>
     <w:tbl>
       <w:tblPr>
@@ -2451,7 +3088,7 @@
           <w:szCs w:val="24"/>
         </w:rPr>
       </w:pPr>
-      <w:bookmarkStart w:id="8" w:name="_Toc241702561"/>
+      <w:bookmarkStart w:id="5" w:name="_Toc241702561"/>
       <w:r>
         <w:rPr>
           <w:rFonts w:cs="Times New Roman"/>
@@ -2460,7 +3097,7 @@
         <w:lastRenderedPageBreak/>
         <w:t>Stack tecnológico</w:t>
       </w:r>
-      <w:bookmarkEnd w:id="8"/>
+      <w:bookmarkEnd w:id="5"/>
     </w:p>
     <w:p>
       <w:pPr>
@@ -2488,49 +3125,7 @@
         <w:rPr>
           <w:rFonts w:ascii="Times New Roman" w:hAnsi="Times New Roman" w:cs="Times New Roman"/>
         </w:rPr>
-        <w:t xml:space="preserve">El desarrollo de la plataforma se estructurará dividiendo la interfaz visual y la lógica interna mediante un </w:t>
-      </w:r>
-      <w:proofErr w:type="spellStart"/>
-      <w:r>
-        <w:rPr>
-          <w:rFonts w:ascii="Times New Roman" w:hAnsi="Times New Roman" w:cs="Times New Roman"/>
-        </w:rPr>
-        <w:t>stack</w:t>
-      </w:r>
-      <w:proofErr w:type="spellEnd"/>
-      <w:r>
-        <w:rPr>
-          <w:rFonts w:ascii="Times New Roman" w:hAnsi="Times New Roman" w:cs="Times New Roman"/>
-        </w:rPr>
-        <w:t xml:space="preserve"> tecnológico claro. En el lado del cliente, se utilizará HTML para construir la estructura de las pantallas, CSS para darle un diseño visual moderno y JavaScript para programar la interactividad y dinamismo de la interfaz. Para agilizar la experiencia de navegación, se hará uso de </w:t>
-      </w:r>
-      <w:proofErr w:type="spellStart"/>
-      <w:r>
-        <w:rPr>
-          <w:rFonts w:ascii="Times New Roman" w:hAnsi="Times New Roman" w:cs="Times New Roman"/>
-        </w:rPr>
-        <w:t>localStorage</w:t>
-      </w:r>
-      <w:proofErr w:type="spellEnd"/>
-      <w:r>
-        <w:rPr>
-          <w:rFonts w:ascii="Times New Roman" w:hAnsi="Times New Roman" w:cs="Times New Roman"/>
-        </w:rPr>
-        <w:t>, lo que permite una persistencia de datos temporal directamente en el dispositivo del usuario, ideal para mantener sesiones activas o guardar preferencias rápidas sin saturar el servidor. Por otro lado, el núcleo del sistema (</w:t>
-      </w:r>
-      <w:proofErr w:type="spellStart"/>
-      <w:r>
-        <w:rPr>
-          <w:rFonts w:ascii="Times New Roman" w:hAnsi="Times New Roman" w:cs="Times New Roman"/>
-        </w:rPr>
-        <w:t>backend</w:t>
-      </w:r>
-      <w:proofErr w:type="spellEnd"/>
-      <w:r>
-        <w:rPr>
-          <w:rFonts w:ascii="Times New Roman" w:hAnsi="Times New Roman" w:cs="Times New Roman"/>
-        </w:rPr>
-        <w:t>) estará desarrollado en Java, encargado de procesar las reglas de negocio, gestionar la seguridad y coordinar las peticiones. Finalmente, para garantizar una persistencia de datos permanente, estructurada y segura a largo plazo —como la información de los clientes, las citas programadas y el historial de servicios—, todo el sistema estará respaldado por una base de datos relacional gestionada mediante SQL.</w:t>
+        <w:t>El desarrollo de la plataforma se estructurará dividiendo la interfaz visual y la lógica interna mediante un stack tecnológico claro. En el lado del cliente, se utilizará HTML para construir la estructura de las pantallas, CSS para darle un diseño visual moderno y JavaScript para programar la interactividad y dinamismo de la interfaz. Para agilizar la experiencia de navegación, se hará uso de localStorage, lo que permite una persistencia de datos temporal directamente en el dispositivo del usuario, ideal para mantener sesiones activas o guardar preferencias rápidas sin saturar el servidor. Por otro lado, el núcleo del sistema (backend) estará desarrollado en Java, encargado de procesar las reglas de negocio, gestionar la seguridad y coordinar las peticiones. Finalmente, para garantizar una persistencia de datos permanente, estructurada y segura a largo plazo —como la información de los clientes, las citas programadas y el historial de servicios—, todo el sistema estará respaldado por una base de datos relacional gestionada mediante SQL.</w:t>
       </w:r>
     </w:p>
     <w:p>
@@ -2618,7 +3213,7 @@
           <w:szCs w:val="24"/>
         </w:rPr>
       </w:pPr>
-      <w:bookmarkStart w:id="9" w:name="_Toc241140366"/>
+      <w:bookmarkStart w:id="6" w:name="_Toc241140366"/>
       <w:r>
         <w:rPr>
           <w:rFonts w:ascii="Times New Roman" w:hAnsi="Times New Roman" w:cs="Times New Roman"/>
@@ -2685,7 +3280,7 @@
         </w:rPr>
         <w:t>tecnológico</w:t>
       </w:r>
-      <w:bookmarkEnd w:id="9"/>
+      <w:bookmarkEnd w:id="6"/>
       <w:r>
         <w:rPr>
           <w:rFonts w:ascii="Times New Roman" w:hAnsi="Times New Roman" w:cs="Times New Roman"/>
@@ -2698,416 +3293,1813 @@
     <w:p>
       <w:pPr>
         <w:pStyle w:val="Ttulo1"/>
+        <w:spacing w:line="480" w:lineRule="auto"/>
         <w:rPr>
           <w:rFonts w:cs="Times New Roman"/>
           <w:szCs w:val="24"/>
         </w:rPr>
       </w:pPr>
-      <w:bookmarkStart w:id="10" w:name="_Toc241702562"/>
       <w:r>
         <w:rPr>
           <w:rFonts w:cs="Times New Roman"/>
           <w:szCs w:val="24"/>
         </w:rPr>
         <w:lastRenderedPageBreak/>
-        <w:t>Alcance</w:t>
-      </w:r>
-      <w:bookmarkEnd w:id="10"/>
-    </w:p>
-    <w:p>
-      <w:pPr>
-        <w:rPr>
-          <w:rFonts w:ascii="Times New Roman" w:hAnsi="Times New Roman" w:cs="Times New Roman"/>
-        </w:rPr>
-      </w:pPr>
-    </w:p>
-    <w:p>
-      <w:pPr>
-        <w:rPr>
-          <w:rFonts w:ascii="Times New Roman" w:hAnsi="Times New Roman" w:cs="Times New Roman"/>
-        </w:rPr>
-      </w:pPr>
-    </w:p>
-    <w:p>
-      <w:pPr>
-        <w:rPr>
-          <w:rFonts w:ascii="Times New Roman" w:hAnsi="Times New Roman" w:cs="Times New Roman"/>
-        </w:rPr>
-      </w:pPr>
+        <w:t>2. Alcance</w:t>
+      </w:r>
     </w:p>
     <w:p>
       <w:pPr>
         <w:spacing w:line="480" w:lineRule="auto"/>
-        <w:ind w:firstLine="720"/>
-        <w:rPr>
-          <w:rFonts w:ascii="Times New Roman" w:hAnsi="Times New Roman" w:cs="Times New Roman"/>
-        </w:rPr>
-      </w:pPr>
-      <w:r>
-        <w:rPr>
-          <w:rFonts w:ascii="Times New Roman" w:hAnsi="Times New Roman" w:cs="Times New Roman"/>
-        </w:rPr>
-        <w:t>El desarrollo de la aplicación se enfocará exclusivamente en solucionar la gestión de citas, la organización del tiempo de los barberos y el registro de clientes. A nivel funcional, el sistema abarca los siguientes módulos:</w:t>
-      </w:r>
-    </w:p>
-    <w:p>
-      <w:pPr>
-        <w:rPr>
-          <w:rFonts w:ascii="Times New Roman" w:hAnsi="Times New Roman" w:cs="Times New Roman"/>
-        </w:rPr>
-      </w:pPr>
+        <w:rPr>
+          <w:rFonts w:ascii="Times New Roman" w:hAnsi="Times New Roman" w:cs="Times New Roman"/>
+        </w:rPr>
+      </w:pPr>
+      <w:r>
+        <w:rPr>
+          <w:rFonts w:ascii="Times New Roman" w:hAnsi="Times New Roman" w:cs="Times New Roman"/>
+        </w:rPr>
+        <w:t>El desarrollo del módulo de comunidad de Sazón comprende las funcionalidades y estructuras necesarias para gestionar las interacciones sociales de los usuarios con las recetas.</w:t>
+      </w:r>
     </w:p>
     <w:p>
       <w:pPr>
         <w:pStyle w:val="Ttulo2"/>
+        <w:spacing w:line="480" w:lineRule="auto"/>
         <w:rPr>
           <w:rFonts w:cs="Times New Roman"/>
           <w:szCs w:val="24"/>
         </w:rPr>
       </w:pPr>
-      <w:bookmarkStart w:id="11" w:name="_Toc241702563"/>
       <w:r>
         <w:rPr>
           <w:rFonts w:cs="Times New Roman"/>
           <w:szCs w:val="24"/>
         </w:rPr>
-        <w:t>Inclusiones</w:t>
-      </w:r>
-      <w:bookmarkEnd w:id="11"/>
-    </w:p>
-    <w:p>
-      <w:pPr>
+        <w:t>2.1 Inclusiones</w:t>
+      </w:r>
+    </w:p>
+    <w:p>
+      <w:pPr>
+        <w:pStyle w:val="Listaconvietas"/>
         <w:spacing w:line="480" w:lineRule="auto"/>
         <w:rPr>
           <w:rFonts w:ascii="Times New Roman" w:hAnsi="Times New Roman" w:cs="Times New Roman"/>
-        </w:rPr>
-      </w:pPr>
-      <w:r>
-        <w:rPr>
-          <w:rFonts w:ascii="Times New Roman" w:hAnsi="Times New Roman" w:cs="Times New Roman"/>
-          <w:b/>
-          <w:bCs/>
-        </w:rPr>
-        <w:t>1. Módulo de Clientes:</w:t>
-      </w:r>
-    </w:p>
-    <w:p>
-      <w:pPr>
-        <w:numPr>
-          <w:ilvl w:val="0"/>
-          <w:numId w:val="5"/>
-        </w:numPr>
+          <w:sz w:val="24"/>
+          <w:szCs w:val="24"/>
+        </w:rPr>
+      </w:pPr>
+      <w:proofErr w:type="spellStart"/>
+      <w:r>
+        <w:rPr>
+          <w:rFonts w:ascii="Times New Roman" w:hAnsi="Times New Roman" w:cs="Times New Roman"/>
+          <w:sz w:val="24"/>
+          <w:szCs w:val="24"/>
+        </w:rPr>
+        <w:t>Registro</w:t>
+      </w:r>
+      <w:proofErr w:type="spellEnd"/>
+      <w:r>
+        <w:rPr>
+          <w:rFonts w:ascii="Times New Roman" w:hAnsi="Times New Roman" w:cs="Times New Roman"/>
+          <w:sz w:val="24"/>
+          <w:szCs w:val="24"/>
+        </w:rPr>
+        <w:t xml:space="preserve"> y </w:t>
+      </w:r>
+      <w:proofErr w:type="spellStart"/>
+      <w:r>
+        <w:rPr>
+          <w:rFonts w:ascii="Times New Roman" w:hAnsi="Times New Roman" w:cs="Times New Roman"/>
+          <w:sz w:val="24"/>
+          <w:szCs w:val="24"/>
+        </w:rPr>
+        <w:t>gestión</w:t>
+      </w:r>
+      <w:proofErr w:type="spellEnd"/>
+      <w:r>
+        <w:rPr>
+          <w:rFonts w:ascii="Times New Roman" w:hAnsi="Times New Roman" w:cs="Times New Roman"/>
+          <w:sz w:val="24"/>
+          <w:szCs w:val="24"/>
+        </w:rPr>
+        <w:t xml:space="preserve"> de las </w:t>
+      </w:r>
+      <w:proofErr w:type="spellStart"/>
+      <w:r>
+        <w:rPr>
+          <w:rFonts w:ascii="Times New Roman" w:hAnsi="Times New Roman" w:cs="Times New Roman"/>
+          <w:sz w:val="24"/>
+          <w:szCs w:val="24"/>
+        </w:rPr>
+        <w:t>calificaciones</w:t>
+      </w:r>
+      <w:proofErr w:type="spellEnd"/>
+      <w:r>
+        <w:rPr>
+          <w:rFonts w:ascii="Times New Roman" w:hAnsi="Times New Roman" w:cs="Times New Roman"/>
+          <w:sz w:val="24"/>
+          <w:szCs w:val="24"/>
+        </w:rPr>
+        <w:t xml:space="preserve"> </w:t>
+      </w:r>
+      <w:proofErr w:type="spellStart"/>
+      <w:r>
+        <w:rPr>
+          <w:rFonts w:ascii="Times New Roman" w:hAnsi="Times New Roman" w:cs="Times New Roman"/>
+          <w:sz w:val="24"/>
+          <w:szCs w:val="24"/>
+        </w:rPr>
+        <w:t>realizadas</w:t>
+      </w:r>
+      <w:proofErr w:type="spellEnd"/>
+      <w:r>
+        <w:rPr>
+          <w:rFonts w:ascii="Times New Roman" w:hAnsi="Times New Roman" w:cs="Times New Roman"/>
+          <w:sz w:val="24"/>
+          <w:szCs w:val="24"/>
+        </w:rPr>
+        <w:t xml:space="preserve"> por los </w:t>
+      </w:r>
+      <w:proofErr w:type="spellStart"/>
+      <w:r>
+        <w:rPr>
+          <w:rFonts w:ascii="Times New Roman" w:hAnsi="Times New Roman" w:cs="Times New Roman"/>
+          <w:sz w:val="24"/>
+          <w:szCs w:val="24"/>
+        </w:rPr>
+        <w:t>usuarios</w:t>
+      </w:r>
+      <w:proofErr w:type="spellEnd"/>
+      <w:r>
+        <w:rPr>
+          <w:rFonts w:ascii="Times New Roman" w:hAnsi="Times New Roman" w:cs="Times New Roman"/>
+          <w:sz w:val="24"/>
+          <w:szCs w:val="24"/>
+        </w:rPr>
+        <w:t xml:space="preserve"> </w:t>
+      </w:r>
+      <w:proofErr w:type="spellStart"/>
+      <w:r>
+        <w:rPr>
+          <w:rFonts w:ascii="Times New Roman" w:hAnsi="Times New Roman" w:cs="Times New Roman"/>
+          <w:sz w:val="24"/>
+          <w:szCs w:val="24"/>
+        </w:rPr>
+        <w:t>sobre</w:t>
+      </w:r>
+      <w:proofErr w:type="spellEnd"/>
+      <w:r>
+        <w:rPr>
+          <w:rFonts w:ascii="Times New Roman" w:hAnsi="Times New Roman" w:cs="Times New Roman"/>
+          <w:sz w:val="24"/>
+          <w:szCs w:val="24"/>
+        </w:rPr>
+        <w:t xml:space="preserve"> las </w:t>
+      </w:r>
+      <w:proofErr w:type="spellStart"/>
+      <w:r>
+        <w:rPr>
+          <w:rFonts w:ascii="Times New Roman" w:hAnsi="Times New Roman" w:cs="Times New Roman"/>
+          <w:sz w:val="24"/>
+          <w:szCs w:val="24"/>
+        </w:rPr>
+        <w:t>recetas</w:t>
+      </w:r>
+      <w:proofErr w:type="spellEnd"/>
+      <w:r>
+        <w:rPr>
+          <w:rFonts w:ascii="Times New Roman" w:hAnsi="Times New Roman" w:cs="Times New Roman"/>
+          <w:sz w:val="24"/>
+          <w:szCs w:val="24"/>
+        </w:rPr>
+        <w:t>.</w:t>
+      </w:r>
+    </w:p>
+    <w:p>
+      <w:pPr>
+        <w:pStyle w:val="Listaconvietas"/>
         <w:spacing w:line="480" w:lineRule="auto"/>
         <w:rPr>
           <w:rFonts w:ascii="Times New Roman" w:hAnsi="Times New Roman" w:cs="Times New Roman"/>
-        </w:rPr>
-      </w:pPr>
-      <w:r>
-        <w:rPr>
-          <w:rFonts w:ascii="Times New Roman" w:hAnsi="Times New Roman" w:cs="Times New Roman"/>
-          <w:b/>
-          <w:bCs/>
-        </w:rPr>
-        <w:t>Gestión de perfil:</w:t>
-      </w:r>
-      <w:r>
-        <w:rPr>
-          <w:rFonts w:ascii="Times New Roman" w:hAnsi="Times New Roman" w:cs="Times New Roman"/>
-        </w:rPr>
-        <w:t xml:space="preserve"> Registro de nuevos usuarios, inicio de sesión (apoyado en persistencia temporal para evitar ingresos constantes) y actualización de datos de contacto.</w:t>
-      </w:r>
-    </w:p>
-    <w:p>
-      <w:pPr>
-        <w:numPr>
-          <w:ilvl w:val="0"/>
-          <w:numId w:val="5"/>
-        </w:numPr>
+          <w:sz w:val="24"/>
+          <w:szCs w:val="24"/>
+        </w:rPr>
+      </w:pPr>
+      <w:proofErr w:type="spellStart"/>
+      <w:r>
+        <w:rPr>
+          <w:rFonts w:ascii="Times New Roman" w:hAnsi="Times New Roman" w:cs="Times New Roman"/>
+          <w:sz w:val="24"/>
+          <w:szCs w:val="24"/>
+        </w:rPr>
+        <w:t>Registro</w:t>
+      </w:r>
+      <w:proofErr w:type="spellEnd"/>
+      <w:r>
+        <w:rPr>
+          <w:rFonts w:ascii="Times New Roman" w:hAnsi="Times New Roman" w:cs="Times New Roman"/>
+          <w:sz w:val="24"/>
+          <w:szCs w:val="24"/>
+        </w:rPr>
+        <w:t xml:space="preserve"> de </w:t>
+      </w:r>
+      <w:proofErr w:type="spellStart"/>
+      <w:r>
+        <w:rPr>
+          <w:rFonts w:ascii="Times New Roman" w:hAnsi="Times New Roman" w:cs="Times New Roman"/>
+          <w:sz w:val="24"/>
+          <w:szCs w:val="24"/>
+        </w:rPr>
+        <w:t>comentarios</w:t>
+      </w:r>
+      <w:proofErr w:type="spellEnd"/>
+      <w:r>
+        <w:rPr>
+          <w:rFonts w:ascii="Times New Roman" w:hAnsi="Times New Roman" w:cs="Times New Roman"/>
+          <w:sz w:val="24"/>
+          <w:szCs w:val="24"/>
+        </w:rPr>
+        <w:t xml:space="preserve"> </w:t>
+      </w:r>
+      <w:proofErr w:type="spellStart"/>
+      <w:r>
+        <w:rPr>
+          <w:rFonts w:ascii="Times New Roman" w:hAnsi="Times New Roman" w:cs="Times New Roman"/>
+          <w:sz w:val="24"/>
+          <w:szCs w:val="24"/>
+        </w:rPr>
+        <w:t>asociados</w:t>
+      </w:r>
+      <w:proofErr w:type="spellEnd"/>
+      <w:r>
+        <w:rPr>
+          <w:rFonts w:ascii="Times New Roman" w:hAnsi="Times New Roman" w:cs="Times New Roman"/>
+          <w:sz w:val="24"/>
+          <w:szCs w:val="24"/>
+        </w:rPr>
+        <w:t xml:space="preserve"> a las </w:t>
+      </w:r>
+      <w:proofErr w:type="spellStart"/>
+      <w:r>
+        <w:rPr>
+          <w:rFonts w:ascii="Times New Roman" w:hAnsi="Times New Roman" w:cs="Times New Roman"/>
+          <w:sz w:val="24"/>
+          <w:szCs w:val="24"/>
+        </w:rPr>
+        <w:t>recetas</w:t>
+      </w:r>
+      <w:proofErr w:type="spellEnd"/>
+      <w:r>
+        <w:rPr>
+          <w:rFonts w:ascii="Times New Roman" w:hAnsi="Times New Roman" w:cs="Times New Roman"/>
+          <w:sz w:val="24"/>
+          <w:szCs w:val="24"/>
+        </w:rPr>
+        <w:t>.</w:t>
+      </w:r>
+    </w:p>
+    <w:p>
+      <w:pPr>
+        <w:pStyle w:val="Listaconvietas"/>
         <w:spacing w:line="480" w:lineRule="auto"/>
         <w:rPr>
           <w:rFonts w:ascii="Times New Roman" w:hAnsi="Times New Roman" w:cs="Times New Roman"/>
-        </w:rPr>
-      </w:pPr>
-      <w:r>
-        <w:rPr>
-          <w:rFonts w:ascii="Times New Roman" w:hAnsi="Times New Roman" w:cs="Times New Roman"/>
-          <w:b/>
-          <w:bCs/>
-        </w:rPr>
-        <w:t>Agendamiento autónomo:</w:t>
-      </w:r>
-      <w:r>
-        <w:rPr>
-          <w:rFonts w:ascii="Times New Roman" w:hAnsi="Times New Roman" w:cs="Times New Roman"/>
-        </w:rPr>
-        <w:t xml:space="preserve"> Interfaz donde el cliente puede consultar el catálogo de servicios (con precios y duración), ver la disponibilidad de los barberos en tiempo real y reservar una fecha y hora específicas.</w:t>
-      </w:r>
-    </w:p>
-    <w:p>
-      <w:pPr>
-        <w:numPr>
-          <w:ilvl w:val="0"/>
-          <w:numId w:val="5"/>
-        </w:numPr>
+          <w:sz w:val="24"/>
+          <w:szCs w:val="24"/>
+        </w:rPr>
+      </w:pPr>
+      <w:proofErr w:type="spellStart"/>
+      <w:r>
+        <w:rPr>
+          <w:rFonts w:ascii="Times New Roman" w:hAnsi="Times New Roman" w:cs="Times New Roman"/>
+          <w:sz w:val="24"/>
+          <w:szCs w:val="24"/>
+        </w:rPr>
+        <w:t>Gestión</w:t>
+      </w:r>
+      <w:proofErr w:type="spellEnd"/>
+      <w:r>
+        <w:rPr>
+          <w:rFonts w:ascii="Times New Roman" w:hAnsi="Times New Roman" w:cs="Times New Roman"/>
+          <w:sz w:val="24"/>
+          <w:szCs w:val="24"/>
+        </w:rPr>
+        <w:t xml:space="preserve"> de las </w:t>
+      </w:r>
+      <w:proofErr w:type="spellStart"/>
+      <w:r>
+        <w:rPr>
+          <w:rFonts w:ascii="Times New Roman" w:hAnsi="Times New Roman" w:cs="Times New Roman"/>
+          <w:sz w:val="24"/>
+          <w:szCs w:val="24"/>
+        </w:rPr>
+        <w:t>recetas</w:t>
+      </w:r>
+      <w:proofErr w:type="spellEnd"/>
+      <w:r>
+        <w:rPr>
+          <w:rFonts w:ascii="Times New Roman" w:hAnsi="Times New Roman" w:cs="Times New Roman"/>
+          <w:sz w:val="24"/>
+          <w:szCs w:val="24"/>
+        </w:rPr>
+        <w:t xml:space="preserve"> </w:t>
+      </w:r>
+      <w:proofErr w:type="spellStart"/>
+      <w:r>
+        <w:rPr>
+          <w:rFonts w:ascii="Times New Roman" w:hAnsi="Times New Roman" w:cs="Times New Roman"/>
+          <w:sz w:val="24"/>
+          <w:szCs w:val="24"/>
+        </w:rPr>
+        <w:t>favoritas</w:t>
+      </w:r>
+      <w:proofErr w:type="spellEnd"/>
+      <w:r>
+        <w:rPr>
+          <w:rFonts w:ascii="Times New Roman" w:hAnsi="Times New Roman" w:cs="Times New Roman"/>
+          <w:sz w:val="24"/>
+          <w:szCs w:val="24"/>
+        </w:rPr>
+        <w:t xml:space="preserve"> de cada </w:t>
+      </w:r>
+      <w:proofErr w:type="spellStart"/>
+      <w:r>
+        <w:rPr>
+          <w:rFonts w:ascii="Times New Roman" w:hAnsi="Times New Roman" w:cs="Times New Roman"/>
+          <w:sz w:val="24"/>
+          <w:szCs w:val="24"/>
+        </w:rPr>
+        <w:t>usuario</w:t>
+      </w:r>
+      <w:proofErr w:type="spellEnd"/>
+      <w:r>
+        <w:rPr>
+          <w:rFonts w:ascii="Times New Roman" w:hAnsi="Times New Roman" w:cs="Times New Roman"/>
+          <w:sz w:val="24"/>
+          <w:szCs w:val="24"/>
+        </w:rPr>
+        <w:t>.</w:t>
+      </w:r>
+    </w:p>
+    <w:p>
+      <w:pPr>
+        <w:pStyle w:val="Listaconvietas"/>
         <w:spacing w:line="480" w:lineRule="auto"/>
         <w:rPr>
           <w:rFonts w:ascii="Times New Roman" w:hAnsi="Times New Roman" w:cs="Times New Roman"/>
-        </w:rPr>
-      </w:pPr>
-      <w:r>
-        <w:rPr>
-          <w:rFonts w:ascii="Times New Roman" w:hAnsi="Times New Roman" w:cs="Times New Roman"/>
-          <w:b/>
-          <w:bCs/>
-        </w:rPr>
-        <w:t>Administración de reservas:</w:t>
-      </w:r>
-      <w:r>
-        <w:rPr>
-          <w:rFonts w:ascii="Times New Roman" w:hAnsi="Times New Roman" w:cs="Times New Roman"/>
-        </w:rPr>
-        <w:t xml:space="preserve"> Capacidad para que el cliente visualice sus citas próximas y pueda cancelarlas o modificarlas dentro de los tiempos permitidos.</w:t>
-      </w:r>
-    </w:p>
-    <w:p>
-      <w:pPr>
+          <w:sz w:val="24"/>
+          <w:szCs w:val="24"/>
+        </w:rPr>
+      </w:pPr>
+      <w:proofErr w:type="spellStart"/>
+      <w:r>
+        <w:rPr>
+          <w:rFonts w:ascii="Times New Roman" w:hAnsi="Times New Roman" w:cs="Times New Roman"/>
+          <w:sz w:val="24"/>
+          <w:szCs w:val="24"/>
+        </w:rPr>
+        <w:t>Creación</w:t>
+      </w:r>
+      <w:proofErr w:type="spellEnd"/>
+      <w:r>
+        <w:rPr>
+          <w:rFonts w:ascii="Times New Roman" w:hAnsi="Times New Roman" w:cs="Times New Roman"/>
+          <w:sz w:val="24"/>
+          <w:szCs w:val="24"/>
+        </w:rPr>
+        <w:t xml:space="preserve"> y </w:t>
+      </w:r>
+      <w:proofErr w:type="spellStart"/>
+      <w:r>
+        <w:rPr>
+          <w:rFonts w:ascii="Times New Roman" w:hAnsi="Times New Roman" w:cs="Times New Roman"/>
+          <w:sz w:val="24"/>
+          <w:szCs w:val="24"/>
+        </w:rPr>
+        <w:t>organización</w:t>
+      </w:r>
+      <w:proofErr w:type="spellEnd"/>
+      <w:r>
+        <w:rPr>
+          <w:rFonts w:ascii="Times New Roman" w:hAnsi="Times New Roman" w:cs="Times New Roman"/>
+          <w:sz w:val="24"/>
+          <w:szCs w:val="24"/>
+        </w:rPr>
+        <w:t xml:space="preserve"> de </w:t>
+      </w:r>
+      <w:proofErr w:type="spellStart"/>
+      <w:r>
+        <w:rPr>
+          <w:rFonts w:ascii="Times New Roman" w:hAnsi="Times New Roman" w:cs="Times New Roman"/>
+          <w:sz w:val="24"/>
+          <w:szCs w:val="24"/>
+        </w:rPr>
+        <w:t>colecciones</w:t>
+      </w:r>
+      <w:proofErr w:type="spellEnd"/>
+      <w:r>
+        <w:rPr>
+          <w:rFonts w:ascii="Times New Roman" w:hAnsi="Times New Roman" w:cs="Times New Roman"/>
+          <w:sz w:val="24"/>
+          <w:szCs w:val="24"/>
+        </w:rPr>
+        <w:t xml:space="preserve"> de </w:t>
+      </w:r>
+      <w:proofErr w:type="spellStart"/>
+      <w:r>
+        <w:rPr>
+          <w:rFonts w:ascii="Times New Roman" w:hAnsi="Times New Roman" w:cs="Times New Roman"/>
+          <w:sz w:val="24"/>
+          <w:szCs w:val="24"/>
+        </w:rPr>
+        <w:t>recetas</w:t>
+      </w:r>
+      <w:proofErr w:type="spellEnd"/>
+      <w:r>
+        <w:rPr>
+          <w:rFonts w:ascii="Times New Roman" w:hAnsi="Times New Roman" w:cs="Times New Roman"/>
+          <w:sz w:val="24"/>
+          <w:szCs w:val="24"/>
+        </w:rPr>
+        <w:t>.</w:t>
+      </w:r>
+    </w:p>
+    <w:p>
+      <w:pPr>
+        <w:pStyle w:val="Listaconvietas"/>
         <w:spacing w:line="480" w:lineRule="auto"/>
         <w:rPr>
           <w:rFonts w:ascii="Times New Roman" w:hAnsi="Times New Roman" w:cs="Times New Roman"/>
-        </w:rPr>
-      </w:pPr>
-      <w:r>
-        <w:rPr>
-          <w:rFonts w:ascii="Times New Roman" w:hAnsi="Times New Roman" w:cs="Times New Roman"/>
-          <w:b/>
-          <w:bCs/>
-        </w:rPr>
-        <w:t>2. Módulo de Barberos / Administración:</w:t>
-      </w:r>
-    </w:p>
-    <w:p>
-      <w:pPr>
-        <w:numPr>
-          <w:ilvl w:val="0"/>
-          <w:numId w:val="6"/>
-        </w:numPr>
+          <w:sz w:val="24"/>
+          <w:szCs w:val="24"/>
+        </w:rPr>
+      </w:pPr>
+      <w:proofErr w:type="spellStart"/>
+      <w:r>
+        <w:rPr>
+          <w:rFonts w:ascii="Times New Roman" w:hAnsi="Times New Roman" w:cs="Times New Roman"/>
+          <w:sz w:val="24"/>
+          <w:szCs w:val="24"/>
+        </w:rPr>
+        <w:t>Relación</w:t>
+      </w:r>
+      <w:proofErr w:type="spellEnd"/>
+      <w:r>
+        <w:rPr>
+          <w:rFonts w:ascii="Times New Roman" w:hAnsi="Times New Roman" w:cs="Times New Roman"/>
+          <w:sz w:val="24"/>
+          <w:szCs w:val="24"/>
+        </w:rPr>
+        <w:t xml:space="preserve"> entre </w:t>
+      </w:r>
+      <w:proofErr w:type="spellStart"/>
+      <w:r>
+        <w:rPr>
+          <w:rFonts w:ascii="Times New Roman" w:hAnsi="Times New Roman" w:cs="Times New Roman"/>
+          <w:sz w:val="24"/>
+          <w:szCs w:val="24"/>
+        </w:rPr>
+        <w:t>favoritos</w:t>
+      </w:r>
+      <w:proofErr w:type="spellEnd"/>
+      <w:r>
+        <w:rPr>
+          <w:rFonts w:ascii="Times New Roman" w:hAnsi="Times New Roman" w:cs="Times New Roman"/>
+          <w:sz w:val="24"/>
+          <w:szCs w:val="24"/>
+        </w:rPr>
+        <w:t xml:space="preserve"> y </w:t>
+      </w:r>
+      <w:proofErr w:type="spellStart"/>
+      <w:r>
+        <w:rPr>
+          <w:rFonts w:ascii="Times New Roman" w:hAnsi="Times New Roman" w:cs="Times New Roman"/>
+          <w:sz w:val="24"/>
+          <w:szCs w:val="24"/>
+        </w:rPr>
+        <w:t>colecciones</w:t>
+      </w:r>
+      <w:proofErr w:type="spellEnd"/>
+      <w:r>
+        <w:rPr>
+          <w:rFonts w:ascii="Times New Roman" w:hAnsi="Times New Roman" w:cs="Times New Roman"/>
+          <w:sz w:val="24"/>
+          <w:szCs w:val="24"/>
+        </w:rPr>
+        <w:t xml:space="preserve"> </w:t>
+      </w:r>
+      <w:proofErr w:type="spellStart"/>
+      <w:r>
+        <w:rPr>
+          <w:rFonts w:ascii="Times New Roman" w:hAnsi="Times New Roman" w:cs="Times New Roman"/>
+          <w:sz w:val="24"/>
+          <w:szCs w:val="24"/>
+        </w:rPr>
+        <w:t>mediante</w:t>
+      </w:r>
+      <w:proofErr w:type="spellEnd"/>
+      <w:r>
+        <w:rPr>
+          <w:rFonts w:ascii="Times New Roman" w:hAnsi="Times New Roman" w:cs="Times New Roman"/>
+          <w:sz w:val="24"/>
+          <w:szCs w:val="24"/>
+        </w:rPr>
+        <w:t xml:space="preserve"> la </w:t>
+      </w:r>
+      <w:proofErr w:type="spellStart"/>
+      <w:r>
+        <w:rPr>
+          <w:rFonts w:ascii="Times New Roman" w:hAnsi="Times New Roman" w:cs="Times New Roman"/>
+          <w:sz w:val="24"/>
+          <w:szCs w:val="24"/>
+        </w:rPr>
+        <w:t>entidad</w:t>
+      </w:r>
+      <w:proofErr w:type="spellEnd"/>
+      <w:r>
+        <w:rPr>
+          <w:rFonts w:ascii="Times New Roman" w:hAnsi="Times New Roman" w:cs="Times New Roman"/>
+          <w:sz w:val="24"/>
+          <w:szCs w:val="24"/>
+        </w:rPr>
+        <w:t xml:space="preserve"> </w:t>
+      </w:r>
+      <w:proofErr w:type="spellStart"/>
+      <w:r>
+        <w:rPr>
+          <w:rFonts w:ascii="Times New Roman" w:hAnsi="Times New Roman" w:cs="Times New Roman"/>
+          <w:sz w:val="24"/>
+          <w:szCs w:val="24"/>
+        </w:rPr>
+        <w:t>Favoritos_colecciones</w:t>
+      </w:r>
+      <w:proofErr w:type="spellEnd"/>
+      <w:r>
+        <w:rPr>
+          <w:rFonts w:ascii="Times New Roman" w:hAnsi="Times New Roman" w:cs="Times New Roman"/>
+          <w:sz w:val="24"/>
+          <w:szCs w:val="24"/>
+        </w:rPr>
+        <w:t>.</w:t>
+      </w:r>
+    </w:p>
+    <w:p>
+      <w:pPr>
+        <w:pStyle w:val="Listaconvietas"/>
         <w:spacing w:line="480" w:lineRule="auto"/>
         <w:rPr>
           <w:rFonts w:ascii="Times New Roman" w:hAnsi="Times New Roman" w:cs="Times New Roman"/>
-        </w:rPr>
-      </w:pPr>
-      <w:r>
-        <w:rPr>
-          <w:rFonts w:ascii="Times New Roman" w:hAnsi="Times New Roman" w:cs="Times New Roman"/>
-          <w:b/>
-          <w:bCs/>
-        </w:rPr>
-        <w:t>Visualización de agenda:</w:t>
-      </w:r>
-      <w:r>
-        <w:rPr>
-          <w:rFonts w:ascii="Times New Roman" w:hAnsi="Times New Roman" w:cs="Times New Roman"/>
-        </w:rPr>
-        <w:t xml:space="preserve"> Panel de control centralizado donde cada barbero puede ver su cronograma diario de forma ordenada.</w:t>
-      </w:r>
-    </w:p>
-    <w:p>
-      <w:pPr>
-        <w:numPr>
-          <w:ilvl w:val="0"/>
-          <w:numId w:val="6"/>
-        </w:numPr>
+          <w:sz w:val="24"/>
+          <w:szCs w:val="24"/>
+        </w:rPr>
+      </w:pPr>
+      <w:proofErr w:type="spellStart"/>
+      <w:r>
+        <w:rPr>
+          <w:rFonts w:ascii="Times New Roman" w:hAnsi="Times New Roman" w:cs="Times New Roman"/>
+          <w:sz w:val="24"/>
+          <w:szCs w:val="24"/>
+        </w:rPr>
+        <w:t>Registro</w:t>
+      </w:r>
+      <w:proofErr w:type="spellEnd"/>
+      <w:r>
+        <w:rPr>
+          <w:rFonts w:ascii="Times New Roman" w:hAnsi="Times New Roman" w:cs="Times New Roman"/>
+          <w:sz w:val="24"/>
+          <w:szCs w:val="24"/>
+        </w:rPr>
+        <w:t xml:space="preserve"> y </w:t>
+      </w:r>
+      <w:proofErr w:type="spellStart"/>
+      <w:r>
+        <w:rPr>
+          <w:rFonts w:ascii="Times New Roman" w:hAnsi="Times New Roman" w:cs="Times New Roman"/>
+          <w:sz w:val="24"/>
+          <w:szCs w:val="24"/>
+        </w:rPr>
+        <w:t>gestión</w:t>
+      </w:r>
+      <w:proofErr w:type="spellEnd"/>
+      <w:r>
+        <w:rPr>
+          <w:rFonts w:ascii="Times New Roman" w:hAnsi="Times New Roman" w:cs="Times New Roman"/>
+          <w:sz w:val="24"/>
+          <w:szCs w:val="24"/>
+        </w:rPr>
+        <w:t xml:space="preserve"> de </w:t>
+      </w:r>
+      <w:proofErr w:type="spellStart"/>
+      <w:r>
+        <w:rPr>
+          <w:rFonts w:ascii="Times New Roman" w:hAnsi="Times New Roman" w:cs="Times New Roman"/>
+          <w:sz w:val="24"/>
+          <w:szCs w:val="24"/>
+        </w:rPr>
+        <w:t>reportes</w:t>
+      </w:r>
+      <w:proofErr w:type="spellEnd"/>
+      <w:r>
+        <w:rPr>
+          <w:rFonts w:ascii="Times New Roman" w:hAnsi="Times New Roman" w:cs="Times New Roman"/>
+          <w:sz w:val="24"/>
+          <w:szCs w:val="24"/>
+        </w:rPr>
+        <w:t xml:space="preserve"> </w:t>
+      </w:r>
+      <w:proofErr w:type="spellStart"/>
+      <w:r>
+        <w:rPr>
+          <w:rFonts w:ascii="Times New Roman" w:hAnsi="Times New Roman" w:cs="Times New Roman"/>
+          <w:sz w:val="24"/>
+          <w:szCs w:val="24"/>
+        </w:rPr>
+        <w:t>realizados</w:t>
+      </w:r>
+      <w:proofErr w:type="spellEnd"/>
+      <w:r>
+        <w:rPr>
+          <w:rFonts w:ascii="Times New Roman" w:hAnsi="Times New Roman" w:cs="Times New Roman"/>
+          <w:sz w:val="24"/>
+          <w:szCs w:val="24"/>
+        </w:rPr>
+        <w:t xml:space="preserve"> por los </w:t>
+      </w:r>
+      <w:proofErr w:type="spellStart"/>
+      <w:r>
+        <w:rPr>
+          <w:rFonts w:ascii="Times New Roman" w:hAnsi="Times New Roman" w:cs="Times New Roman"/>
+          <w:sz w:val="24"/>
+          <w:szCs w:val="24"/>
+        </w:rPr>
+        <w:t>usuarios</w:t>
+      </w:r>
+      <w:proofErr w:type="spellEnd"/>
+      <w:r>
+        <w:rPr>
+          <w:rFonts w:ascii="Times New Roman" w:hAnsi="Times New Roman" w:cs="Times New Roman"/>
+          <w:sz w:val="24"/>
+          <w:szCs w:val="24"/>
+        </w:rPr>
+        <w:t>.</w:t>
+      </w:r>
+    </w:p>
+    <w:p>
+      <w:pPr>
+        <w:pStyle w:val="Listaconvietas"/>
         <w:spacing w:line="480" w:lineRule="auto"/>
         <w:rPr>
           <w:rFonts w:ascii="Times New Roman" w:hAnsi="Times New Roman" w:cs="Times New Roman"/>
-        </w:rPr>
-      </w:pPr>
-      <w:r>
-        <w:rPr>
-          <w:rFonts w:ascii="Times New Roman" w:hAnsi="Times New Roman" w:cs="Times New Roman"/>
-          <w:b/>
-          <w:bCs/>
-        </w:rPr>
-        <w:t>Gestión de estados:</w:t>
-      </w:r>
-      <w:r>
-        <w:rPr>
-          <w:rFonts w:ascii="Times New Roman" w:hAnsi="Times New Roman" w:cs="Times New Roman"/>
-        </w:rPr>
-        <w:t xml:space="preserve"> Opción para cambiar el estado de la cita a medida que avanza el día (pendiente, completada, inasistencia o cancelada).</w:t>
-      </w:r>
-    </w:p>
-    <w:p>
-      <w:pPr>
-        <w:numPr>
-          <w:ilvl w:val="0"/>
-          <w:numId w:val="6"/>
-        </w:numPr>
+          <w:sz w:val="24"/>
+          <w:szCs w:val="24"/>
+        </w:rPr>
+      </w:pPr>
+      <w:proofErr w:type="spellStart"/>
+      <w:r>
+        <w:rPr>
+          <w:rFonts w:ascii="Times New Roman" w:hAnsi="Times New Roman" w:cs="Times New Roman"/>
+          <w:sz w:val="24"/>
+          <w:szCs w:val="24"/>
+        </w:rPr>
+        <w:t>Almacenamiento</w:t>
+      </w:r>
+      <w:proofErr w:type="spellEnd"/>
+      <w:r>
+        <w:rPr>
+          <w:rFonts w:ascii="Times New Roman" w:hAnsi="Times New Roman" w:cs="Times New Roman"/>
+          <w:sz w:val="24"/>
+          <w:szCs w:val="24"/>
+        </w:rPr>
+        <w:t xml:space="preserve"> de la </w:t>
+      </w:r>
+      <w:proofErr w:type="spellStart"/>
+      <w:r>
+        <w:rPr>
+          <w:rFonts w:ascii="Times New Roman" w:hAnsi="Times New Roman" w:cs="Times New Roman"/>
+          <w:sz w:val="24"/>
+          <w:szCs w:val="24"/>
+        </w:rPr>
+        <w:t>información</w:t>
+      </w:r>
+      <w:proofErr w:type="spellEnd"/>
+      <w:r>
+        <w:rPr>
+          <w:rFonts w:ascii="Times New Roman" w:hAnsi="Times New Roman" w:cs="Times New Roman"/>
+          <w:sz w:val="24"/>
+          <w:szCs w:val="24"/>
+        </w:rPr>
+        <w:t xml:space="preserve"> </w:t>
+      </w:r>
+      <w:proofErr w:type="spellStart"/>
+      <w:r>
+        <w:rPr>
+          <w:rFonts w:ascii="Times New Roman" w:hAnsi="Times New Roman" w:cs="Times New Roman"/>
+          <w:sz w:val="24"/>
+          <w:szCs w:val="24"/>
+        </w:rPr>
+        <w:t>necesaria</w:t>
+      </w:r>
+      <w:proofErr w:type="spellEnd"/>
+      <w:r>
+        <w:rPr>
+          <w:rFonts w:ascii="Times New Roman" w:hAnsi="Times New Roman" w:cs="Times New Roman"/>
+          <w:sz w:val="24"/>
+          <w:szCs w:val="24"/>
+        </w:rPr>
+        <w:t xml:space="preserve"> para </w:t>
+      </w:r>
+      <w:proofErr w:type="spellStart"/>
+      <w:r>
+        <w:rPr>
+          <w:rFonts w:ascii="Times New Roman" w:hAnsi="Times New Roman" w:cs="Times New Roman"/>
+          <w:sz w:val="24"/>
+          <w:szCs w:val="24"/>
+        </w:rPr>
+        <w:t>relacionar</w:t>
+      </w:r>
+      <w:proofErr w:type="spellEnd"/>
+      <w:r>
+        <w:rPr>
+          <w:rFonts w:ascii="Times New Roman" w:hAnsi="Times New Roman" w:cs="Times New Roman"/>
+          <w:sz w:val="24"/>
+          <w:szCs w:val="24"/>
+        </w:rPr>
+        <w:t xml:space="preserve"> las </w:t>
+      </w:r>
+      <w:proofErr w:type="spellStart"/>
+      <w:r>
+        <w:rPr>
+          <w:rFonts w:ascii="Times New Roman" w:hAnsi="Times New Roman" w:cs="Times New Roman"/>
+          <w:sz w:val="24"/>
+          <w:szCs w:val="24"/>
+        </w:rPr>
+        <w:t>acciones</w:t>
+      </w:r>
+      <w:proofErr w:type="spellEnd"/>
+      <w:r>
+        <w:rPr>
+          <w:rFonts w:ascii="Times New Roman" w:hAnsi="Times New Roman" w:cs="Times New Roman"/>
+          <w:sz w:val="24"/>
+          <w:szCs w:val="24"/>
+        </w:rPr>
+        <w:t xml:space="preserve"> de los </w:t>
+      </w:r>
+      <w:proofErr w:type="spellStart"/>
+      <w:r>
+        <w:rPr>
+          <w:rFonts w:ascii="Times New Roman" w:hAnsi="Times New Roman" w:cs="Times New Roman"/>
+          <w:sz w:val="24"/>
+          <w:szCs w:val="24"/>
+        </w:rPr>
+        <w:t>usuarios</w:t>
+      </w:r>
+      <w:proofErr w:type="spellEnd"/>
+      <w:r>
+        <w:rPr>
+          <w:rFonts w:ascii="Times New Roman" w:hAnsi="Times New Roman" w:cs="Times New Roman"/>
+          <w:sz w:val="24"/>
+          <w:szCs w:val="24"/>
+        </w:rPr>
+        <w:t xml:space="preserve"> con las </w:t>
+      </w:r>
+      <w:proofErr w:type="spellStart"/>
+      <w:r>
+        <w:rPr>
+          <w:rFonts w:ascii="Times New Roman" w:hAnsi="Times New Roman" w:cs="Times New Roman"/>
+          <w:sz w:val="24"/>
+          <w:szCs w:val="24"/>
+        </w:rPr>
+        <w:t>recetas</w:t>
+      </w:r>
+      <w:proofErr w:type="spellEnd"/>
+      <w:r>
+        <w:rPr>
+          <w:rFonts w:ascii="Times New Roman" w:hAnsi="Times New Roman" w:cs="Times New Roman"/>
+          <w:sz w:val="24"/>
+          <w:szCs w:val="24"/>
+        </w:rPr>
+        <w:t>.</w:t>
+      </w:r>
+    </w:p>
+    <w:p>
+      <w:pPr>
+        <w:pStyle w:val="Listaconvietas"/>
         <w:spacing w:line="480" w:lineRule="auto"/>
         <w:rPr>
           <w:rFonts w:ascii="Times New Roman" w:hAnsi="Times New Roman" w:cs="Times New Roman"/>
-        </w:rPr>
-      </w:pPr>
-      <w:r>
-        <w:rPr>
-          <w:rFonts w:ascii="Times New Roman" w:hAnsi="Times New Roman" w:cs="Times New Roman"/>
-          <w:b/>
-          <w:bCs/>
+          <w:sz w:val="24"/>
+          <w:szCs w:val="24"/>
+        </w:rPr>
+      </w:pPr>
+      <w:proofErr w:type="spellStart"/>
+      <w:r>
+        <w:rPr>
+          <w:rFonts w:ascii="Times New Roman" w:hAnsi="Times New Roman" w:cs="Times New Roman"/>
+          <w:sz w:val="24"/>
+          <w:szCs w:val="24"/>
+        </w:rPr>
+        <w:t>Organización</w:t>
+      </w:r>
+      <w:proofErr w:type="spellEnd"/>
+      <w:r>
+        <w:rPr>
+          <w:rFonts w:ascii="Times New Roman" w:hAnsi="Times New Roman" w:cs="Times New Roman"/>
+          <w:sz w:val="24"/>
+          <w:szCs w:val="24"/>
+        </w:rPr>
+        <w:t xml:space="preserve"> de la </w:t>
+      </w:r>
+      <w:proofErr w:type="spellStart"/>
+      <w:r>
+        <w:rPr>
+          <w:rFonts w:ascii="Times New Roman" w:hAnsi="Times New Roman" w:cs="Times New Roman"/>
+          <w:sz w:val="24"/>
+          <w:szCs w:val="24"/>
+        </w:rPr>
+        <w:t>información</w:t>
+      </w:r>
+      <w:proofErr w:type="spellEnd"/>
+      <w:r>
+        <w:rPr>
+          <w:rFonts w:ascii="Times New Roman" w:hAnsi="Times New Roman" w:cs="Times New Roman"/>
+          <w:sz w:val="24"/>
+          <w:szCs w:val="24"/>
+        </w:rPr>
+        <w:t xml:space="preserve"> </w:t>
+      </w:r>
+      <w:proofErr w:type="spellStart"/>
+      <w:r>
+        <w:rPr>
+          <w:rFonts w:ascii="Times New Roman" w:hAnsi="Times New Roman" w:cs="Times New Roman"/>
+          <w:sz w:val="24"/>
+          <w:szCs w:val="24"/>
+        </w:rPr>
+        <w:t>mediante</w:t>
+      </w:r>
+      <w:proofErr w:type="spellEnd"/>
+      <w:r>
+        <w:rPr>
+          <w:rFonts w:ascii="Times New Roman" w:hAnsi="Times New Roman" w:cs="Times New Roman"/>
+          <w:sz w:val="24"/>
+          <w:szCs w:val="24"/>
+        </w:rPr>
+        <w:t xml:space="preserve"> las </w:t>
+      </w:r>
+      <w:proofErr w:type="spellStart"/>
+      <w:r>
+        <w:rPr>
+          <w:rFonts w:ascii="Times New Roman" w:hAnsi="Times New Roman" w:cs="Times New Roman"/>
+          <w:sz w:val="24"/>
+          <w:szCs w:val="24"/>
+        </w:rPr>
+        <w:t>entidades</w:t>
+      </w:r>
+      <w:proofErr w:type="spellEnd"/>
+      <w:r>
+        <w:rPr>
+          <w:rFonts w:ascii="Times New Roman" w:hAnsi="Times New Roman" w:cs="Times New Roman"/>
+          <w:sz w:val="24"/>
+          <w:szCs w:val="24"/>
+        </w:rPr>
+        <w:t xml:space="preserve"> y </w:t>
+      </w:r>
+      <w:proofErr w:type="spellStart"/>
+      <w:r>
+        <w:rPr>
+          <w:rFonts w:ascii="Times New Roman" w:hAnsi="Times New Roman" w:cs="Times New Roman"/>
+          <w:sz w:val="24"/>
+          <w:szCs w:val="24"/>
+        </w:rPr>
+        <w:t>relaciones</w:t>
+      </w:r>
+      <w:proofErr w:type="spellEnd"/>
+      <w:r>
+        <w:rPr>
+          <w:rFonts w:ascii="Times New Roman" w:hAnsi="Times New Roman" w:cs="Times New Roman"/>
+          <w:sz w:val="24"/>
+          <w:szCs w:val="24"/>
+        </w:rPr>
+        <w:t xml:space="preserve"> </w:t>
+      </w:r>
+      <w:proofErr w:type="spellStart"/>
+      <w:r>
+        <w:rPr>
+          <w:rFonts w:ascii="Times New Roman" w:hAnsi="Times New Roman" w:cs="Times New Roman"/>
+          <w:sz w:val="24"/>
+          <w:szCs w:val="24"/>
+        </w:rPr>
+        <w:t>definidas</w:t>
+      </w:r>
+      <w:proofErr w:type="spellEnd"/>
+      <w:r>
+        <w:rPr>
+          <w:rFonts w:ascii="Times New Roman" w:hAnsi="Times New Roman" w:cs="Times New Roman"/>
+          <w:sz w:val="24"/>
+          <w:szCs w:val="24"/>
+        </w:rPr>
+        <w:t xml:space="preserve"> para </w:t>
+      </w:r>
+      <w:proofErr w:type="spellStart"/>
+      <w:r>
+        <w:rPr>
+          <w:rFonts w:ascii="Times New Roman" w:hAnsi="Times New Roman" w:cs="Times New Roman"/>
+          <w:sz w:val="24"/>
+          <w:szCs w:val="24"/>
+        </w:rPr>
+        <w:t>el</w:t>
+      </w:r>
+      <w:proofErr w:type="spellEnd"/>
+      <w:r>
+        <w:rPr>
+          <w:rFonts w:ascii="Times New Roman" w:hAnsi="Times New Roman" w:cs="Times New Roman"/>
+          <w:sz w:val="24"/>
+          <w:szCs w:val="24"/>
+        </w:rPr>
+        <w:t xml:space="preserve"> </w:t>
+      </w:r>
+      <w:proofErr w:type="spellStart"/>
+      <w:r>
+        <w:rPr>
+          <w:rFonts w:ascii="Times New Roman" w:hAnsi="Times New Roman" w:cs="Times New Roman"/>
+          <w:sz w:val="24"/>
+          <w:szCs w:val="24"/>
+        </w:rPr>
+        <w:t>módulo</w:t>
+      </w:r>
+      <w:proofErr w:type="spellEnd"/>
+      <w:r>
+        <w:rPr>
+          <w:rFonts w:ascii="Times New Roman" w:hAnsi="Times New Roman" w:cs="Times New Roman"/>
+          <w:sz w:val="24"/>
+          <w:szCs w:val="24"/>
+        </w:rPr>
+        <w:t xml:space="preserve"> de </w:t>
+      </w:r>
+      <w:proofErr w:type="spellStart"/>
+      <w:r>
+        <w:rPr>
+          <w:rFonts w:ascii="Times New Roman" w:hAnsi="Times New Roman" w:cs="Times New Roman"/>
+          <w:sz w:val="24"/>
+          <w:szCs w:val="24"/>
+        </w:rPr>
+        <w:t>comunidad</w:t>
+      </w:r>
+      <w:proofErr w:type="spellEnd"/>
+      <w:r>
+        <w:rPr>
+          <w:rFonts w:ascii="Times New Roman" w:hAnsi="Times New Roman" w:cs="Times New Roman"/>
+          <w:sz w:val="24"/>
+          <w:szCs w:val="24"/>
+        </w:rPr>
+        <w:t>.</w:t>
+      </w:r>
+    </w:p>
+    <w:p>
+      <w:pPr>
+        <w:pStyle w:val="Listaconvietas"/>
+        <w:spacing w:line="480" w:lineRule="auto"/>
+        <w:rPr>
+          <w:rFonts w:ascii="Times New Roman" w:hAnsi="Times New Roman" w:cs="Times New Roman"/>
+          <w:sz w:val="24"/>
+          <w:szCs w:val="24"/>
+        </w:rPr>
+      </w:pPr>
+      <w:r>
+        <w:rPr>
+          <w:rFonts w:ascii="Times New Roman" w:hAnsi="Times New Roman" w:cs="Times New Roman"/>
+          <w:sz w:val="24"/>
+          <w:szCs w:val="24"/>
+        </w:rPr>
+        <w:t xml:space="preserve">Consulta de la </w:t>
+      </w:r>
+      <w:proofErr w:type="spellStart"/>
+      <w:r>
+        <w:rPr>
+          <w:rFonts w:ascii="Times New Roman" w:hAnsi="Times New Roman" w:cs="Times New Roman"/>
+          <w:sz w:val="24"/>
+          <w:szCs w:val="24"/>
+        </w:rPr>
+        <w:t>información</w:t>
+      </w:r>
+      <w:proofErr w:type="spellEnd"/>
+      <w:r>
+        <w:rPr>
+          <w:rFonts w:ascii="Times New Roman" w:hAnsi="Times New Roman" w:cs="Times New Roman"/>
+          <w:sz w:val="24"/>
+          <w:szCs w:val="24"/>
+        </w:rPr>
+        <w:t xml:space="preserve"> </w:t>
+      </w:r>
+      <w:proofErr w:type="spellStart"/>
+      <w:r>
+        <w:rPr>
+          <w:rFonts w:ascii="Times New Roman" w:hAnsi="Times New Roman" w:cs="Times New Roman"/>
+          <w:sz w:val="24"/>
+          <w:szCs w:val="24"/>
+        </w:rPr>
+        <w:t>generada</w:t>
+      </w:r>
+      <w:proofErr w:type="spellEnd"/>
+      <w:r>
+        <w:rPr>
+          <w:rFonts w:ascii="Times New Roman" w:hAnsi="Times New Roman" w:cs="Times New Roman"/>
+          <w:sz w:val="24"/>
+          <w:szCs w:val="24"/>
+        </w:rPr>
+        <w:t xml:space="preserve"> por las </w:t>
+      </w:r>
+      <w:proofErr w:type="spellStart"/>
+      <w:r>
+        <w:rPr>
+          <w:rFonts w:ascii="Times New Roman" w:hAnsi="Times New Roman" w:cs="Times New Roman"/>
+          <w:sz w:val="24"/>
+          <w:szCs w:val="24"/>
+        </w:rPr>
+        <w:t>diferentes</w:t>
+      </w:r>
+      <w:proofErr w:type="spellEnd"/>
+      <w:r>
+        <w:rPr>
+          <w:rFonts w:ascii="Times New Roman" w:hAnsi="Times New Roman" w:cs="Times New Roman"/>
+          <w:sz w:val="24"/>
+          <w:szCs w:val="24"/>
+        </w:rPr>
+        <w:t xml:space="preserve"> </w:t>
+      </w:r>
+      <w:proofErr w:type="spellStart"/>
+      <w:r>
+        <w:rPr>
+          <w:rFonts w:ascii="Times New Roman" w:hAnsi="Times New Roman" w:cs="Times New Roman"/>
+          <w:sz w:val="24"/>
+          <w:szCs w:val="24"/>
+        </w:rPr>
+        <w:t>acciones</w:t>
+      </w:r>
+      <w:proofErr w:type="spellEnd"/>
+      <w:r>
+        <w:rPr>
+          <w:rFonts w:ascii="Times New Roman" w:hAnsi="Times New Roman" w:cs="Times New Roman"/>
+          <w:sz w:val="24"/>
+          <w:szCs w:val="24"/>
+        </w:rPr>
+        <w:t xml:space="preserve"> </w:t>
+      </w:r>
+      <w:proofErr w:type="spellStart"/>
+      <w:r>
+        <w:rPr>
+          <w:rFonts w:ascii="Times New Roman" w:hAnsi="Times New Roman" w:cs="Times New Roman"/>
+          <w:sz w:val="24"/>
+          <w:szCs w:val="24"/>
+        </w:rPr>
+        <w:t>sociales</w:t>
+      </w:r>
+      <w:proofErr w:type="spellEnd"/>
+      <w:r>
+        <w:rPr>
+          <w:rFonts w:ascii="Times New Roman" w:hAnsi="Times New Roman" w:cs="Times New Roman"/>
+          <w:sz w:val="24"/>
+          <w:szCs w:val="24"/>
+        </w:rPr>
+        <w:t xml:space="preserve"> </w:t>
+      </w:r>
+      <w:proofErr w:type="spellStart"/>
+      <w:r>
+        <w:rPr>
+          <w:rFonts w:ascii="Times New Roman" w:hAnsi="Times New Roman" w:cs="Times New Roman"/>
+          <w:sz w:val="24"/>
+          <w:szCs w:val="24"/>
+        </w:rPr>
+        <w:t>realizadas</w:t>
+      </w:r>
+      <w:proofErr w:type="spellEnd"/>
+      <w:r>
+        <w:rPr>
+          <w:rFonts w:ascii="Times New Roman" w:hAnsi="Times New Roman" w:cs="Times New Roman"/>
+          <w:sz w:val="24"/>
+          <w:szCs w:val="24"/>
+        </w:rPr>
+        <w:t xml:space="preserve"> dentro del </w:t>
+      </w:r>
+      <w:proofErr w:type="spellStart"/>
+      <w:r>
+        <w:rPr>
+          <w:rFonts w:ascii="Times New Roman" w:hAnsi="Times New Roman" w:cs="Times New Roman"/>
+          <w:sz w:val="24"/>
+          <w:szCs w:val="24"/>
+        </w:rPr>
+        <w:t>sistema</w:t>
+      </w:r>
+      <w:proofErr w:type="spellEnd"/>
+      <w:r>
+        <w:rPr>
+          <w:rFonts w:ascii="Times New Roman" w:hAnsi="Times New Roman" w:cs="Times New Roman"/>
+          <w:sz w:val="24"/>
+          <w:szCs w:val="24"/>
+        </w:rPr>
+        <w:t>.</w:t>
+      </w:r>
+    </w:p>
+    <w:p>
+      <w:pPr>
+        <w:pStyle w:val="Ttulo2"/>
+        <w:spacing w:line="480" w:lineRule="auto"/>
+        <w:rPr>
+          <w:rFonts w:cs="Times New Roman"/>
+          <w:szCs w:val="24"/>
+        </w:rPr>
+      </w:pPr>
+      <w:r>
+        <w:rPr>
+          <w:rFonts w:cs="Times New Roman"/>
+          <w:szCs w:val="24"/>
+        </w:rPr>
+        <w:t>2.2 Exclusiones</w:t>
+      </w:r>
+    </w:p>
+    <w:p>
+      <w:pPr>
+        <w:pStyle w:val="Listaconvietas"/>
+        <w:spacing w:line="480" w:lineRule="auto"/>
+        <w:rPr>
+          <w:rFonts w:ascii="Times New Roman" w:hAnsi="Times New Roman" w:cs="Times New Roman"/>
+          <w:sz w:val="24"/>
+          <w:szCs w:val="24"/>
+        </w:rPr>
+      </w:pPr>
+      <w:r>
+        <w:rPr>
+          <w:rFonts w:ascii="Times New Roman" w:hAnsi="Times New Roman" w:cs="Times New Roman"/>
+          <w:sz w:val="24"/>
+          <w:szCs w:val="24"/>
+        </w:rPr>
+        <w:t xml:space="preserve">Desarrollo de </w:t>
+      </w:r>
+      <w:proofErr w:type="spellStart"/>
+      <w:r>
+        <w:rPr>
+          <w:rFonts w:ascii="Times New Roman" w:hAnsi="Times New Roman" w:cs="Times New Roman"/>
+          <w:sz w:val="24"/>
+          <w:szCs w:val="24"/>
+        </w:rPr>
+        <w:t>funcionalidades</w:t>
+      </w:r>
+      <w:proofErr w:type="spellEnd"/>
+      <w:r>
+        <w:rPr>
+          <w:rFonts w:ascii="Times New Roman" w:hAnsi="Times New Roman" w:cs="Times New Roman"/>
+          <w:sz w:val="24"/>
+          <w:szCs w:val="24"/>
+        </w:rPr>
+        <w:t xml:space="preserve"> </w:t>
+      </w:r>
+      <w:proofErr w:type="spellStart"/>
+      <w:r>
+        <w:rPr>
+          <w:rFonts w:ascii="Times New Roman" w:hAnsi="Times New Roman" w:cs="Times New Roman"/>
+          <w:sz w:val="24"/>
+          <w:szCs w:val="24"/>
+        </w:rPr>
+        <w:t>relacionadas</w:t>
+      </w:r>
+      <w:proofErr w:type="spellEnd"/>
+      <w:r>
+        <w:rPr>
+          <w:rFonts w:ascii="Times New Roman" w:hAnsi="Times New Roman" w:cs="Times New Roman"/>
+          <w:sz w:val="24"/>
+          <w:szCs w:val="24"/>
+        </w:rPr>
+        <w:t xml:space="preserve"> con </w:t>
+      </w:r>
+      <w:proofErr w:type="spellStart"/>
+      <w:r>
+        <w:rPr>
+          <w:rFonts w:ascii="Times New Roman" w:hAnsi="Times New Roman" w:cs="Times New Roman"/>
+          <w:sz w:val="24"/>
+          <w:szCs w:val="24"/>
+        </w:rPr>
+        <w:t>nutrición</w:t>
+      </w:r>
+      <w:proofErr w:type="spellEnd"/>
+      <w:r>
+        <w:rPr>
+          <w:rFonts w:ascii="Times New Roman" w:hAnsi="Times New Roman" w:cs="Times New Roman"/>
+          <w:sz w:val="24"/>
+          <w:szCs w:val="24"/>
+        </w:rPr>
+        <w:t xml:space="preserve"> y </w:t>
+      </w:r>
+      <w:proofErr w:type="spellStart"/>
+      <w:r>
+        <w:rPr>
+          <w:rFonts w:ascii="Times New Roman" w:hAnsi="Times New Roman" w:cs="Times New Roman"/>
+          <w:sz w:val="24"/>
+          <w:szCs w:val="24"/>
+        </w:rPr>
+        <w:t>perfiles</w:t>
+      </w:r>
+      <w:proofErr w:type="spellEnd"/>
+      <w:r>
+        <w:rPr>
+          <w:rFonts w:ascii="Times New Roman" w:hAnsi="Times New Roman" w:cs="Times New Roman"/>
+          <w:sz w:val="24"/>
+          <w:szCs w:val="24"/>
+        </w:rPr>
+        <w:t xml:space="preserve"> </w:t>
+      </w:r>
+      <w:proofErr w:type="spellStart"/>
+      <w:r>
+        <w:rPr>
+          <w:rFonts w:ascii="Times New Roman" w:hAnsi="Times New Roman" w:cs="Times New Roman"/>
+          <w:sz w:val="24"/>
+          <w:szCs w:val="24"/>
+        </w:rPr>
+        <w:t>alimentarios</w:t>
+      </w:r>
+      <w:proofErr w:type="spellEnd"/>
+      <w:r>
+        <w:rPr>
+          <w:rFonts w:ascii="Times New Roman" w:hAnsi="Times New Roman" w:cs="Times New Roman"/>
+          <w:sz w:val="24"/>
+          <w:szCs w:val="24"/>
+        </w:rPr>
+        <w:t>.</w:t>
+      </w:r>
+    </w:p>
+    <w:p>
+      <w:pPr>
+        <w:pStyle w:val="Listaconvietas"/>
+        <w:spacing w:line="480" w:lineRule="auto"/>
+        <w:rPr>
+          <w:rFonts w:ascii="Times New Roman" w:hAnsi="Times New Roman" w:cs="Times New Roman"/>
+          <w:sz w:val="24"/>
+          <w:szCs w:val="24"/>
+        </w:rPr>
+      </w:pPr>
+      <w:r>
+        <w:rPr>
+          <w:rFonts w:ascii="Times New Roman" w:hAnsi="Times New Roman" w:cs="Times New Roman"/>
+          <w:sz w:val="24"/>
+          <w:szCs w:val="24"/>
+        </w:rPr>
+        <w:t xml:space="preserve">Desarrollo de </w:t>
+      </w:r>
+      <w:proofErr w:type="spellStart"/>
+      <w:r>
+        <w:rPr>
+          <w:rFonts w:ascii="Times New Roman" w:hAnsi="Times New Roman" w:cs="Times New Roman"/>
+          <w:sz w:val="24"/>
+          <w:szCs w:val="24"/>
+        </w:rPr>
+        <w:t>funcionalidades</w:t>
+      </w:r>
+      <w:proofErr w:type="spellEnd"/>
+      <w:r>
+        <w:rPr>
+          <w:rFonts w:ascii="Times New Roman" w:hAnsi="Times New Roman" w:cs="Times New Roman"/>
+          <w:sz w:val="24"/>
+          <w:szCs w:val="24"/>
+        </w:rPr>
+        <w:t xml:space="preserve"> </w:t>
+      </w:r>
+      <w:proofErr w:type="spellStart"/>
+      <w:r>
+        <w:rPr>
+          <w:rFonts w:ascii="Times New Roman" w:hAnsi="Times New Roman" w:cs="Times New Roman"/>
+          <w:sz w:val="24"/>
+          <w:szCs w:val="24"/>
+        </w:rPr>
+        <w:t>relacionadas</w:t>
+      </w:r>
+      <w:proofErr w:type="spellEnd"/>
+      <w:r>
+        <w:rPr>
+          <w:rFonts w:ascii="Times New Roman" w:hAnsi="Times New Roman" w:cs="Times New Roman"/>
+          <w:sz w:val="24"/>
+          <w:szCs w:val="24"/>
+        </w:rPr>
+        <w:t xml:space="preserve"> con </w:t>
+      </w:r>
+      <w:proofErr w:type="spellStart"/>
+      <w:r>
+        <w:rPr>
+          <w:rFonts w:ascii="Times New Roman" w:hAnsi="Times New Roman" w:cs="Times New Roman"/>
+          <w:sz w:val="24"/>
+          <w:szCs w:val="24"/>
+        </w:rPr>
+        <w:t>transporte</w:t>
+      </w:r>
+      <w:proofErr w:type="spellEnd"/>
+      <w:r>
+        <w:rPr>
+          <w:rFonts w:ascii="Times New Roman" w:hAnsi="Times New Roman" w:cs="Times New Roman"/>
+          <w:sz w:val="24"/>
+          <w:szCs w:val="24"/>
+        </w:rPr>
+        <w:t xml:space="preserve">, </w:t>
+      </w:r>
+      <w:proofErr w:type="spellStart"/>
+      <w:r>
+        <w:rPr>
+          <w:rFonts w:ascii="Times New Roman" w:hAnsi="Times New Roman" w:cs="Times New Roman"/>
+          <w:sz w:val="24"/>
+          <w:szCs w:val="24"/>
+        </w:rPr>
+        <w:t>pedidos</w:t>
+      </w:r>
+      <w:proofErr w:type="spellEnd"/>
+      <w:r>
+        <w:rPr>
+          <w:rFonts w:ascii="Times New Roman" w:hAnsi="Times New Roman" w:cs="Times New Roman"/>
+          <w:sz w:val="24"/>
+          <w:szCs w:val="24"/>
+        </w:rPr>
+        <w:t xml:space="preserve"> o </w:t>
+      </w:r>
+      <w:proofErr w:type="spellStart"/>
+      <w:r>
+        <w:rPr>
+          <w:rFonts w:ascii="Times New Roman" w:hAnsi="Times New Roman" w:cs="Times New Roman"/>
+          <w:sz w:val="24"/>
+          <w:szCs w:val="24"/>
+        </w:rPr>
+        <w:t>entrega</w:t>
+      </w:r>
+      <w:proofErr w:type="spellEnd"/>
+      <w:r>
+        <w:rPr>
+          <w:rFonts w:ascii="Times New Roman" w:hAnsi="Times New Roman" w:cs="Times New Roman"/>
+          <w:sz w:val="24"/>
+          <w:szCs w:val="24"/>
+        </w:rPr>
+        <w:t xml:space="preserve"> de </w:t>
+      </w:r>
+      <w:proofErr w:type="spellStart"/>
+      <w:r>
+        <w:rPr>
+          <w:rFonts w:ascii="Times New Roman" w:hAnsi="Times New Roman" w:cs="Times New Roman"/>
+          <w:sz w:val="24"/>
+          <w:szCs w:val="24"/>
+        </w:rPr>
+        <w:t>productos</w:t>
+      </w:r>
+      <w:proofErr w:type="spellEnd"/>
+      <w:r>
+        <w:rPr>
+          <w:rFonts w:ascii="Times New Roman" w:hAnsi="Times New Roman" w:cs="Times New Roman"/>
+          <w:sz w:val="24"/>
+          <w:szCs w:val="24"/>
+        </w:rPr>
+        <w:t>.</w:t>
+      </w:r>
+    </w:p>
+    <w:p>
+      <w:pPr>
+        <w:pStyle w:val="Listaconvietas"/>
+        <w:spacing w:line="480" w:lineRule="auto"/>
+        <w:rPr>
+          <w:rFonts w:ascii="Times New Roman" w:hAnsi="Times New Roman" w:cs="Times New Roman"/>
+          <w:sz w:val="24"/>
+          <w:szCs w:val="24"/>
+        </w:rPr>
+      </w:pPr>
+      <w:proofErr w:type="spellStart"/>
+      <w:r>
+        <w:rPr>
+          <w:rFonts w:ascii="Times New Roman" w:hAnsi="Times New Roman" w:cs="Times New Roman"/>
+          <w:sz w:val="24"/>
+          <w:szCs w:val="24"/>
         </w:rPr>
         <w:lastRenderedPageBreak/>
-        <w:t>Historial de atención:</w:t>
-      </w:r>
-      <w:r>
-        <w:rPr>
-          <w:rFonts w:ascii="Times New Roman" w:hAnsi="Times New Roman" w:cs="Times New Roman"/>
-        </w:rPr>
-        <w:t xml:space="preserve"> Acceso al perfil del cliente para revisar qué cortes se ha realizado anteriormente y cuáles son sus preferencias, permitiendo un servicio personalizado.</w:t>
-      </w:r>
-    </w:p>
-    <w:p>
-      <w:pPr>
+        <w:t>Gestión</w:t>
+      </w:r>
+      <w:proofErr w:type="spellEnd"/>
+      <w:r>
+        <w:rPr>
+          <w:rFonts w:ascii="Times New Roman" w:hAnsi="Times New Roman" w:cs="Times New Roman"/>
+          <w:sz w:val="24"/>
+          <w:szCs w:val="24"/>
+        </w:rPr>
+        <w:t xml:space="preserve"> de </w:t>
+      </w:r>
+      <w:proofErr w:type="spellStart"/>
+      <w:r>
+        <w:rPr>
+          <w:rFonts w:ascii="Times New Roman" w:hAnsi="Times New Roman" w:cs="Times New Roman"/>
+          <w:sz w:val="24"/>
+          <w:szCs w:val="24"/>
+        </w:rPr>
+        <w:t>información</w:t>
+      </w:r>
+      <w:proofErr w:type="spellEnd"/>
+      <w:r>
+        <w:rPr>
+          <w:rFonts w:ascii="Times New Roman" w:hAnsi="Times New Roman" w:cs="Times New Roman"/>
+          <w:sz w:val="24"/>
+          <w:szCs w:val="24"/>
+        </w:rPr>
+        <w:t xml:space="preserve"> </w:t>
+      </w:r>
+      <w:proofErr w:type="spellStart"/>
+      <w:r>
+        <w:rPr>
+          <w:rFonts w:ascii="Times New Roman" w:hAnsi="Times New Roman" w:cs="Times New Roman"/>
+          <w:sz w:val="24"/>
+          <w:szCs w:val="24"/>
+        </w:rPr>
+        <w:t>correspondiente</w:t>
+      </w:r>
+      <w:proofErr w:type="spellEnd"/>
+      <w:r>
+        <w:rPr>
+          <w:rFonts w:ascii="Times New Roman" w:hAnsi="Times New Roman" w:cs="Times New Roman"/>
+          <w:sz w:val="24"/>
+          <w:szCs w:val="24"/>
+        </w:rPr>
+        <w:t xml:space="preserve"> a </w:t>
+      </w:r>
+      <w:proofErr w:type="spellStart"/>
+      <w:r>
+        <w:rPr>
+          <w:rFonts w:ascii="Times New Roman" w:hAnsi="Times New Roman" w:cs="Times New Roman"/>
+          <w:sz w:val="24"/>
+          <w:szCs w:val="24"/>
+        </w:rPr>
+        <w:t>módulos</w:t>
+      </w:r>
+      <w:proofErr w:type="spellEnd"/>
+      <w:r>
+        <w:rPr>
+          <w:rFonts w:ascii="Times New Roman" w:hAnsi="Times New Roman" w:cs="Times New Roman"/>
+          <w:sz w:val="24"/>
+          <w:szCs w:val="24"/>
+        </w:rPr>
+        <w:t xml:space="preserve"> </w:t>
+      </w:r>
+      <w:proofErr w:type="spellStart"/>
+      <w:r>
+        <w:rPr>
+          <w:rFonts w:ascii="Times New Roman" w:hAnsi="Times New Roman" w:cs="Times New Roman"/>
+          <w:sz w:val="24"/>
+          <w:szCs w:val="24"/>
+        </w:rPr>
+        <w:t>diferentes</w:t>
+      </w:r>
+      <w:proofErr w:type="spellEnd"/>
+      <w:r>
+        <w:rPr>
+          <w:rFonts w:ascii="Times New Roman" w:hAnsi="Times New Roman" w:cs="Times New Roman"/>
+          <w:sz w:val="24"/>
+          <w:szCs w:val="24"/>
+        </w:rPr>
+        <w:t xml:space="preserve"> al </w:t>
+      </w:r>
+      <w:proofErr w:type="spellStart"/>
+      <w:r>
+        <w:rPr>
+          <w:rFonts w:ascii="Times New Roman" w:hAnsi="Times New Roman" w:cs="Times New Roman"/>
+          <w:sz w:val="24"/>
+          <w:szCs w:val="24"/>
+        </w:rPr>
+        <w:t>componente</w:t>
+      </w:r>
+      <w:proofErr w:type="spellEnd"/>
+      <w:r>
+        <w:rPr>
+          <w:rFonts w:ascii="Times New Roman" w:hAnsi="Times New Roman" w:cs="Times New Roman"/>
+          <w:sz w:val="24"/>
+          <w:szCs w:val="24"/>
+        </w:rPr>
+        <w:t xml:space="preserve"> de </w:t>
+      </w:r>
+      <w:proofErr w:type="spellStart"/>
+      <w:r>
+        <w:rPr>
+          <w:rFonts w:ascii="Times New Roman" w:hAnsi="Times New Roman" w:cs="Times New Roman"/>
+          <w:sz w:val="24"/>
+          <w:szCs w:val="24"/>
+        </w:rPr>
+        <w:t>comunidad</w:t>
+      </w:r>
+      <w:proofErr w:type="spellEnd"/>
+      <w:r>
+        <w:rPr>
+          <w:rFonts w:ascii="Times New Roman" w:hAnsi="Times New Roman" w:cs="Times New Roman"/>
+          <w:sz w:val="24"/>
+          <w:szCs w:val="24"/>
+        </w:rPr>
+        <w:t>.</w:t>
+      </w:r>
+    </w:p>
+    <w:p>
+      <w:pPr>
+        <w:pStyle w:val="Listaconvietas"/>
         <w:spacing w:line="480" w:lineRule="auto"/>
         <w:rPr>
           <w:rFonts w:ascii="Times New Roman" w:hAnsi="Times New Roman" w:cs="Times New Roman"/>
-        </w:rPr>
-      </w:pPr>
-      <w:r>
-        <w:rPr>
-          <w:rFonts w:ascii="Times New Roman" w:hAnsi="Times New Roman" w:cs="Times New Roman"/>
-          <w:b/>
-          <w:bCs/>
-        </w:rPr>
-        <w:t>3. Funciones Internas del Sistema:</w:t>
-      </w:r>
-    </w:p>
-    <w:p>
-      <w:pPr>
-        <w:numPr>
-          <w:ilvl w:val="0"/>
-          <w:numId w:val="7"/>
-        </w:numPr>
+          <w:sz w:val="24"/>
+          <w:szCs w:val="24"/>
+        </w:rPr>
+      </w:pPr>
+      <w:proofErr w:type="spellStart"/>
+      <w:r>
+        <w:rPr>
+          <w:rFonts w:ascii="Times New Roman" w:hAnsi="Times New Roman" w:cs="Times New Roman"/>
+          <w:sz w:val="24"/>
+          <w:szCs w:val="24"/>
+        </w:rPr>
+        <w:t>Administración</w:t>
+      </w:r>
+      <w:proofErr w:type="spellEnd"/>
+      <w:r>
+        <w:rPr>
+          <w:rFonts w:ascii="Times New Roman" w:hAnsi="Times New Roman" w:cs="Times New Roman"/>
+          <w:sz w:val="24"/>
+          <w:szCs w:val="24"/>
+        </w:rPr>
+        <w:t xml:space="preserve"> de </w:t>
+      </w:r>
+      <w:proofErr w:type="spellStart"/>
+      <w:r>
+        <w:rPr>
+          <w:rFonts w:ascii="Times New Roman" w:hAnsi="Times New Roman" w:cs="Times New Roman"/>
+          <w:sz w:val="24"/>
+          <w:szCs w:val="24"/>
+        </w:rPr>
+        <w:t>contenidos</w:t>
+      </w:r>
+      <w:proofErr w:type="spellEnd"/>
+      <w:r>
+        <w:rPr>
+          <w:rFonts w:ascii="Times New Roman" w:hAnsi="Times New Roman" w:cs="Times New Roman"/>
+          <w:sz w:val="24"/>
+          <w:szCs w:val="24"/>
+        </w:rPr>
+        <w:t xml:space="preserve"> que no </w:t>
+      </w:r>
+      <w:proofErr w:type="spellStart"/>
+      <w:r>
+        <w:rPr>
+          <w:rFonts w:ascii="Times New Roman" w:hAnsi="Times New Roman" w:cs="Times New Roman"/>
+          <w:sz w:val="24"/>
+          <w:szCs w:val="24"/>
+        </w:rPr>
+        <w:t>estén</w:t>
+      </w:r>
+      <w:proofErr w:type="spellEnd"/>
+      <w:r>
+        <w:rPr>
+          <w:rFonts w:ascii="Times New Roman" w:hAnsi="Times New Roman" w:cs="Times New Roman"/>
+          <w:sz w:val="24"/>
+          <w:szCs w:val="24"/>
+        </w:rPr>
+        <w:t xml:space="preserve"> </w:t>
+      </w:r>
+      <w:proofErr w:type="spellStart"/>
+      <w:r>
+        <w:rPr>
+          <w:rFonts w:ascii="Times New Roman" w:hAnsi="Times New Roman" w:cs="Times New Roman"/>
+          <w:sz w:val="24"/>
+          <w:szCs w:val="24"/>
+        </w:rPr>
+        <w:t>relacionados</w:t>
+      </w:r>
+      <w:proofErr w:type="spellEnd"/>
+      <w:r>
+        <w:rPr>
+          <w:rFonts w:ascii="Times New Roman" w:hAnsi="Times New Roman" w:cs="Times New Roman"/>
+          <w:sz w:val="24"/>
+          <w:szCs w:val="24"/>
+        </w:rPr>
+        <w:t xml:space="preserve"> con las </w:t>
+      </w:r>
+      <w:proofErr w:type="spellStart"/>
+      <w:r>
+        <w:rPr>
+          <w:rFonts w:ascii="Times New Roman" w:hAnsi="Times New Roman" w:cs="Times New Roman"/>
+          <w:sz w:val="24"/>
+          <w:szCs w:val="24"/>
+        </w:rPr>
+        <w:t>interacciones</w:t>
+      </w:r>
+      <w:proofErr w:type="spellEnd"/>
+      <w:r>
+        <w:rPr>
+          <w:rFonts w:ascii="Times New Roman" w:hAnsi="Times New Roman" w:cs="Times New Roman"/>
+          <w:sz w:val="24"/>
+          <w:szCs w:val="24"/>
+        </w:rPr>
+        <w:t xml:space="preserve"> </w:t>
+      </w:r>
+      <w:proofErr w:type="spellStart"/>
+      <w:r>
+        <w:rPr>
+          <w:rFonts w:ascii="Times New Roman" w:hAnsi="Times New Roman" w:cs="Times New Roman"/>
+          <w:sz w:val="24"/>
+          <w:szCs w:val="24"/>
+        </w:rPr>
+        <w:t>sociales</w:t>
+      </w:r>
+      <w:proofErr w:type="spellEnd"/>
+      <w:r>
+        <w:rPr>
+          <w:rFonts w:ascii="Times New Roman" w:hAnsi="Times New Roman" w:cs="Times New Roman"/>
+          <w:sz w:val="24"/>
+          <w:szCs w:val="24"/>
+        </w:rPr>
+        <w:t xml:space="preserve"> </w:t>
+      </w:r>
+      <w:proofErr w:type="spellStart"/>
+      <w:r>
+        <w:rPr>
+          <w:rFonts w:ascii="Times New Roman" w:hAnsi="Times New Roman" w:cs="Times New Roman"/>
+          <w:sz w:val="24"/>
+          <w:szCs w:val="24"/>
+        </w:rPr>
+        <w:t>definidas</w:t>
+      </w:r>
+      <w:proofErr w:type="spellEnd"/>
+      <w:r>
+        <w:rPr>
+          <w:rFonts w:ascii="Times New Roman" w:hAnsi="Times New Roman" w:cs="Times New Roman"/>
+          <w:sz w:val="24"/>
+          <w:szCs w:val="24"/>
+        </w:rPr>
+        <w:t xml:space="preserve"> para las </w:t>
+      </w:r>
+      <w:proofErr w:type="spellStart"/>
+      <w:r>
+        <w:rPr>
+          <w:rFonts w:ascii="Times New Roman" w:hAnsi="Times New Roman" w:cs="Times New Roman"/>
+          <w:sz w:val="24"/>
+          <w:szCs w:val="24"/>
+        </w:rPr>
+        <w:t>recetas</w:t>
+      </w:r>
+      <w:proofErr w:type="spellEnd"/>
+      <w:r>
+        <w:rPr>
+          <w:rFonts w:ascii="Times New Roman" w:hAnsi="Times New Roman" w:cs="Times New Roman"/>
+          <w:sz w:val="24"/>
+          <w:szCs w:val="24"/>
+        </w:rPr>
+        <w:t>.</w:t>
+      </w:r>
+    </w:p>
+    <w:p>
+      <w:pPr>
+        <w:pStyle w:val="Listaconvietas"/>
         <w:spacing w:line="480" w:lineRule="auto"/>
         <w:rPr>
           <w:rFonts w:ascii="Times New Roman" w:hAnsi="Times New Roman" w:cs="Times New Roman"/>
-        </w:rPr>
-      </w:pPr>
-      <w:r>
-        <w:rPr>
-          <w:rFonts w:ascii="Times New Roman" w:hAnsi="Times New Roman" w:cs="Times New Roman"/>
-          <w:b/>
-          <w:bCs/>
-        </w:rPr>
-        <w:t>Prevención de solapamiento:</w:t>
-      </w:r>
-      <w:r>
-        <w:rPr>
-          <w:rFonts w:ascii="Times New Roman" w:hAnsi="Times New Roman" w:cs="Times New Roman"/>
-        </w:rPr>
-        <w:t xml:space="preserve"> Lógica en el </w:t>
-      </w:r>
-      <w:proofErr w:type="spellStart"/>
-      <w:r>
-        <w:rPr>
-          <w:rFonts w:ascii="Times New Roman" w:hAnsi="Times New Roman" w:cs="Times New Roman"/>
-        </w:rPr>
-        <w:t>backend</w:t>
-      </w:r>
-      <w:proofErr w:type="spellEnd"/>
-      <w:r>
-        <w:rPr>
-          <w:rFonts w:ascii="Times New Roman" w:hAnsi="Times New Roman" w:cs="Times New Roman"/>
-        </w:rPr>
-        <w:t xml:space="preserve"> que valida y bloquea los horarios ocupados, garantizando que no existan cruces de citas para un mismo barbero.</w:t>
-      </w:r>
-    </w:p>
-    <w:p>
-      <w:pPr>
-        <w:numPr>
-          <w:ilvl w:val="0"/>
-          <w:numId w:val="7"/>
-        </w:numPr>
-        <w:spacing w:line="480" w:lineRule="auto"/>
-        <w:rPr>
-          <w:rFonts w:ascii="Times New Roman" w:hAnsi="Times New Roman" w:cs="Times New Roman"/>
-        </w:rPr>
-      </w:pPr>
-      <w:r>
-        <w:rPr>
-          <w:rFonts w:ascii="Times New Roman" w:hAnsi="Times New Roman" w:cs="Times New Roman"/>
-          <w:b/>
-          <w:bCs/>
-        </w:rPr>
-        <w:t>Sistema de recordatorios:</w:t>
-      </w:r>
-      <w:r>
-        <w:rPr>
-          <w:rFonts w:ascii="Times New Roman" w:hAnsi="Times New Roman" w:cs="Times New Roman"/>
-        </w:rPr>
-        <w:t xml:space="preserve"> Generación de notificaciones o alertas automáticas previas a la cita para mitigar el olvido por parte de los clientes.</w:t>
-      </w:r>
-    </w:p>
-    <w:p>
-      <w:pPr>
-        <w:rPr>
-          <w:rFonts w:ascii="Times New Roman" w:hAnsi="Times New Roman" w:cs="Times New Roman"/>
-        </w:rPr>
-      </w:pPr>
-    </w:p>
-    <w:p>
-      <w:pPr>
-        <w:pStyle w:val="Ttulo2"/>
-        <w:rPr>
-          <w:rFonts w:cs="Times New Roman"/>
-          <w:szCs w:val="24"/>
-        </w:rPr>
-      </w:pPr>
-      <w:bookmarkStart w:id="12" w:name="_Toc241702564"/>
-      <w:r>
-        <w:rPr>
-          <w:rFonts w:cs="Times New Roman"/>
-          <w:szCs w:val="24"/>
-        </w:rPr>
-        <w:t>Exclusiones</w:t>
-      </w:r>
-      <w:bookmarkEnd w:id="12"/>
-    </w:p>
-    <w:p>
-      <w:pPr>
-        <w:spacing w:line="480" w:lineRule="auto"/>
-        <w:ind w:firstLine="720"/>
-        <w:rPr>
-          <w:rFonts w:ascii="Times New Roman" w:hAnsi="Times New Roman" w:cs="Times New Roman"/>
-        </w:rPr>
-      </w:pPr>
-      <w:r>
-        <w:rPr>
-          <w:rFonts w:ascii="Times New Roman" w:hAnsi="Times New Roman" w:cs="Times New Roman"/>
-        </w:rPr>
-        <w:t xml:space="preserve">Para delimitar correctamente el desarrollo, esta versión de la aplicación </w:t>
-      </w:r>
-      <w:r>
-        <w:rPr>
-          <w:rFonts w:ascii="Times New Roman" w:hAnsi="Times New Roman" w:cs="Times New Roman"/>
-          <w:b/>
-          <w:bCs/>
-        </w:rPr>
-        <w:t>no</w:t>
-      </w:r>
-      <w:r>
-        <w:rPr>
-          <w:rFonts w:ascii="Times New Roman" w:hAnsi="Times New Roman" w:cs="Times New Roman"/>
-        </w:rPr>
-        <w:t xml:space="preserve"> contempla integraciones con pasarelas de pago en línea (los cobros se seguirán realizando en el local), no incluye módulos de facturación electrónica contable, y tampoco abarcará la gestión de inventario de productos físicos (como venta de ceras, lociones o cuchillas). El proyecto está enfocado estrictamente en la optimización operativa de los servicios y el tiempo.</w:t>
-      </w:r>
-    </w:p>
-    <w:p>
-      <w:pPr>
-        <w:spacing w:line="480" w:lineRule="auto"/>
-        <w:ind w:firstLine="720"/>
-        <w:rPr>
-          <w:rFonts w:ascii="Times New Roman" w:hAnsi="Times New Roman" w:cs="Times New Roman"/>
-        </w:rPr>
-      </w:pPr>
+          <w:sz w:val="24"/>
+          <w:szCs w:val="24"/>
+        </w:rPr>
+      </w:pPr>
+      <w:proofErr w:type="spellStart"/>
+      <w:r>
+        <w:rPr>
+          <w:rFonts w:ascii="Times New Roman" w:hAnsi="Times New Roman" w:cs="Times New Roman"/>
+          <w:sz w:val="24"/>
+          <w:szCs w:val="24"/>
+        </w:rPr>
+        <w:t>Implementación</w:t>
+      </w:r>
+      <w:proofErr w:type="spellEnd"/>
+      <w:r>
+        <w:rPr>
+          <w:rFonts w:ascii="Times New Roman" w:hAnsi="Times New Roman" w:cs="Times New Roman"/>
+          <w:sz w:val="24"/>
+          <w:szCs w:val="24"/>
+        </w:rPr>
+        <w:t xml:space="preserve"> de </w:t>
+      </w:r>
+      <w:proofErr w:type="spellStart"/>
+      <w:r>
+        <w:rPr>
+          <w:rFonts w:ascii="Times New Roman" w:hAnsi="Times New Roman" w:cs="Times New Roman"/>
+          <w:sz w:val="24"/>
+          <w:szCs w:val="24"/>
+        </w:rPr>
+        <w:t>funcionalidades</w:t>
+      </w:r>
+      <w:proofErr w:type="spellEnd"/>
+      <w:r>
+        <w:rPr>
+          <w:rFonts w:ascii="Times New Roman" w:hAnsi="Times New Roman" w:cs="Times New Roman"/>
+          <w:sz w:val="24"/>
+          <w:szCs w:val="24"/>
+        </w:rPr>
+        <w:t xml:space="preserve"> </w:t>
+      </w:r>
+      <w:proofErr w:type="spellStart"/>
+      <w:r>
+        <w:rPr>
+          <w:rFonts w:ascii="Times New Roman" w:hAnsi="Times New Roman" w:cs="Times New Roman"/>
+          <w:sz w:val="24"/>
+          <w:szCs w:val="24"/>
+        </w:rPr>
+        <w:t>diferentes</w:t>
+      </w:r>
+      <w:proofErr w:type="spellEnd"/>
+      <w:r>
+        <w:rPr>
+          <w:rFonts w:ascii="Times New Roman" w:hAnsi="Times New Roman" w:cs="Times New Roman"/>
+          <w:sz w:val="24"/>
+          <w:szCs w:val="24"/>
+        </w:rPr>
+        <w:t xml:space="preserve"> a las </w:t>
+      </w:r>
+      <w:proofErr w:type="spellStart"/>
+      <w:r>
+        <w:rPr>
+          <w:rFonts w:ascii="Times New Roman" w:hAnsi="Times New Roman" w:cs="Times New Roman"/>
+          <w:sz w:val="24"/>
+          <w:szCs w:val="24"/>
+        </w:rPr>
+        <w:t>establecidas</w:t>
+      </w:r>
+      <w:proofErr w:type="spellEnd"/>
+      <w:r>
+        <w:rPr>
+          <w:rFonts w:ascii="Times New Roman" w:hAnsi="Times New Roman" w:cs="Times New Roman"/>
+          <w:sz w:val="24"/>
+          <w:szCs w:val="24"/>
+        </w:rPr>
+        <w:t xml:space="preserve"> dentro de las </w:t>
+      </w:r>
+      <w:proofErr w:type="spellStart"/>
+      <w:r>
+        <w:rPr>
+          <w:rFonts w:ascii="Times New Roman" w:hAnsi="Times New Roman" w:cs="Times New Roman"/>
+          <w:sz w:val="24"/>
+          <w:szCs w:val="24"/>
+        </w:rPr>
+        <w:t>entidades</w:t>
+      </w:r>
+      <w:proofErr w:type="spellEnd"/>
+      <w:r>
+        <w:rPr>
+          <w:rFonts w:ascii="Times New Roman" w:hAnsi="Times New Roman" w:cs="Times New Roman"/>
+          <w:sz w:val="24"/>
+          <w:szCs w:val="24"/>
+        </w:rPr>
+        <w:t xml:space="preserve"> y </w:t>
+      </w:r>
+      <w:proofErr w:type="spellStart"/>
+      <w:r>
+        <w:rPr>
+          <w:rFonts w:ascii="Times New Roman" w:hAnsi="Times New Roman" w:cs="Times New Roman"/>
+          <w:sz w:val="24"/>
+          <w:szCs w:val="24"/>
+        </w:rPr>
+        <w:t>relaciones</w:t>
+      </w:r>
+      <w:proofErr w:type="spellEnd"/>
+      <w:r>
+        <w:rPr>
+          <w:rFonts w:ascii="Times New Roman" w:hAnsi="Times New Roman" w:cs="Times New Roman"/>
+          <w:sz w:val="24"/>
+          <w:szCs w:val="24"/>
+        </w:rPr>
+        <w:t xml:space="preserve"> </w:t>
+      </w:r>
+      <w:proofErr w:type="spellStart"/>
+      <w:r>
+        <w:rPr>
+          <w:rFonts w:ascii="Times New Roman" w:hAnsi="Times New Roman" w:cs="Times New Roman"/>
+          <w:sz w:val="24"/>
+          <w:szCs w:val="24"/>
+        </w:rPr>
+        <w:t>correspondientes</w:t>
+      </w:r>
+      <w:proofErr w:type="spellEnd"/>
+      <w:r>
+        <w:rPr>
+          <w:rFonts w:ascii="Times New Roman" w:hAnsi="Times New Roman" w:cs="Times New Roman"/>
+          <w:sz w:val="24"/>
+          <w:szCs w:val="24"/>
+        </w:rPr>
+        <w:t xml:space="preserve"> al </w:t>
+      </w:r>
+      <w:proofErr w:type="spellStart"/>
+      <w:r>
+        <w:rPr>
+          <w:rFonts w:ascii="Times New Roman" w:hAnsi="Times New Roman" w:cs="Times New Roman"/>
+          <w:sz w:val="24"/>
+          <w:szCs w:val="24"/>
+        </w:rPr>
+        <w:t>módulo</w:t>
+      </w:r>
+      <w:proofErr w:type="spellEnd"/>
+      <w:r>
+        <w:rPr>
+          <w:rFonts w:ascii="Times New Roman" w:hAnsi="Times New Roman" w:cs="Times New Roman"/>
+          <w:sz w:val="24"/>
+          <w:szCs w:val="24"/>
+        </w:rPr>
+        <w:t>.</w:t>
+      </w:r>
     </w:p>
     <w:p>
       <w:pPr>
@@ -3797,21 +5789,6 @@
     </w:p>
     <w:p>
       <w:pPr>
-        <w:jc w:val="center"/>
-        <w:rPr>
-          <w:rFonts w:ascii="Times New Roman" w:hAnsi="Times New Roman" w:cs="Times New Roman"/>
-        </w:rPr>
-      </w:pPr>
-      <w:r>
-        <w:rPr>
-          <w:rFonts w:ascii="Times New Roman" w:hAnsi="Times New Roman" w:cs="Times New Roman"/>
-        </w:rPr>
-        <w:br w:type="page"/>
-      </w:r>
-    </w:p>
-    <w:p>
-      <w:pPr>
-        <w:jc w:val="center"/>
         <w:rPr>
           <w:rFonts w:ascii="Times New Roman" w:hAnsi="Times New Roman" w:cs="Times New Roman"/>
         </w:rPr>
@@ -3828,8 +5805,29 @@
 </file>
 
 <file path=word/numbering.xml><?xml version="1.0" encoding="utf-8"?>
-<w:numbering xmlns:wpc="http://schemas.microsoft.com/office/word/2010/wordprocessingCanvas" xmlns:cx="http://schemas.microsoft.com/office/drawing/2014/chartex" xmlns:cx1="http://schemas.microsoft.com/office/drawing/2015/9/8/chartex" xmlns:cx2="http://schemas.microsoft.com/office/drawing/2015/10/21/chartex" xmlns:cx3="http://schemas.microsoft.com/office/drawing/2016/5/9/chartex" xmlns:cx4="http://schemas.microsoft.com/office/drawing/2016/5/10/chartex" xmlns:cx5="http://schemas.microsoft.com/office/drawing/2016/5/11/chartex" xmlns:cx6="http://schemas.microsoft.com/office/drawing/2016/5/12/chartex" xmlns:cx7="http://schemas.microsoft.com/office/drawing/2016/5/13/chartex" xmlns:cx8="http://schemas.microsoft.com/office/drawing/2016/5/14/chartex" xmlns:mc="http://schemas.openxmlformats.org/markup-compatibility/2006" xmlns:aink="http://schemas.microsoft.com/office/drawing/2016/ink" xmlns:am3d="http://schemas.microsoft.com/office/drawing/2017/model3d" xmlns:o="urn:schemas-microsoft-com:office:office" xmlns:oel="http://schemas.microsoft.com/office/2019/extlst" xmlns:r="http://schemas.openxmlformats.org/officeDocument/2006/relationships" xmlns:m="http://schemas.openxmlformats.org/officeDocument/2006/math" xmlns:v="urn:schemas-microsoft-com:vml" xmlns:wp14="http://schemas.microsoft.com/office/word/2010/wordprocessingDrawing" xmlns:wp="http://schemas.openxmlformats.org/drawingml/2006/wordprocessingDrawing" xmlns:w10="urn:schemas-microsoft-com:office:word" xmlns:w="http://schemas.openxmlformats.org/wordprocessingml/2006/main" xmlns:w14="http://schemas.microsoft.com/office/word/2010/wordml" xmlns:w15="http://schemas.microsoft.com/office/word/2012/wordml" xmlns:w16cex="http://schemas.microsoft.com/office/word/2018/wordml/cex" xmlns:w16cid="http://schemas.microsoft.com/office/word/2016/wordml/cid" xmlns:w16="http://schemas.microsoft.com/office/word/2018/wordml" xmlns:w16du="http://schemas.microsoft.com/office/word/2023/wordml/word16du" xmlns:w16sdtdh="http://schemas.microsoft.com/office/word/2020/wordml/sdtdatahash" xmlns:w16se="http://schemas.microsoft.com/office/word/2015/wordml/symex" xmlns:wpg="http://schemas.microsoft.com/office/word/2010/wordprocessingGroup" xmlns:wpi="http://schemas.microsoft.com/office/word/2010/wordprocessingInk" xmlns:wne="http://schemas.microsoft.com/office/word/2006/wordml" xmlns:wps="http://schemas.microsoft.com/office/word/2010/wordprocessingShape" mc:Ignorable="w14 w15 w16se w16cid w16 w16cex w16sdtdh w16du wp14">
+<w:numbering xmlns:wpc="http://schemas.microsoft.com/office/word/2010/wordprocessingCanvas" xmlns:cx="http://schemas.microsoft.com/office/drawing/2014/chartex" xmlns:cx1="http://schemas.microsoft.com/office/drawing/2015/9/8/chartex" xmlns:cx2="http://schemas.microsoft.com/office/drawing/2015/10/21/chartex" xmlns:cx3="http://schemas.microsoft.com/office/drawing/2016/5/9/chartex" xmlns:cx4="http://schemas.microsoft.com/office/drawing/2016/5/10/chartex" xmlns:cx5="http://schemas.microsoft.com/office/drawing/2016/5/11/chartex" xmlns:cx6="http://schemas.microsoft.com/office/drawing/2016/5/12/chartex" xmlns:cx7="http://schemas.microsoft.com/office/drawing/2016/5/13/chartex" xmlns:cx8="http://schemas.microsoft.com/office/drawing/2016/5/14/chartex" xmlns:mc="http://schemas.openxmlformats.org/markup-compatibility/2006" xmlns:aink="http://schemas.microsoft.com/office/drawing/2016/ink" xmlns:am3d="http://schemas.microsoft.com/office/drawing/2017/model3d" xmlns:o="urn:schemas-microsoft-com:office:office" xmlns:r="http://schemas.openxmlformats.org/officeDocument/2006/relationships" xmlns:m="http://schemas.openxmlformats.org/officeDocument/2006/math" xmlns:v="urn:schemas-microsoft-com:vml" xmlns:wp14="http://schemas.microsoft.com/office/word/2010/wordprocessingDrawing" xmlns:wp="http://schemas.openxmlformats.org/drawingml/2006/wordprocessingDrawing" xmlns:w10="urn:schemas-microsoft-com:office:word" xmlns:w="http://schemas.openxmlformats.org/wordprocessingml/2006/main" xmlns:w14="http://schemas.microsoft.com/office/word/2010/wordml" xmlns:w15="http://schemas.microsoft.com/office/word/2012/wordml" xmlns:w16cex="http://schemas.microsoft.com/office/word/2018/wordml/cex" xmlns:w16cid="http://schemas.microsoft.com/office/word/2016/wordml/cid" xmlns:w16="http://schemas.microsoft.com/office/word/2018/wordml" xmlns:w16sdtdh="http://schemas.microsoft.com/office/word/2020/wordml/sdtdatahash" xmlns:w16se="http://schemas.microsoft.com/office/word/2015/wordml/symex" xmlns:wpg="http://schemas.microsoft.com/office/word/2010/wordprocessingGroup" xmlns:wpi="http://schemas.microsoft.com/office/word/2010/wordprocessingInk" xmlns:wne="http://schemas.microsoft.com/office/word/2006/wordml" xmlns:wps="http://schemas.microsoft.com/office/word/2010/wordprocessingShape" mc:Ignorable="w14 w15 w16se w16cid w16 w16cex w16sdtdh wp14">
   <w:abstractNum w:abstractNumId="0" w15:restartNumberingAfterBreak="0">
+    <w:nsid w:val="FFFFFF89"/>
+    <w:multiLevelType w:val="singleLevel"/>
+    <w:tmpl w:val="86D28790"/>
+    <w:lvl w:ilvl="0">
+      <w:start w:val="1"/>
+      <w:numFmt w:val="bullet"/>
+      <w:pStyle w:val="Listaconvietas"/>
+      <w:lvlText w:val=""/>
+      <w:lvlJc w:val="left"/>
+      <w:pPr>
+        <w:tabs>
+          <w:tab w:val="num" w:pos="360"/>
+        </w:tabs>
+        <w:ind w:left="360" w:hanging="360"/>
+      </w:pPr>
+      <w:rPr>
+        <w:rFonts w:ascii="Symbol" w:hAnsi="Symbol" w:hint="default"/>
+      </w:rPr>
+    </w:lvl>
+  </w:abstractNum>
+  <w:abstractNum w:abstractNumId="1" w15:restartNumberingAfterBreak="0">
     <w:nsid w:val="149E244F"/>
     <w:multiLevelType w:val="hybridMultilevel"/>
     <w:tmpl w:val="27288E86"/>
@@ -3941,7 +5939,7 @@
       </w:rPr>
     </w:lvl>
   </w:abstractNum>
-  <w:abstractNum w:abstractNumId="1" w15:restartNumberingAfterBreak="0">
+  <w:abstractNum w:abstractNumId="2" w15:restartNumberingAfterBreak="0">
     <w:nsid w:val="195915A6"/>
     <w:multiLevelType w:val="hybridMultilevel"/>
     <w:tmpl w:val="FA08BCDC"/>
@@ -4053,7 +6051,7 @@
       </w:rPr>
     </w:lvl>
   </w:abstractNum>
-  <w:abstractNum w:abstractNumId="2" w15:restartNumberingAfterBreak="0">
+  <w:abstractNum w:abstractNumId="3" w15:restartNumberingAfterBreak="0">
     <w:nsid w:val="1D697240"/>
     <w:multiLevelType w:val="hybridMultilevel"/>
     <w:tmpl w:val="8F46FBE4"/>
@@ -4139,7 +6137,7 @@
       </w:pPr>
     </w:lvl>
   </w:abstractNum>
-  <w:abstractNum w:abstractNumId="3" w15:restartNumberingAfterBreak="0">
+  <w:abstractNum w:abstractNumId="4" w15:restartNumberingAfterBreak="0">
     <w:nsid w:val="24870064"/>
     <w:multiLevelType w:val="hybridMultilevel"/>
     <w:tmpl w:val="52BA0B96"/>
@@ -4252,7 +6250,7 @@
       </w:rPr>
     </w:lvl>
   </w:abstractNum>
-  <w:abstractNum w:abstractNumId="4" w15:restartNumberingAfterBreak="0">
+  <w:abstractNum w:abstractNumId="5" w15:restartNumberingAfterBreak="0">
     <w:nsid w:val="2FF631EF"/>
     <w:multiLevelType w:val="multilevel"/>
     <w:tmpl w:val="BA60679A"/>
@@ -4401,7 +6399,7 @@
       </w:rPr>
     </w:lvl>
   </w:abstractNum>
-  <w:abstractNum w:abstractNumId="5" w15:restartNumberingAfterBreak="0">
+  <w:abstractNum w:abstractNumId="6" w15:restartNumberingAfterBreak="0">
     <w:nsid w:val="327D240E"/>
     <w:multiLevelType w:val="multilevel"/>
     <w:tmpl w:val="ECBA2908"/>
@@ -4550,7 +6548,7 @@
       </w:rPr>
     </w:lvl>
   </w:abstractNum>
-  <w:abstractNum w:abstractNumId="6" w15:restartNumberingAfterBreak="0">
+  <w:abstractNum w:abstractNumId="7" w15:restartNumberingAfterBreak="0">
     <w:nsid w:val="58B02F24"/>
     <w:multiLevelType w:val="multilevel"/>
     <w:tmpl w:val="57CA5B46"/>
@@ -4699,32 +6697,35 @@
       </w:rPr>
     </w:lvl>
   </w:abstractNum>
-  <w:num w:numId="1" w16cid:durableId="1782801061">
+  <w:num w:numId="1">
+    <w:abstractNumId w:val="4"/>
+  </w:num>
+  <w:num w:numId="2">
+    <w:abstractNumId w:val="2"/>
+  </w:num>
+  <w:num w:numId="3">
+    <w:abstractNumId w:val="1"/>
+  </w:num>
+  <w:num w:numId="4">
     <w:abstractNumId w:val="3"/>
   </w:num>
-  <w:num w:numId="2" w16cid:durableId="1047292899">
-    <w:abstractNumId w:val="1"/>
+  <w:num w:numId="5">
+    <w:abstractNumId w:val="5"/>
   </w:num>
-  <w:num w:numId="3" w16cid:durableId="1075739152">
-    <w:abstractNumId w:val="0"/>
+  <w:num w:numId="6">
+    <w:abstractNumId w:val="7"/>
   </w:num>
-  <w:num w:numId="4" w16cid:durableId="234827722">
-    <w:abstractNumId w:val="2"/>
-  </w:num>
-  <w:num w:numId="5" w16cid:durableId="1934781202">
-    <w:abstractNumId w:val="4"/>
-  </w:num>
-  <w:num w:numId="6" w16cid:durableId="50735537">
+  <w:num w:numId="7">
     <w:abstractNumId w:val="6"/>
   </w:num>
-  <w:num w:numId="7" w16cid:durableId="795369927">
-    <w:abstractNumId w:val="5"/>
+  <w:num w:numId="8">
+    <w:abstractNumId w:val="0"/>
   </w:num>
 </w:numbering>
 </file>
 
 <file path=word/styles.xml><?xml version="1.0" encoding="utf-8"?>
-<w:styles xmlns:mc="http://schemas.openxmlformats.org/markup-compatibility/2006" xmlns:r="http://schemas.openxmlformats.org/officeDocument/2006/relationships" xmlns:w="http://schemas.openxmlformats.org/wordprocessingml/2006/main" xmlns:w14="http://schemas.microsoft.com/office/word/2010/wordml" xmlns:w15="http://schemas.microsoft.com/office/word/2012/wordml" xmlns:w16cex="http://schemas.microsoft.com/office/word/2018/wordml/cex" xmlns:w16cid="http://schemas.microsoft.com/office/word/2016/wordml/cid" xmlns:w16="http://schemas.microsoft.com/office/word/2018/wordml" xmlns:w16du="http://schemas.microsoft.com/office/word/2023/wordml/word16du" xmlns:w16sdtdh="http://schemas.microsoft.com/office/word/2020/wordml/sdtdatahash" xmlns:w16se="http://schemas.microsoft.com/office/word/2015/wordml/symex" mc:Ignorable="w14 w15 w16se w16cid w16 w16cex w16sdtdh w16du">
+<w:styles xmlns:mc="http://schemas.openxmlformats.org/markup-compatibility/2006" xmlns:r="http://schemas.openxmlformats.org/officeDocument/2006/relationships" xmlns:w="http://schemas.openxmlformats.org/wordprocessingml/2006/main" xmlns:w14="http://schemas.microsoft.com/office/word/2010/wordml" xmlns:w15="http://schemas.microsoft.com/office/word/2012/wordml" xmlns:w16cex="http://schemas.microsoft.com/office/word/2018/wordml/cex" xmlns:w16cid="http://schemas.microsoft.com/office/word/2016/wordml/cid" xmlns:w16="http://schemas.microsoft.com/office/word/2018/wordml" xmlns:w16sdtdh="http://schemas.microsoft.com/office/word/2020/wordml/sdtdatahash" xmlns:w16se="http://schemas.microsoft.com/office/word/2015/wordml/symex" mc:Ignorable="w14 w15 w16se w16cid w16 w16cex w16sdtdh">
   <w:docDefaults>
     <w:rPrDefault>
       <w:rPr>
@@ -5174,7 +7175,6 @@
     <w:next w:val="Normal"/>
     <w:link w:val="Ttulo3Car"/>
     <w:uiPriority w:val="9"/>
-    <w:semiHidden/>
     <w:unhideWhenUsed/>
     <w:qFormat/>
     <w:rsid w:val="00CD3F3B"/>
@@ -5381,7 +7381,6 @@
     <w:basedOn w:val="Fuentedeprrafopredeter"/>
     <w:link w:val="Ttulo3"/>
     <w:uiPriority w:val="9"/>
-    <w:semiHidden/>
     <w:rsid w:val="00CD3F3B"/>
     <w:rPr>
       <w:rFonts w:eastAsiaTheme="majorEastAsia" w:cstheme="majorBidi"/>
@@ -5824,6 +7823,28 @@
       </w:tcPr>
     </w:tblStylePr>
   </w:style>
+  <w:style w:type="paragraph" w:styleId="Listaconvietas">
+    <w:name w:val="List Bullet"/>
+    <w:basedOn w:val="Normal"/>
+    <w:uiPriority w:val="99"/>
+    <w:unhideWhenUsed/>
+    <w:rsid w:val="00FE45F1"/>
+    <w:pPr>
+      <w:numPr>
+        <w:numId w:val="8"/>
+      </w:numPr>
+      <w:spacing w:after="200" w:line="276" w:lineRule="auto"/>
+      <w:contextualSpacing/>
+    </w:pPr>
+    <w:rPr>
+      <w:rFonts w:ascii="Arial" w:eastAsiaTheme="minorEastAsia" w:hAnsi="Arial"/>
+      <w:kern w:val="0"/>
+      <w:sz w:val="22"/>
+      <w:szCs w:val="22"/>
+      <w:lang w:val="en-US"/>
+      <w14:ligatures w14:val="none"/>
+    </w:rPr>
+  </w:style>
 </w:styles>
 </file>
 

</xml_diff>

<commit_message>
docs: se hacen cambios al README.md y al informe con las asignaciones respectivas a los cambios de los integrantes del equipo. se cambiaron desde la main pero no se había hecho en la rama develop
</commit_message>
<xml_diff>
--- a/informe de requisitos.docx
+++ b/informe de requisitos.docx
@@ -45,6 +45,186 @@
         </w:rPr>
       </w:pPr>
     </w:p>
+    <w:tbl>
+      <w:tblPr>
+        <w:tblW w:w="22501" w:type="dxa"/>
+        <w:tblCellSpacing w:w="0" w:type="dxa"/>
+        <w:tblBorders>
+          <w:top w:val="single" w:sz="6" w:space="0" w:color="C4C7C5"/>
+        </w:tblBorders>
+        <w:shd w:val="clear" w:color="auto" w:fill="F8FAFD"/>
+        <w:tblCellMar>
+          <w:left w:w="0" w:type="dxa"/>
+          <w:right w:w="840" w:type="dxa"/>
+        </w:tblCellMar>
+        <w:tblLook w:val="04A0" w:firstRow="1" w:lastRow="0" w:firstColumn="1" w:lastColumn="0" w:noHBand="0" w:noVBand="1"/>
+      </w:tblPr>
+      <w:tblGrid>
+        <w:gridCol w:w="901"/>
+        <w:gridCol w:w="901"/>
+        <w:gridCol w:w="901"/>
+        <w:gridCol w:w="1755"/>
+        <w:gridCol w:w="16899"/>
+        <w:gridCol w:w="1144"/>
+      </w:tblGrid>
+      <w:tr>
+        <w:trPr>
+          <w:tblCellSpacing w:w="0" w:type="dxa"/>
+        </w:trPr>
+        <w:tc>
+          <w:tcPr>
+            <w:tcW w:w="901" w:type="dxa"/>
+            <w:shd w:val="clear" w:color="auto" w:fill="F8FAFD"/>
+            <w:vAlign w:val="center"/>
+            <w:hideMark/>
+          </w:tcPr>
+          <w:p>
+            <w:pPr>
+              <w:spacing w:before="15" w:after="0" w:line="0" w:lineRule="auto"/>
+              <w:rPr>
+                <w:rFonts w:ascii="Times New Roman" w:eastAsia="Times New Roman" w:hAnsi="Times New Roman" w:cs="Times New Roman"/>
+                <w:kern w:val="0"/>
+                <w:lang w:val="es-MX" w:eastAsia="es-MX"/>
+                <w14:ligatures w14:val="none"/>
+              </w:rPr>
+            </w:pPr>
+          </w:p>
+        </w:tc>
+        <w:tc>
+          <w:tcPr>
+            <w:tcW w:w="901" w:type="dxa"/>
+            <w:shd w:val="clear" w:color="auto" w:fill="F8FAFD"/>
+          </w:tcPr>
+          <w:p>
+            <w:pPr>
+              <w:spacing w:before="15" w:after="0" w:line="0" w:lineRule="auto"/>
+              <w:rPr>
+                <w:rFonts w:ascii="Times New Roman" w:eastAsia="Times New Roman" w:hAnsi="Times New Roman" w:cs="Times New Roman"/>
+                <w:kern w:val="0"/>
+                <w:lang w:val="es-MX" w:eastAsia="es-MX"/>
+                <w14:ligatures w14:val="none"/>
+              </w:rPr>
+            </w:pPr>
+          </w:p>
+        </w:tc>
+        <w:tc>
+          <w:tcPr>
+            <w:tcW w:w="901" w:type="dxa"/>
+            <w:shd w:val="clear" w:color="auto" w:fill="F8FAFD"/>
+            <w:vAlign w:val="center"/>
+            <w:hideMark/>
+          </w:tcPr>
+          <w:p>
+            <w:pPr>
+              <w:spacing w:before="15" w:after="0" w:line="0" w:lineRule="auto"/>
+              <w:rPr>
+                <w:rFonts w:ascii="Times New Roman" w:eastAsia="Times New Roman" w:hAnsi="Times New Roman" w:cs="Times New Roman"/>
+                <w:kern w:val="0"/>
+                <w:lang w:val="es-MX" w:eastAsia="es-MX"/>
+                <w14:ligatures w14:val="none"/>
+              </w:rPr>
+            </w:pPr>
+          </w:p>
+        </w:tc>
+        <w:tc>
+          <w:tcPr>
+            <w:tcW w:w="1755" w:type="dxa"/>
+            <w:shd w:val="clear" w:color="auto" w:fill="F8FAFD"/>
+            <w:vAlign w:val="bottom"/>
+            <w:hideMark/>
+          </w:tcPr>
+          <w:p>
+            <w:pPr>
+              <w:spacing w:before="15" w:after="0" w:line="0" w:lineRule="auto"/>
+              <w:rPr>
+                <w:rFonts w:ascii="Times New Roman" w:eastAsia="Times New Roman" w:hAnsi="Times New Roman" w:cs="Times New Roman"/>
+                <w:kern w:val="0"/>
+                <w:sz w:val="20"/>
+                <w:szCs w:val="20"/>
+                <w:lang w:val="es-MX" w:eastAsia="es-MX"/>
+                <w14:ligatures w14:val="none"/>
+              </w:rPr>
+            </w:pPr>
+          </w:p>
+        </w:tc>
+        <w:tc>
+          <w:tcPr>
+            <w:tcW w:w="0" w:type="auto"/>
+            <w:shd w:val="clear" w:color="auto" w:fill="F8FAFD"/>
+            <w:vAlign w:val="center"/>
+            <w:hideMark/>
+          </w:tcPr>
+          <w:p>
+            <w:pPr>
+              <w:spacing w:before="15" w:after="0" w:line="0" w:lineRule="auto"/>
+              <w:rPr>
+                <w:rFonts w:ascii="Times New Roman" w:eastAsia="Times New Roman" w:hAnsi="Times New Roman" w:cs="Times New Roman"/>
+                <w:kern w:val="0"/>
+                <w:sz w:val="20"/>
+                <w:szCs w:val="20"/>
+                <w:lang w:val="es-MX" w:eastAsia="es-MX"/>
+                <w14:ligatures w14:val="none"/>
+              </w:rPr>
+            </w:pPr>
+          </w:p>
+        </w:tc>
+        <w:tc>
+          <w:tcPr>
+            <w:tcW w:w="0" w:type="auto"/>
+            <w:shd w:val="clear" w:color="auto" w:fill="F8FAFD"/>
+            <w:tcMar>
+              <w:top w:w="0" w:type="dxa"/>
+              <w:left w:w="0" w:type="dxa"/>
+              <w:bottom w:w="0" w:type="dxa"/>
+              <w:right w:w="0" w:type="dxa"/>
+            </w:tcMar>
+            <w:vAlign w:val="center"/>
+            <w:hideMark/>
+          </w:tcPr>
+          <w:p>
+            <w:pPr>
+              <w:spacing w:before="15" w:after="0" w:line="0" w:lineRule="auto"/>
+              <w:rPr>
+                <w:rFonts w:ascii="Times New Roman" w:eastAsia="Times New Roman" w:hAnsi="Times New Roman" w:cs="Times New Roman"/>
+                <w:kern w:val="0"/>
+                <w:sz w:val="20"/>
+                <w:szCs w:val="20"/>
+                <w:lang w:val="es-MX" w:eastAsia="es-MX"/>
+                <w14:ligatures w14:val="none"/>
+              </w:rPr>
+            </w:pPr>
+          </w:p>
+        </w:tc>
+      </w:tr>
+    </w:tbl>
+    <w:p>
+      <w:pPr>
+        <w:shd w:val="clear" w:color="auto" w:fill="FFFFFF"/>
+        <w:spacing w:after="0" w:line="240" w:lineRule="auto"/>
+        <w:jc w:val="center"/>
+        <w:rPr>
+          <w:rFonts w:ascii="docs-Calibri" w:eastAsia="Times New Roman" w:hAnsi="docs-Calibri" w:cs="Calibri"/>
+          <w:color w:val="000000"/>
+          <w:kern w:val="0"/>
+          <w:sz w:val="23"/>
+          <w:szCs w:val="23"/>
+          <w:lang w:val="es-MX" w:eastAsia="es-MX"/>
+          <w14:ligatures w14:val="none"/>
+        </w:rPr>
+      </w:pPr>
+      <w:r>
+        <w:rPr>
+          <w:rFonts w:ascii="docs-Calibri" w:eastAsia="Times New Roman" w:hAnsi="docs-Calibri" w:cs="Calibri"/>
+          <w:color w:val="000000"/>
+          <w:kern w:val="0"/>
+          <w:sz w:val="23"/>
+          <w:szCs w:val="23"/>
+          <w:lang w:val="es-MX" w:eastAsia="es-MX"/>
+          <w14:ligatures w14:val="none"/>
+        </w:rPr>
+        <w:t>Juan Felipe Isaza Vásquez</w:t>
+      </w:r>
+    </w:p>
     <w:p>
       <w:pPr>
         <w:jc w:val="center"/>
@@ -53,20 +233,21 @@
           <w:color w:val="000000" w:themeColor="text1"/>
         </w:rPr>
       </w:pPr>
+      <w:proofErr w:type="spellStart"/>
       <w:r>
         <w:rPr>
           <w:rFonts w:ascii="Times New Roman" w:hAnsi="Times New Roman" w:cs="Times New Roman"/>
           <w:color w:val="000000" w:themeColor="text1"/>
         </w:rPr>
-        <w:t>Estefanía Muñoz Tobón</w:t>
-      </w:r>
+        <w:t>Stiven</w:t>
+      </w:r>
+      <w:proofErr w:type="spellEnd"/>
       <w:r>
         <w:rPr>
           <w:rFonts w:ascii="Times New Roman" w:hAnsi="Times New Roman" w:cs="Times New Roman"/>
           <w:color w:val="000000" w:themeColor="text1"/>
         </w:rPr>
-        <w:br/>
-        <w:t>Stiven Martínez Piedrahíta</w:t>
+        <w:t xml:space="preserve"> Martínez Piedrahíta</w:t>
       </w:r>
       <w:r>
         <w:rPr>
@@ -1692,47 +1873,13 @@
         <w:ind w:firstLine="720"/>
         <w:rPr>
           <w:rFonts w:ascii="Times New Roman" w:hAnsi="Times New Roman" w:cs="Times New Roman"/>
-          <w:lang w:val="es-MX"/>
-        </w:rPr>
-      </w:pPr>
-      <w:r>
-        <w:rPr>
-          <w:rFonts w:ascii="Times New Roman" w:hAnsi="Times New Roman" w:cs="Times New Roman"/>
-          <w:lang w:val="es-MX"/>
-        </w:rPr>
-        <w:t xml:space="preserve">El presente Documento de Especificación de Requisitos de Software (SRS) detalla los aspectos técnicos, funcionales y de diseño asignados de manera exclusiva a la </w:t>
-      </w:r>
-      <w:r>
-        <w:rPr>
-          <w:rFonts w:ascii="Times New Roman" w:hAnsi="Times New Roman" w:cs="Times New Roman"/>
-          <w:b/>
-          <w:bCs/>
-          <w:lang w:val="es-MX"/>
-        </w:rPr>
-        <w:t>Célula 6: Comunidad y Valoraciones</w:t>
-      </w:r>
-      <w:r>
-        <w:rPr>
-          <w:rFonts w:ascii="Times New Roman" w:hAnsi="Times New Roman" w:cs="Times New Roman"/>
-          <w:lang w:val="es-MX"/>
-        </w:rPr>
-        <w:t xml:space="preserve">, dentro del marco del proyecto integral </w:t>
-      </w:r>
-      <w:r>
-        <w:rPr>
-          <w:rFonts w:ascii="Times New Roman" w:hAnsi="Times New Roman" w:cs="Times New Roman"/>
-          <w:b/>
-          <w:bCs/>
-          <w:lang w:val="es-MX"/>
-        </w:rPr>
-        <w:t>Sazón</w:t>
-      </w:r>
-      <w:r>
-        <w:rPr>
-          <w:rFonts w:ascii="Times New Roman" w:hAnsi="Times New Roman" w:cs="Times New Roman"/>
-          <w:lang w:val="es-MX"/>
-        </w:rPr>
-        <w:t>. Mientras que el proyecto macro abarca la gestión global del catálogo, usuarios e infraestructura, este informe se centra de manera especializada en el motor de interacción social, retroalimentación y evaluación de recetas por parte de los usuarios.</w:t>
+        </w:rPr>
+      </w:pPr>
+      <w:r>
+        <w:rPr>
+          <w:rFonts w:ascii="Times New Roman" w:hAnsi="Times New Roman" w:cs="Times New Roman"/>
+        </w:rPr>
+        <w:t>Este documento presenta el informe de requisitos para el desarrollo de la nueva aplicación de la barbería. El propósito de este texto es servir como la carta de navegación principal para todas las personas involucradas en el proyecto, asegurando que tengamos una visión clara, estructurada y unificada antes de iniciar cualquier fase de diseño o programación.</w:t>
       </w:r>
     </w:p>
     <w:p>
@@ -1741,31 +1888,13 @@
         <w:ind w:firstLine="720"/>
         <w:rPr>
           <w:rFonts w:ascii="Times New Roman" w:hAnsi="Times New Roman" w:cs="Times New Roman"/>
-          <w:lang w:val="es-MX"/>
-        </w:rPr>
-      </w:pPr>
-      <w:r>
-        <w:rPr>
-          <w:rFonts w:ascii="Times New Roman" w:hAnsi="Times New Roman" w:cs="Times New Roman"/>
-          <w:lang w:val="es-MX"/>
-        </w:rPr>
-        <w:t xml:space="preserve">A lo largo de este informe, se guiará al lector a través de la justificación funcional de la célula, sus objetivos redactados bajo la taxonomía de Bloom, el alcance detallado delimitando inclusiones y exclusiones específicas del módulo, la arquitectura tecnológica del </w:t>
-      </w:r>
-      <w:proofErr w:type="spellStart"/>
-      <w:r>
-        <w:rPr>
-          <w:rFonts w:ascii="Times New Roman" w:hAnsi="Times New Roman" w:cs="Times New Roman"/>
-          <w:lang w:val="es-MX"/>
-        </w:rPr>
-        <w:t>stack</w:t>
-      </w:r>
-      <w:proofErr w:type="spellEnd"/>
-      <w:r>
-        <w:rPr>
-          <w:rFonts w:ascii="Times New Roman" w:hAnsi="Times New Roman" w:cs="Times New Roman"/>
-          <w:lang w:val="es-MX"/>
-        </w:rPr>
-        <w:t xml:space="preserve"> seleccionado, el modelado relacional de datos de comunidad, la lista exhaustiva de requisitos funcionales y no funcionales, la reglamentación legal del desarrollo formativo y las conclusiones obtenidas por el equipo durante la fase de análisis.</w:t>
+        </w:rPr>
+      </w:pPr>
+      <w:r>
+        <w:rPr>
+          <w:rFonts w:ascii="Times New Roman" w:hAnsi="Times New Roman" w:cs="Times New Roman"/>
+        </w:rPr>
+        <w:t>A lo largo de este informe encontrarás una serie de secciones organizadas para ir de lo general a lo específico. En primer lugar, se exponen los problemas actuales que enfrenta la barbería en su operación diaria, los cuales justifican la necesidad de este software. A partir de allí, se plantean los objetivos generales y específicos que el sistema debe cumplir para darle solución a dichas problemáticas.</w:t>
       </w:r>
     </w:p>
     <w:p>
@@ -1780,7 +1909,29 @@
         <w:rPr>
           <w:rFonts w:ascii="Times New Roman" w:hAnsi="Times New Roman" w:cs="Times New Roman"/>
         </w:rPr>
-        <w:t>.</w:t>
+        <w:t>Para hacer que la información técnica y operativa sea mucho más fácil de entender, el contenido de este documento se apoya en distintos recursos visuales. Encontrarás diversas ilustraciones que ayudan a visualizar cómo interactuarán los usuarios con el sistema, así como tablas detalladas que organizan los requerimientos puntuales, categorizando de forma exacta qué debe hacer la aplicación y cómo debe comportarse.</w:t>
+      </w:r>
+    </w:p>
+    <w:p>
+      <w:pPr>
+        <w:spacing w:line="480" w:lineRule="auto"/>
+        <w:ind w:firstLine="720"/>
+        <w:rPr>
+          <w:rFonts w:ascii="Times New Roman" w:hAnsi="Times New Roman" w:cs="Times New Roman"/>
+        </w:rPr>
+      </w:pPr>
+      <w:r>
+        <w:rPr>
+          <w:rFonts w:ascii="Times New Roman" w:hAnsi="Times New Roman" w:cs="Times New Roman"/>
+        </w:rPr>
+        <w:t xml:space="preserve">Por último, se incluye un glosario de términos. Esta sección está pensada para alinear el vocabulario técnico con el lenguaje del día a día de la barbería, evitando confusiones a lo largo del desarrollo. En resumen, en las siguientes páginas está plasmada </w:t>
+      </w:r>
+      <w:r>
+        <w:rPr>
+          <w:rFonts w:ascii="Times New Roman" w:hAnsi="Times New Roman" w:cs="Times New Roman"/>
+        </w:rPr>
+        <w:lastRenderedPageBreak/>
+        <w:t>toda la base teórica y visual necesaria para arrancar con la construcción del proyecto de manera organizada.</w:t>
       </w:r>
     </w:p>
     <w:p>
@@ -2029,23 +2180,24 @@
     </w:p>
     <w:p>
       <w:pPr>
+        <w:rPr>
+          <w:rFonts w:ascii="Times New Roman" w:hAnsi="Times New Roman" w:cs="Times New Roman"/>
+        </w:rPr>
+      </w:pPr>
+    </w:p>
+    <w:p>
+      <w:pPr>
         <w:spacing w:line="480" w:lineRule="auto"/>
         <w:ind w:firstLine="720"/>
         <w:rPr>
           <w:rFonts w:ascii="Times New Roman" w:hAnsi="Times New Roman" w:cs="Times New Roman"/>
-          <w:b/>
-          <w:bCs/>
-          <w:lang w:val="es-MX"/>
-        </w:rPr>
-      </w:pPr>
-      <w:r>
-        <w:rPr>
-          <w:rFonts w:ascii="Times New Roman" w:hAnsi="Times New Roman" w:cs="Times New Roman"/>
-          <w:b/>
-          <w:bCs/>
-          <w:lang w:val="es-MX"/>
-        </w:rPr>
-        <w:t>1. Necesidad</w:t>
+        </w:rPr>
+      </w:pPr>
+      <w:r>
+        <w:rPr>
+          <w:rFonts w:ascii="Times New Roman" w:hAnsi="Times New Roman" w:cs="Times New Roman"/>
+        </w:rPr>
+        <w:t>Actualmente, la barbería gestiona sus citas de manera manual mediante mensajes y llamadas, lo que genera cruces de horarios, interrupciones constantes durante el servicio y un alto índice de inasistencias al no tener un seguimiento adecuado. Al analizar este flujo de trabajo diario, identificamos que la dependencia de la comunicación manual para agendar es el principal cuello de botella operativo y quita tiempo valioso. Para solucionar esto, desarrollaremos una aplicación de gestión centralizada que traslade esta carga a un sistema automatizado, permitiendo a los clientes reservar su propio espacio según la disponibilidad en tiempo real y recibir recordatorios automáticos, mientras los barberos cuentan con un panel administrativo que organiza sus horarios y el historial de cada cliente, eliminando por completo el uso de agendas físicas y chats desorganizados.</w:t>
       </w:r>
     </w:p>
     <w:p>
@@ -2054,148 +2206,6 @@
         <w:ind w:firstLine="720"/>
         <w:rPr>
           <w:rFonts w:ascii="Times New Roman" w:hAnsi="Times New Roman" w:cs="Times New Roman"/>
-          <w:lang w:val="es-MX"/>
-        </w:rPr>
-      </w:pPr>
-      <w:r>
-        <w:rPr>
-          <w:rFonts w:ascii="Times New Roman" w:hAnsi="Times New Roman" w:cs="Times New Roman"/>
-          <w:lang w:val="es-MX"/>
-        </w:rPr>
-        <w:t>Dentro de una plataforma gastronómica moderna, la simple consulta de ingredientes y pasos resulta insuficiente para generar fidelización. Los usuarios requieren conocer la experiencia real de otras personas al preparar un platillo (tiempo real empleado, posibles sustituciones de ingredientes y nivel de dificultad percibido). Sin un módulo de comunidad y valoraciones, la plataforma carece de "prueba social", lo que disminuye la confianza del usuario al momento de seleccionar una receta.</w:t>
-      </w:r>
-    </w:p>
-    <w:p>
-      <w:pPr>
-        <w:spacing w:line="480" w:lineRule="auto"/>
-        <w:ind w:firstLine="720"/>
-        <w:rPr>
-          <w:rFonts w:ascii="Times New Roman" w:hAnsi="Times New Roman" w:cs="Times New Roman"/>
-          <w:b/>
-          <w:bCs/>
-          <w:lang w:val="es-MX"/>
-        </w:rPr>
-      </w:pPr>
-      <w:r>
-        <w:rPr>
-          <w:rFonts w:ascii="Times New Roman" w:hAnsi="Times New Roman" w:cs="Times New Roman"/>
-          <w:b/>
-          <w:bCs/>
-          <w:lang w:val="es-MX"/>
-        </w:rPr>
-        <w:t>2. Manejo Actual</w:t>
-      </w:r>
-    </w:p>
-    <w:p>
-      <w:pPr>
-        <w:spacing w:line="480" w:lineRule="auto"/>
-        <w:ind w:firstLine="720"/>
-        <w:rPr>
-          <w:rFonts w:ascii="Times New Roman" w:hAnsi="Times New Roman" w:cs="Times New Roman"/>
-          <w:lang w:val="es-MX"/>
-        </w:rPr>
-      </w:pPr>
-      <w:r>
-        <w:rPr>
-          <w:rFonts w:ascii="Times New Roman" w:hAnsi="Times New Roman" w:cs="Times New Roman"/>
-          <w:lang w:val="es-MX"/>
-        </w:rPr>
-        <w:t xml:space="preserve">En la versión base de </w:t>
-      </w:r>
-      <w:r>
-        <w:rPr>
-          <w:rFonts w:ascii="Times New Roman" w:hAnsi="Times New Roman" w:cs="Times New Roman"/>
-          <w:b/>
-          <w:bCs/>
-          <w:lang w:val="es-MX"/>
-        </w:rPr>
-        <w:t>Sazón</w:t>
-      </w:r>
-      <w:r>
-        <w:rPr>
-          <w:rFonts w:ascii="Times New Roman" w:hAnsi="Times New Roman" w:cs="Times New Roman"/>
-          <w:lang w:val="es-MX"/>
-        </w:rPr>
-        <w:t xml:space="preserve"> (y en blogs culinarios estáticos), el contenido fluye en una sola dirección: de la plataforma hacia el lector. Los usuarios consumen la </w:t>
-      </w:r>
-      <w:proofErr w:type="gramStart"/>
-      <w:r>
-        <w:rPr>
-          <w:rFonts w:ascii="Times New Roman" w:hAnsi="Times New Roman" w:cs="Times New Roman"/>
-          <w:lang w:val="es-MX"/>
-        </w:rPr>
-        <w:t>receta</w:t>
-      </w:r>
-      <w:proofErr w:type="gramEnd"/>
-      <w:r>
-        <w:rPr>
-          <w:rFonts w:ascii="Times New Roman" w:hAnsi="Times New Roman" w:cs="Times New Roman"/>
-          <w:lang w:val="es-MX"/>
-        </w:rPr>
-        <w:t xml:space="preserve"> pero no tienen un canal para calificar su precisión, sugerir mejoras, subir evidencias fotográficas o consultar opiniones de otros cocineros antes de preparar el alimento.</w:t>
-      </w:r>
-    </w:p>
-    <w:p>
-      <w:pPr>
-        <w:spacing w:line="480" w:lineRule="auto"/>
-        <w:ind w:firstLine="720"/>
-        <w:rPr>
-          <w:rFonts w:ascii="Times New Roman" w:hAnsi="Times New Roman" w:cs="Times New Roman"/>
-          <w:b/>
-          <w:bCs/>
-          <w:lang w:val="es-MX"/>
-        </w:rPr>
-      </w:pPr>
-      <w:r>
-        <w:rPr>
-          <w:rFonts w:ascii="Times New Roman" w:hAnsi="Times New Roman" w:cs="Times New Roman"/>
-          <w:b/>
-          <w:bCs/>
-          <w:lang w:val="es-MX"/>
-        </w:rPr>
-        <w:t>3. Solución Propuesta (Célula 6)</w:t>
-      </w:r>
-    </w:p>
-    <w:p>
-      <w:pPr>
-        <w:spacing w:line="480" w:lineRule="auto"/>
-        <w:ind w:firstLine="720"/>
-        <w:rPr>
-          <w:rFonts w:ascii="Times New Roman" w:hAnsi="Times New Roman" w:cs="Times New Roman"/>
-          <w:lang w:val="es-MX"/>
-        </w:rPr>
-      </w:pPr>
-      <w:r>
-        <w:rPr>
-          <w:rFonts w:ascii="Times New Roman" w:hAnsi="Times New Roman" w:cs="Times New Roman"/>
-          <w:lang w:val="es-MX"/>
-        </w:rPr>
-        <w:t xml:space="preserve">La Célula 6 implementará un </w:t>
-      </w:r>
-      <w:r>
-        <w:rPr>
-          <w:rFonts w:ascii="Times New Roman" w:hAnsi="Times New Roman" w:cs="Times New Roman"/>
-          <w:b/>
-          <w:bCs/>
-          <w:lang w:val="es-MX"/>
-        </w:rPr>
-        <w:t>Módulo de Comunidad y Valoraciones</w:t>
-      </w:r>
-      <w:r>
-        <w:rPr>
-          <w:rFonts w:ascii="Times New Roman" w:hAnsi="Times New Roman" w:cs="Times New Roman"/>
-          <w:lang w:val="es-MX"/>
-        </w:rPr>
-        <w:t xml:space="preserve"> integrado de forma transparente en la plataforma. Esta solución permitirá a los usuarios registrados calificar las recetas mediante una escala de 1 a 5 estrellas, redactar reseñas con comentarios constructivos, responder a las opiniones de otros miembros y visualizar estadísticas agregadas (promedios de valoración y número de reseñas) en cada ficha de receta, fomentando un ecosistema culinario participativo.</w:t>
-      </w:r>
-    </w:p>
-    <w:p>
-      <w:pPr>
-        <w:spacing w:line="480" w:lineRule="auto"/>
-        <w:ind w:firstLine="720"/>
-        <w:rPr>
-          <w:rFonts w:ascii="Times New Roman" w:hAnsi="Times New Roman" w:cs="Times New Roman"/>
-          <w:lang w:val="es-MX"/>
         </w:rPr>
       </w:pPr>
     </w:p>
@@ -5310,6 +5320,7 @@
   <w:style w:type="character" w:default="1" w:styleId="Fuentedeprrafopredeter">
     <w:name w:val="Default Paragraph Font"/>
     <w:uiPriority w:val="1"/>
+    <w:semiHidden/>
     <w:unhideWhenUsed/>
   </w:style>
   <w:style w:type="table" w:default="1" w:styleId="Tablanormal">

</xml_diff>

<commit_message>
Resuelve conflicto del informe: integra cambios de main y de develop
</commit_message>
<xml_diff>
--- a/informe de requisitos.docx
+++ b/informe de requisitos.docx
@@ -44,195 +44,21 @@
           <w:color w:val="000000" w:themeColor="text1"/>
         </w:rPr>
       </w:pPr>
-    </w:p>
-    <w:tbl>
-      <w:tblPr>
-        <w:tblW w:w="22501" w:type="dxa"/>
-        <w:tblCellSpacing w:w="0" w:type="dxa"/>
-        <w:tblBorders>
-          <w:top w:val="single" w:sz="6" w:space="0" w:color="C4C7C5"/>
-        </w:tblBorders>
-        <w:shd w:val="clear" w:color="auto" w:fill="F8FAFD"/>
-        <w:tblCellMar>
-          <w:left w:w="0" w:type="dxa"/>
-          <w:right w:w="840" w:type="dxa"/>
-        </w:tblCellMar>
-        <w:tblLook w:val="04A0" w:firstRow="1" w:lastRow="0" w:firstColumn="1" w:lastColumn="0" w:noHBand="0" w:noVBand="1"/>
-      </w:tblPr>
-      <w:tblGrid>
-        <w:gridCol w:w="901"/>
-        <w:gridCol w:w="901"/>
-        <w:gridCol w:w="901"/>
-        <w:gridCol w:w="1755"/>
-        <w:gridCol w:w="16899"/>
-        <w:gridCol w:w="1144"/>
-      </w:tblGrid>
-      <w:tr>
-        <w:trPr>
-          <w:tblCellSpacing w:w="0" w:type="dxa"/>
-        </w:trPr>
-        <w:tc>
-          <w:tcPr>
-            <w:tcW w:w="901" w:type="dxa"/>
-            <w:shd w:val="clear" w:color="auto" w:fill="F8FAFD"/>
-            <w:vAlign w:val="center"/>
-            <w:hideMark/>
-          </w:tcPr>
-          <w:p>
-            <w:pPr>
-              <w:spacing w:before="15" w:after="0" w:line="0" w:lineRule="auto"/>
-              <w:rPr>
-                <w:rFonts w:ascii="Times New Roman" w:eastAsia="Times New Roman" w:hAnsi="Times New Roman" w:cs="Times New Roman"/>
-                <w:kern w:val="0"/>
-                <w:lang w:val="es-MX" w:eastAsia="es-MX"/>
-                <w14:ligatures w14:val="none"/>
-              </w:rPr>
-            </w:pPr>
-          </w:p>
-        </w:tc>
-        <w:tc>
-          <w:tcPr>
-            <w:tcW w:w="901" w:type="dxa"/>
-            <w:shd w:val="clear" w:color="auto" w:fill="F8FAFD"/>
-          </w:tcPr>
-          <w:p>
-            <w:pPr>
-              <w:spacing w:before="15" w:after="0" w:line="0" w:lineRule="auto"/>
-              <w:rPr>
-                <w:rFonts w:ascii="Times New Roman" w:eastAsia="Times New Roman" w:hAnsi="Times New Roman" w:cs="Times New Roman"/>
-                <w:kern w:val="0"/>
-                <w:lang w:val="es-MX" w:eastAsia="es-MX"/>
-                <w14:ligatures w14:val="none"/>
-              </w:rPr>
-            </w:pPr>
-          </w:p>
-        </w:tc>
-        <w:tc>
-          <w:tcPr>
-            <w:tcW w:w="901" w:type="dxa"/>
-            <w:shd w:val="clear" w:color="auto" w:fill="F8FAFD"/>
-            <w:vAlign w:val="center"/>
-            <w:hideMark/>
-          </w:tcPr>
-          <w:p>
-            <w:pPr>
-              <w:spacing w:before="15" w:after="0" w:line="0" w:lineRule="auto"/>
-              <w:rPr>
-                <w:rFonts w:ascii="Times New Roman" w:eastAsia="Times New Roman" w:hAnsi="Times New Roman" w:cs="Times New Roman"/>
-                <w:kern w:val="0"/>
-                <w:lang w:val="es-MX" w:eastAsia="es-MX"/>
-                <w14:ligatures w14:val="none"/>
-              </w:rPr>
-            </w:pPr>
-          </w:p>
-        </w:tc>
-        <w:tc>
-          <w:tcPr>
-            <w:tcW w:w="1755" w:type="dxa"/>
-            <w:shd w:val="clear" w:color="auto" w:fill="F8FAFD"/>
-            <w:vAlign w:val="bottom"/>
-            <w:hideMark/>
-          </w:tcPr>
-          <w:p>
-            <w:pPr>
-              <w:spacing w:before="15" w:after="0" w:line="0" w:lineRule="auto"/>
-              <w:rPr>
-                <w:rFonts w:ascii="Times New Roman" w:eastAsia="Times New Roman" w:hAnsi="Times New Roman" w:cs="Times New Roman"/>
-                <w:kern w:val="0"/>
-                <w:sz w:val="20"/>
-                <w:szCs w:val="20"/>
-                <w:lang w:val="es-MX" w:eastAsia="es-MX"/>
-                <w14:ligatures w14:val="none"/>
-              </w:rPr>
-            </w:pPr>
-          </w:p>
-        </w:tc>
-        <w:tc>
-          <w:tcPr>
-            <w:tcW w:w="0" w:type="auto"/>
-            <w:shd w:val="clear" w:color="auto" w:fill="F8FAFD"/>
-            <w:vAlign w:val="center"/>
-            <w:hideMark/>
-          </w:tcPr>
-          <w:p>
-            <w:pPr>
-              <w:spacing w:before="15" w:after="0" w:line="0" w:lineRule="auto"/>
-              <w:rPr>
-                <w:rFonts w:ascii="Times New Roman" w:eastAsia="Times New Roman" w:hAnsi="Times New Roman" w:cs="Times New Roman"/>
-                <w:kern w:val="0"/>
-                <w:sz w:val="20"/>
-                <w:szCs w:val="20"/>
-                <w:lang w:val="es-MX" w:eastAsia="es-MX"/>
-                <w14:ligatures w14:val="none"/>
-              </w:rPr>
-            </w:pPr>
-          </w:p>
-        </w:tc>
-        <w:tc>
-          <w:tcPr>
-            <w:tcW w:w="0" w:type="auto"/>
-            <w:shd w:val="clear" w:color="auto" w:fill="F8FAFD"/>
-            <w:tcMar>
-              <w:top w:w="0" w:type="dxa"/>
-              <w:left w:w="0" w:type="dxa"/>
-              <w:bottom w:w="0" w:type="dxa"/>
-              <w:right w:w="0" w:type="dxa"/>
-            </w:tcMar>
-            <w:vAlign w:val="center"/>
-            <w:hideMark/>
-          </w:tcPr>
-          <w:p>
-            <w:pPr>
-              <w:spacing w:before="15" w:after="0" w:line="0" w:lineRule="auto"/>
-              <w:rPr>
-                <w:rFonts w:ascii="Times New Roman" w:eastAsia="Times New Roman" w:hAnsi="Times New Roman" w:cs="Times New Roman"/>
-                <w:kern w:val="0"/>
-                <w:sz w:val="20"/>
-                <w:szCs w:val="20"/>
-                <w:lang w:val="es-MX" w:eastAsia="es-MX"/>
-                <w14:ligatures w14:val="none"/>
-              </w:rPr>
-            </w:pPr>
-          </w:p>
-        </w:tc>
-      </w:tr>
-    </w:tbl>
-    <w:p>
-      <w:pPr>
-        <w:shd w:val="clear" w:color="auto" w:fill="FFFFFF"/>
-        <w:spacing w:after="0" w:line="240" w:lineRule="auto"/>
-        <w:jc w:val="center"/>
-        <w:rPr>
-          <w:rFonts w:ascii="docs-Calibri" w:eastAsia="Times New Roman" w:hAnsi="docs-Calibri" w:cs="Calibri"/>
-          <w:color w:val="000000"/>
-          <w:kern w:val="0"/>
-          <w:sz w:val="23"/>
-          <w:szCs w:val="23"/>
-          <w:lang w:val="es-MX" w:eastAsia="es-MX"/>
-          <w14:ligatures w14:val="none"/>
-        </w:rPr>
-      </w:pPr>
-      <w:r>
-        <w:rPr>
-          <w:rFonts w:ascii="docs-Calibri" w:eastAsia="Times New Roman" w:hAnsi="docs-Calibri" w:cs="Calibri"/>
-          <w:color w:val="000000"/>
-          <w:kern w:val="0"/>
-          <w:sz w:val="23"/>
-          <w:szCs w:val="23"/>
-          <w:lang w:val="es-MX" w:eastAsia="es-MX"/>
-          <w14:ligatures w14:val="none"/>
-        </w:rPr>
+      <w:r>
+        <w:rPr>
+          <w:rFonts w:ascii="Times New Roman" w:hAnsi="Times New Roman" w:cs="Times New Roman"/>
+          <w:color w:val="000000" w:themeColor="text1"/>
+        </w:rPr>
+        <w:br/>
         <w:t>Juan Felipe Isaza Vásquez</w:t>
       </w:r>
-    </w:p>
-    <w:p>
-      <w:pPr>
-        <w:jc w:val="center"/>
+      <w:r>
         <w:rPr>
           <w:rFonts w:ascii="Times New Roman" w:hAnsi="Times New Roman" w:cs="Times New Roman"/>
           <w:color w:val="000000" w:themeColor="text1"/>
         </w:rPr>
-      </w:pPr>
+        <w:br/>
+      </w:r>
       <w:proofErr w:type="spellStart"/>
       <w:r>
         <w:rPr>

</xml_diff>

<commit_message>
docs:se hace una edicion de la introducción mas precisa y con normas APA
</commit_message>
<xml_diff>
--- a/informe de requisitos.docx
+++ b/informe de requisitos.docx
@@ -6,14 +6,12 @@
       <w:pPr>
         <w:jc w:val="center"/>
         <w:rPr>
-          <w:rFonts w:ascii="Times New Roman" w:hAnsi="Times New Roman" w:cs="Times New Roman"/>
-          <w:color w:val="000000" w:themeColor="text1"/>
-        </w:rPr>
-      </w:pPr>
-      <w:r>
-        <w:rPr>
-          <w:rFonts w:ascii="Times New Roman" w:hAnsi="Times New Roman" w:cs="Times New Roman"/>
-          <w:color w:val="000000" w:themeColor="text1"/>
+          <w:rFonts w:cs="Times New Roman"/>
+        </w:rPr>
+      </w:pPr>
+      <w:r>
+        <w:rPr>
+          <w:rFonts w:cs="Times New Roman"/>
         </w:rPr>
         <w:t>Informe de requisitos</w:t>
       </w:r>
@@ -22,98 +20,85 @@
       <w:pPr>
         <w:jc w:val="center"/>
         <w:rPr>
-          <w:rFonts w:ascii="Times New Roman" w:hAnsi="Times New Roman" w:cs="Times New Roman"/>
-          <w:color w:val="000000" w:themeColor="text1"/>
-        </w:rPr>
-      </w:pPr>
-    </w:p>
-    <w:p>
-      <w:pPr>
-        <w:jc w:val="center"/>
-        <w:rPr>
-          <w:rFonts w:ascii="Times New Roman" w:hAnsi="Times New Roman" w:cs="Times New Roman"/>
-          <w:color w:val="000000" w:themeColor="text1"/>
-        </w:rPr>
-      </w:pPr>
-    </w:p>
-    <w:p>
-      <w:pPr>
-        <w:jc w:val="center"/>
-        <w:rPr>
-          <w:rFonts w:ascii="Times New Roman" w:hAnsi="Times New Roman" w:cs="Times New Roman"/>
-          <w:color w:val="000000" w:themeColor="text1"/>
-        </w:rPr>
-      </w:pPr>
-      <w:r>
-        <w:rPr>
-          <w:rFonts w:ascii="Times New Roman" w:hAnsi="Times New Roman" w:cs="Times New Roman"/>
-          <w:color w:val="000000" w:themeColor="text1"/>
+          <w:rFonts w:cs="Times New Roman"/>
+        </w:rPr>
+      </w:pPr>
+    </w:p>
+    <w:p>
+      <w:pPr>
+        <w:jc w:val="center"/>
+        <w:rPr>
+          <w:rFonts w:cs="Times New Roman"/>
+        </w:rPr>
+      </w:pPr>
+    </w:p>
+    <w:p>
+      <w:pPr>
+        <w:jc w:val="center"/>
+        <w:rPr>
+          <w:rFonts w:cs="Times New Roman"/>
+        </w:rPr>
+      </w:pPr>
+      <w:r>
+        <w:rPr>
+          <w:rFonts w:cs="Times New Roman"/>
         </w:rPr>
         <w:br/>
         <w:t>Juan Felipe Isaza Vásquez</w:t>
       </w:r>
       <w:r>
         <w:rPr>
-          <w:rFonts w:ascii="Times New Roman" w:hAnsi="Times New Roman" w:cs="Times New Roman"/>
-          <w:color w:val="000000" w:themeColor="text1"/>
+          <w:rFonts w:cs="Times New Roman"/>
         </w:rPr>
         <w:br/>
       </w:r>
       <w:proofErr w:type="spellStart"/>
       <w:r>
         <w:rPr>
-          <w:rFonts w:ascii="Times New Roman" w:hAnsi="Times New Roman" w:cs="Times New Roman"/>
-          <w:color w:val="000000" w:themeColor="text1"/>
+          <w:rFonts w:cs="Times New Roman"/>
         </w:rPr>
         <w:t>Stiven</w:t>
       </w:r>
       <w:proofErr w:type="spellEnd"/>
       <w:r>
         <w:rPr>
-          <w:rFonts w:ascii="Times New Roman" w:hAnsi="Times New Roman" w:cs="Times New Roman"/>
-          <w:color w:val="000000" w:themeColor="text1"/>
+          <w:rFonts w:cs="Times New Roman"/>
         </w:rPr>
         <w:t xml:space="preserve"> Martínez Piedrahíta</w:t>
       </w:r>
       <w:r>
         <w:rPr>
-          <w:rFonts w:ascii="Times New Roman" w:hAnsi="Times New Roman" w:cs="Times New Roman"/>
-          <w:color w:val="000000" w:themeColor="text1"/>
+          <w:rFonts w:cs="Times New Roman"/>
         </w:rPr>
         <w:br/>
       </w:r>
       <w:r>
         <w:rPr>
-          <w:rFonts w:ascii="Times New Roman" w:hAnsi="Times New Roman" w:cs="Times New Roman"/>
-          <w:color w:val="000000" w:themeColor="text1"/>
+          <w:rFonts w:cs="Times New Roman"/>
         </w:rPr>
         <w:t>Jorge Andrés Ávila Rodríguez</w:t>
       </w:r>
       <w:r>
         <w:rPr>
-          <w:rFonts w:ascii="Times New Roman" w:hAnsi="Times New Roman" w:cs="Times New Roman"/>
-          <w:color w:val="000000" w:themeColor="text1"/>
+          <w:rFonts w:cs="Times New Roman"/>
         </w:rPr>
         <w:br/>
       </w:r>
       <w:r>
         <w:rPr>
-          <w:rFonts w:ascii="Times New Roman" w:hAnsi="Times New Roman" w:cs="Times New Roman"/>
-          <w:color w:val="000000" w:themeColor="text1"/>
+          <w:rFonts w:cs="Times New Roman"/>
         </w:rPr>
         <w:t>Brayner Stewart Flórez Palacios</w:t>
       </w:r>
       <w:r>
         <w:rPr>
-          <w:rFonts w:ascii="Times New Roman" w:hAnsi="Times New Roman" w:cs="Times New Roman"/>
-          <w:color w:val="000000" w:themeColor="text1"/>
+          <w:rFonts w:cs="Times New Roman"/>
         </w:rPr>
         <w:br/>
       </w:r>
       <w:r>
         <w:rPr>
-          <w:rFonts w:ascii="Times New Roman" w:hAnsi="Times New Roman" w:cs="Times New Roman"/>
-          <w:color w:val="000000" w:themeColor="text1"/>
+          <w:rFonts w:cs="Times New Roman"/>
         </w:rPr>
         <w:t>Johann Felipe Hincapié Usuga</w:t>
       </w:r>
@@ -122,49 +107,43 @@
       <w:pPr>
         <w:jc w:val="center"/>
         <w:rPr>
-          <w:rFonts w:ascii="Times New Roman" w:hAnsi="Times New Roman" w:cs="Times New Roman"/>
-          <w:color w:val="000000" w:themeColor="text1"/>
-        </w:rPr>
-      </w:pPr>
-    </w:p>
-    <w:p>
-      <w:pPr>
-        <w:jc w:val="center"/>
-        <w:rPr>
-          <w:rFonts w:ascii="Times New Roman" w:hAnsi="Times New Roman" w:cs="Times New Roman"/>
-          <w:color w:val="000000" w:themeColor="text1"/>
-        </w:rPr>
-      </w:pPr>
-    </w:p>
-    <w:p>
-      <w:pPr>
-        <w:rPr>
-          <w:rFonts w:ascii="Times New Roman" w:hAnsi="Times New Roman" w:cs="Times New Roman"/>
-          <w:color w:val="000000" w:themeColor="text1"/>
-        </w:rPr>
-      </w:pPr>
-    </w:p>
-    <w:p>
-      <w:pPr>
-        <w:jc w:val="center"/>
-        <w:rPr>
-          <w:rFonts w:ascii="Times New Roman" w:hAnsi="Times New Roman" w:cs="Times New Roman"/>
-          <w:color w:val="000000" w:themeColor="text1"/>
-        </w:rPr>
-      </w:pPr>
-    </w:p>
-    <w:p>
-      <w:pPr>
-        <w:jc w:val="center"/>
-        <w:rPr>
-          <w:rFonts w:ascii="Times New Roman" w:hAnsi="Times New Roman" w:cs="Times New Roman"/>
-          <w:color w:val="000000" w:themeColor="text1"/>
-        </w:rPr>
-      </w:pPr>
-      <w:r>
-        <w:rPr>
-          <w:rFonts w:ascii="Times New Roman" w:hAnsi="Times New Roman" w:cs="Times New Roman"/>
-          <w:color w:val="000000" w:themeColor="text1"/>
+          <w:rFonts w:cs="Times New Roman"/>
+        </w:rPr>
+      </w:pPr>
+    </w:p>
+    <w:p>
+      <w:pPr>
+        <w:jc w:val="center"/>
+        <w:rPr>
+          <w:rFonts w:cs="Times New Roman"/>
+        </w:rPr>
+      </w:pPr>
+    </w:p>
+    <w:p>
+      <w:pPr>
+        <w:rPr>
+          <w:rFonts w:cs="Times New Roman"/>
+        </w:rPr>
+      </w:pPr>
+    </w:p>
+    <w:p>
+      <w:pPr>
+        <w:jc w:val="center"/>
+        <w:rPr>
+          <w:rFonts w:cs="Times New Roman"/>
+        </w:rPr>
+      </w:pPr>
+    </w:p>
+    <w:p>
+      <w:pPr>
+        <w:jc w:val="center"/>
+        <w:rPr>
+          <w:rFonts w:cs="Times New Roman"/>
+        </w:rPr>
+      </w:pPr>
+      <w:r>
+        <w:rPr>
+          <w:rFonts w:cs="Times New Roman"/>
         </w:rPr>
         <w:t>Metodologías ágiles</w:t>
       </w:r>
@@ -173,49 +152,43 @@
       <w:pPr>
         <w:jc w:val="center"/>
         <w:rPr>
-          <w:rFonts w:ascii="Times New Roman" w:hAnsi="Times New Roman" w:cs="Times New Roman"/>
-          <w:color w:val="000000" w:themeColor="text1"/>
-        </w:rPr>
-      </w:pPr>
-    </w:p>
-    <w:p>
-      <w:pPr>
-        <w:rPr>
-          <w:rFonts w:ascii="Times New Roman" w:hAnsi="Times New Roman" w:cs="Times New Roman"/>
-          <w:color w:val="000000" w:themeColor="text1"/>
-        </w:rPr>
-      </w:pPr>
-    </w:p>
-    <w:p>
-      <w:pPr>
-        <w:jc w:val="center"/>
-        <w:rPr>
-          <w:rFonts w:ascii="Times New Roman" w:hAnsi="Times New Roman" w:cs="Times New Roman"/>
-          <w:color w:val="000000" w:themeColor="text1"/>
-        </w:rPr>
-      </w:pPr>
-    </w:p>
-    <w:p>
-      <w:pPr>
-        <w:jc w:val="center"/>
-        <w:rPr>
-          <w:rFonts w:ascii="Times New Roman" w:hAnsi="Times New Roman" w:cs="Times New Roman"/>
-          <w:color w:val="000000" w:themeColor="text1"/>
-        </w:rPr>
-      </w:pPr>
-    </w:p>
-    <w:p>
-      <w:pPr>
-        <w:jc w:val="center"/>
-        <w:rPr>
-          <w:rFonts w:ascii="Times New Roman" w:hAnsi="Times New Roman" w:cs="Times New Roman"/>
-          <w:color w:val="000000" w:themeColor="text1"/>
-        </w:rPr>
-      </w:pPr>
-      <w:r>
-        <w:rPr>
-          <w:rFonts w:ascii="Times New Roman" w:hAnsi="Times New Roman" w:cs="Times New Roman"/>
-          <w:color w:val="000000" w:themeColor="text1"/>
+          <w:rFonts w:cs="Times New Roman"/>
+        </w:rPr>
+      </w:pPr>
+    </w:p>
+    <w:p>
+      <w:pPr>
+        <w:rPr>
+          <w:rFonts w:cs="Times New Roman"/>
+        </w:rPr>
+      </w:pPr>
+    </w:p>
+    <w:p>
+      <w:pPr>
+        <w:jc w:val="center"/>
+        <w:rPr>
+          <w:rFonts w:cs="Times New Roman"/>
+        </w:rPr>
+      </w:pPr>
+    </w:p>
+    <w:p>
+      <w:pPr>
+        <w:jc w:val="center"/>
+        <w:rPr>
+          <w:rFonts w:cs="Times New Roman"/>
+        </w:rPr>
+      </w:pPr>
+    </w:p>
+    <w:p>
+      <w:pPr>
+        <w:jc w:val="center"/>
+        <w:rPr>
+          <w:rFonts w:cs="Times New Roman"/>
+        </w:rPr>
+      </w:pPr>
+      <w:r>
+        <w:rPr>
+          <w:rFonts w:cs="Times New Roman"/>
         </w:rPr>
         <w:t>Jaime Alberto Zapata Valencia</w:t>
       </w:r>
@@ -224,76 +197,67 @@
       <w:pPr>
         <w:jc w:val="center"/>
         <w:rPr>
-          <w:rFonts w:ascii="Times New Roman" w:hAnsi="Times New Roman" w:cs="Times New Roman"/>
-          <w:color w:val="000000" w:themeColor="text1"/>
-        </w:rPr>
-      </w:pPr>
-    </w:p>
-    <w:p>
-      <w:pPr>
-        <w:rPr>
-          <w:rFonts w:ascii="Times New Roman" w:hAnsi="Times New Roman" w:cs="Times New Roman"/>
-          <w:color w:val="000000" w:themeColor="text1"/>
-        </w:rPr>
-      </w:pPr>
-    </w:p>
-    <w:p>
-      <w:pPr>
-        <w:jc w:val="center"/>
-        <w:rPr>
-          <w:rFonts w:ascii="Times New Roman" w:hAnsi="Times New Roman" w:cs="Times New Roman"/>
-          <w:color w:val="000000" w:themeColor="text1"/>
-        </w:rPr>
-      </w:pPr>
-    </w:p>
-    <w:p>
-      <w:pPr>
-        <w:jc w:val="center"/>
-        <w:rPr>
-          <w:rFonts w:ascii="Times New Roman" w:hAnsi="Times New Roman" w:cs="Times New Roman"/>
-          <w:color w:val="000000" w:themeColor="text1"/>
-        </w:rPr>
-      </w:pPr>
-    </w:p>
-    <w:p>
-      <w:pPr>
-        <w:jc w:val="center"/>
-        <w:rPr>
-          <w:rFonts w:ascii="Times New Roman" w:hAnsi="Times New Roman" w:cs="Times New Roman"/>
-          <w:color w:val="000000" w:themeColor="text1"/>
-        </w:rPr>
-      </w:pPr>
-    </w:p>
-    <w:p>
-      <w:pPr>
-        <w:jc w:val="center"/>
-        <w:rPr>
-          <w:rFonts w:ascii="Times New Roman" w:hAnsi="Times New Roman" w:cs="Times New Roman"/>
-          <w:color w:val="000000" w:themeColor="text1"/>
-        </w:rPr>
-      </w:pPr>
-    </w:p>
-    <w:p>
-      <w:pPr>
-        <w:jc w:val="center"/>
-        <w:rPr>
-          <w:rFonts w:ascii="Times New Roman" w:hAnsi="Times New Roman" w:cs="Times New Roman"/>
-          <w:color w:val="000000" w:themeColor="text1"/>
-        </w:rPr>
-      </w:pPr>
-    </w:p>
-    <w:p>
-      <w:pPr>
-        <w:jc w:val="center"/>
-        <w:rPr>
-          <w:rFonts w:ascii="Times New Roman" w:hAnsi="Times New Roman" w:cs="Times New Roman"/>
-          <w:color w:val="000000" w:themeColor="text1"/>
-        </w:rPr>
-      </w:pPr>
-      <w:r>
-        <w:rPr>
-          <w:rFonts w:ascii="Times New Roman" w:hAnsi="Times New Roman" w:cs="Times New Roman"/>
-          <w:color w:val="000000" w:themeColor="text1"/>
+          <w:rFonts w:cs="Times New Roman"/>
+        </w:rPr>
+      </w:pPr>
+    </w:p>
+    <w:p>
+      <w:pPr>
+        <w:rPr>
+          <w:rFonts w:cs="Times New Roman"/>
+        </w:rPr>
+      </w:pPr>
+    </w:p>
+    <w:p>
+      <w:pPr>
+        <w:jc w:val="center"/>
+        <w:rPr>
+          <w:rFonts w:cs="Times New Roman"/>
+        </w:rPr>
+      </w:pPr>
+    </w:p>
+    <w:p>
+      <w:pPr>
+        <w:jc w:val="center"/>
+        <w:rPr>
+          <w:rFonts w:cs="Times New Roman"/>
+        </w:rPr>
+      </w:pPr>
+    </w:p>
+    <w:p>
+      <w:pPr>
+        <w:jc w:val="center"/>
+        <w:rPr>
+          <w:rFonts w:cs="Times New Roman"/>
+        </w:rPr>
+      </w:pPr>
+    </w:p>
+    <w:p>
+      <w:pPr>
+        <w:jc w:val="center"/>
+        <w:rPr>
+          <w:rFonts w:cs="Times New Roman"/>
+        </w:rPr>
+      </w:pPr>
+    </w:p>
+    <w:p>
+      <w:pPr>
+        <w:jc w:val="center"/>
+        <w:rPr>
+          <w:rFonts w:cs="Times New Roman"/>
+        </w:rPr>
+      </w:pPr>
+    </w:p>
+    <w:p>
+      <w:pPr>
+        <w:jc w:val="center"/>
+        <w:rPr>
+          <w:rFonts w:cs="Times New Roman"/>
+        </w:rPr>
+      </w:pPr>
+      <w:r>
+        <w:rPr>
+          <w:rFonts w:cs="Times New Roman"/>
         </w:rPr>
         <w:t>SENA</w:t>
       </w:r>
@@ -302,28 +266,24 @@
       <w:pPr>
         <w:jc w:val="center"/>
         <w:rPr>
-          <w:rFonts w:ascii="Times New Roman" w:hAnsi="Times New Roman" w:cs="Times New Roman"/>
-          <w:color w:val="000000" w:themeColor="text1"/>
-        </w:rPr>
-      </w:pPr>
-      <w:r>
-        <w:rPr>
-          <w:rFonts w:ascii="Times New Roman" w:hAnsi="Times New Roman" w:cs="Times New Roman"/>
-          <w:color w:val="000000" w:themeColor="text1"/>
+          <w:rFonts w:cs="Times New Roman"/>
+        </w:rPr>
+      </w:pPr>
+      <w:r>
+        <w:rPr>
+          <w:rFonts w:cs="Times New Roman"/>
         </w:rPr>
         <w:t xml:space="preserve">Antioquia, </w:t>
       </w:r>
       <w:r>
         <w:rPr>
-          <w:rFonts w:ascii="Times New Roman" w:hAnsi="Times New Roman" w:cs="Times New Roman"/>
-          <w:color w:val="000000" w:themeColor="text1"/>
+          <w:rFonts w:cs="Times New Roman"/>
         </w:rPr>
         <w:t>Medellín</w:t>
       </w:r>
       <w:r>
         <w:rPr>
-          <w:rFonts w:ascii="Times New Roman" w:hAnsi="Times New Roman" w:cs="Times New Roman"/>
-          <w:color w:val="000000" w:themeColor="text1"/>
+          <w:rFonts w:cs="Times New Roman"/>
         </w:rPr>
         <w:br w:type="page"/>
       </w:r>
@@ -348,8 +308,10 @@
       </w:sdtPr>
       <w:sdtEndPr>
         <w:rPr>
+          <w:rFonts w:ascii="Times New Roman" w:hAnsi="Times New Roman"/>
           <w:bCs/>
           <w:noProof/>
+          <w:color w:val="000000" w:themeColor="text1"/>
         </w:rPr>
       </w:sdtEndPr>
       <w:sdtContent>
@@ -376,7 +338,7 @@
         <w:p>
           <w:pPr>
             <w:rPr>
-              <w:rFonts w:ascii="Times New Roman" w:hAnsi="Times New Roman" w:cs="Times New Roman"/>
+              <w:rFonts w:cs="Times New Roman"/>
               <w:lang w:val="en-US"/>
             </w:rPr>
           </w:pPr>
@@ -384,7 +346,7 @@
         <w:p>
           <w:pPr>
             <w:rPr>
-              <w:rFonts w:ascii="Times New Roman" w:hAnsi="Times New Roman" w:cs="Times New Roman"/>
+              <w:rFonts w:cs="Times New Roman"/>
               <w:lang w:val="en-US"/>
             </w:rPr>
           </w:pPr>
@@ -392,7 +354,7 @@
         <w:p>
           <w:pPr>
             <w:rPr>
-              <w:rFonts w:ascii="Times New Roman" w:hAnsi="Times New Roman" w:cs="Times New Roman"/>
+              <w:rFonts w:cs="Times New Roman"/>
               <w:lang w:val="en-US"/>
             </w:rPr>
           </w:pPr>
@@ -413,23 +375,20 @@
           </w:pPr>
           <w:r>
             <w:rPr>
-              <w:rFonts w:ascii="Times New Roman" w:hAnsi="Times New Roman" w:cs="Times New Roman"/>
-              <w:color w:val="000000" w:themeColor="text1"/>
+              <w:rFonts w:cs="Times New Roman"/>
             </w:rPr>
             <w:fldChar w:fldCharType="begin"/>
           </w:r>
           <w:r>
             <w:rPr>
-              <w:rFonts w:ascii="Times New Roman" w:hAnsi="Times New Roman" w:cs="Times New Roman"/>
-              <w:color w:val="000000" w:themeColor="text1"/>
+              <w:rFonts w:cs="Times New Roman"/>
               <w:lang w:val="en-US"/>
             </w:rPr>
             <w:instrText xml:space="preserve"> TOC \o "1-3" \h \z \u </w:instrText>
           </w:r>
           <w:r>
             <w:rPr>
-              <w:rFonts w:ascii="Times New Roman" w:hAnsi="Times New Roman" w:cs="Times New Roman"/>
-              <w:color w:val="000000" w:themeColor="text1"/>
+              <w:rFonts w:cs="Times New Roman"/>
             </w:rPr>
             <w:fldChar w:fldCharType="separate"/>
           </w:r>
@@ -1226,18 +1185,16 @@
         <w:p>
           <w:pPr>
             <w:rPr>
-              <w:rFonts w:ascii="Times New Roman" w:hAnsi="Times New Roman" w:cs="Times New Roman"/>
-              <w:color w:val="000000" w:themeColor="text1"/>
+              <w:rFonts w:cs="Times New Roman"/>
               <w:lang w:val="en-US"/>
             </w:rPr>
           </w:pPr>
           <w:r>
             <w:rPr>
-              <w:rFonts w:ascii="Times New Roman" w:hAnsi="Times New Roman" w:cs="Times New Roman"/>
+              <w:rFonts w:cs="Times New Roman"/>
               <w:b/>
               <w:bCs/>
               <w:noProof/>
-              <w:color w:val="000000" w:themeColor="text1"/>
             </w:rPr>
             <w:fldChar w:fldCharType="end"/>
           </w:r>
@@ -1247,7 +1204,7 @@
     <w:p>
       <w:pPr>
         <w:rPr>
-          <w:rFonts w:ascii="Times New Roman" w:hAnsi="Times New Roman" w:cs="Times New Roman"/>
+          <w:rFonts w:cs="Times New Roman"/>
           <w:lang w:val="en-US"/>
         </w:rPr>
       </w:pPr>
@@ -1255,7 +1212,7 @@
     <w:p>
       <w:pPr>
         <w:rPr>
-          <w:rFonts w:ascii="Times New Roman" w:hAnsi="Times New Roman" w:cs="Times New Roman"/>
+          <w:rFonts w:cs="Times New Roman"/>
           <w:lang w:val="en-US"/>
         </w:rPr>
       </w:pPr>
@@ -1263,7 +1220,7 @@
     <w:p>
       <w:pPr>
         <w:rPr>
-          <w:rFonts w:ascii="Times New Roman" w:hAnsi="Times New Roman" w:cs="Times New Roman"/>
+          <w:rFonts w:cs="Times New Roman"/>
           <w:lang w:val="en-US"/>
         </w:rPr>
       </w:pPr>
@@ -1271,7 +1228,7 @@
     <w:p>
       <w:pPr>
         <w:rPr>
-          <w:rFonts w:ascii="Times New Roman" w:hAnsi="Times New Roman" w:cs="Times New Roman"/>
+          <w:rFonts w:cs="Times New Roman"/>
           <w:lang w:val="en-US"/>
         </w:rPr>
       </w:pPr>
@@ -1279,13 +1236,13 @@
     <w:p>
       <w:pPr>
         <w:rPr>
-          <w:rFonts w:ascii="Times New Roman" w:hAnsi="Times New Roman" w:cs="Times New Roman"/>
+          <w:rFonts w:cs="Times New Roman"/>
           <w:lang w:val="en-US"/>
         </w:rPr>
       </w:pPr>
       <w:r>
         <w:rPr>
-          <w:rFonts w:ascii="Times New Roman" w:hAnsi="Times New Roman" w:cs="Times New Roman"/>
+          <w:rFonts w:cs="Times New Roman"/>
           <w:lang w:val="en-US"/>
         </w:rPr>
         <w:br w:type="page"/>
@@ -1308,6 +1265,7 @@
           <w:szCs w:val="24"/>
           <w:lang w:val="en-US"/>
         </w:rPr>
+        <w:lastRenderedPageBreak/>
         <w:t>Listado</w:t>
       </w:r>
       <w:proofErr w:type="spellEnd"/>
@@ -1334,7 +1292,7 @@
     <w:p>
       <w:pPr>
         <w:rPr>
-          <w:rFonts w:ascii="Times New Roman" w:hAnsi="Times New Roman" w:cs="Times New Roman"/>
+          <w:rFonts w:cs="Times New Roman"/>
           <w:lang w:val="en-US"/>
         </w:rPr>
       </w:pPr>
@@ -1342,7 +1300,7 @@
     <w:p>
       <w:pPr>
         <w:rPr>
-          <w:rFonts w:ascii="Times New Roman" w:hAnsi="Times New Roman" w:cs="Times New Roman"/>
+          <w:rFonts w:cs="Times New Roman"/>
           <w:lang w:val="en-US"/>
         </w:rPr>
       </w:pPr>
@@ -1350,7 +1308,7 @@
     <w:p>
       <w:pPr>
         <w:rPr>
-          <w:rFonts w:ascii="Times New Roman" w:hAnsi="Times New Roman" w:cs="Times New Roman"/>
+          <w:rFonts w:cs="Times New Roman"/>
           <w:lang w:val="en-US"/>
         </w:rPr>
       </w:pPr>
@@ -1362,28 +1320,28 @@
           <w:tab w:val="right" w:leader="dot" w:pos="8828"/>
         </w:tabs>
         <w:rPr>
-          <w:rFonts w:ascii="Times New Roman" w:eastAsiaTheme="minorEastAsia" w:hAnsi="Times New Roman" w:cs="Times New Roman"/>
+          <w:rFonts w:eastAsiaTheme="minorEastAsia" w:cs="Times New Roman"/>
           <w:noProof/>
           <w:lang w:eastAsia="es-CO"/>
         </w:rPr>
       </w:pPr>
       <w:r>
         <w:rPr>
-          <w:rFonts w:ascii="Times New Roman" w:hAnsi="Times New Roman" w:cs="Times New Roman"/>
+          <w:rFonts w:cs="Times New Roman"/>
           <w:lang w:val="en-US"/>
         </w:rPr>
         <w:fldChar w:fldCharType="begin"/>
       </w:r>
       <w:r>
         <w:rPr>
-          <w:rFonts w:ascii="Times New Roman" w:hAnsi="Times New Roman" w:cs="Times New Roman"/>
+          <w:rFonts w:cs="Times New Roman"/>
           <w:lang w:val="en-US"/>
         </w:rPr>
         <w:instrText xml:space="preserve"> TOC \h \z \c "Tabla" </w:instrText>
       </w:r>
       <w:r>
         <w:rPr>
-          <w:rFonts w:ascii="Times New Roman" w:hAnsi="Times New Roman" w:cs="Times New Roman"/>
+          <w:rFonts w:cs="Times New Roman"/>
           <w:lang w:val="en-US"/>
         </w:rPr>
         <w:fldChar w:fldCharType="separate"/>
@@ -1392,14 +1350,14 @@
         <w:r>
           <w:rPr>
             <w:rStyle w:val="Hipervnculo"/>
-            <w:rFonts w:ascii="Times New Roman" w:hAnsi="Times New Roman" w:cs="Times New Roman"/>
+            <w:rFonts w:cs="Times New Roman"/>
             <w:noProof/>
           </w:rPr>
           <w:t>Tabla 1 - Comparativa</w:t>
         </w:r>
         <w:r>
           <w:rPr>
-            <w:rFonts w:ascii="Times New Roman" w:hAnsi="Times New Roman" w:cs="Times New Roman"/>
+            <w:rFonts w:cs="Times New Roman"/>
             <w:noProof/>
             <w:webHidden/>
           </w:rPr>
@@ -1407,7 +1365,7 @@
         </w:r>
         <w:r>
           <w:rPr>
-            <w:rFonts w:ascii="Times New Roman" w:hAnsi="Times New Roman" w:cs="Times New Roman"/>
+            <w:rFonts w:cs="Times New Roman"/>
             <w:noProof/>
             <w:webHidden/>
           </w:rPr>
@@ -1415,7 +1373,7 @@
         </w:r>
         <w:r>
           <w:rPr>
-            <w:rFonts w:ascii="Times New Roman" w:hAnsi="Times New Roman" w:cs="Times New Roman"/>
+            <w:rFonts w:cs="Times New Roman"/>
             <w:noProof/>
             <w:webHidden/>
           </w:rPr>
@@ -1423,14 +1381,14 @@
         </w:r>
         <w:r>
           <w:rPr>
-            <w:rFonts w:ascii="Times New Roman" w:hAnsi="Times New Roman" w:cs="Times New Roman"/>
+            <w:rFonts w:cs="Times New Roman"/>
             <w:noProof/>
             <w:webHidden/>
           </w:rPr>
         </w:r>
         <w:r>
           <w:rPr>
-            <w:rFonts w:ascii="Times New Roman" w:hAnsi="Times New Roman" w:cs="Times New Roman"/>
+            <w:rFonts w:cs="Times New Roman"/>
             <w:noProof/>
             <w:webHidden/>
           </w:rPr>
@@ -1438,7 +1396,7 @@
         </w:r>
         <w:r>
           <w:rPr>
-            <w:rFonts w:ascii="Times New Roman" w:hAnsi="Times New Roman" w:cs="Times New Roman"/>
+            <w:rFonts w:cs="Times New Roman"/>
             <w:noProof/>
             <w:webHidden/>
           </w:rPr>
@@ -1446,7 +1404,7 @@
         </w:r>
         <w:r>
           <w:rPr>
-            <w:rFonts w:ascii="Times New Roman" w:hAnsi="Times New Roman" w:cs="Times New Roman"/>
+            <w:rFonts w:cs="Times New Roman"/>
             <w:noProof/>
             <w:webHidden/>
           </w:rPr>
@@ -1457,13 +1415,13 @@
     <w:p>
       <w:pPr>
         <w:rPr>
-          <w:rFonts w:ascii="Times New Roman" w:hAnsi="Times New Roman" w:cs="Times New Roman"/>
+          <w:rFonts w:cs="Times New Roman"/>
           <w:lang w:val="en-US"/>
         </w:rPr>
       </w:pPr>
       <w:r>
         <w:rPr>
-          <w:rFonts w:ascii="Times New Roman" w:hAnsi="Times New Roman" w:cs="Times New Roman"/>
+          <w:rFonts w:cs="Times New Roman"/>
           <w:lang w:val="en-US"/>
         </w:rPr>
         <w:fldChar w:fldCharType="end"/>
@@ -1472,13 +1430,13 @@
     <w:p>
       <w:pPr>
         <w:rPr>
-          <w:rFonts w:ascii="Times New Roman" w:hAnsi="Times New Roman" w:cs="Times New Roman"/>
+          <w:rFonts w:cs="Times New Roman"/>
           <w:lang w:val="en-US"/>
         </w:rPr>
       </w:pPr>
       <w:r>
         <w:rPr>
-          <w:rFonts w:ascii="Times New Roman" w:hAnsi="Times New Roman" w:cs="Times New Roman"/>
+          <w:rFonts w:cs="Times New Roman"/>
           <w:lang w:val="en-US"/>
         </w:rPr>
         <w:br w:type="page"/>
@@ -1498,6 +1456,7 @@
           <w:rFonts w:cs="Times New Roman"/>
           <w:szCs w:val="24"/>
         </w:rPr>
+        <w:lastRenderedPageBreak/>
         <w:t>Listado de ilustraciones</w:t>
       </w:r>
       <w:bookmarkEnd w:id="1"/>
@@ -1505,14 +1464,14 @@
     <w:p>
       <w:pPr>
         <w:rPr>
-          <w:rFonts w:ascii="Times New Roman" w:hAnsi="Times New Roman" w:cs="Times New Roman"/>
-        </w:rPr>
-      </w:pPr>
-    </w:p>
-    <w:p>
-      <w:pPr>
-        <w:rPr>
-          <w:rFonts w:ascii="Times New Roman" w:hAnsi="Times New Roman" w:cs="Times New Roman"/>
+          <w:rFonts w:cs="Times New Roman"/>
+        </w:rPr>
+      </w:pPr>
+    </w:p>
+    <w:p>
+      <w:pPr>
+        <w:rPr>
+          <w:rFonts w:cs="Times New Roman"/>
         </w:rPr>
       </w:pPr>
     </w:p>
@@ -1523,31 +1482,28 @@
           <w:tab w:val="right" w:leader="dot" w:pos="8828"/>
         </w:tabs>
         <w:rPr>
-          <w:rFonts w:ascii="Times New Roman" w:eastAsiaTheme="minorEastAsia" w:hAnsi="Times New Roman" w:cs="Times New Roman"/>
+          <w:rFonts w:eastAsiaTheme="minorEastAsia" w:cs="Times New Roman"/>
           <w:noProof/>
           <w:lang w:eastAsia="es-CO"/>
         </w:rPr>
       </w:pPr>
       <w:r>
         <w:rPr>
-          <w:rFonts w:ascii="Times New Roman" w:hAnsi="Times New Roman" w:cs="Times New Roman"/>
-          <w:color w:val="000000" w:themeColor="text1"/>
+          <w:rFonts w:cs="Times New Roman"/>
           <w:lang w:val="en-US"/>
         </w:rPr>
         <w:fldChar w:fldCharType="begin"/>
       </w:r>
       <w:r>
         <w:rPr>
-          <w:rFonts w:ascii="Times New Roman" w:hAnsi="Times New Roman" w:cs="Times New Roman"/>
-          <w:color w:val="000000" w:themeColor="text1"/>
+          <w:rFonts w:cs="Times New Roman"/>
           <w:lang w:val="en-US"/>
         </w:rPr>
         <w:instrText xml:space="preserve"> TOC \h \z \c "Ilustración" </w:instrText>
       </w:r>
       <w:r>
         <w:rPr>
-          <w:rFonts w:ascii="Times New Roman" w:hAnsi="Times New Roman" w:cs="Times New Roman"/>
-          <w:color w:val="000000" w:themeColor="text1"/>
+          <w:rFonts w:cs="Times New Roman"/>
           <w:lang w:val="en-US"/>
         </w:rPr>
         <w:fldChar w:fldCharType="separate"/>
@@ -1556,14 +1512,14 @@
         <w:r>
           <w:rPr>
             <w:rStyle w:val="Hipervnculo"/>
-            <w:rFonts w:ascii="Times New Roman" w:hAnsi="Times New Roman" w:cs="Times New Roman"/>
+            <w:rFonts w:cs="Times New Roman"/>
             <w:noProof/>
           </w:rPr>
           <w:t>Ilustración 1 - Stack tecnologico</w:t>
         </w:r>
         <w:r>
           <w:rPr>
-            <w:rFonts w:ascii="Times New Roman" w:hAnsi="Times New Roman" w:cs="Times New Roman"/>
+            <w:rFonts w:cs="Times New Roman"/>
             <w:noProof/>
             <w:webHidden/>
           </w:rPr>
@@ -1571,7 +1527,7 @@
         </w:r>
         <w:r>
           <w:rPr>
-            <w:rFonts w:ascii="Times New Roman" w:hAnsi="Times New Roman" w:cs="Times New Roman"/>
+            <w:rFonts w:cs="Times New Roman"/>
             <w:noProof/>
             <w:webHidden/>
           </w:rPr>
@@ -1579,7 +1535,7 @@
         </w:r>
         <w:r>
           <w:rPr>
-            <w:rFonts w:ascii="Times New Roman" w:hAnsi="Times New Roman" w:cs="Times New Roman"/>
+            <w:rFonts w:cs="Times New Roman"/>
             <w:noProof/>
             <w:webHidden/>
           </w:rPr>
@@ -1587,14 +1543,14 @@
         </w:r>
         <w:r>
           <w:rPr>
-            <w:rFonts w:ascii="Times New Roman" w:hAnsi="Times New Roman" w:cs="Times New Roman"/>
+            <w:rFonts w:cs="Times New Roman"/>
             <w:noProof/>
             <w:webHidden/>
           </w:rPr>
         </w:r>
         <w:r>
           <w:rPr>
-            <w:rFonts w:ascii="Times New Roman" w:hAnsi="Times New Roman" w:cs="Times New Roman"/>
+            <w:rFonts w:cs="Times New Roman"/>
             <w:noProof/>
             <w:webHidden/>
           </w:rPr>
@@ -1602,7 +1558,7 @@
         </w:r>
         <w:r>
           <w:rPr>
-            <w:rFonts w:ascii="Times New Roman" w:hAnsi="Times New Roman" w:cs="Times New Roman"/>
+            <w:rFonts w:cs="Times New Roman"/>
             <w:noProof/>
             <w:webHidden/>
           </w:rPr>
@@ -1610,7 +1566,7 @@
         </w:r>
         <w:r>
           <w:rPr>
-            <w:rFonts w:ascii="Times New Roman" w:hAnsi="Times New Roman" w:cs="Times New Roman"/>
+            <w:rFonts w:cs="Times New Roman"/>
             <w:noProof/>
             <w:webHidden/>
           </w:rPr>
@@ -1621,23 +1577,20 @@
     <w:p>
       <w:pPr>
         <w:rPr>
-          <w:rFonts w:ascii="Times New Roman" w:hAnsi="Times New Roman" w:cs="Times New Roman"/>
-          <w:color w:val="000000" w:themeColor="text1"/>
+          <w:rFonts w:cs="Times New Roman"/>
           <w:lang w:val="en-US"/>
         </w:rPr>
       </w:pPr>
       <w:r>
         <w:rPr>
-          <w:rFonts w:ascii="Times New Roman" w:hAnsi="Times New Roman" w:cs="Times New Roman"/>
-          <w:color w:val="000000" w:themeColor="text1"/>
+          <w:rFonts w:cs="Times New Roman"/>
           <w:lang w:val="en-US"/>
         </w:rPr>
         <w:fldChar w:fldCharType="end"/>
       </w:r>
       <w:r>
         <w:rPr>
-          <w:rFonts w:ascii="Times New Roman" w:hAnsi="Times New Roman" w:cs="Times New Roman"/>
-          <w:color w:val="000000" w:themeColor="text1"/>
+          <w:rFonts w:cs="Times New Roman"/>
           <w:lang w:val="en-US"/>
         </w:rPr>
         <w:br w:type="page"/>
@@ -1646,8 +1599,7 @@
     <w:p>
       <w:pPr>
         <w:rPr>
-          <w:rFonts w:ascii="Times New Roman" w:hAnsi="Times New Roman" w:cs="Times New Roman"/>
-          <w:color w:val="000000" w:themeColor="text1"/>
+          <w:rFonts w:cs="Times New Roman"/>
           <w:lang w:val="en-US"/>
         </w:rPr>
       </w:pPr>
@@ -1673,100 +1625,68 @@
     <w:p>
       <w:pPr>
         <w:rPr>
-          <w:rFonts w:ascii="Times New Roman" w:hAnsi="Times New Roman" w:cs="Times New Roman"/>
-        </w:rPr>
-      </w:pPr>
-    </w:p>
-    <w:p>
-      <w:pPr>
-        <w:rPr>
-          <w:rFonts w:ascii="Times New Roman" w:hAnsi="Times New Roman" w:cs="Times New Roman"/>
-        </w:rPr>
-      </w:pPr>
-    </w:p>
-    <w:p>
-      <w:pPr>
-        <w:rPr>
-          <w:rFonts w:ascii="Times New Roman" w:hAnsi="Times New Roman" w:cs="Times New Roman"/>
-        </w:rPr>
-      </w:pPr>
-    </w:p>
-    <w:p>
-      <w:pPr>
-        <w:spacing w:line="480" w:lineRule="auto"/>
-        <w:ind w:firstLine="720"/>
-        <w:rPr>
-          <w:rFonts w:ascii="Times New Roman" w:hAnsi="Times New Roman" w:cs="Times New Roman"/>
-        </w:rPr>
-      </w:pPr>
-      <w:r>
-        <w:rPr>
-          <w:rFonts w:ascii="Times New Roman" w:hAnsi="Times New Roman" w:cs="Times New Roman"/>
-        </w:rPr>
-        <w:t>Este documento presenta el informe de requisitos para el desarrollo de la nueva aplicación de la barbería. El propósito de este texto es servir como la carta de navegación principal para todas las personas involucradas en el proyecto, asegurando que tengamos una visión clara, estructurada y unificada antes de iniciar cualquier fase de diseño o programación.</w:t>
-      </w:r>
-    </w:p>
-    <w:p>
-      <w:pPr>
-        <w:spacing w:line="480" w:lineRule="auto"/>
-        <w:ind w:firstLine="720"/>
-        <w:rPr>
-          <w:rFonts w:ascii="Times New Roman" w:hAnsi="Times New Roman" w:cs="Times New Roman"/>
-        </w:rPr>
-      </w:pPr>
-      <w:r>
-        <w:rPr>
-          <w:rFonts w:ascii="Times New Roman" w:hAnsi="Times New Roman" w:cs="Times New Roman"/>
-        </w:rPr>
-        <w:t>A lo largo de este informe encontrarás una serie de secciones organizadas para ir de lo general a lo específico. En primer lugar, se exponen los problemas actuales que enfrenta la barbería en su operación diaria, los cuales justifican la necesidad de este software. A partir de allí, se plantean los objetivos generales y específicos que el sistema debe cumplir para darle solución a dichas problemáticas.</w:t>
-      </w:r>
-    </w:p>
-    <w:p>
-      <w:pPr>
-        <w:spacing w:line="480" w:lineRule="auto"/>
-        <w:ind w:firstLine="720"/>
-        <w:rPr>
-          <w:rFonts w:ascii="Times New Roman" w:hAnsi="Times New Roman" w:cs="Times New Roman"/>
-        </w:rPr>
-      </w:pPr>
-      <w:r>
-        <w:rPr>
-          <w:rFonts w:ascii="Times New Roman" w:hAnsi="Times New Roman" w:cs="Times New Roman"/>
-        </w:rPr>
-        <w:t>Para hacer que la información técnica y operativa sea mucho más fácil de entender, el contenido de este documento se apoya en distintos recursos visuales. Encontrarás diversas ilustraciones que ayudan a visualizar cómo interactuarán los usuarios con el sistema, así como tablas detalladas que organizan los requerimientos puntuales, categorizando de forma exacta qué debe hacer la aplicación y cómo debe comportarse.</w:t>
-      </w:r>
-    </w:p>
-    <w:p>
-      <w:pPr>
-        <w:spacing w:line="480" w:lineRule="auto"/>
-        <w:ind w:firstLine="720"/>
-        <w:rPr>
-          <w:rFonts w:ascii="Times New Roman" w:hAnsi="Times New Roman" w:cs="Times New Roman"/>
-        </w:rPr>
-      </w:pPr>
-      <w:r>
-        <w:rPr>
-          <w:rFonts w:ascii="Times New Roman" w:hAnsi="Times New Roman" w:cs="Times New Roman"/>
-        </w:rPr>
-        <w:t>Por último, se incluye un glosario de términos. Esta sección está pensada para alinear el vocabulario técnico con el lenguaje del día a día de la barbería, evitando confusiones a lo largo del desarrollo. En resumen, en las siguientes páginas está plasmada toda la base teórica y visual necesaria para arrancar con la construcción del proyecto de manera organizada.</w:t>
-      </w:r>
-    </w:p>
-    <w:p>
-      <w:pPr>
-        <w:rPr>
-          <w:rFonts w:ascii="Times New Roman" w:hAnsi="Times New Roman" w:cs="Times New Roman"/>
-        </w:rPr>
-      </w:pPr>
-    </w:p>
-    <w:p>
-      <w:pPr>
-        <w:rPr>
-          <w:rFonts w:ascii="Times New Roman" w:hAnsi="Times New Roman" w:cs="Times New Roman"/>
-        </w:rPr>
-      </w:pPr>
-      <w:r>
-        <w:rPr>
-          <w:rFonts w:ascii="Times New Roman" w:hAnsi="Times New Roman" w:cs="Times New Roman"/>
+          <w:rFonts w:cs="Times New Roman"/>
+        </w:rPr>
+      </w:pPr>
+    </w:p>
+    <w:p>
+      <w:pPr>
+        <w:rPr>
+          <w:rFonts w:cs="Times New Roman"/>
+        </w:rPr>
+      </w:pPr>
+    </w:p>
+    <w:p>
+      <w:pPr>
+        <w:rPr>
+          <w:rFonts w:cs="Times New Roman"/>
+        </w:rPr>
+      </w:pPr>
+    </w:p>
+    <w:p>
+      <w:r>
+        <w:t>El presente Documento de Especificación de Requisitos de Software (SRS) detalla los aspectos técnicos, funcionales y de diseño asignados de manera exclusiva a la Célula 6: Comunidad y Valoraciones, dentro del marco del proyecto integral Sazón. Mientras que el proyecto macro abarca la gestión global del catálogo, usuarios e infraestructura, este informe se centra de manera especializada en el motor de interacción social, retroalimentación y evaluación de recetas por parte de los usuarios.</w:t>
+      </w:r>
+    </w:p>
+    <w:p>
+      <w:r>
+        <w:t xml:space="preserve">A lo largo de este informe encontrarás una serie de secciones organizadas para ir de lo general a lo específico. Inicialmente, se exponen las problemáticas y necesidades actuales de la plataforma que justifican el desarrollo de este software. A partir de allí, se definen los objetivos generales y específicos que guiarán la solución, seguidos por la delimitación del alcance en cuanto a inclusiones y exclusiones. Posteriormente, se presenta la especificación detallada de requisitos funcionales y no funcionales, el </w:t>
+      </w:r>
+      <w:proofErr w:type="spellStart"/>
+      <w:r>
+        <w:t>stack</w:t>
+      </w:r>
+      <w:proofErr w:type="spellEnd"/>
+      <w:r>
+        <w:t xml:space="preserve"> tecnológico seleccionado y la arquitectura del sistema junto con sus modelos relacionales y de clases. Finalmente, el documento concluye con las valoraciones del equipo, las referencias bibliográficas, un glosario de términos especializados y el marco de reglamentación y condiciones legales.</w:t>
+      </w:r>
+    </w:p>
+    <w:p>
+      <w:r>
+        <w:t xml:space="preserve">Para hacer que la información técnica y operativa sea mucho más fácil de entender, el contenido de este documento se apoya en distintos recursos visuales. Encontrarás </w:t>
+      </w:r>
+      <w:r>
+        <w:lastRenderedPageBreak/>
+        <w:t>diversas ilustraciones que ayudan a visualizar cómo interactuarán los usuarios con el sistema y la estructura lógica de los datos, así como tablas detalladas que organizan los requerimientos puntuales, categorizando de forma exacta qué debe hacer la aplicación y cómo debe comportarse.</w:t>
+      </w:r>
+    </w:p>
+    <w:p>
+      <w:pPr>
+        <w:rPr>
+          <w:rFonts w:cs="Times New Roman"/>
+          <w:lang w:val="es-MX"/>
+        </w:rPr>
+      </w:pPr>
+    </w:p>
+    <w:p>
+      <w:pPr>
+        <w:rPr>
+          <w:rFonts w:cs="Times New Roman"/>
+        </w:rPr>
+      </w:pPr>
+      <w:r>
+        <w:rPr>
+          <w:rFonts w:cs="Times New Roman"/>
         </w:rPr>
         <w:br w:type="page"/>
       </w:r>
@@ -1785,6 +1705,7 @@
           <w:rFonts w:cs="Times New Roman"/>
           <w:szCs w:val="24"/>
         </w:rPr>
+        <w:lastRenderedPageBreak/>
         <w:t>Objetivos</w:t>
       </w:r>
       <w:bookmarkEnd w:id="3"/>
@@ -1792,21 +1713,21 @@
     <w:p>
       <w:pPr>
         <w:rPr>
-          <w:rFonts w:ascii="Times New Roman" w:hAnsi="Times New Roman" w:cs="Times New Roman"/>
-        </w:rPr>
-      </w:pPr>
-    </w:p>
-    <w:p>
-      <w:pPr>
-        <w:rPr>
-          <w:rFonts w:ascii="Times New Roman" w:hAnsi="Times New Roman" w:cs="Times New Roman"/>
-        </w:rPr>
-      </w:pPr>
-    </w:p>
-    <w:p>
-      <w:pPr>
-        <w:rPr>
-          <w:rFonts w:ascii="Times New Roman" w:hAnsi="Times New Roman" w:cs="Times New Roman"/>
+          <w:rFonts w:cs="Times New Roman"/>
+        </w:rPr>
+      </w:pPr>
+    </w:p>
+    <w:p>
+      <w:pPr>
+        <w:rPr>
+          <w:rFonts w:cs="Times New Roman"/>
+        </w:rPr>
+      </w:pPr>
+    </w:p>
+    <w:p>
+      <w:pPr>
+        <w:rPr>
+          <w:rFonts w:cs="Times New Roman"/>
         </w:rPr>
       </w:pPr>
     </w:p>
@@ -1830,15 +1751,13 @@
     </w:p>
     <w:p>
       <w:pPr>
-        <w:spacing w:line="480" w:lineRule="auto"/>
-        <w:ind w:firstLine="720"/>
-        <w:rPr>
-          <w:rFonts w:ascii="Times New Roman" w:hAnsi="Times New Roman" w:cs="Times New Roman"/>
-        </w:rPr>
-      </w:pPr>
-      <w:r>
-        <w:rPr>
-          <w:rFonts w:ascii="Times New Roman" w:hAnsi="Times New Roman" w:cs="Times New Roman"/>
+        <w:rPr>
+          <w:rFonts w:cs="Times New Roman"/>
+        </w:rPr>
+      </w:pPr>
+      <w:r>
+        <w:rPr>
+          <w:rFonts w:cs="Times New Roman"/>
         </w:rPr>
         <w:t>Diseñar y desarrollar una aplicación para la gestión integral de la barbería, que centralice la reserva de citas, el control de los servicios y la administración de los clientes, con el fin de optimizar el tiempo de operación diaria y mejorar la experiencia de servicio.</w:t>
       </w:r>
@@ -1846,7 +1765,7 @@
     <w:p>
       <w:pPr>
         <w:rPr>
-          <w:rFonts w:ascii="Times New Roman" w:hAnsi="Times New Roman" w:cs="Times New Roman"/>
+          <w:rFonts w:cs="Times New Roman"/>
         </w:rPr>
       </w:pPr>
     </w:p>
@@ -1871,7 +1790,7 @@
     <w:p>
       <w:pPr>
         <w:rPr>
-          <w:rFonts w:ascii="Times New Roman" w:hAnsi="Times New Roman" w:cs="Times New Roman"/>
+          <w:rFonts w:cs="Times New Roman"/>
         </w:rPr>
       </w:pPr>
     </w:p>
@@ -1882,15 +1801,14 @@
           <w:ilvl w:val="0"/>
           <w:numId w:val="4"/>
         </w:numPr>
-        <w:spacing w:line="480" w:lineRule="auto"/>
         <w:ind w:left="1077" w:hanging="357"/>
         <w:rPr>
-          <w:rFonts w:ascii="Times New Roman" w:hAnsi="Times New Roman" w:cs="Times New Roman"/>
-        </w:rPr>
-      </w:pPr>
-      <w:r>
-        <w:rPr>
-          <w:rFonts w:ascii="Times New Roman" w:hAnsi="Times New Roman" w:cs="Times New Roman"/>
+          <w:rFonts w:cs="Times New Roman"/>
+        </w:rPr>
+      </w:pPr>
+      <w:r>
+        <w:rPr>
+          <w:rFonts w:cs="Times New Roman"/>
         </w:rPr>
         <w:t>Implementar un módulo de agendamiento en línea que permita a los clientes reservar, modificar o cancelar sus citas en tiempo real, basándose en la disponibilidad de cada barbero.</w:t>
       </w:r>
@@ -1902,15 +1820,14 @@
           <w:ilvl w:val="0"/>
           <w:numId w:val="4"/>
         </w:numPr>
-        <w:spacing w:line="480" w:lineRule="auto"/>
         <w:ind w:left="1077" w:hanging="357"/>
         <w:rPr>
-          <w:rFonts w:ascii="Times New Roman" w:hAnsi="Times New Roman" w:cs="Times New Roman"/>
-        </w:rPr>
-      </w:pPr>
-      <w:r>
-        <w:rPr>
-          <w:rFonts w:ascii="Times New Roman" w:hAnsi="Times New Roman" w:cs="Times New Roman"/>
+          <w:rFonts w:cs="Times New Roman"/>
+        </w:rPr>
+      </w:pPr>
+      <w:r>
+        <w:rPr>
+          <w:rFonts w:cs="Times New Roman"/>
         </w:rPr>
         <w:t>Crear un sistema de perfiles para registrar el historial de los clientes, incluyendo sus cortes frecuentes, preferencias y datos de contacto, facilitando un servicio más personalizado.</w:t>
       </w:r>
@@ -1922,15 +1839,14 @@
           <w:ilvl w:val="0"/>
           <w:numId w:val="4"/>
         </w:numPr>
-        <w:spacing w:line="480" w:lineRule="auto"/>
         <w:ind w:left="1077" w:hanging="357"/>
         <w:rPr>
-          <w:rFonts w:ascii="Times New Roman" w:hAnsi="Times New Roman" w:cs="Times New Roman"/>
-        </w:rPr>
-      </w:pPr>
-      <w:r>
-        <w:rPr>
-          <w:rFonts w:ascii="Times New Roman" w:hAnsi="Times New Roman" w:cs="Times New Roman"/>
+          <w:rFonts w:cs="Times New Roman"/>
+        </w:rPr>
+      </w:pPr>
+      <w:r>
+        <w:rPr>
+          <w:rFonts w:cs="Times New Roman"/>
         </w:rPr>
         <w:t>Desarrollar un panel de administración interno para que los barberos puedan gestionar sus horarios, visualizar las citas del día y registrar los servicios que ya completaron.</w:t>
       </w:r>
@@ -1942,21 +1858,20 @@
           <w:ilvl w:val="0"/>
           <w:numId w:val="4"/>
         </w:numPr>
-        <w:spacing w:line="480" w:lineRule="auto"/>
         <w:ind w:left="1077" w:hanging="357"/>
         <w:rPr>
-          <w:rFonts w:ascii="Times New Roman" w:hAnsi="Times New Roman" w:cs="Times New Roman"/>
-        </w:rPr>
-      </w:pPr>
-      <w:r>
-        <w:rPr>
-          <w:rFonts w:ascii="Times New Roman" w:hAnsi="Times New Roman" w:cs="Times New Roman"/>
+          <w:rFonts w:cs="Times New Roman"/>
+        </w:rPr>
+      </w:pPr>
+      <w:r>
+        <w:rPr>
+          <w:rFonts w:cs="Times New Roman"/>
         </w:rPr>
         <w:t>Integrar un sistema de notificaciones automáticas que envíe recordatorios a los clientes antes de sus citas programadas, para reducir los tiempos muertos y las inasistencias.</w:t>
       </w:r>
       <w:r>
         <w:rPr>
-          <w:rFonts w:ascii="Times New Roman" w:hAnsi="Times New Roman" w:cs="Times New Roman"/>
+          <w:rFonts w:cs="Times New Roman"/>
         </w:rPr>
         <w:br w:type="page"/>
       </w:r>
@@ -1975,6 +1890,7 @@
           <w:rFonts w:cs="Times New Roman"/>
           <w:szCs w:val="24"/>
         </w:rPr>
+        <w:lastRenderedPageBreak/>
         <w:t>Planteamiento del problema</w:t>
       </w:r>
       <w:bookmarkEnd w:id="6"/>
@@ -1982,45 +1898,41 @@
     <w:p>
       <w:pPr>
         <w:rPr>
-          <w:rFonts w:ascii="Times New Roman" w:hAnsi="Times New Roman" w:cs="Times New Roman"/>
-        </w:rPr>
-      </w:pPr>
-    </w:p>
-    <w:p>
-      <w:pPr>
-        <w:rPr>
-          <w:rFonts w:ascii="Times New Roman" w:hAnsi="Times New Roman" w:cs="Times New Roman"/>
-        </w:rPr>
-      </w:pPr>
-    </w:p>
-    <w:p>
-      <w:pPr>
-        <w:rPr>
-          <w:rFonts w:ascii="Times New Roman" w:hAnsi="Times New Roman" w:cs="Times New Roman"/>
-        </w:rPr>
-      </w:pPr>
-    </w:p>
-    <w:p>
-      <w:pPr>
-        <w:spacing w:line="480" w:lineRule="auto"/>
-        <w:ind w:firstLine="720"/>
-        <w:rPr>
-          <w:rFonts w:ascii="Times New Roman" w:hAnsi="Times New Roman" w:cs="Times New Roman"/>
-        </w:rPr>
-      </w:pPr>
-      <w:r>
-        <w:rPr>
-          <w:rFonts w:ascii="Times New Roman" w:hAnsi="Times New Roman" w:cs="Times New Roman"/>
+          <w:rFonts w:cs="Times New Roman"/>
+        </w:rPr>
+      </w:pPr>
+    </w:p>
+    <w:p>
+      <w:pPr>
+        <w:rPr>
+          <w:rFonts w:cs="Times New Roman"/>
+        </w:rPr>
+      </w:pPr>
+    </w:p>
+    <w:p>
+      <w:pPr>
+        <w:rPr>
+          <w:rFonts w:cs="Times New Roman"/>
+        </w:rPr>
+      </w:pPr>
+    </w:p>
+    <w:p>
+      <w:pPr>
+        <w:rPr>
+          <w:rFonts w:cs="Times New Roman"/>
+        </w:rPr>
+      </w:pPr>
+      <w:r>
+        <w:rPr>
+          <w:rFonts w:cs="Times New Roman"/>
         </w:rPr>
         <w:t>Actualmente, la barbería gestiona sus citas de manera manual mediante mensajes y llamadas, lo que genera cruces de horarios, interrupciones constantes durante el servicio y un alto índice de inasistencias al no tener un seguimiento adecuado. Al analizar este flujo de trabajo diario, identificamos que la dependencia de la comunicación manual para agendar es el principal cuello de botella operativo y quita tiempo valioso. Para solucionar esto, desarrollaremos una aplicación de gestión centralizada que traslade esta carga a un sistema automatizado, permitiendo a los clientes reservar su propio espacio según la disponibilidad en tiempo real y recibir recordatorios automáticos, mientras los barberos cuentan con un panel administrativo que organiza sus horarios y el historial de cada cliente, eliminando por completo el uso de agendas físicas y chats desorganizados.</w:t>
       </w:r>
     </w:p>
     <w:p>
       <w:pPr>
-        <w:spacing w:line="480" w:lineRule="auto"/>
-        <w:ind w:firstLine="720"/>
-        <w:rPr>
-          <w:rFonts w:ascii="Times New Roman" w:hAnsi="Times New Roman" w:cs="Times New Roman"/>
+        <w:rPr>
+          <w:rFonts w:cs="Times New Roman"/>
         </w:rPr>
       </w:pPr>
     </w:p>
@@ -2029,7 +1941,7 @@
         <w:pStyle w:val="Descripcin"/>
         <w:keepNext/>
         <w:rPr>
-          <w:rFonts w:ascii="Times New Roman" w:hAnsi="Times New Roman" w:cs="Times New Roman"/>
+          <w:rFonts w:cs="Times New Roman"/>
           <w:sz w:val="24"/>
           <w:szCs w:val="24"/>
         </w:rPr>
@@ -2037,7 +1949,7 @@
       <w:bookmarkStart w:id="7" w:name="_Toc241140091"/>
       <w:r>
         <w:rPr>
-          <w:rFonts w:ascii="Times New Roman" w:hAnsi="Times New Roman" w:cs="Times New Roman"/>
+          <w:rFonts w:cs="Times New Roman"/>
           <w:sz w:val="24"/>
           <w:szCs w:val="24"/>
         </w:rPr>
@@ -2045,7 +1957,7 @@
       </w:r>
       <w:r>
         <w:rPr>
-          <w:rFonts w:ascii="Times New Roman" w:hAnsi="Times New Roman" w:cs="Times New Roman"/>
+          <w:rFonts w:cs="Times New Roman"/>
           <w:sz w:val="24"/>
           <w:szCs w:val="24"/>
         </w:rPr>
@@ -2053,7 +1965,7 @@
       </w:r>
       <w:r>
         <w:rPr>
-          <w:rFonts w:ascii="Times New Roman" w:hAnsi="Times New Roman" w:cs="Times New Roman"/>
+          <w:rFonts w:cs="Times New Roman"/>
           <w:sz w:val="24"/>
           <w:szCs w:val="24"/>
         </w:rPr>
@@ -2061,7 +1973,7 @@
       </w:r>
       <w:r>
         <w:rPr>
-          <w:rFonts w:ascii="Times New Roman" w:hAnsi="Times New Roman" w:cs="Times New Roman"/>
+          <w:rFonts w:cs="Times New Roman"/>
           <w:sz w:val="24"/>
           <w:szCs w:val="24"/>
         </w:rPr>
@@ -2069,7 +1981,7 @@
       </w:r>
       <w:r>
         <w:rPr>
-          <w:rFonts w:ascii="Times New Roman" w:hAnsi="Times New Roman" w:cs="Times New Roman"/>
+          <w:rFonts w:cs="Times New Roman"/>
           <w:noProof/>
           <w:sz w:val="24"/>
           <w:szCs w:val="24"/>
@@ -2078,7 +1990,7 @@
       </w:r>
       <w:r>
         <w:rPr>
-          <w:rFonts w:ascii="Times New Roman" w:hAnsi="Times New Roman" w:cs="Times New Roman"/>
+          <w:rFonts w:cs="Times New Roman"/>
           <w:sz w:val="24"/>
           <w:szCs w:val="24"/>
         </w:rPr>
@@ -2086,7 +1998,7 @@
       </w:r>
       <w:r>
         <w:rPr>
-          <w:rFonts w:ascii="Times New Roman" w:hAnsi="Times New Roman" w:cs="Times New Roman"/>
+          <w:rFonts w:cs="Times New Roman"/>
           <w:sz w:val="24"/>
           <w:szCs w:val="24"/>
         </w:rPr>
@@ -2117,12 +2029,12 @@
           <w:p>
             <w:pPr>
               <w:rPr>
-                <w:rFonts w:ascii="Times New Roman" w:hAnsi="Times New Roman" w:cs="Times New Roman"/>
+                <w:rFonts w:cs="Times New Roman"/>
               </w:rPr>
             </w:pPr>
             <w:r>
               <w:rPr>
-                <w:rFonts w:ascii="Times New Roman" w:hAnsi="Times New Roman" w:cs="Times New Roman"/>
+                <w:rFonts w:cs="Times New Roman"/>
               </w:rPr>
               <w:t>Problema Actual</w:t>
             </w:r>
@@ -2136,12 +2048,12 @@
             <w:pPr>
               <w:cnfStyle w:val="100000000000" w:firstRow="1" w:lastRow="0" w:firstColumn="0" w:lastColumn="0" w:oddVBand="0" w:evenVBand="0" w:oddHBand="0" w:evenHBand="0" w:firstRowFirstColumn="0" w:firstRowLastColumn="0" w:lastRowFirstColumn="0" w:lastRowLastColumn="0"/>
               <w:rPr>
-                <w:rFonts w:ascii="Times New Roman" w:hAnsi="Times New Roman" w:cs="Times New Roman"/>
+                <w:rFonts w:cs="Times New Roman"/>
               </w:rPr>
             </w:pPr>
             <w:r>
               <w:rPr>
-                <w:rFonts w:ascii="Times New Roman" w:hAnsi="Times New Roman" w:cs="Times New Roman"/>
+                <w:rFonts w:cs="Times New Roman"/>
               </w:rPr>
               <w:t>Consecuencia en la Operación</w:t>
             </w:r>
@@ -2155,12 +2067,12 @@
             <w:pPr>
               <w:cnfStyle w:val="100000000000" w:firstRow="1" w:lastRow="0" w:firstColumn="0" w:lastColumn="0" w:oddVBand="0" w:evenVBand="0" w:oddHBand="0" w:evenHBand="0" w:firstRowFirstColumn="0" w:firstRowLastColumn="0" w:lastRowFirstColumn="0" w:lastRowLastColumn="0"/>
               <w:rPr>
-                <w:rFonts w:ascii="Times New Roman" w:hAnsi="Times New Roman" w:cs="Times New Roman"/>
+                <w:rFonts w:cs="Times New Roman"/>
               </w:rPr>
             </w:pPr>
             <w:r>
               <w:rPr>
-                <w:rFonts w:ascii="Times New Roman" w:hAnsi="Times New Roman" w:cs="Times New Roman"/>
+                <w:rFonts w:cs="Times New Roman"/>
               </w:rPr>
               <w:t>Solución con la Aplicación</w:t>
             </w:r>
@@ -2179,12 +2091,12 @@
           <w:p>
             <w:pPr>
               <w:rPr>
-                <w:rFonts w:ascii="Times New Roman" w:hAnsi="Times New Roman" w:cs="Times New Roman"/>
+                <w:rFonts w:cs="Times New Roman"/>
               </w:rPr>
             </w:pPr>
             <w:r>
               <w:rPr>
-                <w:rFonts w:ascii="Times New Roman" w:hAnsi="Times New Roman" w:cs="Times New Roman"/>
+                <w:rFonts w:cs="Times New Roman"/>
               </w:rPr>
               <w:t>Agendamiento manual por WhatsApp y llamadas</w:t>
             </w:r>
@@ -2198,12 +2110,12 @@
             <w:pPr>
               <w:cnfStyle w:val="000000100000" w:firstRow="0" w:lastRow="0" w:firstColumn="0" w:lastColumn="0" w:oddVBand="0" w:evenVBand="0" w:oddHBand="1" w:evenHBand="0" w:firstRowFirstColumn="0" w:firstRowLastColumn="0" w:lastRowFirstColumn="0" w:lastRowLastColumn="0"/>
               <w:rPr>
-                <w:rFonts w:ascii="Times New Roman" w:hAnsi="Times New Roman" w:cs="Times New Roman"/>
+                <w:rFonts w:cs="Times New Roman"/>
               </w:rPr>
             </w:pPr>
             <w:r>
               <w:rPr>
-                <w:rFonts w:ascii="Times New Roman" w:hAnsi="Times New Roman" w:cs="Times New Roman"/>
+                <w:rFonts w:cs="Times New Roman"/>
               </w:rPr>
               <w:t>Interrupciones constantes durante el servicio al cliente y errores humanos como cruces de horarios.</w:t>
             </w:r>
@@ -2217,12 +2129,12 @@
             <w:pPr>
               <w:cnfStyle w:val="000000100000" w:firstRow="0" w:lastRow="0" w:firstColumn="0" w:lastColumn="0" w:oddVBand="0" w:evenVBand="0" w:oddHBand="1" w:evenHBand="0" w:firstRowFirstColumn="0" w:firstRowLastColumn="0" w:lastRowFirstColumn="0" w:lastRowLastColumn="0"/>
               <w:rPr>
-                <w:rFonts w:ascii="Times New Roman" w:hAnsi="Times New Roman" w:cs="Times New Roman"/>
+                <w:rFonts w:cs="Times New Roman"/>
               </w:rPr>
             </w:pPr>
             <w:r>
               <w:rPr>
-                <w:rFonts w:ascii="Times New Roman" w:hAnsi="Times New Roman" w:cs="Times New Roman"/>
+                <w:rFonts w:cs="Times New Roman"/>
               </w:rPr>
               <w:t>Sistema de reservas en línea donde el cliente agenda de forma autónoma viendo la disponibilidad real.</w:t>
             </w:r>
@@ -2232,23 +2144,22 @@
     </w:tbl>
     <w:p>
       <w:pPr>
-        <w:spacing w:line="480" w:lineRule="auto"/>
-        <w:ind w:firstLine="720"/>
-        <w:rPr>
-          <w:rFonts w:ascii="Times New Roman" w:hAnsi="Times New Roman" w:cs="Times New Roman"/>
-        </w:rPr>
-      </w:pPr>
-    </w:p>
-    <w:p>
-      <w:pPr>
-        <w:rPr>
-          <w:rFonts w:ascii="Times New Roman" w:hAnsi="Times New Roman" w:cs="Times New Roman"/>
-        </w:rPr>
-      </w:pPr>
-      <w:r>
-        <w:rPr>
-          <w:rFonts w:ascii="Times New Roman" w:hAnsi="Times New Roman" w:cs="Times New Roman"/>
-        </w:rPr>
+        <w:rPr>
+          <w:rFonts w:cs="Times New Roman"/>
+        </w:rPr>
+      </w:pPr>
+    </w:p>
+    <w:p>
+      <w:pPr>
+        <w:rPr>
+          <w:rFonts w:cs="Times New Roman"/>
+        </w:rPr>
+      </w:pPr>
+      <w:r>
+        <w:rPr>
+          <w:rFonts w:cs="Times New Roman"/>
+        </w:rPr>
+        <w:lastRenderedPageBreak/>
         <w:br w:type="page"/>
       </w:r>
     </w:p>
@@ -2266,6 +2177,7 @@
           <w:rFonts w:cs="Times New Roman"/>
           <w:szCs w:val="24"/>
         </w:rPr>
+        <w:lastRenderedPageBreak/>
         <w:t>Stack tecnológico</w:t>
       </w:r>
       <w:bookmarkEnd w:id="8"/>
@@ -2273,97 +2185,92 @@
     <w:p>
       <w:pPr>
         <w:rPr>
-          <w:rFonts w:ascii="Times New Roman" w:hAnsi="Times New Roman" w:cs="Times New Roman"/>
-        </w:rPr>
-      </w:pPr>
-    </w:p>
-    <w:p>
-      <w:pPr>
-        <w:rPr>
-          <w:rFonts w:ascii="Times New Roman" w:hAnsi="Times New Roman" w:cs="Times New Roman"/>
-        </w:rPr>
-      </w:pPr>
-    </w:p>
-    <w:p>
-      <w:pPr>
-        <w:spacing w:line="480" w:lineRule="auto"/>
-        <w:ind w:firstLine="720"/>
-        <w:rPr>
-          <w:rFonts w:ascii="Times New Roman" w:hAnsi="Times New Roman" w:cs="Times New Roman"/>
-        </w:rPr>
-      </w:pPr>
-      <w:r>
-        <w:rPr>
-          <w:rFonts w:ascii="Times New Roman" w:hAnsi="Times New Roman" w:cs="Times New Roman"/>
+          <w:rFonts w:cs="Times New Roman"/>
+        </w:rPr>
+      </w:pPr>
+    </w:p>
+    <w:p>
+      <w:pPr>
+        <w:rPr>
+          <w:rFonts w:cs="Times New Roman"/>
+        </w:rPr>
+      </w:pPr>
+    </w:p>
+    <w:p>
+      <w:pPr>
+        <w:rPr>
+          <w:rFonts w:cs="Times New Roman"/>
+        </w:rPr>
+      </w:pPr>
+      <w:r>
+        <w:rPr>
+          <w:rFonts w:cs="Times New Roman"/>
         </w:rPr>
         <w:t xml:space="preserve">El desarrollo de la plataforma se estructurará dividiendo la interfaz visual y la lógica interna mediante un </w:t>
       </w:r>
       <w:proofErr w:type="spellStart"/>
       <w:r>
         <w:rPr>
-          <w:rFonts w:ascii="Times New Roman" w:hAnsi="Times New Roman" w:cs="Times New Roman"/>
+          <w:rFonts w:cs="Times New Roman"/>
         </w:rPr>
         <w:t>stack</w:t>
       </w:r>
       <w:proofErr w:type="spellEnd"/>
       <w:r>
         <w:rPr>
-          <w:rFonts w:ascii="Times New Roman" w:hAnsi="Times New Roman" w:cs="Times New Roman"/>
+          <w:rFonts w:cs="Times New Roman"/>
         </w:rPr>
         <w:t xml:space="preserve"> tecnológico claro. En el lado del cliente, se utilizará HTML para construir la estructura de las pantallas, CSS para darle un diseño visual moderno y JavaScript para programar la interactividad y dinamismo de la interfaz. Para agilizar la experiencia de navegación, se hará uso de </w:t>
       </w:r>
       <w:proofErr w:type="spellStart"/>
       <w:r>
         <w:rPr>
-          <w:rFonts w:ascii="Times New Roman" w:hAnsi="Times New Roman" w:cs="Times New Roman"/>
+          <w:rFonts w:cs="Times New Roman"/>
         </w:rPr>
         <w:t>localStorage</w:t>
       </w:r>
       <w:proofErr w:type="spellEnd"/>
       <w:r>
         <w:rPr>
-          <w:rFonts w:ascii="Times New Roman" w:hAnsi="Times New Roman" w:cs="Times New Roman"/>
+          <w:rFonts w:cs="Times New Roman"/>
         </w:rPr>
         <w:t>, lo que permite una persistencia de datos temporal directamente en el dispositivo del usuario, ideal para mantener sesiones activas o guardar preferencias rápidas sin saturar el servidor. Por otro lado, el núcleo del sistema (</w:t>
       </w:r>
       <w:proofErr w:type="spellStart"/>
       <w:r>
         <w:rPr>
-          <w:rFonts w:ascii="Times New Roman" w:hAnsi="Times New Roman" w:cs="Times New Roman"/>
+          <w:rFonts w:cs="Times New Roman"/>
         </w:rPr>
         <w:t>backend</w:t>
       </w:r>
       <w:proofErr w:type="spellEnd"/>
       <w:r>
         <w:rPr>
-          <w:rFonts w:ascii="Times New Roman" w:hAnsi="Times New Roman" w:cs="Times New Roman"/>
+          <w:rFonts w:cs="Times New Roman"/>
         </w:rPr>
         <w:t>) estará desarrollado en Java, encargado de procesar las reglas de negocio, gestionar la seguridad y coordinar las peticiones. Finalmente, para garantizar una persistencia de datos permanente, estructurada y segura a largo plazo —como la información de los clientes, las citas programadas y el historial de servicios—, todo el sistema estará respaldado por una base de datos relacional gestionada mediante SQL.</w:t>
       </w:r>
     </w:p>
     <w:p>
       <w:pPr>
-        <w:spacing w:line="480" w:lineRule="auto"/>
-        <w:ind w:firstLine="720"/>
-        <w:rPr>
-          <w:rFonts w:ascii="Times New Roman" w:hAnsi="Times New Roman" w:cs="Times New Roman"/>
+        <w:rPr>
+          <w:rFonts w:cs="Times New Roman"/>
         </w:rPr>
       </w:pPr>
     </w:p>
     <w:p>
       <w:pPr>
         <w:keepNext/>
-        <w:spacing w:line="480" w:lineRule="auto"/>
-        <w:ind w:firstLine="720"/>
-        <w:rPr>
-          <w:rFonts w:ascii="Times New Roman" w:hAnsi="Times New Roman" w:cs="Times New Roman"/>
-        </w:rPr>
-      </w:pPr>
-      <w:r>
-        <w:rPr>
-          <w:rFonts w:ascii="Times New Roman" w:hAnsi="Times New Roman" w:cs="Times New Roman"/>
+        <w:rPr>
+          <w:rFonts w:cs="Times New Roman"/>
+        </w:rPr>
+      </w:pPr>
+      <w:r>
+        <w:rPr>
+          <w:rFonts w:cs="Times New Roman"/>
           <w:noProof/>
         </w:rPr>
+        <w:lastRenderedPageBreak/>
         <w:drawing>
           <wp:inline distT="0" distB="0" distL="0" distR="0" wp14:anchorId="2EE34CBC" wp14:editId="04F9D64E">
             <wp:extent cx="1972924" cy="7827899"/>
@@ -2418,7 +2325,7 @@
       <w:pPr>
         <w:pStyle w:val="Descripcin"/>
         <w:rPr>
-          <w:rFonts w:ascii="Times New Roman" w:hAnsi="Times New Roman" w:cs="Times New Roman"/>
+          <w:rFonts w:cs="Times New Roman"/>
           <w:i w:val="0"/>
           <w:iCs w:val="0"/>
           <w:sz w:val="24"/>
@@ -2428,7 +2335,7 @@
       <w:bookmarkStart w:id="9" w:name="_Toc241140366"/>
       <w:r>
         <w:rPr>
-          <w:rFonts w:ascii="Times New Roman" w:hAnsi="Times New Roman" w:cs="Times New Roman"/>
+          <w:rFonts w:cs="Times New Roman"/>
           <w:sz w:val="24"/>
           <w:szCs w:val="24"/>
         </w:rPr>
@@ -2436,7 +2343,7 @@
       </w:r>
       <w:r>
         <w:rPr>
-          <w:rFonts w:ascii="Times New Roman" w:hAnsi="Times New Roman" w:cs="Times New Roman"/>
+          <w:rFonts w:cs="Times New Roman"/>
           <w:sz w:val="24"/>
           <w:szCs w:val="24"/>
         </w:rPr>
@@ -2444,7 +2351,7 @@
       </w:r>
       <w:r>
         <w:rPr>
-          <w:rFonts w:ascii="Times New Roman" w:hAnsi="Times New Roman" w:cs="Times New Roman"/>
+          <w:rFonts w:cs="Times New Roman"/>
           <w:sz w:val="24"/>
           <w:szCs w:val="24"/>
         </w:rPr>
@@ -2452,7 +2359,7 @@
       </w:r>
       <w:r>
         <w:rPr>
-          <w:rFonts w:ascii="Times New Roman" w:hAnsi="Times New Roman" w:cs="Times New Roman"/>
+          <w:rFonts w:cs="Times New Roman"/>
           <w:sz w:val="24"/>
           <w:szCs w:val="24"/>
         </w:rPr>
@@ -2460,7 +2367,7 @@
       </w:r>
       <w:r>
         <w:rPr>
-          <w:rFonts w:ascii="Times New Roman" w:hAnsi="Times New Roman" w:cs="Times New Roman"/>
+          <w:rFonts w:cs="Times New Roman"/>
           <w:noProof/>
           <w:sz w:val="24"/>
           <w:szCs w:val="24"/>
@@ -2469,7 +2376,7 @@
       </w:r>
       <w:r>
         <w:rPr>
-          <w:rFonts w:ascii="Times New Roman" w:hAnsi="Times New Roman" w:cs="Times New Roman"/>
+          <w:rFonts w:cs="Times New Roman"/>
           <w:sz w:val="24"/>
           <w:szCs w:val="24"/>
         </w:rPr>
@@ -2477,7 +2384,7 @@
       </w:r>
       <w:r>
         <w:rPr>
-          <w:rFonts w:ascii="Times New Roman" w:hAnsi="Times New Roman" w:cs="Times New Roman"/>
+          <w:rFonts w:cs="Times New Roman"/>
           <w:sz w:val="24"/>
           <w:szCs w:val="24"/>
         </w:rPr>
@@ -2485,7 +2392,7 @@
       </w:r>
       <w:r>
         <w:rPr>
-          <w:rFonts w:ascii="Times New Roman" w:hAnsi="Times New Roman" w:cs="Times New Roman"/>
+          <w:rFonts w:cs="Times New Roman"/>
           <w:sz w:val="24"/>
           <w:szCs w:val="24"/>
         </w:rPr>
@@ -2494,7 +2401,7 @@
       <w:bookmarkEnd w:id="9"/>
       <w:r>
         <w:rPr>
-          <w:rFonts w:ascii="Times New Roman" w:hAnsi="Times New Roman" w:cs="Times New Roman"/>
+          <w:rFonts w:cs="Times New Roman"/>
           <w:sz w:val="24"/>
           <w:szCs w:val="24"/>
         </w:rPr>
@@ -2515,6 +2422,7 @@
           <w:rFonts w:cs="Times New Roman"/>
           <w:szCs w:val="24"/>
         </w:rPr>
+        <w:lastRenderedPageBreak/>
         <w:t>Alcance</w:t>
       </w:r>
       <w:bookmarkEnd w:id="10"/>
@@ -2522,35 +2430,33 @@
     <w:p>
       <w:pPr>
         <w:rPr>
-          <w:rFonts w:ascii="Times New Roman" w:hAnsi="Times New Roman" w:cs="Times New Roman"/>
-        </w:rPr>
-      </w:pPr>
-    </w:p>
-    <w:p>
-      <w:pPr>
-        <w:rPr>
-          <w:rFonts w:ascii="Times New Roman" w:hAnsi="Times New Roman" w:cs="Times New Roman"/>
-        </w:rPr>
-      </w:pPr>
-    </w:p>
-    <w:p>
-      <w:pPr>
-        <w:rPr>
-          <w:rFonts w:ascii="Times New Roman" w:hAnsi="Times New Roman" w:cs="Times New Roman"/>
-        </w:rPr>
-      </w:pPr>
-    </w:p>
-    <w:p>
-      <w:pPr>
-        <w:spacing w:line="480" w:lineRule="auto"/>
-        <w:ind w:firstLine="720"/>
-        <w:rPr>
-          <w:rFonts w:ascii="Times New Roman" w:hAnsi="Times New Roman" w:cs="Times New Roman"/>
-        </w:rPr>
-      </w:pPr>
-      <w:r>
-        <w:rPr>
-          <w:rFonts w:ascii="Times New Roman" w:hAnsi="Times New Roman" w:cs="Times New Roman"/>
+          <w:rFonts w:cs="Times New Roman"/>
+        </w:rPr>
+      </w:pPr>
+    </w:p>
+    <w:p>
+      <w:pPr>
+        <w:rPr>
+          <w:rFonts w:cs="Times New Roman"/>
+        </w:rPr>
+      </w:pPr>
+    </w:p>
+    <w:p>
+      <w:pPr>
+        <w:rPr>
+          <w:rFonts w:cs="Times New Roman"/>
+        </w:rPr>
+      </w:pPr>
+    </w:p>
+    <w:p>
+      <w:pPr>
+        <w:rPr>
+          <w:rFonts w:cs="Times New Roman"/>
+        </w:rPr>
+      </w:pPr>
+      <w:r>
+        <w:rPr>
+          <w:rFonts w:cs="Times New Roman"/>
         </w:rPr>
         <w:t>El desarrollo de la aplicación se enfocará exclusivamente en solucionar la gestión de citas, la organización del tiempo de los barberos y el registro de clientes. A nivel funcional, el sistema abarca los siguientes módulos:</w:t>
       </w:r>
@@ -2558,7 +2464,7 @@
     <w:p>
       <w:pPr>
         <w:rPr>
-          <w:rFonts w:ascii="Times New Roman" w:hAnsi="Times New Roman" w:cs="Times New Roman"/>
+          <w:rFonts w:cs="Times New Roman"/>
         </w:rPr>
       </w:pPr>
     </w:p>
@@ -2582,14 +2488,13 @@
     </w:p>
     <w:p>
       <w:pPr>
-        <w:spacing w:line="480" w:lineRule="auto"/>
-        <w:rPr>
-          <w:rFonts w:ascii="Times New Roman" w:hAnsi="Times New Roman" w:cs="Times New Roman"/>
-        </w:rPr>
-      </w:pPr>
-      <w:r>
-        <w:rPr>
-          <w:rFonts w:ascii="Times New Roman" w:hAnsi="Times New Roman" w:cs="Times New Roman"/>
+        <w:rPr>
+          <w:rFonts w:cs="Times New Roman"/>
+        </w:rPr>
+      </w:pPr>
+      <w:r>
+        <w:rPr>
+          <w:rFonts w:cs="Times New Roman"/>
           <w:b/>
           <w:bCs/>
         </w:rPr>
@@ -2602,14 +2507,13 @@
           <w:ilvl w:val="0"/>
           <w:numId w:val="5"/>
         </w:numPr>
-        <w:spacing w:line="480" w:lineRule="auto"/>
-        <w:rPr>
-          <w:rFonts w:ascii="Times New Roman" w:hAnsi="Times New Roman" w:cs="Times New Roman"/>
-        </w:rPr>
-      </w:pPr>
-      <w:r>
-        <w:rPr>
-          <w:rFonts w:ascii="Times New Roman" w:hAnsi="Times New Roman" w:cs="Times New Roman"/>
+        <w:rPr>
+          <w:rFonts w:cs="Times New Roman"/>
+        </w:rPr>
+      </w:pPr>
+      <w:r>
+        <w:rPr>
+          <w:rFonts w:cs="Times New Roman"/>
           <w:b/>
           <w:bCs/>
         </w:rPr>
@@ -2617,7 +2521,7 @@
       </w:r>
       <w:r>
         <w:rPr>
-          <w:rFonts w:ascii="Times New Roman" w:hAnsi="Times New Roman" w:cs="Times New Roman"/>
+          <w:rFonts w:cs="Times New Roman"/>
         </w:rPr>
         <w:t xml:space="preserve"> Registro de nuevos usuarios, inicio de sesión (apoyado en persistencia temporal para evitar ingresos constantes) y actualización de datos de contacto.</w:t>
       </w:r>
@@ -2628,14 +2532,13 @@
           <w:ilvl w:val="0"/>
           <w:numId w:val="5"/>
         </w:numPr>
-        <w:spacing w:line="480" w:lineRule="auto"/>
-        <w:rPr>
-          <w:rFonts w:ascii="Times New Roman" w:hAnsi="Times New Roman" w:cs="Times New Roman"/>
-        </w:rPr>
-      </w:pPr>
-      <w:r>
-        <w:rPr>
-          <w:rFonts w:ascii="Times New Roman" w:hAnsi="Times New Roman" w:cs="Times New Roman"/>
+        <w:rPr>
+          <w:rFonts w:cs="Times New Roman"/>
+        </w:rPr>
+      </w:pPr>
+      <w:r>
+        <w:rPr>
+          <w:rFonts w:cs="Times New Roman"/>
           <w:b/>
           <w:bCs/>
         </w:rPr>
@@ -2643,7 +2546,7 @@
       </w:r>
       <w:r>
         <w:rPr>
-          <w:rFonts w:ascii="Times New Roman" w:hAnsi="Times New Roman" w:cs="Times New Roman"/>
+          <w:rFonts w:cs="Times New Roman"/>
         </w:rPr>
         <w:t xml:space="preserve"> Interfaz donde el cliente puede consultar el catálogo de servicios (con precios y duración), ver la disponibilidad de los barberos en tiempo real y reservar una fecha y hora específicas.</w:t>
       </w:r>
@@ -2654,14 +2557,13 @@
           <w:ilvl w:val="0"/>
           <w:numId w:val="5"/>
         </w:numPr>
-        <w:spacing w:line="480" w:lineRule="auto"/>
-        <w:rPr>
-          <w:rFonts w:ascii="Times New Roman" w:hAnsi="Times New Roman" w:cs="Times New Roman"/>
-        </w:rPr>
-      </w:pPr>
-      <w:r>
-        <w:rPr>
-          <w:rFonts w:ascii="Times New Roman" w:hAnsi="Times New Roman" w:cs="Times New Roman"/>
+        <w:rPr>
+          <w:rFonts w:cs="Times New Roman"/>
+        </w:rPr>
+      </w:pPr>
+      <w:r>
+        <w:rPr>
+          <w:rFonts w:cs="Times New Roman"/>
           <w:b/>
           <w:bCs/>
         </w:rPr>
@@ -2669,21 +2571,20 @@
       </w:r>
       <w:r>
         <w:rPr>
-          <w:rFonts w:ascii="Times New Roman" w:hAnsi="Times New Roman" w:cs="Times New Roman"/>
+          <w:rFonts w:cs="Times New Roman"/>
         </w:rPr>
         <w:t xml:space="preserve"> Capacidad para que el cliente visualice sus citas próximas y pueda cancelarlas o modificarlas dentro de los tiempos permitidos.</w:t>
       </w:r>
     </w:p>
     <w:p>
       <w:pPr>
-        <w:spacing w:line="480" w:lineRule="auto"/>
-        <w:rPr>
-          <w:rFonts w:ascii="Times New Roman" w:hAnsi="Times New Roman" w:cs="Times New Roman"/>
-        </w:rPr>
-      </w:pPr>
-      <w:r>
-        <w:rPr>
-          <w:rFonts w:ascii="Times New Roman" w:hAnsi="Times New Roman" w:cs="Times New Roman"/>
+        <w:rPr>
+          <w:rFonts w:cs="Times New Roman"/>
+        </w:rPr>
+      </w:pPr>
+      <w:r>
+        <w:rPr>
+          <w:rFonts w:cs="Times New Roman"/>
           <w:b/>
           <w:bCs/>
         </w:rPr>
@@ -2696,14 +2597,13 @@
           <w:ilvl w:val="0"/>
           <w:numId w:val="6"/>
         </w:numPr>
-        <w:spacing w:line="480" w:lineRule="auto"/>
-        <w:rPr>
-          <w:rFonts w:ascii="Times New Roman" w:hAnsi="Times New Roman" w:cs="Times New Roman"/>
-        </w:rPr>
-      </w:pPr>
-      <w:r>
-        <w:rPr>
-          <w:rFonts w:ascii="Times New Roman" w:hAnsi="Times New Roman" w:cs="Times New Roman"/>
+        <w:rPr>
+          <w:rFonts w:cs="Times New Roman"/>
+        </w:rPr>
+      </w:pPr>
+      <w:r>
+        <w:rPr>
+          <w:rFonts w:cs="Times New Roman"/>
           <w:b/>
           <w:bCs/>
         </w:rPr>
@@ -2711,7 +2611,7 @@
       </w:r>
       <w:r>
         <w:rPr>
-          <w:rFonts w:ascii="Times New Roman" w:hAnsi="Times New Roman" w:cs="Times New Roman"/>
+          <w:rFonts w:cs="Times New Roman"/>
         </w:rPr>
         <w:t xml:space="preserve"> Panel de control centralizado donde cada barbero puede ver su cronograma diario de forma ordenada.</w:t>
       </w:r>
@@ -2722,14 +2622,13 @@
           <w:ilvl w:val="0"/>
           <w:numId w:val="6"/>
         </w:numPr>
-        <w:spacing w:line="480" w:lineRule="auto"/>
-        <w:rPr>
-          <w:rFonts w:ascii="Times New Roman" w:hAnsi="Times New Roman" w:cs="Times New Roman"/>
-        </w:rPr>
-      </w:pPr>
-      <w:r>
-        <w:rPr>
-          <w:rFonts w:ascii="Times New Roman" w:hAnsi="Times New Roman" w:cs="Times New Roman"/>
+        <w:rPr>
+          <w:rFonts w:cs="Times New Roman"/>
+        </w:rPr>
+      </w:pPr>
+      <w:r>
+        <w:rPr>
+          <w:rFonts w:cs="Times New Roman"/>
           <w:b/>
           <w:bCs/>
         </w:rPr>
@@ -2737,7 +2636,7 @@
       </w:r>
       <w:r>
         <w:rPr>
-          <w:rFonts w:ascii="Times New Roman" w:hAnsi="Times New Roman" w:cs="Times New Roman"/>
+          <w:rFonts w:cs="Times New Roman"/>
         </w:rPr>
         <w:t xml:space="preserve"> Opción para cambiar el estado de la cita a medida que avanza el día (pendiente, completada, inasistencia o cancelada).</w:t>
       </w:r>
@@ -2748,36 +2647,35 @@
           <w:ilvl w:val="0"/>
           <w:numId w:val="6"/>
         </w:numPr>
-        <w:spacing w:line="480" w:lineRule="auto"/>
-        <w:rPr>
-          <w:rFonts w:ascii="Times New Roman" w:hAnsi="Times New Roman" w:cs="Times New Roman"/>
-        </w:rPr>
-      </w:pPr>
-      <w:r>
-        <w:rPr>
-          <w:rFonts w:ascii="Times New Roman" w:hAnsi="Times New Roman" w:cs="Times New Roman"/>
+        <w:rPr>
+          <w:rFonts w:cs="Times New Roman"/>
+        </w:rPr>
+      </w:pPr>
+      <w:r>
+        <w:rPr>
+          <w:rFonts w:cs="Times New Roman"/>
           <w:b/>
           <w:bCs/>
         </w:rPr>
+        <w:lastRenderedPageBreak/>
         <w:t>Historial de atención:</w:t>
       </w:r>
       <w:r>
         <w:rPr>
-          <w:rFonts w:ascii="Times New Roman" w:hAnsi="Times New Roman" w:cs="Times New Roman"/>
+          <w:rFonts w:cs="Times New Roman"/>
         </w:rPr>
         <w:t xml:space="preserve"> Acceso al perfil del cliente para revisar qué cortes se ha realizado anteriormente y cuáles son sus preferencias, permitiendo un servicio personalizado.</w:t>
       </w:r>
     </w:p>
     <w:p>
       <w:pPr>
-        <w:spacing w:line="480" w:lineRule="auto"/>
-        <w:rPr>
-          <w:rFonts w:ascii="Times New Roman" w:hAnsi="Times New Roman" w:cs="Times New Roman"/>
-        </w:rPr>
-      </w:pPr>
-      <w:r>
-        <w:rPr>
-          <w:rFonts w:ascii="Times New Roman" w:hAnsi="Times New Roman" w:cs="Times New Roman"/>
+        <w:rPr>
+          <w:rFonts w:cs="Times New Roman"/>
+        </w:rPr>
+      </w:pPr>
+      <w:r>
+        <w:rPr>
+          <w:rFonts w:cs="Times New Roman"/>
           <w:b/>
           <w:bCs/>
         </w:rPr>
@@ -2790,14 +2688,13 @@
           <w:ilvl w:val="0"/>
           <w:numId w:val="7"/>
         </w:numPr>
-        <w:spacing w:line="480" w:lineRule="auto"/>
-        <w:rPr>
-          <w:rFonts w:ascii="Times New Roman" w:hAnsi="Times New Roman" w:cs="Times New Roman"/>
-        </w:rPr>
-      </w:pPr>
-      <w:r>
-        <w:rPr>
-          <w:rFonts w:ascii="Times New Roman" w:hAnsi="Times New Roman" w:cs="Times New Roman"/>
+        <w:rPr>
+          <w:rFonts w:cs="Times New Roman"/>
+        </w:rPr>
+      </w:pPr>
+      <w:r>
+        <w:rPr>
+          <w:rFonts w:cs="Times New Roman"/>
           <w:b/>
           <w:bCs/>
         </w:rPr>
@@ -2805,21 +2702,21 @@
       </w:r>
       <w:r>
         <w:rPr>
-          <w:rFonts w:ascii="Times New Roman" w:hAnsi="Times New Roman" w:cs="Times New Roman"/>
+          <w:rFonts w:cs="Times New Roman"/>
         </w:rPr>
         <w:t xml:space="preserve"> Lógica en el </w:t>
       </w:r>
       <w:proofErr w:type="spellStart"/>
       <w:r>
         <w:rPr>
-          <w:rFonts w:ascii="Times New Roman" w:hAnsi="Times New Roman" w:cs="Times New Roman"/>
+          <w:rFonts w:cs="Times New Roman"/>
         </w:rPr>
         <w:t>backend</w:t>
       </w:r>
       <w:proofErr w:type="spellEnd"/>
       <w:r>
         <w:rPr>
-          <w:rFonts w:ascii="Times New Roman" w:hAnsi="Times New Roman" w:cs="Times New Roman"/>
+          <w:rFonts w:cs="Times New Roman"/>
         </w:rPr>
         <w:t xml:space="preserve"> que valida y bloquea los horarios ocupados, garantizando que no existan cruces de citas para un mismo barbero.</w:t>
       </w:r>
@@ -2830,14 +2727,13 @@
           <w:ilvl w:val="0"/>
           <w:numId w:val="7"/>
         </w:numPr>
-        <w:spacing w:line="480" w:lineRule="auto"/>
-        <w:rPr>
-          <w:rFonts w:ascii="Times New Roman" w:hAnsi="Times New Roman" w:cs="Times New Roman"/>
-        </w:rPr>
-      </w:pPr>
-      <w:r>
-        <w:rPr>
-          <w:rFonts w:ascii="Times New Roman" w:hAnsi="Times New Roman" w:cs="Times New Roman"/>
+        <w:rPr>
+          <w:rFonts w:cs="Times New Roman"/>
+        </w:rPr>
+      </w:pPr>
+      <w:r>
+        <w:rPr>
+          <w:rFonts w:cs="Times New Roman"/>
           <w:b/>
           <w:bCs/>
         </w:rPr>
@@ -2845,7 +2741,7 @@
       </w:r>
       <w:r>
         <w:rPr>
-          <w:rFonts w:ascii="Times New Roman" w:hAnsi="Times New Roman" w:cs="Times New Roman"/>
+          <w:rFonts w:cs="Times New Roman"/>
         </w:rPr>
         <w:t xml:space="preserve"> Generación de notificaciones o alertas automáticas previas a la cita para mitigar el olvido por parte de los clientes.</w:t>
       </w:r>
@@ -2853,7 +2749,7 @@
     <w:p>
       <w:pPr>
         <w:rPr>
-          <w:rFonts w:ascii="Times New Roman" w:hAnsi="Times New Roman" w:cs="Times New Roman"/>
+          <w:rFonts w:cs="Times New Roman"/>
         </w:rPr>
       </w:pPr>
     </w:p>
@@ -2877,21 +2773,19 @@
     </w:p>
     <w:p>
       <w:pPr>
-        <w:spacing w:line="480" w:lineRule="auto"/>
-        <w:ind w:firstLine="720"/>
-        <w:rPr>
-          <w:rFonts w:ascii="Times New Roman" w:hAnsi="Times New Roman" w:cs="Times New Roman"/>
-        </w:rPr>
-      </w:pPr>
-      <w:r>
-        <w:rPr>
-          <w:rFonts w:ascii="Times New Roman" w:hAnsi="Times New Roman" w:cs="Times New Roman"/>
+        <w:rPr>
+          <w:rFonts w:cs="Times New Roman"/>
+        </w:rPr>
+      </w:pPr>
+      <w:r>
+        <w:rPr>
+          <w:rFonts w:cs="Times New Roman"/>
         </w:rPr>
         <w:t xml:space="preserve">Para delimitar correctamente el desarrollo, esta versión de la aplicación </w:t>
       </w:r>
       <w:r>
         <w:rPr>
-          <w:rFonts w:ascii="Times New Roman" w:hAnsi="Times New Roman" w:cs="Times New Roman"/>
+          <w:rFonts w:cs="Times New Roman"/>
           <w:b/>
           <w:bCs/>
         </w:rPr>
@@ -2899,29 +2793,27 @@
       </w:r>
       <w:r>
         <w:rPr>
-          <w:rFonts w:ascii="Times New Roman" w:hAnsi="Times New Roman" w:cs="Times New Roman"/>
+          <w:rFonts w:cs="Times New Roman"/>
         </w:rPr>
         <w:t xml:space="preserve"> contempla integraciones con pasarelas de pago en línea (los cobros se seguirán realizando en el local), no incluye módulos de facturación electrónica contable, y tampoco abarcará la gestión de inventario de productos físicos (como venta de ceras, lociones o cuchillas). El proyecto está enfocado estrictamente en la optimización operativa de los servicios y el tiempo.</w:t>
       </w:r>
     </w:p>
     <w:p>
       <w:pPr>
-        <w:spacing w:line="480" w:lineRule="auto"/>
-        <w:ind w:firstLine="720"/>
-        <w:rPr>
-          <w:rFonts w:ascii="Times New Roman" w:hAnsi="Times New Roman" w:cs="Times New Roman"/>
-        </w:rPr>
-      </w:pPr>
-    </w:p>
-    <w:p>
-      <w:pPr>
-        <w:rPr>
-          <w:rFonts w:ascii="Times New Roman" w:hAnsi="Times New Roman" w:cs="Times New Roman"/>
-        </w:rPr>
-      </w:pPr>
-      <w:r>
-        <w:rPr>
-          <w:rFonts w:ascii="Times New Roman" w:hAnsi="Times New Roman" w:cs="Times New Roman"/>
+        <w:rPr>
+          <w:rFonts w:cs="Times New Roman"/>
+        </w:rPr>
+      </w:pPr>
+    </w:p>
+    <w:p>
+      <w:pPr>
+        <w:rPr>
+          <w:rFonts w:cs="Times New Roman"/>
+        </w:rPr>
+      </w:pPr>
+      <w:r>
+        <w:rPr>
+          <w:rFonts w:cs="Times New Roman"/>
         </w:rPr>
         <w:br w:type="page"/>
       </w:r>
@@ -2930,13 +2822,14 @@
       <w:pPr>
         <w:jc w:val="center"/>
         <w:rPr>
-          <w:rFonts w:ascii="Times New Roman" w:hAnsi="Times New Roman" w:cs="Times New Roman"/>
-        </w:rPr>
-      </w:pPr>
-      <w:r>
-        <w:rPr>
-          <w:rFonts w:ascii="Times New Roman" w:hAnsi="Times New Roman" w:cs="Times New Roman"/>
-        </w:rPr>
+          <w:rFonts w:cs="Times New Roman"/>
+        </w:rPr>
+      </w:pPr>
+      <w:r>
+        <w:rPr>
+          <w:rFonts w:cs="Times New Roman"/>
+        </w:rPr>
+        <w:lastRenderedPageBreak/>
         <w:t>Glosario</w:t>
       </w:r>
     </w:p>
@@ -2944,212 +2837,212 @@
       <w:pPr>
         <w:jc w:val="center"/>
         <w:rPr>
-          <w:rFonts w:ascii="Times New Roman" w:hAnsi="Times New Roman" w:cs="Times New Roman"/>
-        </w:rPr>
-      </w:pPr>
-    </w:p>
-    <w:p>
-      <w:pPr>
-        <w:jc w:val="center"/>
-        <w:rPr>
-          <w:rFonts w:ascii="Times New Roman" w:hAnsi="Times New Roman" w:cs="Times New Roman"/>
-        </w:rPr>
-      </w:pPr>
-    </w:p>
-    <w:p>
-      <w:pPr>
-        <w:jc w:val="center"/>
-        <w:rPr>
-          <w:rFonts w:ascii="Times New Roman" w:hAnsi="Times New Roman" w:cs="Times New Roman"/>
-        </w:rPr>
-      </w:pPr>
-    </w:p>
-    <w:p>
-      <w:pPr>
-        <w:jc w:val="center"/>
-        <w:rPr>
-          <w:rFonts w:ascii="Times New Roman" w:hAnsi="Times New Roman" w:cs="Times New Roman"/>
-        </w:rPr>
-      </w:pPr>
-    </w:p>
-    <w:p>
-      <w:pPr>
-        <w:jc w:val="center"/>
-        <w:rPr>
-          <w:rFonts w:ascii="Times New Roman" w:hAnsi="Times New Roman" w:cs="Times New Roman"/>
-        </w:rPr>
-      </w:pPr>
-    </w:p>
-    <w:p>
-      <w:pPr>
-        <w:jc w:val="center"/>
-        <w:rPr>
-          <w:rFonts w:ascii="Times New Roman" w:hAnsi="Times New Roman" w:cs="Times New Roman"/>
-        </w:rPr>
-      </w:pPr>
-    </w:p>
-    <w:p>
-      <w:pPr>
-        <w:jc w:val="center"/>
-        <w:rPr>
-          <w:rFonts w:ascii="Times New Roman" w:hAnsi="Times New Roman" w:cs="Times New Roman"/>
-        </w:rPr>
-      </w:pPr>
-    </w:p>
-    <w:p>
-      <w:pPr>
-        <w:jc w:val="center"/>
-        <w:rPr>
-          <w:rFonts w:ascii="Times New Roman" w:hAnsi="Times New Roman" w:cs="Times New Roman"/>
-        </w:rPr>
-      </w:pPr>
-    </w:p>
-    <w:p>
-      <w:pPr>
-        <w:jc w:val="center"/>
-        <w:rPr>
-          <w:rFonts w:ascii="Times New Roman" w:hAnsi="Times New Roman" w:cs="Times New Roman"/>
-        </w:rPr>
-      </w:pPr>
-    </w:p>
-    <w:p>
-      <w:pPr>
-        <w:jc w:val="center"/>
-        <w:rPr>
-          <w:rFonts w:ascii="Times New Roman" w:hAnsi="Times New Roman" w:cs="Times New Roman"/>
-        </w:rPr>
-      </w:pPr>
-    </w:p>
-    <w:p>
-      <w:pPr>
-        <w:jc w:val="center"/>
-        <w:rPr>
-          <w:rFonts w:ascii="Times New Roman" w:hAnsi="Times New Roman" w:cs="Times New Roman"/>
-        </w:rPr>
-      </w:pPr>
-    </w:p>
-    <w:p>
-      <w:pPr>
-        <w:jc w:val="center"/>
-        <w:rPr>
-          <w:rFonts w:ascii="Times New Roman" w:hAnsi="Times New Roman" w:cs="Times New Roman"/>
-        </w:rPr>
-      </w:pPr>
-    </w:p>
-    <w:p>
-      <w:pPr>
-        <w:jc w:val="center"/>
-        <w:rPr>
-          <w:rFonts w:ascii="Times New Roman" w:hAnsi="Times New Roman" w:cs="Times New Roman"/>
-        </w:rPr>
-      </w:pPr>
-    </w:p>
-    <w:p>
-      <w:pPr>
-        <w:jc w:val="center"/>
-        <w:rPr>
-          <w:rFonts w:ascii="Times New Roman" w:hAnsi="Times New Roman" w:cs="Times New Roman"/>
-        </w:rPr>
-      </w:pPr>
-    </w:p>
-    <w:p>
-      <w:pPr>
-        <w:jc w:val="center"/>
-        <w:rPr>
-          <w:rFonts w:ascii="Times New Roman" w:hAnsi="Times New Roman" w:cs="Times New Roman"/>
-        </w:rPr>
-      </w:pPr>
-    </w:p>
-    <w:p>
-      <w:pPr>
-        <w:jc w:val="center"/>
-        <w:rPr>
-          <w:rFonts w:ascii="Times New Roman" w:hAnsi="Times New Roman" w:cs="Times New Roman"/>
-        </w:rPr>
-      </w:pPr>
-    </w:p>
-    <w:p>
-      <w:pPr>
-        <w:jc w:val="center"/>
-        <w:rPr>
-          <w:rFonts w:ascii="Times New Roman" w:hAnsi="Times New Roman" w:cs="Times New Roman"/>
-        </w:rPr>
-      </w:pPr>
-    </w:p>
-    <w:p>
-      <w:pPr>
-        <w:jc w:val="center"/>
-        <w:rPr>
-          <w:rFonts w:ascii="Times New Roman" w:hAnsi="Times New Roman" w:cs="Times New Roman"/>
-        </w:rPr>
-      </w:pPr>
-    </w:p>
-    <w:p>
-      <w:pPr>
-        <w:jc w:val="center"/>
-        <w:rPr>
-          <w:rFonts w:ascii="Times New Roman" w:hAnsi="Times New Roman" w:cs="Times New Roman"/>
-        </w:rPr>
-      </w:pPr>
-    </w:p>
-    <w:p>
-      <w:pPr>
-        <w:jc w:val="center"/>
-        <w:rPr>
-          <w:rFonts w:ascii="Times New Roman" w:hAnsi="Times New Roman" w:cs="Times New Roman"/>
-        </w:rPr>
-      </w:pPr>
-    </w:p>
-    <w:p>
-      <w:pPr>
-        <w:jc w:val="center"/>
-        <w:rPr>
-          <w:rFonts w:ascii="Times New Roman" w:hAnsi="Times New Roman" w:cs="Times New Roman"/>
-        </w:rPr>
-      </w:pPr>
-    </w:p>
-    <w:p>
-      <w:pPr>
-        <w:jc w:val="center"/>
-        <w:rPr>
-          <w:rFonts w:ascii="Times New Roman" w:hAnsi="Times New Roman" w:cs="Times New Roman"/>
-        </w:rPr>
-      </w:pPr>
-    </w:p>
-    <w:p>
-      <w:pPr>
-        <w:jc w:val="center"/>
-        <w:rPr>
-          <w:rFonts w:ascii="Times New Roman" w:hAnsi="Times New Roman" w:cs="Times New Roman"/>
-        </w:rPr>
-      </w:pPr>
-    </w:p>
-    <w:p>
-      <w:pPr>
-        <w:jc w:val="center"/>
-        <w:rPr>
-          <w:rFonts w:ascii="Times New Roman" w:hAnsi="Times New Roman" w:cs="Times New Roman"/>
-        </w:rPr>
-      </w:pPr>
-    </w:p>
-    <w:p>
-      <w:pPr>
-        <w:jc w:val="center"/>
-        <w:rPr>
-          <w:rFonts w:ascii="Times New Roman" w:hAnsi="Times New Roman" w:cs="Times New Roman"/>
-        </w:rPr>
-      </w:pPr>
-    </w:p>
-    <w:p>
-      <w:pPr>
-        <w:jc w:val="center"/>
-        <w:rPr>
-          <w:rFonts w:ascii="Times New Roman" w:hAnsi="Times New Roman" w:cs="Times New Roman"/>
-        </w:rPr>
-      </w:pPr>
-      <w:r>
-        <w:rPr>
-          <w:rFonts w:ascii="Times New Roman" w:hAnsi="Times New Roman" w:cs="Times New Roman"/>
+          <w:rFonts w:cs="Times New Roman"/>
+        </w:rPr>
+      </w:pPr>
+    </w:p>
+    <w:p>
+      <w:pPr>
+        <w:jc w:val="center"/>
+        <w:rPr>
+          <w:rFonts w:cs="Times New Roman"/>
+        </w:rPr>
+      </w:pPr>
+    </w:p>
+    <w:p>
+      <w:pPr>
+        <w:jc w:val="center"/>
+        <w:rPr>
+          <w:rFonts w:cs="Times New Roman"/>
+        </w:rPr>
+      </w:pPr>
+    </w:p>
+    <w:p>
+      <w:pPr>
+        <w:jc w:val="center"/>
+        <w:rPr>
+          <w:rFonts w:cs="Times New Roman"/>
+        </w:rPr>
+      </w:pPr>
+    </w:p>
+    <w:p>
+      <w:pPr>
+        <w:jc w:val="center"/>
+        <w:rPr>
+          <w:rFonts w:cs="Times New Roman"/>
+        </w:rPr>
+      </w:pPr>
+    </w:p>
+    <w:p>
+      <w:pPr>
+        <w:jc w:val="center"/>
+        <w:rPr>
+          <w:rFonts w:cs="Times New Roman"/>
+        </w:rPr>
+      </w:pPr>
+    </w:p>
+    <w:p>
+      <w:pPr>
+        <w:jc w:val="center"/>
+        <w:rPr>
+          <w:rFonts w:cs="Times New Roman"/>
+        </w:rPr>
+      </w:pPr>
+    </w:p>
+    <w:p>
+      <w:pPr>
+        <w:jc w:val="center"/>
+        <w:rPr>
+          <w:rFonts w:cs="Times New Roman"/>
+        </w:rPr>
+      </w:pPr>
+    </w:p>
+    <w:p>
+      <w:pPr>
+        <w:jc w:val="center"/>
+        <w:rPr>
+          <w:rFonts w:cs="Times New Roman"/>
+        </w:rPr>
+      </w:pPr>
+    </w:p>
+    <w:p>
+      <w:pPr>
+        <w:jc w:val="center"/>
+        <w:rPr>
+          <w:rFonts w:cs="Times New Roman"/>
+        </w:rPr>
+      </w:pPr>
+    </w:p>
+    <w:p>
+      <w:pPr>
+        <w:jc w:val="center"/>
+        <w:rPr>
+          <w:rFonts w:cs="Times New Roman"/>
+        </w:rPr>
+      </w:pPr>
+    </w:p>
+    <w:p>
+      <w:pPr>
+        <w:jc w:val="center"/>
+        <w:rPr>
+          <w:rFonts w:cs="Times New Roman"/>
+        </w:rPr>
+      </w:pPr>
+    </w:p>
+    <w:p>
+      <w:pPr>
+        <w:jc w:val="center"/>
+        <w:rPr>
+          <w:rFonts w:cs="Times New Roman"/>
+        </w:rPr>
+      </w:pPr>
+    </w:p>
+    <w:p>
+      <w:pPr>
+        <w:jc w:val="center"/>
+        <w:rPr>
+          <w:rFonts w:cs="Times New Roman"/>
+        </w:rPr>
+      </w:pPr>
+    </w:p>
+    <w:p>
+      <w:pPr>
+        <w:jc w:val="center"/>
+        <w:rPr>
+          <w:rFonts w:cs="Times New Roman"/>
+        </w:rPr>
+      </w:pPr>
+    </w:p>
+    <w:p>
+      <w:pPr>
+        <w:jc w:val="center"/>
+        <w:rPr>
+          <w:rFonts w:cs="Times New Roman"/>
+        </w:rPr>
+      </w:pPr>
+    </w:p>
+    <w:p>
+      <w:pPr>
+        <w:jc w:val="center"/>
+        <w:rPr>
+          <w:rFonts w:cs="Times New Roman"/>
+        </w:rPr>
+      </w:pPr>
+    </w:p>
+    <w:p>
+      <w:pPr>
+        <w:jc w:val="center"/>
+        <w:rPr>
+          <w:rFonts w:cs="Times New Roman"/>
+        </w:rPr>
+      </w:pPr>
+    </w:p>
+    <w:p>
+      <w:pPr>
+        <w:jc w:val="center"/>
+        <w:rPr>
+          <w:rFonts w:cs="Times New Roman"/>
+        </w:rPr>
+      </w:pPr>
+    </w:p>
+    <w:p>
+      <w:pPr>
+        <w:jc w:val="center"/>
+        <w:rPr>
+          <w:rFonts w:cs="Times New Roman"/>
+        </w:rPr>
+      </w:pPr>
+    </w:p>
+    <w:p>
+      <w:pPr>
+        <w:jc w:val="center"/>
+        <w:rPr>
+          <w:rFonts w:cs="Times New Roman"/>
+        </w:rPr>
+      </w:pPr>
+    </w:p>
+    <w:p>
+      <w:pPr>
+        <w:jc w:val="center"/>
+        <w:rPr>
+          <w:rFonts w:cs="Times New Roman"/>
+        </w:rPr>
+      </w:pPr>
+    </w:p>
+    <w:p>
+      <w:pPr>
+        <w:jc w:val="center"/>
+        <w:rPr>
+          <w:rFonts w:cs="Times New Roman"/>
+        </w:rPr>
+      </w:pPr>
+    </w:p>
+    <w:p>
+      <w:pPr>
+        <w:jc w:val="center"/>
+        <w:rPr>
+          <w:rFonts w:cs="Times New Roman"/>
+        </w:rPr>
+      </w:pPr>
+    </w:p>
+    <w:p>
+      <w:pPr>
+        <w:jc w:val="center"/>
+        <w:rPr>
+          <w:rFonts w:cs="Times New Roman"/>
+        </w:rPr>
+      </w:pPr>
+    </w:p>
+    <w:p>
+      <w:pPr>
+        <w:jc w:val="center"/>
+        <w:rPr>
+          <w:rFonts w:cs="Times New Roman"/>
+        </w:rPr>
+      </w:pPr>
+      <w:r>
+        <w:rPr>
+          <w:rFonts w:cs="Times New Roman"/>
         </w:rPr>
         <w:br w:type="page"/>
       </w:r>
@@ -3158,13 +3051,14 @@
       <w:pPr>
         <w:jc w:val="center"/>
         <w:rPr>
-          <w:rFonts w:ascii="Times New Roman" w:hAnsi="Times New Roman" w:cs="Times New Roman"/>
-        </w:rPr>
-      </w:pPr>
-      <w:r>
-        <w:rPr>
-          <w:rFonts w:ascii="Times New Roman" w:hAnsi="Times New Roman" w:cs="Times New Roman"/>
-        </w:rPr>
+          <w:rFonts w:cs="Times New Roman"/>
+        </w:rPr>
+      </w:pPr>
+      <w:r>
+        <w:rPr>
+          <w:rFonts w:cs="Times New Roman"/>
+        </w:rPr>
+        <w:lastRenderedPageBreak/>
         <w:t>Referencias</w:t>
       </w:r>
     </w:p>
@@ -3172,212 +3066,212 @@
       <w:pPr>
         <w:jc w:val="center"/>
         <w:rPr>
-          <w:rFonts w:ascii="Times New Roman" w:hAnsi="Times New Roman" w:cs="Times New Roman"/>
-        </w:rPr>
-      </w:pPr>
-    </w:p>
-    <w:p>
-      <w:pPr>
-        <w:jc w:val="center"/>
-        <w:rPr>
-          <w:rFonts w:ascii="Times New Roman" w:hAnsi="Times New Roman" w:cs="Times New Roman"/>
-        </w:rPr>
-      </w:pPr>
-    </w:p>
-    <w:p>
-      <w:pPr>
-        <w:jc w:val="center"/>
-        <w:rPr>
-          <w:rFonts w:ascii="Times New Roman" w:hAnsi="Times New Roman" w:cs="Times New Roman"/>
-        </w:rPr>
-      </w:pPr>
-    </w:p>
-    <w:p>
-      <w:pPr>
-        <w:jc w:val="center"/>
-        <w:rPr>
-          <w:rFonts w:ascii="Times New Roman" w:hAnsi="Times New Roman" w:cs="Times New Roman"/>
-        </w:rPr>
-      </w:pPr>
-    </w:p>
-    <w:p>
-      <w:pPr>
-        <w:jc w:val="center"/>
-        <w:rPr>
-          <w:rFonts w:ascii="Times New Roman" w:hAnsi="Times New Roman" w:cs="Times New Roman"/>
-        </w:rPr>
-      </w:pPr>
-    </w:p>
-    <w:p>
-      <w:pPr>
-        <w:jc w:val="center"/>
-        <w:rPr>
-          <w:rFonts w:ascii="Times New Roman" w:hAnsi="Times New Roman" w:cs="Times New Roman"/>
-        </w:rPr>
-      </w:pPr>
-    </w:p>
-    <w:p>
-      <w:pPr>
-        <w:jc w:val="center"/>
-        <w:rPr>
-          <w:rFonts w:ascii="Times New Roman" w:hAnsi="Times New Roman" w:cs="Times New Roman"/>
-        </w:rPr>
-      </w:pPr>
-    </w:p>
-    <w:p>
-      <w:pPr>
-        <w:jc w:val="center"/>
-        <w:rPr>
-          <w:rFonts w:ascii="Times New Roman" w:hAnsi="Times New Roman" w:cs="Times New Roman"/>
-        </w:rPr>
-      </w:pPr>
-    </w:p>
-    <w:p>
-      <w:pPr>
-        <w:jc w:val="center"/>
-        <w:rPr>
-          <w:rFonts w:ascii="Times New Roman" w:hAnsi="Times New Roman" w:cs="Times New Roman"/>
-        </w:rPr>
-      </w:pPr>
-    </w:p>
-    <w:p>
-      <w:pPr>
-        <w:jc w:val="center"/>
-        <w:rPr>
-          <w:rFonts w:ascii="Times New Roman" w:hAnsi="Times New Roman" w:cs="Times New Roman"/>
-        </w:rPr>
-      </w:pPr>
-    </w:p>
-    <w:p>
-      <w:pPr>
-        <w:jc w:val="center"/>
-        <w:rPr>
-          <w:rFonts w:ascii="Times New Roman" w:hAnsi="Times New Roman" w:cs="Times New Roman"/>
-        </w:rPr>
-      </w:pPr>
-    </w:p>
-    <w:p>
-      <w:pPr>
-        <w:jc w:val="center"/>
-        <w:rPr>
-          <w:rFonts w:ascii="Times New Roman" w:hAnsi="Times New Roman" w:cs="Times New Roman"/>
-        </w:rPr>
-      </w:pPr>
-    </w:p>
-    <w:p>
-      <w:pPr>
-        <w:jc w:val="center"/>
-        <w:rPr>
-          <w:rFonts w:ascii="Times New Roman" w:hAnsi="Times New Roman" w:cs="Times New Roman"/>
-        </w:rPr>
-      </w:pPr>
-    </w:p>
-    <w:p>
-      <w:pPr>
-        <w:jc w:val="center"/>
-        <w:rPr>
-          <w:rFonts w:ascii="Times New Roman" w:hAnsi="Times New Roman" w:cs="Times New Roman"/>
-        </w:rPr>
-      </w:pPr>
-    </w:p>
-    <w:p>
-      <w:pPr>
-        <w:jc w:val="center"/>
-        <w:rPr>
-          <w:rFonts w:ascii="Times New Roman" w:hAnsi="Times New Roman" w:cs="Times New Roman"/>
-        </w:rPr>
-      </w:pPr>
-    </w:p>
-    <w:p>
-      <w:pPr>
-        <w:jc w:val="center"/>
-        <w:rPr>
-          <w:rFonts w:ascii="Times New Roman" w:hAnsi="Times New Roman" w:cs="Times New Roman"/>
-        </w:rPr>
-      </w:pPr>
-    </w:p>
-    <w:p>
-      <w:pPr>
-        <w:jc w:val="center"/>
-        <w:rPr>
-          <w:rFonts w:ascii="Times New Roman" w:hAnsi="Times New Roman" w:cs="Times New Roman"/>
-        </w:rPr>
-      </w:pPr>
-    </w:p>
-    <w:p>
-      <w:pPr>
-        <w:jc w:val="center"/>
-        <w:rPr>
-          <w:rFonts w:ascii="Times New Roman" w:hAnsi="Times New Roman" w:cs="Times New Roman"/>
-        </w:rPr>
-      </w:pPr>
-    </w:p>
-    <w:p>
-      <w:pPr>
-        <w:jc w:val="center"/>
-        <w:rPr>
-          <w:rFonts w:ascii="Times New Roman" w:hAnsi="Times New Roman" w:cs="Times New Roman"/>
-        </w:rPr>
-      </w:pPr>
-    </w:p>
-    <w:p>
-      <w:pPr>
-        <w:jc w:val="center"/>
-        <w:rPr>
-          <w:rFonts w:ascii="Times New Roman" w:hAnsi="Times New Roman" w:cs="Times New Roman"/>
-        </w:rPr>
-      </w:pPr>
-    </w:p>
-    <w:p>
-      <w:pPr>
-        <w:jc w:val="center"/>
-        <w:rPr>
-          <w:rFonts w:ascii="Times New Roman" w:hAnsi="Times New Roman" w:cs="Times New Roman"/>
-        </w:rPr>
-      </w:pPr>
-    </w:p>
-    <w:p>
-      <w:pPr>
-        <w:jc w:val="center"/>
-        <w:rPr>
-          <w:rFonts w:ascii="Times New Roman" w:hAnsi="Times New Roman" w:cs="Times New Roman"/>
-        </w:rPr>
-      </w:pPr>
-    </w:p>
-    <w:p>
-      <w:pPr>
-        <w:jc w:val="center"/>
-        <w:rPr>
-          <w:rFonts w:ascii="Times New Roman" w:hAnsi="Times New Roman" w:cs="Times New Roman"/>
-        </w:rPr>
-      </w:pPr>
-    </w:p>
-    <w:p>
-      <w:pPr>
-        <w:jc w:val="center"/>
-        <w:rPr>
-          <w:rFonts w:ascii="Times New Roman" w:hAnsi="Times New Roman" w:cs="Times New Roman"/>
-        </w:rPr>
-      </w:pPr>
-    </w:p>
-    <w:p>
-      <w:pPr>
-        <w:jc w:val="center"/>
-        <w:rPr>
-          <w:rFonts w:ascii="Times New Roman" w:hAnsi="Times New Roman" w:cs="Times New Roman"/>
-        </w:rPr>
-      </w:pPr>
-    </w:p>
-    <w:p>
-      <w:pPr>
-        <w:jc w:val="center"/>
-        <w:rPr>
-          <w:rFonts w:ascii="Times New Roman" w:hAnsi="Times New Roman" w:cs="Times New Roman"/>
-        </w:rPr>
-      </w:pPr>
-      <w:r>
-        <w:rPr>
-          <w:rFonts w:ascii="Times New Roman" w:hAnsi="Times New Roman" w:cs="Times New Roman"/>
+          <w:rFonts w:cs="Times New Roman"/>
+        </w:rPr>
+      </w:pPr>
+    </w:p>
+    <w:p>
+      <w:pPr>
+        <w:jc w:val="center"/>
+        <w:rPr>
+          <w:rFonts w:cs="Times New Roman"/>
+        </w:rPr>
+      </w:pPr>
+    </w:p>
+    <w:p>
+      <w:pPr>
+        <w:jc w:val="center"/>
+        <w:rPr>
+          <w:rFonts w:cs="Times New Roman"/>
+        </w:rPr>
+      </w:pPr>
+    </w:p>
+    <w:p>
+      <w:pPr>
+        <w:jc w:val="center"/>
+        <w:rPr>
+          <w:rFonts w:cs="Times New Roman"/>
+        </w:rPr>
+      </w:pPr>
+    </w:p>
+    <w:p>
+      <w:pPr>
+        <w:jc w:val="center"/>
+        <w:rPr>
+          <w:rFonts w:cs="Times New Roman"/>
+        </w:rPr>
+      </w:pPr>
+    </w:p>
+    <w:p>
+      <w:pPr>
+        <w:jc w:val="center"/>
+        <w:rPr>
+          <w:rFonts w:cs="Times New Roman"/>
+        </w:rPr>
+      </w:pPr>
+    </w:p>
+    <w:p>
+      <w:pPr>
+        <w:jc w:val="center"/>
+        <w:rPr>
+          <w:rFonts w:cs="Times New Roman"/>
+        </w:rPr>
+      </w:pPr>
+    </w:p>
+    <w:p>
+      <w:pPr>
+        <w:jc w:val="center"/>
+        <w:rPr>
+          <w:rFonts w:cs="Times New Roman"/>
+        </w:rPr>
+      </w:pPr>
+    </w:p>
+    <w:p>
+      <w:pPr>
+        <w:jc w:val="center"/>
+        <w:rPr>
+          <w:rFonts w:cs="Times New Roman"/>
+        </w:rPr>
+      </w:pPr>
+    </w:p>
+    <w:p>
+      <w:pPr>
+        <w:jc w:val="center"/>
+        <w:rPr>
+          <w:rFonts w:cs="Times New Roman"/>
+        </w:rPr>
+      </w:pPr>
+    </w:p>
+    <w:p>
+      <w:pPr>
+        <w:jc w:val="center"/>
+        <w:rPr>
+          <w:rFonts w:cs="Times New Roman"/>
+        </w:rPr>
+      </w:pPr>
+    </w:p>
+    <w:p>
+      <w:pPr>
+        <w:jc w:val="center"/>
+        <w:rPr>
+          <w:rFonts w:cs="Times New Roman"/>
+        </w:rPr>
+      </w:pPr>
+    </w:p>
+    <w:p>
+      <w:pPr>
+        <w:jc w:val="center"/>
+        <w:rPr>
+          <w:rFonts w:cs="Times New Roman"/>
+        </w:rPr>
+      </w:pPr>
+    </w:p>
+    <w:p>
+      <w:pPr>
+        <w:jc w:val="center"/>
+        <w:rPr>
+          <w:rFonts w:cs="Times New Roman"/>
+        </w:rPr>
+      </w:pPr>
+    </w:p>
+    <w:p>
+      <w:pPr>
+        <w:jc w:val="center"/>
+        <w:rPr>
+          <w:rFonts w:cs="Times New Roman"/>
+        </w:rPr>
+      </w:pPr>
+    </w:p>
+    <w:p>
+      <w:pPr>
+        <w:jc w:val="center"/>
+        <w:rPr>
+          <w:rFonts w:cs="Times New Roman"/>
+        </w:rPr>
+      </w:pPr>
+    </w:p>
+    <w:p>
+      <w:pPr>
+        <w:jc w:val="center"/>
+        <w:rPr>
+          <w:rFonts w:cs="Times New Roman"/>
+        </w:rPr>
+      </w:pPr>
+    </w:p>
+    <w:p>
+      <w:pPr>
+        <w:jc w:val="center"/>
+        <w:rPr>
+          <w:rFonts w:cs="Times New Roman"/>
+        </w:rPr>
+      </w:pPr>
+    </w:p>
+    <w:p>
+      <w:pPr>
+        <w:jc w:val="center"/>
+        <w:rPr>
+          <w:rFonts w:cs="Times New Roman"/>
+        </w:rPr>
+      </w:pPr>
+    </w:p>
+    <w:p>
+      <w:pPr>
+        <w:jc w:val="center"/>
+        <w:rPr>
+          <w:rFonts w:cs="Times New Roman"/>
+        </w:rPr>
+      </w:pPr>
+    </w:p>
+    <w:p>
+      <w:pPr>
+        <w:jc w:val="center"/>
+        <w:rPr>
+          <w:rFonts w:cs="Times New Roman"/>
+        </w:rPr>
+      </w:pPr>
+    </w:p>
+    <w:p>
+      <w:pPr>
+        <w:jc w:val="center"/>
+        <w:rPr>
+          <w:rFonts w:cs="Times New Roman"/>
+        </w:rPr>
+      </w:pPr>
+    </w:p>
+    <w:p>
+      <w:pPr>
+        <w:jc w:val="center"/>
+        <w:rPr>
+          <w:rFonts w:cs="Times New Roman"/>
+        </w:rPr>
+      </w:pPr>
+    </w:p>
+    <w:p>
+      <w:pPr>
+        <w:jc w:val="center"/>
+        <w:rPr>
+          <w:rFonts w:cs="Times New Roman"/>
+        </w:rPr>
+      </w:pPr>
+    </w:p>
+    <w:p>
+      <w:pPr>
+        <w:jc w:val="center"/>
+        <w:rPr>
+          <w:rFonts w:cs="Times New Roman"/>
+        </w:rPr>
+      </w:pPr>
+    </w:p>
+    <w:p>
+      <w:pPr>
+        <w:jc w:val="center"/>
+        <w:rPr>
+          <w:rFonts w:cs="Times New Roman"/>
+        </w:rPr>
+      </w:pPr>
+      <w:r>
+        <w:rPr>
+          <w:rFonts w:cs="Times New Roman"/>
         </w:rPr>
         <w:br w:type="page"/>
       </w:r>
@@ -3386,13 +3280,14 @@
       <w:pPr>
         <w:jc w:val="center"/>
         <w:rPr>
-          <w:rFonts w:ascii="Times New Roman" w:hAnsi="Times New Roman" w:cs="Times New Roman"/>
-        </w:rPr>
-      </w:pPr>
-      <w:r>
-        <w:rPr>
-          <w:rFonts w:ascii="Times New Roman" w:hAnsi="Times New Roman" w:cs="Times New Roman"/>
-        </w:rPr>
+          <w:rFonts w:cs="Times New Roman"/>
+        </w:rPr>
+      </w:pPr>
+      <w:r>
+        <w:rPr>
+          <w:rFonts w:cs="Times New Roman"/>
+        </w:rPr>
+        <w:lastRenderedPageBreak/>
         <w:t>Reglamentación y Condiciones Legales</w:t>
       </w:r>
     </w:p>
@@ -3400,212 +3295,212 @@
       <w:pPr>
         <w:jc w:val="center"/>
         <w:rPr>
-          <w:rFonts w:ascii="Times New Roman" w:hAnsi="Times New Roman" w:cs="Times New Roman"/>
-        </w:rPr>
-      </w:pPr>
-    </w:p>
-    <w:p>
-      <w:pPr>
-        <w:jc w:val="center"/>
-        <w:rPr>
-          <w:rFonts w:ascii="Times New Roman" w:hAnsi="Times New Roman" w:cs="Times New Roman"/>
-        </w:rPr>
-      </w:pPr>
-    </w:p>
-    <w:p>
-      <w:pPr>
-        <w:jc w:val="center"/>
-        <w:rPr>
-          <w:rFonts w:ascii="Times New Roman" w:hAnsi="Times New Roman" w:cs="Times New Roman"/>
-        </w:rPr>
-      </w:pPr>
-    </w:p>
-    <w:p>
-      <w:pPr>
-        <w:jc w:val="center"/>
-        <w:rPr>
-          <w:rFonts w:ascii="Times New Roman" w:hAnsi="Times New Roman" w:cs="Times New Roman"/>
-        </w:rPr>
-      </w:pPr>
-    </w:p>
-    <w:p>
-      <w:pPr>
-        <w:jc w:val="center"/>
-        <w:rPr>
-          <w:rFonts w:ascii="Times New Roman" w:hAnsi="Times New Roman" w:cs="Times New Roman"/>
-        </w:rPr>
-      </w:pPr>
-    </w:p>
-    <w:p>
-      <w:pPr>
-        <w:jc w:val="center"/>
-        <w:rPr>
-          <w:rFonts w:ascii="Times New Roman" w:hAnsi="Times New Roman" w:cs="Times New Roman"/>
-        </w:rPr>
-      </w:pPr>
-    </w:p>
-    <w:p>
-      <w:pPr>
-        <w:jc w:val="center"/>
-        <w:rPr>
-          <w:rFonts w:ascii="Times New Roman" w:hAnsi="Times New Roman" w:cs="Times New Roman"/>
-        </w:rPr>
-      </w:pPr>
-    </w:p>
-    <w:p>
-      <w:pPr>
-        <w:jc w:val="center"/>
-        <w:rPr>
-          <w:rFonts w:ascii="Times New Roman" w:hAnsi="Times New Roman" w:cs="Times New Roman"/>
-        </w:rPr>
-      </w:pPr>
-    </w:p>
-    <w:p>
-      <w:pPr>
-        <w:jc w:val="center"/>
-        <w:rPr>
-          <w:rFonts w:ascii="Times New Roman" w:hAnsi="Times New Roman" w:cs="Times New Roman"/>
-        </w:rPr>
-      </w:pPr>
-    </w:p>
-    <w:p>
-      <w:pPr>
-        <w:jc w:val="center"/>
-        <w:rPr>
-          <w:rFonts w:ascii="Times New Roman" w:hAnsi="Times New Roman" w:cs="Times New Roman"/>
-        </w:rPr>
-      </w:pPr>
-    </w:p>
-    <w:p>
-      <w:pPr>
-        <w:jc w:val="center"/>
-        <w:rPr>
-          <w:rFonts w:ascii="Times New Roman" w:hAnsi="Times New Roman" w:cs="Times New Roman"/>
-        </w:rPr>
-      </w:pPr>
-    </w:p>
-    <w:p>
-      <w:pPr>
-        <w:jc w:val="center"/>
-        <w:rPr>
-          <w:rFonts w:ascii="Times New Roman" w:hAnsi="Times New Roman" w:cs="Times New Roman"/>
-        </w:rPr>
-      </w:pPr>
-    </w:p>
-    <w:p>
-      <w:pPr>
-        <w:jc w:val="center"/>
-        <w:rPr>
-          <w:rFonts w:ascii="Times New Roman" w:hAnsi="Times New Roman" w:cs="Times New Roman"/>
-        </w:rPr>
-      </w:pPr>
-    </w:p>
-    <w:p>
-      <w:pPr>
-        <w:jc w:val="center"/>
-        <w:rPr>
-          <w:rFonts w:ascii="Times New Roman" w:hAnsi="Times New Roman" w:cs="Times New Roman"/>
-        </w:rPr>
-      </w:pPr>
-    </w:p>
-    <w:p>
-      <w:pPr>
-        <w:jc w:val="center"/>
-        <w:rPr>
-          <w:rFonts w:ascii="Times New Roman" w:hAnsi="Times New Roman" w:cs="Times New Roman"/>
-        </w:rPr>
-      </w:pPr>
-    </w:p>
-    <w:p>
-      <w:pPr>
-        <w:jc w:val="center"/>
-        <w:rPr>
-          <w:rFonts w:ascii="Times New Roman" w:hAnsi="Times New Roman" w:cs="Times New Roman"/>
-        </w:rPr>
-      </w:pPr>
-    </w:p>
-    <w:p>
-      <w:pPr>
-        <w:jc w:val="center"/>
-        <w:rPr>
-          <w:rFonts w:ascii="Times New Roman" w:hAnsi="Times New Roman" w:cs="Times New Roman"/>
-        </w:rPr>
-      </w:pPr>
-    </w:p>
-    <w:p>
-      <w:pPr>
-        <w:jc w:val="center"/>
-        <w:rPr>
-          <w:rFonts w:ascii="Times New Roman" w:hAnsi="Times New Roman" w:cs="Times New Roman"/>
-        </w:rPr>
-      </w:pPr>
-    </w:p>
-    <w:p>
-      <w:pPr>
-        <w:jc w:val="center"/>
-        <w:rPr>
-          <w:rFonts w:ascii="Times New Roman" w:hAnsi="Times New Roman" w:cs="Times New Roman"/>
-        </w:rPr>
-      </w:pPr>
-    </w:p>
-    <w:p>
-      <w:pPr>
-        <w:jc w:val="center"/>
-        <w:rPr>
-          <w:rFonts w:ascii="Times New Roman" w:hAnsi="Times New Roman" w:cs="Times New Roman"/>
-        </w:rPr>
-      </w:pPr>
-    </w:p>
-    <w:p>
-      <w:pPr>
-        <w:jc w:val="center"/>
-        <w:rPr>
-          <w:rFonts w:ascii="Times New Roman" w:hAnsi="Times New Roman" w:cs="Times New Roman"/>
-        </w:rPr>
-      </w:pPr>
-    </w:p>
-    <w:p>
-      <w:pPr>
-        <w:jc w:val="center"/>
-        <w:rPr>
-          <w:rFonts w:ascii="Times New Roman" w:hAnsi="Times New Roman" w:cs="Times New Roman"/>
-        </w:rPr>
-      </w:pPr>
-    </w:p>
-    <w:p>
-      <w:pPr>
-        <w:jc w:val="center"/>
-        <w:rPr>
-          <w:rFonts w:ascii="Times New Roman" w:hAnsi="Times New Roman" w:cs="Times New Roman"/>
-        </w:rPr>
-      </w:pPr>
-    </w:p>
-    <w:p>
-      <w:pPr>
-        <w:jc w:val="center"/>
-        <w:rPr>
-          <w:rFonts w:ascii="Times New Roman" w:hAnsi="Times New Roman" w:cs="Times New Roman"/>
-        </w:rPr>
-      </w:pPr>
-    </w:p>
-    <w:p>
-      <w:pPr>
-        <w:jc w:val="center"/>
-        <w:rPr>
-          <w:rFonts w:ascii="Times New Roman" w:hAnsi="Times New Roman" w:cs="Times New Roman"/>
-        </w:rPr>
-      </w:pPr>
-    </w:p>
-    <w:p>
-      <w:pPr>
-        <w:jc w:val="center"/>
-        <w:rPr>
-          <w:rFonts w:ascii="Times New Roman" w:hAnsi="Times New Roman" w:cs="Times New Roman"/>
-        </w:rPr>
-      </w:pPr>
-      <w:r>
-        <w:rPr>
-          <w:rFonts w:ascii="Times New Roman" w:hAnsi="Times New Roman" w:cs="Times New Roman"/>
+          <w:rFonts w:cs="Times New Roman"/>
+        </w:rPr>
+      </w:pPr>
+    </w:p>
+    <w:p>
+      <w:pPr>
+        <w:jc w:val="center"/>
+        <w:rPr>
+          <w:rFonts w:cs="Times New Roman"/>
+        </w:rPr>
+      </w:pPr>
+    </w:p>
+    <w:p>
+      <w:pPr>
+        <w:jc w:val="center"/>
+        <w:rPr>
+          <w:rFonts w:cs="Times New Roman"/>
+        </w:rPr>
+      </w:pPr>
+    </w:p>
+    <w:p>
+      <w:pPr>
+        <w:jc w:val="center"/>
+        <w:rPr>
+          <w:rFonts w:cs="Times New Roman"/>
+        </w:rPr>
+      </w:pPr>
+    </w:p>
+    <w:p>
+      <w:pPr>
+        <w:jc w:val="center"/>
+        <w:rPr>
+          <w:rFonts w:cs="Times New Roman"/>
+        </w:rPr>
+      </w:pPr>
+    </w:p>
+    <w:p>
+      <w:pPr>
+        <w:jc w:val="center"/>
+        <w:rPr>
+          <w:rFonts w:cs="Times New Roman"/>
+        </w:rPr>
+      </w:pPr>
+    </w:p>
+    <w:p>
+      <w:pPr>
+        <w:jc w:val="center"/>
+        <w:rPr>
+          <w:rFonts w:cs="Times New Roman"/>
+        </w:rPr>
+      </w:pPr>
+    </w:p>
+    <w:p>
+      <w:pPr>
+        <w:jc w:val="center"/>
+        <w:rPr>
+          <w:rFonts w:cs="Times New Roman"/>
+        </w:rPr>
+      </w:pPr>
+    </w:p>
+    <w:p>
+      <w:pPr>
+        <w:jc w:val="center"/>
+        <w:rPr>
+          <w:rFonts w:cs="Times New Roman"/>
+        </w:rPr>
+      </w:pPr>
+    </w:p>
+    <w:p>
+      <w:pPr>
+        <w:jc w:val="center"/>
+        <w:rPr>
+          <w:rFonts w:cs="Times New Roman"/>
+        </w:rPr>
+      </w:pPr>
+    </w:p>
+    <w:p>
+      <w:pPr>
+        <w:jc w:val="center"/>
+        <w:rPr>
+          <w:rFonts w:cs="Times New Roman"/>
+        </w:rPr>
+      </w:pPr>
+    </w:p>
+    <w:p>
+      <w:pPr>
+        <w:jc w:val="center"/>
+        <w:rPr>
+          <w:rFonts w:cs="Times New Roman"/>
+        </w:rPr>
+      </w:pPr>
+    </w:p>
+    <w:p>
+      <w:pPr>
+        <w:jc w:val="center"/>
+        <w:rPr>
+          <w:rFonts w:cs="Times New Roman"/>
+        </w:rPr>
+      </w:pPr>
+    </w:p>
+    <w:p>
+      <w:pPr>
+        <w:jc w:val="center"/>
+        <w:rPr>
+          <w:rFonts w:cs="Times New Roman"/>
+        </w:rPr>
+      </w:pPr>
+    </w:p>
+    <w:p>
+      <w:pPr>
+        <w:jc w:val="center"/>
+        <w:rPr>
+          <w:rFonts w:cs="Times New Roman"/>
+        </w:rPr>
+      </w:pPr>
+    </w:p>
+    <w:p>
+      <w:pPr>
+        <w:jc w:val="center"/>
+        <w:rPr>
+          <w:rFonts w:cs="Times New Roman"/>
+        </w:rPr>
+      </w:pPr>
+    </w:p>
+    <w:p>
+      <w:pPr>
+        <w:jc w:val="center"/>
+        <w:rPr>
+          <w:rFonts w:cs="Times New Roman"/>
+        </w:rPr>
+      </w:pPr>
+    </w:p>
+    <w:p>
+      <w:pPr>
+        <w:jc w:val="center"/>
+        <w:rPr>
+          <w:rFonts w:cs="Times New Roman"/>
+        </w:rPr>
+      </w:pPr>
+    </w:p>
+    <w:p>
+      <w:pPr>
+        <w:jc w:val="center"/>
+        <w:rPr>
+          <w:rFonts w:cs="Times New Roman"/>
+        </w:rPr>
+      </w:pPr>
+    </w:p>
+    <w:p>
+      <w:pPr>
+        <w:jc w:val="center"/>
+        <w:rPr>
+          <w:rFonts w:cs="Times New Roman"/>
+        </w:rPr>
+      </w:pPr>
+    </w:p>
+    <w:p>
+      <w:pPr>
+        <w:jc w:val="center"/>
+        <w:rPr>
+          <w:rFonts w:cs="Times New Roman"/>
+        </w:rPr>
+      </w:pPr>
+    </w:p>
+    <w:p>
+      <w:pPr>
+        <w:jc w:val="center"/>
+        <w:rPr>
+          <w:rFonts w:cs="Times New Roman"/>
+        </w:rPr>
+      </w:pPr>
+    </w:p>
+    <w:p>
+      <w:pPr>
+        <w:jc w:val="center"/>
+        <w:rPr>
+          <w:rFonts w:cs="Times New Roman"/>
+        </w:rPr>
+      </w:pPr>
+    </w:p>
+    <w:p>
+      <w:pPr>
+        <w:jc w:val="center"/>
+        <w:rPr>
+          <w:rFonts w:cs="Times New Roman"/>
+        </w:rPr>
+      </w:pPr>
+    </w:p>
+    <w:p>
+      <w:pPr>
+        <w:jc w:val="center"/>
+        <w:rPr>
+          <w:rFonts w:cs="Times New Roman"/>
+        </w:rPr>
+      </w:pPr>
+    </w:p>
+    <w:p>
+      <w:pPr>
+        <w:jc w:val="center"/>
+        <w:rPr>
+          <w:rFonts w:cs="Times New Roman"/>
+        </w:rPr>
+      </w:pPr>
+      <w:r>
+        <w:rPr>
+          <w:rFonts w:cs="Times New Roman"/>
         </w:rPr>
         <w:br w:type="page"/>
       </w:r>
@@ -3614,7 +3509,7 @@
       <w:pPr>
         <w:jc w:val="center"/>
         <w:rPr>
-          <w:rFonts w:ascii="Times New Roman" w:hAnsi="Times New Roman" w:cs="Times New Roman"/>
+          <w:rFonts w:cs="Times New Roman"/>
         </w:rPr>
       </w:pPr>
     </w:p>
@@ -4924,6 +4819,15 @@
   <w:style w:type="paragraph" w:default="1" w:styleId="Normal">
     <w:name w:val="Normal"/>
     <w:qFormat/>
+    <w:rsid w:val="00641223"/>
+    <w:pPr>
+      <w:spacing w:after="0" w:line="480" w:lineRule="auto"/>
+      <w:ind w:firstLine="720"/>
+    </w:pPr>
+    <w:rPr>
+      <w:rFonts w:ascii="Times New Roman" w:hAnsi="Times New Roman"/>
+      <w:color w:val="000000" w:themeColor="text1"/>
+    </w:rPr>
   </w:style>
   <w:style w:type="paragraph" w:styleId="Ttulo1">
     <w:name w:val="heading 1"/>
@@ -4941,9 +4845,8 @@
       <w:outlineLvl w:val="0"/>
     </w:pPr>
     <w:rPr>
-      <w:rFonts w:ascii="Times New Roman" w:eastAsiaTheme="majorEastAsia" w:hAnsi="Times New Roman" w:cstheme="majorBidi"/>
+      <w:rFonts w:eastAsiaTheme="majorEastAsia" w:cstheme="majorBidi"/>
       <w:b/>
-      <w:color w:val="000000" w:themeColor="text1"/>
       <w:szCs w:val="40"/>
     </w:rPr>
   </w:style>
@@ -4963,9 +4866,8 @@
       <w:outlineLvl w:val="1"/>
     </w:pPr>
     <w:rPr>
-      <w:rFonts w:ascii="Times New Roman" w:eastAsiaTheme="majorEastAsia" w:hAnsi="Times New Roman" w:cstheme="majorBidi"/>
+      <w:rFonts w:eastAsiaTheme="majorEastAsia" w:cstheme="majorBidi"/>
       <w:b/>
-      <w:color w:val="000000" w:themeColor="text1"/>
       <w:szCs w:val="32"/>
     </w:rPr>
   </w:style>
@@ -5049,7 +4951,7 @@
     <w:pPr>
       <w:keepNext/>
       <w:keepLines/>
-      <w:spacing w:before="40" w:after="0"/>
+      <w:spacing w:before="40"/>
       <w:outlineLvl w:val="5"/>
     </w:pPr>
     <w:rPr>
@@ -5072,7 +4974,7 @@
     <w:pPr>
       <w:keepNext/>
       <w:keepLines/>
-      <w:spacing w:before="40" w:after="0"/>
+      <w:spacing w:before="40"/>
       <w:outlineLvl w:val="6"/>
     </w:pPr>
     <w:rPr>
@@ -5093,7 +4995,6 @@
     <w:pPr>
       <w:keepNext/>
       <w:keepLines/>
-      <w:spacing w:after="0"/>
       <w:outlineLvl w:val="7"/>
     </w:pPr>
     <w:rPr>
@@ -5116,7 +5017,6 @@
     <w:pPr>
       <w:keepNext/>
       <w:keepLines/>
-      <w:spacing w:after="0"/>
       <w:outlineLvl w:val="8"/>
     </w:pPr>
     <w:rPr>
@@ -5315,6 +5215,7 @@
       <w:numPr>
         <w:ilvl w:val="1"/>
       </w:numPr>
+      <w:ind w:firstLine="720"/>
     </w:pPr>
     <w:rPr>
       <w:rFonts w:eastAsiaTheme="majorEastAsia" w:cstheme="majorBidi"/>
@@ -5541,9 +5442,6 @@
     <w:uiPriority w:val="99"/>
     <w:unhideWhenUsed/>
     <w:rsid w:val="00B47789"/>
-    <w:pPr>
-      <w:spacing w:after="0"/>
-    </w:pPr>
   </w:style>
   <w:style w:type="table" w:styleId="Tablanormal2">
     <w:name w:val="Plain Table 2"/>
@@ -5624,6 +5522,23 @@
         </w:tcBorders>
       </w:tcPr>
     </w:tblStylePr>
+  </w:style>
+  <w:style w:type="paragraph" w:styleId="NormalWeb">
+    <w:name w:val="Normal (Web)"/>
+    <w:basedOn w:val="Normal"/>
+    <w:uiPriority w:val="99"/>
+    <w:semiHidden/>
+    <w:unhideWhenUsed/>
+    <w:rsid w:val="00641223"/>
+    <w:pPr>
+      <w:spacing w:before="100" w:beforeAutospacing="1" w:after="100" w:afterAutospacing="1" w:line="240" w:lineRule="auto"/>
+    </w:pPr>
+    <w:rPr>
+      <w:rFonts w:eastAsia="Times New Roman" w:cs="Times New Roman"/>
+      <w:kern w:val="0"/>
+      <w:lang w:val="es-MX" w:eastAsia="es-MX"/>
+      <w14:ligatures w14:val="none"/>
+    </w:rPr>
   </w:style>
 </w:styles>
 </file>

</xml_diff>

<commit_message>
feat: actualizar informe de requisitos
</commit_message>
<xml_diff>
--- a/informe de requisitos.docx
+++ b/informe de requisitos.docx
@@ -1,6 +1,6 @@
 
 <file path=word/document.xml><?xml version="1.0" encoding="utf-8"?>
-<w:document xmlns:wpc="http://schemas.microsoft.com/office/word/2010/wordprocessingCanvas" xmlns:cx="http://schemas.microsoft.com/office/drawing/2014/chartex" xmlns:cx1="http://schemas.microsoft.com/office/drawing/2015/9/8/chartex" xmlns:cx2="http://schemas.microsoft.com/office/drawing/2015/10/21/chartex" xmlns:cx3="http://schemas.microsoft.com/office/drawing/2016/5/9/chartex" xmlns:cx4="http://schemas.microsoft.com/office/drawing/2016/5/10/chartex" xmlns:cx5="http://schemas.microsoft.com/office/drawing/2016/5/11/chartex" xmlns:cx6="http://schemas.microsoft.com/office/drawing/2016/5/12/chartex" xmlns:cx7="http://schemas.microsoft.com/office/drawing/2016/5/13/chartex" xmlns:cx8="http://schemas.microsoft.com/office/drawing/2016/5/14/chartex" xmlns:mc="http://schemas.openxmlformats.org/markup-compatibility/2006" xmlns:aink="http://schemas.microsoft.com/office/drawing/2016/ink" xmlns:am3d="http://schemas.microsoft.com/office/drawing/2017/model3d" xmlns:o="urn:schemas-microsoft-com:office:office" xmlns:oel="http://schemas.microsoft.com/office/2019/extlst" xmlns:r="http://schemas.openxmlformats.org/officeDocument/2006/relationships" xmlns:m="http://schemas.openxmlformats.org/officeDocument/2006/math" xmlns:v="urn:schemas-microsoft-com:vml" xmlns:wp14="http://schemas.microsoft.com/office/word/2010/wordprocessingDrawing" xmlns:wp="http://schemas.openxmlformats.org/drawingml/2006/wordprocessingDrawing" xmlns:w10="urn:schemas-microsoft-com:office:word" xmlns:w="http://schemas.openxmlformats.org/wordprocessingml/2006/main" xmlns:w14="http://schemas.microsoft.com/office/word/2010/wordml" xmlns:w15="http://schemas.microsoft.com/office/word/2012/wordml" xmlns:w16cex="http://schemas.microsoft.com/office/word/2018/wordml/cex" xmlns:w16cid="http://schemas.microsoft.com/office/word/2016/wordml/cid" xmlns:w16="http://schemas.microsoft.com/office/word/2018/wordml" xmlns:w16du="http://schemas.microsoft.com/office/word/2023/wordml/word16du" xmlns:w16sdtdh="http://schemas.microsoft.com/office/word/2020/wordml/sdtdatahash" xmlns:w16se="http://schemas.microsoft.com/office/word/2015/wordml/symex" xmlns:wpg="http://schemas.microsoft.com/office/word/2010/wordprocessingGroup" xmlns:wpi="http://schemas.microsoft.com/office/word/2010/wordprocessingInk" xmlns:wne="http://schemas.microsoft.com/office/word/2006/wordml" xmlns:wps="http://schemas.microsoft.com/office/word/2010/wordprocessingShape" mc:Ignorable="w14 w15 w16se w16cid w16 w16cex w16sdtdh w16du wp14">
+<w:document xmlns:wpc="http://schemas.microsoft.com/office/word/2010/wordprocessingCanvas" xmlns:cx="http://schemas.microsoft.com/office/drawing/2014/chartex" xmlns:cx1="http://schemas.microsoft.com/office/drawing/2015/9/8/chartex" xmlns:cx2="http://schemas.microsoft.com/office/drawing/2015/10/21/chartex" xmlns:cx3="http://schemas.microsoft.com/office/drawing/2016/5/9/chartex" xmlns:cx4="http://schemas.microsoft.com/office/drawing/2016/5/10/chartex" xmlns:cx5="http://schemas.microsoft.com/office/drawing/2016/5/11/chartex" xmlns:cx6="http://schemas.microsoft.com/office/drawing/2016/5/12/chartex" xmlns:cx7="http://schemas.microsoft.com/office/drawing/2016/5/13/chartex" xmlns:cx8="http://schemas.microsoft.com/office/drawing/2016/5/14/chartex" xmlns:mc="http://schemas.openxmlformats.org/markup-compatibility/2006" xmlns:aink="http://schemas.microsoft.com/office/drawing/2016/ink" xmlns:am3d="http://schemas.microsoft.com/office/drawing/2017/model3d" xmlns:o="urn:schemas-microsoft-com:office:office" xmlns:r="http://schemas.openxmlformats.org/officeDocument/2006/relationships" xmlns:m="http://schemas.openxmlformats.org/officeDocument/2006/math" xmlns:v="urn:schemas-microsoft-com:vml" xmlns:wp14="http://schemas.microsoft.com/office/word/2010/wordprocessingDrawing" xmlns:wp="http://schemas.openxmlformats.org/drawingml/2006/wordprocessingDrawing" xmlns:w10="urn:schemas-microsoft-com:office:word" xmlns:w="http://schemas.openxmlformats.org/wordprocessingml/2006/main" xmlns:w14="http://schemas.microsoft.com/office/word/2010/wordml" xmlns:w15="http://schemas.microsoft.com/office/word/2012/wordml" xmlns:w16cex="http://schemas.microsoft.com/office/word/2018/wordml/cex" xmlns:w16cid="http://schemas.microsoft.com/office/word/2016/wordml/cid" xmlns:w16="http://schemas.microsoft.com/office/word/2018/wordml" xmlns:w16sdtdh="http://schemas.microsoft.com/office/word/2020/wordml/sdtdatahash" xmlns:w16se="http://schemas.microsoft.com/office/word/2015/wordml/symex" xmlns:wpg="http://schemas.microsoft.com/office/word/2010/wordprocessingGroup" xmlns:wpi="http://schemas.microsoft.com/office/word/2010/wordprocessingInk" xmlns:wne="http://schemas.microsoft.com/office/word/2006/wordml" xmlns:wps="http://schemas.microsoft.com/office/word/2010/wordprocessingShape" mc:Ignorable="w14 w15 w16se w16cid w16 w16cex w16sdtdh wp14">
   <w:body>
     <w:p>
       <w:pPr>
@@ -1414,6 +1414,7 @@
     </w:p>
     <w:p>
       <w:pPr>
+        <w:jc w:val="both"/>
         <w:rPr>
           <w:rFonts w:cs="Times New Roman"/>
           <w:lang w:val="en-US"/>
@@ -1425,6 +1426,216 @@
           <w:lang w:val="en-US"/>
         </w:rPr>
         <w:fldChar w:fldCharType="end"/>
+      </w:r>
+    </w:p>
+    <w:p>
+      <w:pPr>
+        <w:jc w:val="both"/>
+        <w:rPr>
+          <w:rFonts w:cs="Times New Roman"/>
+        </w:rPr>
+      </w:pPr>
+      <w:r>
+        <w:rPr>
+          <w:rFonts w:cs="Times New Roman"/>
+          <w:b/>
+          <w:bCs/>
+        </w:rPr>
+        <w:t>Tabla 1</w:t>
+      </w:r>
+      <w:r>
+        <w:rPr>
+          <w:rFonts w:cs="Times New Roman"/>
+        </w:rPr>
+        <w:t>.</w:t>
+      </w:r>
+    </w:p>
+    <w:p>
+      <w:pPr>
+        <w:ind w:left="708" w:firstLine="12"/>
+        <w:jc w:val="both"/>
+        <w:rPr>
+          <w:rFonts w:cs="Times New Roman"/>
+        </w:rPr>
+      </w:pPr>
+      <w:r>
+        <w:rPr>
+          <w:rFonts w:cs="Times New Roman"/>
+        </w:rPr>
+        <w:t xml:space="preserve">Colecciones Descripción: Permite almacenar las colecciones creadas por los </w:t>
+      </w:r>
+      <w:r>
+        <w:rPr>
+          <w:rFonts w:cs="Times New Roman"/>
+        </w:rPr>
+        <w:t>u</w:t>
+      </w:r>
+      <w:r>
+        <w:rPr>
+          <w:rFonts w:cs="Times New Roman"/>
+        </w:rPr>
+        <w:t xml:space="preserve">suarios. </w:t>
+      </w:r>
+    </w:p>
+    <w:p>
+      <w:pPr>
+        <w:jc w:val="both"/>
+        <w:rPr>
+          <w:rFonts w:cs="Times New Roman"/>
+          <w:b/>
+          <w:bCs/>
+        </w:rPr>
+      </w:pPr>
+      <w:r>
+        <w:rPr>
+          <w:rFonts w:cs="Times New Roman"/>
+          <w:b/>
+          <w:bCs/>
+        </w:rPr>
+        <w:t xml:space="preserve">Tabla 2. </w:t>
+      </w:r>
+    </w:p>
+    <w:p>
+      <w:pPr>
+        <w:jc w:val="both"/>
+        <w:rPr>
+          <w:rFonts w:cs="Times New Roman"/>
+        </w:rPr>
+      </w:pPr>
+      <w:r>
+        <w:rPr>
+          <w:rFonts w:cs="Times New Roman"/>
+        </w:rPr>
+        <w:t xml:space="preserve">Favoritos Descripción: Registra las recetas guardadas por cada usuario. </w:t>
+      </w:r>
+    </w:p>
+    <w:p>
+      <w:pPr>
+        <w:jc w:val="both"/>
+        <w:rPr>
+          <w:rFonts w:cs="Times New Roman"/>
+          <w:b/>
+          <w:bCs/>
+        </w:rPr>
+      </w:pPr>
+      <w:r>
+        <w:rPr>
+          <w:rFonts w:cs="Times New Roman"/>
+          <w:b/>
+          <w:bCs/>
+        </w:rPr>
+        <w:t>Tabla 3.</w:t>
+      </w:r>
+    </w:p>
+    <w:p>
+      <w:pPr>
+        <w:jc w:val="both"/>
+        <w:rPr>
+          <w:rFonts w:cs="Times New Roman"/>
+        </w:rPr>
+      </w:pPr>
+      <w:r>
+        <w:rPr>
+          <w:rFonts w:cs="Times New Roman"/>
+        </w:rPr>
+        <w:t xml:space="preserve">Comentarios Descripción: Almacena comentarios realizados sobre las recetas. </w:t>
+      </w:r>
+    </w:p>
+    <w:p>
+      <w:pPr>
+        <w:jc w:val="both"/>
+        <w:rPr>
+          <w:rFonts w:cs="Times New Roman"/>
+          <w:b/>
+          <w:bCs/>
+        </w:rPr>
+      </w:pPr>
+      <w:r>
+        <w:rPr>
+          <w:rFonts w:cs="Times New Roman"/>
+          <w:b/>
+          <w:bCs/>
+        </w:rPr>
+        <w:t>Tabla 4.</w:t>
+      </w:r>
+    </w:p>
+    <w:p>
+      <w:pPr>
+        <w:jc w:val="both"/>
+        <w:rPr>
+          <w:rFonts w:cs="Times New Roman"/>
+        </w:rPr>
+      </w:pPr>
+      <w:r>
+        <w:rPr>
+          <w:rFonts w:cs="Times New Roman"/>
+        </w:rPr>
+        <w:t xml:space="preserve">Reportes Descripción: Registra reportes de contenido realizados por los usuarios. </w:t>
+      </w:r>
+    </w:p>
+    <w:p>
+      <w:pPr>
+        <w:jc w:val="both"/>
+        <w:rPr>
+          <w:rFonts w:cs="Times New Roman"/>
+          <w:b/>
+          <w:bCs/>
+        </w:rPr>
+      </w:pPr>
+      <w:r>
+        <w:rPr>
+          <w:rFonts w:cs="Times New Roman"/>
+          <w:b/>
+          <w:bCs/>
+        </w:rPr>
+        <w:t>Tabla 5.</w:t>
+      </w:r>
+    </w:p>
+    <w:p>
+      <w:pPr>
+        <w:jc w:val="both"/>
+        <w:rPr>
+          <w:rFonts w:cs="Times New Roman"/>
+        </w:rPr>
+      </w:pPr>
+      <w:r>
+        <w:rPr>
+          <w:rFonts w:cs="Times New Roman"/>
+        </w:rPr>
+        <w:t xml:space="preserve">Calificaciones Descripción: Guarda las puntuaciones asignadas a las recetas. </w:t>
+      </w:r>
+    </w:p>
+    <w:p>
+      <w:pPr>
+        <w:jc w:val="both"/>
+        <w:rPr>
+          <w:rFonts w:cs="Times New Roman"/>
+          <w:b/>
+          <w:bCs/>
+        </w:rPr>
+      </w:pPr>
+      <w:r>
+        <w:rPr>
+          <w:rFonts w:cs="Times New Roman"/>
+          <w:b/>
+          <w:bCs/>
+        </w:rPr>
+        <w:t>Tabla 6.</w:t>
+      </w:r>
+    </w:p>
+    <w:p>
+      <w:pPr>
+        <w:jc w:val="both"/>
+        <w:rPr>
+          <w:rFonts w:cs="Times New Roman"/>
+          <w:lang w:val="en-US"/>
+        </w:rPr>
+      </w:pPr>
+      <w:r>
+        <w:rPr>
+          <w:rFonts w:cs="Times New Roman"/>
+        </w:rPr>
+        <w:t>Favoritos colecciones Descripción: Relaciona recetas favoritas con colecciones.</w:t>
       </w:r>
     </w:p>
     <w:p>
@@ -1650,15 +1861,7 @@
     </w:p>
     <w:p>
       <w:r>
-        <w:t xml:space="preserve">A lo largo de este informe encontrarás una serie de secciones organizadas para ir de lo general a lo específico. Inicialmente, se exponen las problemáticas y necesidades actuales de la plataforma que justifican el desarrollo de este software. A partir de allí, se definen los objetivos generales y específicos que guiarán la solución, seguidos por la delimitación del alcance en cuanto a inclusiones y exclusiones. Posteriormente, se presenta la especificación detallada de requisitos funcionales y no funcionales, el </w:t>
-      </w:r>
-      <w:proofErr w:type="spellStart"/>
-      <w:r>
-        <w:t>stack</w:t>
-      </w:r>
-      <w:proofErr w:type="spellEnd"/>
-      <w:r>
-        <w:t xml:space="preserve"> tecnológico seleccionado y la arquitectura del sistema junto con sus modelos relacionales y de clases. Finalmente, el documento concluye con las valoraciones del equipo, las referencias bibliográficas, un glosario de términos especializados y el marco de reglamentación y condiciones legales.</w:t>
+        <w:t>A lo largo de este informe encontrarás una serie de secciones organizadas para ir de lo general a lo específico. Inicialmente, se exponen las problemáticas y necesidades actuales de la plataforma que justifican el desarrollo de este software. A partir de allí, se definen los objetivos generales y específicos que guiarán la solución, seguidos por la delimitación del alcance en cuanto a inclusiones y exclusiones. Posteriormente, se presenta la especificación detallada de requisitos funcionales y no funcionales, el stack tecnológico seleccionado y la arquitectura del sistema junto con sus modelos relacionales y de clases. Finalmente, el documento concluye con las valoraciones del equipo, las referencias bibliográficas, un glosario de términos especializados y el marco de reglamentación y condiciones legales.</w:t>
       </w:r>
     </w:p>
     <w:p>
@@ -1694,186 +1897,717 @@
     <w:p>
       <w:pPr>
         <w:pStyle w:val="Ttulo1"/>
-        <w:rPr>
-          <w:rFonts w:cs="Times New Roman"/>
-          <w:szCs w:val="24"/>
-        </w:rPr>
-      </w:pPr>
-      <w:bookmarkStart w:id="3" w:name="_Toc241702557"/>
-      <w:r>
-        <w:rPr>
-          <w:rFonts w:cs="Times New Roman"/>
-          <w:szCs w:val="24"/>
-        </w:rPr>
+      </w:pPr>
+      <w:bookmarkStart w:id="3" w:name="_Toc241702560"/>
+      <w:r>
         <w:lastRenderedPageBreak/>
-        <w:t>Objetivos</w:t>
-      </w:r>
-      <w:bookmarkEnd w:id="3"/>
-    </w:p>
-    <w:p>
-      <w:pPr>
-        <w:rPr>
-          <w:rFonts w:cs="Times New Roman"/>
-        </w:rPr>
-      </w:pPr>
-    </w:p>
-    <w:p>
-      <w:pPr>
-        <w:rPr>
-          <w:rFonts w:cs="Times New Roman"/>
-        </w:rPr>
-      </w:pPr>
-    </w:p>
-    <w:p>
-      <w:pPr>
-        <w:rPr>
-          <w:rFonts w:cs="Times New Roman"/>
-        </w:rPr>
-      </w:pPr>
+        <w:t>1. Objetivos</w:t>
+      </w:r>
     </w:p>
     <w:p>
       <w:pPr>
         <w:pStyle w:val="Ttulo2"/>
-        <w:rPr>
-          <w:rFonts w:cs="Times New Roman"/>
-          <w:szCs w:val="24"/>
-        </w:rPr>
-      </w:pPr>
-      <w:bookmarkStart w:id="4" w:name="_Toc241702558"/>
-      <w:r>
-        <w:rPr>
-          <w:rFonts w:cs="Times New Roman"/>
-          <w:szCs w:val="24"/>
-        </w:rPr>
-        <w:t>Objetivo General</w:t>
-      </w:r>
-      <w:bookmarkEnd w:id="4"/>
-    </w:p>
-    <w:p>
-      <w:pPr>
-        <w:rPr>
-          <w:rFonts w:cs="Times New Roman"/>
-        </w:rPr>
-      </w:pPr>
-      <w:r>
-        <w:rPr>
-          <w:rFonts w:cs="Times New Roman"/>
-        </w:rPr>
-        <w:t>Diseñar y desarrollar una aplicación para la gestión integral de la barbería, que centralice la reserva de citas, el control de los servicios y la administración de los clientes, con el fin de optimizar el tiempo de operación diaria y mejorar la experiencia de servicio.</w:t>
-      </w:r>
-    </w:p>
-    <w:p>
-      <w:pPr>
-        <w:rPr>
-          <w:rFonts w:cs="Times New Roman"/>
-        </w:rPr>
-      </w:pPr>
+      </w:pPr>
+      <w:r>
+        <w:t>1.1 Objetivo general</w:t>
+      </w:r>
+    </w:p>
+    <w:p>
+      <w:r>
+        <w:t>Desarrollar un módulo de comunidad para el sistema Sazón que permita gestionar las interacciones de los usuarios con las recetas mediante calificaciones, comentarios, favoritos, colecciones y reportes, con el propósito de fortalecer la participación, organización y cuidado del contenido dentro de la plataforma.</w:t>
+      </w:r>
     </w:p>
     <w:p>
       <w:pPr>
         <w:pStyle w:val="Ttulo2"/>
-        <w:rPr>
-          <w:rFonts w:cs="Times New Roman"/>
-          <w:szCs w:val="24"/>
-        </w:rPr>
-      </w:pPr>
-      <w:bookmarkStart w:id="5" w:name="_Toc241702559"/>
-      <w:r>
-        <w:rPr>
-          <w:rFonts w:cs="Times New Roman"/>
-          <w:szCs w:val="24"/>
-        </w:rPr>
-        <w:t>Objetivos específicos</w:t>
-      </w:r>
-      <w:bookmarkEnd w:id="5"/>
-    </w:p>
-    <w:p>
-      <w:pPr>
-        <w:rPr>
-          <w:rFonts w:cs="Times New Roman"/>
-        </w:rPr>
-      </w:pPr>
-    </w:p>
-    <w:p>
-      <w:pPr>
-        <w:pStyle w:val="Prrafodelista"/>
-        <w:numPr>
-          <w:ilvl w:val="0"/>
-          <w:numId w:val="4"/>
-        </w:numPr>
-        <w:ind w:left="1077" w:hanging="357"/>
-        <w:rPr>
-          <w:rFonts w:cs="Times New Roman"/>
-        </w:rPr>
-      </w:pPr>
-      <w:r>
-        <w:rPr>
-          <w:rFonts w:cs="Times New Roman"/>
-        </w:rPr>
-        <w:t>Implementar un módulo de agendamiento en línea que permita a los clientes reservar, modificar o cancelar sus citas en tiempo real, basándose en la disponibilidad de cada barbero.</w:t>
-      </w:r>
-    </w:p>
-    <w:p>
-      <w:pPr>
-        <w:pStyle w:val="Prrafodelista"/>
-        <w:numPr>
-          <w:ilvl w:val="0"/>
-          <w:numId w:val="4"/>
-        </w:numPr>
-        <w:ind w:left="1077" w:hanging="357"/>
-        <w:rPr>
-          <w:rFonts w:cs="Times New Roman"/>
-        </w:rPr>
-      </w:pPr>
-      <w:r>
-        <w:rPr>
-          <w:rFonts w:cs="Times New Roman"/>
-        </w:rPr>
-        <w:t>Crear un sistema de perfiles para registrar el historial de los clientes, incluyendo sus cortes frecuentes, preferencias y datos de contacto, facilitando un servicio más personalizado.</w:t>
-      </w:r>
-    </w:p>
-    <w:p>
-      <w:pPr>
-        <w:pStyle w:val="Prrafodelista"/>
-        <w:numPr>
-          <w:ilvl w:val="0"/>
-          <w:numId w:val="4"/>
-        </w:numPr>
-        <w:ind w:left="1077" w:hanging="357"/>
-        <w:rPr>
-          <w:rFonts w:cs="Times New Roman"/>
-        </w:rPr>
-      </w:pPr>
-      <w:r>
-        <w:rPr>
-          <w:rFonts w:cs="Times New Roman"/>
-        </w:rPr>
-        <w:t>Desarrollar un panel de administración interno para que los barberos puedan gestionar sus horarios, visualizar las citas del día y registrar los servicios que ya completaron.</w:t>
-      </w:r>
-    </w:p>
-    <w:p>
-      <w:pPr>
-        <w:pStyle w:val="Prrafodelista"/>
-        <w:numPr>
-          <w:ilvl w:val="0"/>
-          <w:numId w:val="4"/>
-        </w:numPr>
-        <w:ind w:left="1077" w:hanging="357"/>
-        <w:rPr>
-          <w:rFonts w:cs="Times New Roman"/>
-        </w:rPr>
-      </w:pPr>
-      <w:r>
-        <w:rPr>
-          <w:rFonts w:cs="Times New Roman"/>
-        </w:rPr>
-        <w:t>Integrar un sistema de notificaciones automáticas que envíe recordatorios a los clientes antes de sus citas programadas, para reducir los tiempos muertos y las inasistencias.</w:t>
-      </w:r>
-      <w:r>
-        <w:rPr>
-          <w:rFonts w:cs="Times New Roman"/>
-        </w:rPr>
-        <w:br w:type="page"/>
+      </w:pPr>
+      <w:r>
+        <w:t>1.2 Objetivos específicos</w:t>
+      </w:r>
+    </w:p>
+    <w:p>
+      <w:pPr>
+        <w:pStyle w:val="Listaconvietas"/>
+        <w:spacing w:line="480" w:lineRule="auto"/>
+      </w:pPr>
+      <w:proofErr w:type="spellStart"/>
+      <w:r>
+        <w:t>Identificar</w:t>
+      </w:r>
+      <w:proofErr w:type="spellEnd"/>
+      <w:r>
+        <w:t xml:space="preserve"> las </w:t>
+      </w:r>
+      <w:proofErr w:type="spellStart"/>
+      <w:r>
+        <w:t>principales</w:t>
+      </w:r>
+      <w:proofErr w:type="spellEnd"/>
+      <w:r>
+        <w:t xml:space="preserve"> </w:t>
+      </w:r>
+      <w:proofErr w:type="spellStart"/>
+      <w:r>
+        <w:t>interacciones</w:t>
+      </w:r>
+      <w:proofErr w:type="spellEnd"/>
+      <w:r>
+        <w:t xml:space="preserve"> que los </w:t>
+      </w:r>
+      <w:proofErr w:type="spellStart"/>
+      <w:r>
+        <w:t>usuarios</w:t>
+      </w:r>
+      <w:proofErr w:type="spellEnd"/>
+      <w:r>
+        <w:t xml:space="preserve"> </w:t>
+      </w:r>
+      <w:proofErr w:type="spellStart"/>
+      <w:r>
+        <w:t>pueden</w:t>
+      </w:r>
+      <w:proofErr w:type="spellEnd"/>
+      <w:r>
+        <w:t xml:space="preserve"> </w:t>
+      </w:r>
+      <w:proofErr w:type="spellStart"/>
+      <w:r>
+        <w:t>realizar</w:t>
+      </w:r>
+      <w:proofErr w:type="spellEnd"/>
+      <w:r>
+        <w:t xml:space="preserve"> </w:t>
+      </w:r>
+      <w:proofErr w:type="spellStart"/>
+      <w:r>
+        <w:t>sobre</w:t>
+      </w:r>
+      <w:proofErr w:type="spellEnd"/>
+      <w:r>
+        <w:t xml:space="preserve"> las </w:t>
+      </w:r>
+      <w:proofErr w:type="spellStart"/>
+      <w:r>
+        <w:t>recetas</w:t>
+      </w:r>
+      <w:proofErr w:type="spellEnd"/>
+      <w:r>
+        <w:t xml:space="preserve"> dentro de la </w:t>
+      </w:r>
+      <w:proofErr w:type="spellStart"/>
+      <w:r>
+        <w:t>comunidad</w:t>
+      </w:r>
+      <w:proofErr w:type="spellEnd"/>
+      <w:r>
+        <w:t xml:space="preserve"> de </w:t>
+      </w:r>
+      <w:proofErr w:type="spellStart"/>
+      <w:r>
+        <w:t>Sazón</w:t>
+      </w:r>
+      <w:proofErr w:type="spellEnd"/>
+      <w:r>
+        <w:t>.</w:t>
+      </w:r>
+    </w:p>
+    <w:p>
+      <w:pPr>
+        <w:pStyle w:val="Listaconvietas"/>
+        <w:spacing w:line="480" w:lineRule="auto"/>
+      </w:pPr>
+      <w:proofErr w:type="spellStart"/>
+      <w:r>
+        <w:t>Diseñar</w:t>
+      </w:r>
+      <w:proofErr w:type="spellEnd"/>
+      <w:r>
+        <w:t xml:space="preserve"> la </w:t>
+      </w:r>
+      <w:proofErr w:type="spellStart"/>
+      <w:r>
+        <w:t>estructura</w:t>
+      </w:r>
+      <w:proofErr w:type="spellEnd"/>
+      <w:r>
+        <w:t xml:space="preserve"> de </w:t>
+      </w:r>
+      <w:proofErr w:type="spellStart"/>
+      <w:r>
+        <w:t>datos</w:t>
+      </w:r>
+      <w:proofErr w:type="spellEnd"/>
+      <w:r>
+        <w:t xml:space="preserve"> </w:t>
+      </w:r>
+      <w:proofErr w:type="spellStart"/>
+      <w:r>
+        <w:t>necesaria</w:t>
+      </w:r>
+      <w:proofErr w:type="spellEnd"/>
+      <w:r>
+        <w:t xml:space="preserve"> para registrar </w:t>
+      </w:r>
+      <w:proofErr w:type="spellStart"/>
+      <w:r>
+        <w:t>calificaciones</w:t>
+      </w:r>
+      <w:proofErr w:type="spellEnd"/>
+      <w:r>
+        <w:t xml:space="preserve">, </w:t>
+      </w:r>
+      <w:proofErr w:type="spellStart"/>
+      <w:r>
+        <w:t>comentarios</w:t>
+      </w:r>
+      <w:proofErr w:type="spellEnd"/>
+      <w:r>
+        <w:t xml:space="preserve">, </w:t>
+      </w:r>
+      <w:proofErr w:type="spellStart"/>
+      <w:r>
+        <w:t>favoritos</w:t>
+      </w:r>
+      <w:proofErr w:type="spellEnd"/>
+      <w:r>
+        <w:t xml:space="preserve">, </w:t>
+      </w:r>
+      <w:proofErr w:type="spellStart"/>
+      <w:r>
+        <w:t>colecciones</w:t>
+      </w:r>
+      <w:proofErr w:type="spellEnd"/>
+      <w:r>
+        <w:t xml:space="preserve"> y </w:t>
+      </w:r>
+      <w:proofErr w:type="spellStart"/>
+      <w:r>
+        <w:t>reportes</w:t>
+      </w:r>
+      <w:proofErr w:type="spellEnd"/>
+      <w:r>
+        <w:t xml:space="preserve"> </w:t>
+      </w:r>
+      <w:proofErr w:type="spellStart"/>
+      <w:r>
+        <w:t>realizados</w:t>
+      </w:r>
+      <w:proofErr w:type="spellEnd"/>
+      <w:r>
+        <w:t xml:space="preserve"> por los </w:t>
+      </w:r>
+      <w:proofErr w:type="spellStart"/>
+      <w:r>
+        <w:t>usuarios</w:t>
+      </w:r>
+      <w:proofErr w:type="spellEnd"/>
+      <w:r>
+        <w:t>.</w:t>
+      </w:r>
+    </w:p>
+    <w:p>
+      <w:pPr>
+        <w:pStyle w:val="Listaconvietas"/>
+        <w:spacing w:line="480" w:lineRule="auto"/>
+      </w:pPr>
+      <w:proofErr w:type="spellStart"/>
+      <w:r>
+        <w:t>Implementar</w:t>
+      </w:r>
+      <w:proofErr w:type="spellEnd"/>
+      <w:r>
+        <w:t xml:space="preserve"> las </w:t>
+      </w:r>
+      <w:proofErr w:type="spellStart"/>
+      <w:r>
+        <w:t>relaciones</w:t>
+      </w:r>
+      <w:proofErr w:type="spellEnd"/>
+      <w:r>
+        <w:t xml:space="preserve"> entre las </w:t>
+      </w:r>
+      <w:proofErr w:type="spellStart"/>
+      <w:r>
+        <w:t>entidades</w:t>
+      </w:r>
+      <w:proofErr w:type="spellEnd"/>
+      <w:r>
+        <w:t xml:space="preserve"> que </w:t>
+      </w:r>
+      <w:proofErr w:type="spellStart"/>
+      <w:r>
+        <w:t>conforman</w:t>
+      </w:r>
+      <w:proofErr w:type="spellEnd"/>
+      <w:r>
+        <w:t xml:space="preserve"> </w:t>
+      </w:r>
+      <w:proofErr w:type="spellStart"/>
+      <w:r>
+        <w:t>el</w:t>
+      </w:r>
+      <w:proofErr w:type="spellEnd"/>
+      <w:r>
+        <w:t xml:space="preserve"> </w:t>
+      </w:r>
+      <w:proofErr w:type="spellStart"/>
+      <w:r>
+        <w:t>módulo</w:t>
+      </w:r>
+      <w:proofErr w:type="spellEnd"/>
+      <w:r>
+        <w:t xml:space="preserve"> de </w:t>
+      </w:r>
+      <w:proofErr w:type="spellStart"/>
+      <w:r>
+        <w:t>comunidad</w:t>
+      </w:r>
+      <w:proofErr w:type="spellEnd"/>
+      <w:r>
+        <w:t xml:space="preserve">, </w:t>
+      </w:r>
+      <w:proofErr w:type="spellStart"/>
+      <w:r>
+        <w:t>permitiendo</w:t>
+      </w:r>
+      <w:proofErr w:type="spellEnd"/>
+      <w:r>
+        <w:t xml:space="preserve"> </w:t>
+      </w:r>
+      <w:proofErr w:type="spellStart"/>
+      <w:r>
+        <w:t>almacenar</w:t>
+      </w:r>
+      <w:proofErr w:type="spellEnd"/>
+      <w:r>
+        <w:t xml:space="preserve"> y </w:t>
+      </w:r>
+      <w:proofErr w:type="spellStart"/>
+      <w:r>
+        <w:t>consultar</w:t>
+      </w:r>
+      <w:proofErr w:type="spellEnd"/>
+      <w:r>
+        <w:t xml:space="preserve"> la </w:t>
+      </w:r>
+      <w:proofErr w:type="spellStart"/>
+      <w:r>
+        <w:t>información</w:t>
+      </w:r>
+      <w:proofErr w:type="spellEnd"/>
+      <w:r>
+        <w:t xml:space="preserve"> </w:t>
+      </w:r>
+      <w:proofErr w:type="spellStart"/>
+      <w:r>
+        <w:t>generada</w:t>
+      </w:r>
+      <w:proofErr w:type="spellEnd"/>
+      <w:r>
+        <w:t xml:space="preserve"> por las </w:t>
+      </w:r>
+      <w:proofErr w:type="spellStart"/>
+      <w:r>
+        <w:t>interacciones</w:t>
+      </w:r>
+      <w:proofErr w:type="spellEnd"/>
+      <w:r>
+        <w:t xml:space="preserve"> de los </w:t>
+      </w:r>
+      <w:proofErr w:type="spellStart"/>
+      <w:r>
+        <w:t>usuarios</w:t>
+      </w:r>
+      <w:proofErr w:type="spellEnd"/>
+      <w:r>
+        <w:t>.</w:t>
+      </w:r>
+    </w:p>
+    <w:p>
+      <w:pPr>
+        <w:pStyle w:val="Listaconvietas"/>
+        <w:spacing w:line="480" w:lineRule="auto"/>
+      </w:pPr>
+      <w:proofErr w:type="spellStart"/>
+      <w:r>
+        <w:t>Gestionar</w:t>
+      </w:r>
+      <w:proofErr w:type="spellEnd"/>
+      <w:r>
+        <w:t xml:space="preserve"> las </w:t>
+      </w:r>
+      <w:proofErr w:type="spellStart"/>
+      <w:r>
+        <w:t>calificaciones</w:t>
+      </w:r>
+      <w:proofErr w:type="spellEnd"/>
+      <w:r>
+        <w:t xml:space="preserve"> </w:t>
+      </w:r>
+      <w:proofErr w:type="spellStart"/>
+      <w:r>
+        <w:t>realizadas</w:t>
+      </w:r>
+      <w:proofErr w:type="spellEnd"/>
+      <w:r>
+        <w:t xml:space="preserve"> </w:t>
+      </w:r>
+      <w:proofErr w:type="spellStart"/>
+      <w:r>
+        <w:t>sobre</w:t>
+      </w:r>
+      <w:proofErr w:type="spellEnd"/>
+      <w:r>
+        <w:t xml:space="preserve"> las </w:t>
+      </w:r>
+      <w:proofErr w:type="spellStart"/>
+      <w:r>
+        <w:t>recetas</w:t>
+      </w:r>
+      <w:proofErr w:type="spellEnd"/>
+      <w:r>
+        <w:t xml:space="preserve"> para registrar la </w:t>
+      </w:r>
+      <w:proofErr w:type="spellStart"/>
+      <w:r>
+        <w:t>valoración</w:t>
+      </w:r>
+      <w:proofErr w:type="spellEnd"/>
+      <w:r>
+        <w:t xml:space="preserve"> de los </w:t>
+      </w:r>
+      <w:proofErr w:type="spellStart"/>
+      <w:r>
+        <w:t>usuarios</w:t>
+      </w:r>
+      <w:proofErr w:type="spellEnd"/>
+      <w:r>
+        <w:t xml:space="preserve"> y </w:t>
+      </w:r>
+      <w:proofErr w:type="spellStart"/>
+      <w:r>
+        <w:t>contribuir</w:t>
+      </w:r>
+      <w:proofErr w:type="spellEnd"/>
+      <w:r>
+        <w:t xml:space="preserve"> a la </w:t>
+      </w:r>
+      <w:proofErr w:type="spellStart"/>
+      <w:r>
+        <w:t>organización</w:t>
+      </w:r>
+      <w:proofErr w:type="spellEnd"/>
+      <w:r>
+        <w:t xml:space="preserve"> de la </w:t>
+      </w:r>
+      <w:proofErr w:type="spellStart"/>
+      <w:r>
+        <w:t>información</w:t>
+      </w:r>
+      <w:proofErr w:type="spellEnd"/>
+      <w:r>
+        <w:t xml:space="preserve"> del </w:t>
+      </w:r>
+      <w:proofErr w:type="spellStart"/>
+      <w:r>
+        <w:t>recetario</w:t>
+      </w:r>
+      <w:proofErr w:type="spellEnd"/>
+      <w:r>
+        <w:t>.</w:t>
+      </w:r>
+    </w:p>
+    <w:p>
+      <w:pPr>
+        <w:pStyle w:val="Listaconvietas"/>
+        <w:spacing w:line="480" w:lineRule="auto"/>
+      </w:pPr>
+      <w:r>
+        <w:t xml:space="preserve">Registrar los </w:t>
+      </w:r>
+      <w:proofErr w:type="spellStart"/>
+      <w:r>
+        <w:t>comentarios</w:t>
+      </w:r>
+      <w:proofErr w:type="spellEnd"/>
+      <w:r>
+        <w:t xml:space="preserve"> </w:t>
+      </w:r>
+      <w:proofErr w:type="spellStart"/>
+      <w:r>
+        <w:t>realizados</w:t>
+      </w:r>
+      <w:proofErr w:type="spellEnd"/>
+      <w:r>
+        <w:t xml:space="preserve"> por los </w:t>
+      </w:r>
+      <w:proofErr w:type="spellStart"/>
+      <w:r>
+        <w:t>usuarios</w:t>
+      </w:r>
+      <w:proofErr w:type="spellEnd"/>
+      <w:r>
+        <w:t xml:space="preserve"> </w:t>
+      </w:r>
+      <w:proofErr w:type="spellStart"/>
+      <w:r>
+        <w:t>sobre</w:t>
+      </w:r>
+      <w:proofErr w:type="spellEnd"/>
+      <w:r>
+        <w:t xml:space="preserve"> las </w:t>
+      </w:r>
+      <w:proofErr w:type="spellStart"/>
+      <w:r>
+        <w:t>recetas</w:t>
+      </w:r>
+      <w:proofErr w:type="spellEnd"/>
+      <w:r>
+        <w:t xml:space="preserve">, </w:t>
+      </w:r>
+      <w:proofErr w:type="spellStart"/>
+      <w:r>
+        <w:t>conservando</w:t>
+      </w:r>
+      <w:proofErr w:type="spellEnd"/>
+      <w:r>
+        <w:t xml:space="preserve"> </w:t>
+      </w:r>
+      <w:proofErr w:type="spellStart"/>
+      <w:r>
+        <w:t>información</w:t>
+      </w:r>
+      <w:proofErr w:type="spellEnd"/>
+      <w:r>
+        <w:t xml:space="preserve"> </w:t>
+      </w:r>
+      <w:proofErr w:type="spellStart"/>
+      <w:r>
+        <w:t>relacionada</w:t>
+      </w:r>
+      <w:proofErr w:type="spellEnd"/>
+      <w:r>
+        <w:t xml:space="preserve"> con </w:t>
+      </w:r>
+      <w:proofErr w:type="spellStart"/>
+      <w:r>
+        <w:t>su</w:t>
+      </w:r>
+      <w:proofErr w:type="spellEnd"/>
+      <w:r>
+        <w:t xml:space="preserve"> </w:t>
+      </w:r>
+      <w:proofErr w:type="spellStart"/>
+      <w:r>
+        <w:t>autor</w:t>
+      </w:r>
+      <w:proofErr w:type="spellEnd"/>
+      <w:r>
+        <w:t xml:space="preserve">, </w:t>
+      </w:r>
+      <w:proofErr w:type="spellStart"/>
+      <w:r>
+        <w:t>fecha</w:t>
+      </w:r>
+      <w:proofErr w:type="spellEnd"/>
+      <w:r>
+        <w:t xml:space="preserve"> y </w:t>
+      </w:r>
+      <w:proofErr w:type="spellStart"/>
+      <w:r>
+        <w:t>contenido</w:t>
+      </w:r>
+      <w:proofErr w:type="spellEnd"/>
+      <w:r>
+        <w:t>.</w:t>
+      </w:r>
+    </w:p>
+    <w:p>
+      <w:pPr>
+        <w:pStyle w:val="Listaconvietas"/>
+        <w:spacing w:line="480" w:lineRule="auto"/>
+      </w:pPr>
+      <w:proofErr w:type="spellStart"/>
+      <w:r>
+        <w:t>Organizar</w:t>
+      </w:r>
+      <w:proofErr w:type="spellEnd"/>
+      <w:r>
+        <w:t xml:space="preserve"> las </w:t>
+      </w:r>
+      <w:proofErr w:type="spellStart"/>
+      <w:r>
+        <w:t>recetas</w:t>
+      </w:r>
+      <w:proofErr w:type="spellEnd"/>
+      <w:r>
+        <w:t xml:space="preserve"> </w:t>
+      </w:r>
+      <w:proofErr w:type="spellStart"/>
+      <w:r>
+        <w:t>favoritas</w:t>
+      </w:r>
+      <w:proofErr w:type="spellEnd"/>
+      <w:r>
+        <w:t xml:space="preserve"> de los </w:t>
+      </w:r>
+      <w:proofErr w:type="spellStart"/>
+      <w:r>
+        <w:t>usuarios</w:t>
+      </w:r>
+      <w:proofErr w:type="spellEnd"/>
+      <w:r>
+        <w:t xml:space="preserve"> </w:t>
+      </w:r>
+      <w:proofErr w:type="spellStart"/>
+      <w:r>
+        <w:t>mediante</w:t>
+      </w:r>
+      <w:proofErr w:type="spellEnd"/>
+      <w:r>
+        <w:t xml:space="preserve"> </w:t>
+      </w:r>
+      <w:proofErr w:type="spellStart"/>
+      <w:r>
+        <w:t>colecciones</w:t>
+      </w:r>
+      <w:proofErr w:type="spellEnd"/>
+      <w:r>
+        <w:t xml:space="preserve"> que </w:t>
+      </w:r>
+      <w:proofErr w:type="spellStart"/>
+      <w:r>
+        <w:t>permitan</w:t>
+      </w:r>
+      <w:proofErr w:type="spellEnd"/>
+      <w:r>
+        <w:t xml:space="preserve"> </w:t>
+      </w:r>
+      <w:proofErr w:type="spellStart"/>
+      <w:r>
+        <w:t>agrupar</w:t>
+      </w:r>
+      <w:proofErr w:type="spellEnd"/>
+      <w:r>
+        <w:t xml:space="preserve"> y </w:t>
+      </w:r>
+      <w:proofErr w:type="spellStart"/>
+      <w:r>
+        <w:t>administrar</w:t>
+      </w:r>
+      <w:proofErr w:type="spellEnd"/>
+      <w:r>
+        <w:t xml:space="preserve"> </w:t>
+      </w:r>
+      <w:proofErr w:type="spellStart"/>
+      <w:r>
+        <w:t>diferentes</w:t>
+      </w:r>
+      <w:proofErr w:type="spellEnd"/>
+      <w:r>
+        <w:t xml:space="preserve"> </w:t>
+      </w:r>
+      <w:proofErr w:type="spellStart"/>
+      <w:r>
+        <w:t>recetas</w:t>
+      </w:r>
+      <w:proofErr w:type="spellEnd"/>
+      <w:r>
+        <w:t>.</w:t>
+      </w:r>
+    </w:p>
+    <w:p>
+      <w:pPr>
+        <w:pStyle w:val="Listaconvietas"/>
+        <w:spacing w:line="480" w:lineRule="auto"/>
+      </w:pPr>
+      <w:proofErr w:type="spellStart"/>
+      <w:r>
+        <w:t>Gestionar</w:t>
+      </w:r>
+      <w:proofErr w:type="spellEnd"/>
+      <w:r>
+        <w:t xml:space="preserve"> los </w:t>
+      </w:r>
+      <w:proofErr w:type="spellStart"/>
+      <w:r>
+        <w:t>reportes</w:t>
+      </w:r>
+      <w:proofErr w:type="spellEnd"/>
+      <w:r>
+        <w:t xml:space="preserve"> </w:t>
+      </w:r>
+      <w:proofErr w:type="spellStart"/>
+      <w:r>
+        <w:t>realizados</w:t>
+      </w:r>
+      <w:proofErr w:type="spellEnd"/>
+      <w:r>
+        <w:t xml:space="preserve"> por los </w:t>
+      </w:r>
+      <w:proofErr w:type="spellStart"/>
+      <w:r>
+        <w:t>usuarios</w:t>
+      </w:r>
+      <w:proofErr w:type="spellEnd"/>
+      <w:r>
+        <w:t xml:space="preserve"> </w:t>
+      </w:r>
+      <w:proofErr w:type="spellStart"/>
+      <w:r>
+        <w:t>sobre</w:t>
+      </w:r>
+      <w:proofErr w:type="spellEnd"/>
+      <w:r>
+        <w:t xml:space="preserve"> </w:t>
+      </w:r>
+      <w:proofErr w:type="spellStart"/>
+      <w:r>
+        <w:t>contenido</w:t>
+      </w:r>
+      <w:proofErr w:type="spellEnd"/>
+      <w:r>
+        <w:t xml:space="preserve"> que </w:t>
+      </w:r>
+      <w:proofErr w:type="spellStart"/>
+      <w:r>
+        <w:t>pueda</w:t>
+      </w:r>
+      <w:proofErr w:type="spellEnd"/>
+      <w:r>
+        <w:t xml:space="preserve"> </w:t>
+      </w:r>
+      <w:proofErr w:type="spellStart"/>
+      <w:r>
+        <w:t>afectar</w:t>
+      </w:r>
+      <w:proofErr w:type="spellEnd"/>
+      <w:r>
+        <w:t xml:space="preserve"> la </w:t>
+      </w:r>
+      <w:proofErr w:type="spellStart"/>
+      <w:r>
+        <w:t>calidad</w:t>
+      </w:r>
+      <w:proofErr w:type="spellEnd"/>
+      <w:r>
+        <w:t xml:space="preserve"> o </w:t>
+      </w:r>
+      <w:proofErr w:type="spellStart"/>
+      <w:r>
+        <w:t>convivencia</w:t>
+      </w:r>
+      <w:proofErr w:type="spellEnd"/>
+      <w:r>
+        <w:t xml:space="preserve"> de la </w:t>
+      </w:r>
+      <w:proofErr w:type="spellStart"/>
+      <w:r>
+        <w:t>comunidad</w:t>
+      </w:r>
+      <w:proofErr w:type="spellEnd"/>
+      <w:r>
+        <w:t>.</w:t>
       </w:r>
     </w:p>
     <w:p>
@@ -1884,7 +2618,6 @@
           <w:szCs w:val="24"/>
         </w:rPr>
       </w:pPr>
-      <w:bookmarkStart w:id="6" w:name="_Toc241702560"/>
       <w:r>
         <w:rPr>
           <w:rFonts w:cs="Times New Roman"/>
@@ -1893,7 +2626,7 @@
         <w:lastRenderedPageBreak/>
         <w:t>Planteamiento del problema</w:t>
       </w:r>
-      <w:bookmarkEnd w:id="6"/>
+      <w:bookmarkEnd w:id="3"/>
     </w:p>
     <w:p>
       <w:pPr>
@@ -1946,7 +2679,7 @@
           <w:szCs w:val="24"/>
         </w:rPr>
       </w:pPr>
-      <w:bookmarkStart w:id="7" w:name="_Toc241140091"/>
+      <w:bookmarkStart w:id="4" w:name="_Toc241140091"/>
       <w:r>
         <w:rPr>
           <w:rFonts w:cs="Times New Roman"/>
@@ -2004,7 +2737,7 @@
         </w:rPr>
         <w:t xml:space="preserve"> - Comparativa</w:t>
       </w:r>
-      <w:bookmarkEnd w:id="7"/>
+      <w:bookmarkEnd w:id="4"/>
     </w:p>
     <w:tbl>
       <w:tblPr>
@@ -2171,7 +2904,7 @@
           <w:szCs w:val="24"/>
         </w:rPr>
       </w:pPr>
-      <w:bookmarkStart w:id="8" w:name="_Toc241702561"/>
+      <w:bookmarkStart w:id="5" w:name="_Toc241702561"/>
       <w:r>
         <w:rPr>
           <w:rFonts w:cs="Times New Roman"/>
@@ -2180,75 +2913,33 @@
         <w:lastRenderedPageBreak/>
         <w:t>Stack tecnológico</w:t>
       </w:r>
-      <w:bookmarkEnd w:id="8"/>
-    </w:p>
-    <w:p>
-      <w:pPr>
-        <w:rPr>
-          <w:rFonts w:cs="Times New Roman"/>
-        </w:rPr>
-      </w:pPr>
-    </w:p>
-    <w:p>
-      <w:pPr>
-        <w:rPr>
-          <w:rFonts w:cs="Times New Roman"/>
-        </w:rPr>
-      </w:pPr>
-    </w:p>
-    <w:p>
-      <w:pPr>
-        <w:rPr>
-          <w:rFonts w:cs="Times New Roman"/>
-        </w:rPr>
-      </w:pPr>
-      <w:r>
-        <w:rPr>
-          <w:rFonts w:cs="Times New Roman"/>
-        </w:rPr>
-        <w:t xml:space="preserve">El desarrollo de la plataforma se estructurará dividiendo la interfaz visual y la lógica interna mediante un </w:t>
-      </w:r>
-      <w:proofErr w:type="spellStart"/>
-      <w:r>
-        <w:rPr>
-          <w:rFonts w:cs="Times New Roman"/>
-        </w:rPr>
-        <w:t>stack</w:t>
-      </w:r>
-      <w:proofErr w:type="spellEnd"/>
-      <w:r>
-        <w:rPr>
-          <w:rFonts w:cs="Times New Roman"/>
-        </w:rPr>
-        <w:t xml:space="preserve"> tecnológico claro. En el lado del cliente, se utilizará HTML para construir la estructura de las pantallas, CSS para darle un diseño visual moderno y JavaScript para programar la interactividad y dinamismo de la interfaz. Para agilizar la experiencia de navegación, se hará uso de </w:t>
-      </w:r>
-      <w:proofErr w:type="spellStart"/>
-      <w:r>
-        <w:rPr>
-          <w:rFonts w:cs="Times New Roman"/>
-        </w:rPr>
-        <w:t>localStorage</w:t>
-      </w:r>
-      <w:proofErr w:type="spellEnd"/>
-      <w:r>
-        <w:rPr>
-          <w:rFonts w:cs="Times New Roman"/>
-        </w:rPr>
-        <w:t>, lo que permite una persistencia de datos temporal directamente en el dispositivo del usuario, ideal para mantener sesiones activas o guardar preferencias rápidas sin saturar el servidor. Por otro lado, el núcleo del sistema (</w:t>
-      </w:r>
-      <w:proofErr w:type="spellStart"/>
-      <w:r>
-        <w:rPr>
-          <w:rFonts w:cs="Times New Roman"/>
-        </w:rPr>
-        <w:t>backend</w:t>
-      </w:r>
-      <w:proofErr w:type="spellEnd"/>
-      <w:r>
-        <w:rPr>
-          <w:rFonts w:cs="Times New Roman"/>
-        </w:rPr>
-        <w:t>) estará desarrollado en Java, encargado de procesar las reglas de negocio, gestionar la seguridad y coordinar las peticiones. Finalmente, para garantizar una persistencia de datos permanente, estructurada y segura a largo plazo —como la información de los clientes, las citas programadas y el historial de servicios—, todo el sistema estará respaldado por una base de datos relacional gestionada mediante SQL.</w:t>
+      <w:bookmarkEnd w:id="5"/>
+    </w:p>
+    <w:p>
+      <w:pPr>
+        <w:rPr>
+          <w:rFonts w:cs="Times New Roman"/>
+        </w:rPr>
+      </w:pPr>
+    </w:p>
+    <w:p>
+      <w:pPr>
+        <w:rPr>
+          <w:rFonts w:cs="Times New Roman"/>
+        </w:rPr>
+      </w:pPr>
+    </w:p>
+    <w:p>
+      <w:pPr>
+        <w:rPr>
+          <w:rFonts w:cs="Times New Roman"/>
+        </w:rPr>
+      </w:pPr>
+      <w:r>
+        <w:rPr>
+          <w:rFonts w:cs="Times New Roman"/>
+        </w:rPr>
+        <w:t>El desarrollo de la plataforma se estructurará dividiendo la interfaz visual y la lógica interna mediante un stack tecnológico claro. En el lado del cliente, se utilizará HTML para construir la estructura de las pantallas, CSS para darle un diseño visual moderno y JavaScript para programar la interactividad y dinamismo de la interfaz. Para agilizar la experiencia de navegación, se hará uso de localStorage, lo que permite una persistencia de datos temporal directamente en el dispositivo del usuario, ideal para mantener sesiones activas o guardar preferencias rápidas sin saturar el servidor. Por otro lado, el núcleo del sistema (backend) estará desarrollado en Java, encargado de procesar las reglas de negocio, gestionar la seguridad y coordinar las peticiones. Finalmente, para garantizar una persistencia de datos permanente, estructurada y segura a largo plazo —como la información de los clientes, las citas programadas y el historial de servicios—, todo el sistema estará respaldado por una base de datos relacional gestionada mediante SQL.</w:t>
       </w:r>
     </w:p>
     <w:p>
@@ -2332,7 +3023,7 @@
           <w:szCs w:val="24"/>
         </w:rPr>
       </w:pPr>
-      <w:bookmarkStart w:id="9" w:name="_Toc241140366"/>
+      <w:bookmarkStart w:id="6" w:name="_Toc241140366"/>
       <w:r>
         <w:rPr>
           <w:rFonts w:cs="Times New Roman"/>
@@ -2398,7 +3089,7 @@
         </w:rPr>
         <w:t>tecnológico</w:t>
       </w:r>
-      <w:bookmarkEnd w:id="9"/>
+      <w:bookmarkEnd w:id="6"/>
       <w:r>
         <w:rPr>
           <w:rFonts w:cs="Times New Roman"/>
@@ -2416,57 +3107,27 @@
           <w:szCs w:val="24"/>
         </w:rPr>
       </w:pPr>
-      <w:bookmarkStart w:id="10" w:name="_Toc241702562"/>
       <w:r>
         <w:rPr>
           <w:rFonts w:cs="Times New Roman"/>
           <w:szCs w:val="24"/>
         </w:rPr>
         <w:lastRenderedPageBreak/>
-        <w:t>Alcance</w:t>
-      </w:r>
-      <w:bookmarkEnd w:id="10"/>
-    </w:p>
-    <w:p>
-      <w:pPr>
-        <w:rPr>
-          <w:rFonts w:cs="Times New Roman"/>
-        </w:rPr>
-      </w:pPr>
-    </w:p>
-    <w:p>
-      <w:pPr>
-        <w:rPr>
-          <w:rFonts w:cs="Times New Roman"/>
-        </w:rPr>
-      </w:pPr>
-    </w:p>
-    <w:p>
-      <w:pPr>
-        <w:rPr>
-          <w:rFonts w:cs="Times New Roman"/>
-        </w:rPr>
-      </w:pPr>
-    </w:p>
-    <w:p>
-      <w:pPr>
-        <w:rPr>
-          <w:rFonts w:cs="Times New Roman"/>
-        </w:rPr>
-      </w:pPr>
-      <w:r>
-        <w:rPr>
-          <w:rFonts w:cs="Times New Roman"/>
-        </w:rPr>
-        <w:t>El desarrollo de la aplicación se enfocará exclusivamente en solucionar la gestión de citas, la organización del tiempo de los barberos y el registro de clientes. A nivel funcional, el sistema abarca los siguientes módulos:</w:t>
-      </w:r>
-    </w:p>
-    <w:p>
-      <w:pPr>
-        <w:rPr>
-          <w:rFonts w:cs="Times New Roman"/>
-        </w:rPr>
-      </w:pPr>
+        <w:t>2. Alcance</w:t>
+      </w:r>
+    </w:p>
+    <w:p>
+      <w:pPr>
+        <w:rPr>
+          <w:rFonts w:cs="Times New Roman"/>
+        </w:rPr>
+      </w:pPr>
+      <w:r>
+        <w:rPr>
+          <w:rFonts w:cs="Times New Roman"/>
+        </w:rPr>
+        <w:t>El desarrollo del módulo de comunidad de Sazón comprende las funcionalidades y estructuras necesarias para gestionar las interacciones sociales de los usuarios con las recetas.</w:t>
+      </w:r>
     </w:p>
     <w:p>
       <w:pPr>
@@ -2476,337 +3137,1779 @@
           <w:szCs w:val="24"/>
         </w:rPr>
       </w:pPr>
-      <w:bookmarkStart w:id="11" w:name="_Toc241702563"/>
-      <w:r>
-        <w:rPr>
-          <w:rFonts w:cs="Times New Roman"/>
-          <w:szCs w:val="24"/>
-        </w:rPr>
-        <w:t>Inclusiones</w:t>
-      </w:r>
-      <w:bookmarkEnd w:id="11"/>
-    </w:p>
-    <w:p>
-      <w:pPr>
-        <w:rPr>
-          <w:rFonts w:cs="Times New Roman"/>
-        </w:rPr>
-      </w:pPr>
-      <w:r>
-        <w:rPr>
-          <w:rFonts w:cs="Times New Roman"/>
-          <w:b/>
-          <w:bCs/>
-        </w:rPr>
-        <w:t>1. Módulo de Clientes:</w:t>
-      </w:r>
-    </w:p>
-    <w:p>
-      <w:pPr>
-        <w:numPr>
-          <w:ilvl w:val="0"/>
-          <w:numId w:val="5"/>
-        </w:numPr>
-        <w:rPr>
-          <w:rFonts w:cs="Times New Roman"/>
-        </w:rPr>
-      </w:pPr>
-      <w:r>
-        <w:rPr>
-          <w:rFonts w:cs="Times New Roman"/>
-          <w:b/>
-          <w:bCs/>
-        </w:rPr>
-        <w:t>Gestión de perfil:</w:t>
-      </w:r>
-      <w:r>
-        <w:rPr>
-          <w:rFonts w:cs="Times New Roman"/>
-        </w:rPr>
-        <w:t xml:space="preserve"> Registro de nuevos usuarios, inicio de sesión (apoyado en persistencia temporal para evitar ingresos constantes) y actualización de datos de contacto.</w:t>
-      </w:r>
-    </w:p>
-    <w:p>
-      <w:pPr>
-        <w:numPr>
-          <w:ilvl w:val="0"/>
-          <w:numId w:val="5"/>
-        </w:numPr>
-        <w:rPr>
-          <w:rFonts w:cs="Times New Roman"/>
-        </w:rPr>
-      </w:pPr>
-      <w:r>
-        <w:rPr>
-          <w:rFonts w:cs="Times New Roman"/>
-          <w:b/>
-          <w:bCs/>
-        </w:rPr>
-        <w:t>Agendamiento autónomo:</w:t>
-      </w:r>
-      <w:r>
-        <w:rPr>
-          <w:rFonts w:cs="Times New Roman"/>
-        </w:rPr>
-        <w:t xml:space="preserve"> Interfaz donde el cliente puede consultar el catálogo de servicios (con precios y duración), ver la disponibilidad de los barberos en tiempo real y reservar una fecha y hora específicas.</w:t>
-      </w:r>
-    </w:p>
-    <w:p>
-      <w:pPr>
-        <w:numPr>
-          <w:ilvl w:val="0"/>
-          <w:numId w:val="5"/>
-        </w:numPr>
-        <w:rPr>
-          <w:rFonts w:cs="Times New Roman"/>
-        </w:rPr>
-      </w:pPr>
-      <w:r>
-        <w:rPr>
-          <w:rFonts w:cs="Times New Roman"/>
-          <w:b/>
-          <w:bCs/>
-        </w:rPr>
-        <w:t>Administración de reservas:</w:t>
-      </w:r>
-      <w:r>
-        <w:rPr>
-          <w:rFonts w:cs="Times New Roman"/>
-        </w:rPr>
-        <w:t xml:space="preserve"> Capacidad para que el cliente visualice sus citas próximas y pueda cancelarlas o modificarlas dentro de los tiempos permitidos.</w:t>
-      </w:r>
-    </w:p>
-    <w:p>
-      <w:pPr>
-        <w:rPr>
-          <w:rFonts w:cs="Times New Roman"/>
-        </w:rPr>
-      </w:pPr>
-      <w:r>
-        <w:rPr>
-          <w:rFonts w:cs="Times New Roman"/>
-          <w:b/>
-          <w:bCs/>
-        </w:rPr>
-        <w:t>2. Módulo de Barberos / Administración:</w:t>
-      </w:r>
-    </w:p>
-    <w:p>
-      <w:pPr>
-        <w:numPr>
-          <w:ilvl w:val="0"/>
-          <w:numId w:val="6"/>
-        </w:numPr>
-        <w:rPr>
-          <w:rFonts w:cs="Times New Roman"/>
-        </w:rPr>
-      </w:pPr>
-      <w:r>
-        <w:rPr>
-          <w:rFonts w:cs="Times New Roman"/>
-          <w:b/>
-          <w:bCs/>
-        </w:rPr>
-        <w:t>Visualización de agenda:</w:t>
-      </w:r>
-      <w:r>
-        <w:rPr>
-          <w:rFonts w:cs="Times New Roman"/>
-        </w:rPr>
-        <w:t xml:space="preserve"> Panel de control centralizado donde cada barbero puede ver su cronograma diario de forma ordenada.</w:t>
-      </w:r>
-    </w:p>
-    <w:p>
-      <w:pPr>
-        <w:numPr>
-          <w:ilvl w:val="0"/>
-          <w:numId w:val="6"/>
-        </w:numPr>
-        <w:rPr>
-          <w:rFonts w:cs="Times New Roman"/>
-        </w:rPr>
-      </w:pPr>
-      <w:r>
-        <w:rPr>
-          <w:rFonts w:cs="Times New Roman"/>
-          <w:b/>
-          <w:bCs/>
-        </w:rPr>
-        <w:t>Gestión de estados:</w:t>
-      </w:r>
-      <w:r>
-        <w:rPr>
-          <w:rFonts w:cs="Times New Roman"/>
-        </w:rPr>
-        <w:t xml:space="preserve"> Opción para cambiar el estado de la cita a medida que avanza el día (pendiente, completada, inasistencia o cancelada).</w:t>
-      </w:r>
-    </w:p>
-    <w:p>
-      <w:pPr>
-        <w:numPr>
-          <w:ilvl w:val="0"/>
-          <w:numId w:val="6"/>
-        </w:numPr>
-        <w:rPr>
-          <w:rFonts w:cs="Times New Roman"/>
-        </w:rPr>
-      </w:pPr>
-      <w:r>
-        <w:rPr>
-          <w:rFonts w:cs="Times New Roman"/>
-          <w:b/>
-          <w:bCs/>
+      <w:r>
+        <w:rPr>
+          <w:rFonts w:cs="Times New Roman"/>
+          <w:szCs w:val="24"/>
+        </w:rPr>
+        <w:t>2.1 Inclusiones</w:t>
+      </w:r>
+    </w:p>
+    <w:p>
+      <w:pPr>
+        <w:pStyle w:val="Listaconvietas"/>
+        <w:spacing w:line="480" w:lineRule="auto"/>
+        <w:rPr>
+          <w:rFonts w:ascii="Times New Roman" w:hAnsi="Times New Roman" w:cs="Times New Roman"/>
+          <w:sz w:val="24"/>
+          <w:szCs w:val="24"/>
+        </w:rPr>
+      </w:pPr>
+      <w:proofErr w:type="spellStart"/>
+      <w:r>
+        <w:rPr>
+          <w:rFonts w:ascii="Times New Roman" w:hAnsi="Times New Roman" w:cs="Times New Roman"/>
+          <w:sz w:val="24"/>
+          <w:szCs w:val="24"/>
+        </w:rPr>
+        <w:t>Registro</w:t>
+      </w:r>
+      <w:proofErr w:type="spellEnd"/>
+      <w:r>
+        <w:rPr>
+          <w:rFonts w:ascii="Times New Roman" w:hAnsi="Times New Roman" w:cs="Times New Roman"/>
+          <w:sz w:val="24"/>
+          <w:szCs w:val="24"/>
+        </w:rPr>
+        <w:t xml:space="preserve"> y </w:t>
+      </w:r>
+      <w:proofErr w:type="spellStart"/>
+      <w:r>
+        <w:rPr>
+          <w:rFonts w:ascii="Times New Roman" w:hAnsi="Times New Roman" w:cs="Times New Roman"/>
+          <w:sz w:val="24"/>
+          <w:szCs w:val="24"/>
+        </w:rPr>
+        <w:t>gestión</w:t>
+      </w:r>
+      <w:proofErr w:type="spellEnd"/>
+      <w:r>
+        <w:rPr>
+          <w:rFonts w:ascii="Times New Roman" w:hAnsi="Times New Roman" w:cs="Times New Roman"/>
+          <w:sz w:val="24"/>
+          <w:szCs w:val="24"/>
+        </w:rPr>
+        <w:t xml:space="preserve"> de las </w:t>
+      </w:r>
+      <w:proofErr w:type="spellStart"/>
+      <w:r>
+        <w:rPr>
+          <w:rFonts w:ascii="Times New Roman" w:hAnsi="Times New Roman" w:cs="Times New Roman"/>
+          <w:sz w:val="24"/>
+          <w:szCs w:val="24"/>
+        </w:rPr>
+        <w:t>calificaciones</w:t>
+      </w:r>
+      <w:proofErr w:type="spellEnd"/>
+      <w:r>
+        <w:rPr>
+          <w:rFonts w:ascii="Times New Roman" w:hAnsi="Times New Roman" w:cs="Times New Roman"/>
+          <w:sz w:val="24"/>
+          <w:szCs w:val="24"/>
+        </w:rPr>
+        <w:t xml:space="preserve"> </w:t>
+      </w:r>
+      <w:proofErr w:type="spellStart"/>
+      <w:r>
+        <w:rPr>
+          <w:rFonts w:ascii="Times New Roman" w:hAnsi="Times New Roman" w:cs="Times New Roman"/>
+          <w:sz w:val="24"/>
+          <w:szCs w:val="24"/>
+        </w:rPr>
+        <w:t>realizadas</w:t>
+      </w:r>
+      <w:proofErr w:type="spellEnd"/>
+      <w:r>
+        <w:rPr>
+          <w:rFonts w:ascii="Times New Roman" w:hAnsi="Times New Roman" w:cs="Times New Roman"/>
+          <w:sz w:val="24"/>
+          <w:szCs w:val="24"/>
+        </w:rPr>
+        <w:t xml:space="preserve"> por los </w:t>
+      </w:r>
+      <w:proofErr w:type="spellStart"/>
+      <w:r>
+        <w:rPr>
+          <w:rFonts w:ascii="Times New Roman" w:hAnsi="Times New Roman" w:cs="Times New Roman"/>
+          <w:sz w:val="24"/>
+          <w:szCs w:val="24"/>
+        </w:rPr>
+        <w:t>usuarios</w:t>
+      </w:r>
+      <w:proofErr w:type="spellEnd"/>
+      <w:r>
+        <w:rPr>
+          <w:rFonts w:ascii="Times New Roman" w:hAnsi="Times New Roman" w:cs="Times New Roman"/>
+          <w:sz w:val="24"/>
+          <w:szCs w:val="24"/>
+        </w:rPr>
+        <w:t xml:space="preserve"> </w:t>
+      </w:r>
+      <w:proofErr w:type="spellStart"/>
+      <w:r>
+        <w:rPr>
+          <w:rFonts w:ascii="Times New Roman" w:hAnsi="Times New Roman" w:cs="Times New Roman"/>
+          <w:sz w:val="24"/>
+          <w:szCs w:val="24"/>
+        </w:rPr>
+        <w:t>sobre</w:t>
+      </w:r>
+      <w:proofErr w:type="spellEnd"/>
+      <w:r>
+        <w:rPr>
+          <w:rFonts w:ascii="Times New Roman" w:hAnsi="Times New Roman" w:cs="Times New Roman"/>
+          <w:sz w:val="24"/>
+          <w:szCs w:val="24"/>
+        </w:rPr>
+        <w:t xml:space="preserve"> las </w:t>
+      </w:r>
+      <w:proofErr w:type="spellStart"/>
+      <w:r>
+        <w:rPr>
+          <w:rFonts w:ascii="Times New Roman" w:hAnsi="Times New Roman" w:cs="Times New Roman"/>
+          <w:sz w:val="24"/>
+          <w:szCs w:val="24"/>
+        </w:rPr>
+        <w:t>recetas</w:t>
+      </w:r>
+      <w:proofErr w:type="spellEnd"/>
+      <w:r>
+        <w:rPr>
+          <w:rFonts w:ascii="Times New Roman" w:hAnsi="Times New Roman" w:cs="Times New Roman"/>
+          <w:sz w:val="24"/>
+          <w:szCs w:val="24"/>
+        </w:rPr>
+        <w:t>.</w:t>
+      </w:r>
+    </w:p>
+    <w:p>
+      <w:pPr>
+        <w:pStyle w:val="Listaconvietas"/>
+        <w:spacing w:line="480" w:lineRule="auto"/>
+        <w:rPr>
+          <w:rFonts w:ascii="Times New Roman" w:hAnsi="Times New Roman" w:cs="Times New Roman"/>
+          <w:sz w:val="24"/>
+          <w:szCs w:val="24"/>
+        </w:rPr>
+      </w:pPr>
+      <w:proofErr w:type="spellStart"/>
+      <w:r>
+        <w:rPr>
+          <w:rFonts w:ascii="Times New Roman" w:hAnsi="Times New Roman" w:cs="Times New Roman"/>
+          <w:sz w:val="24"/>
+          <w:szCs w:val="24"/>
+        </w:rPr>
+        <w:t>Registro</w:t>
+      </w:r>
+      <w:proofErr w:type="spellEnd"/>
+      <w:r>
+        <w:rPr>
+          <w:rFonts w:ascii="Times New Roman" w:hAnsi="Times New Roman" w:cs="Times New Roman"/>
+          <w:sz w:val="24"/>
+          <w:szCs w:val="24"/>
+        </w:rPr>
+        <w:t xml:space="preserve"> de </w:t>
+      </w:r>
+      <w:proofErr w:type="spellStart"/>
+      <w:r>
+        <w:rPr>
+          <w:rFonts w:ascii="Times New Roman" w:hAnsi="Times New Roman" w:cs="Times New Roman"/>
+          <w:sz w:val="24"/>
+          <w:szCs w:val="24"/>
+        </w:rPr>
+        <w:t>comentarios</w:t>
+      </w:r>
+      <w:proofErr w:type="spellEnd"/>
+      <w:r>
+        <w:rPr>
+          <w:rFonts w:ascii="Times New Roman" w:hAnsi="Times New Roman" w:cs="Times New Roman"/>
+          <w:sz w:val="24"/>
+          <w:szCs w:val="24"/>
+        </w:rPr>
+        <w:t xml:space="preserve"> </w:t>
+      </w:r>
+      <w:proofErr w:type="spellStart"/>
+      <w:r>
+        <w:rPr>
+          <w:rFonts w:ascii="Times New Roman" w:hAnsi="Times New Roman" w:cs="Times New Roman"/>
+          <w:sz w:val="24"/>
+          <w:szCs w:val="24"/>
+        </w:rPr>
+        <w:t>asociados</w:t>
+      </w:r>
+      <w:proofErr w:type="spellEnd"/>
+      <w:r>
+        <w:rPr>
+          <w:rFonts w:ascii="Times New Roman" w:hAnsi="Times New Roman" w:cs="Times New Roman"/>
+          <w:sz w:val="24"/>
+          <w:szCs w:val="24"/>
+        </w:rPr>
+        <w:t xml:space="preserve"> a las </w:t>
+      </w:r>
+      <w:proofErr w:type="spellStart"/>
+      <w:r>
+        <w:rPr>
+          <w:rFonts w:ascii="Times New Roman" w:hAnsi="Times New Roman" w:cs="Times New Roman"/>
+          <w:sz w:val="24"/>
+          <w:szCs w:val="24"/>
+        </w:rPr>
+        <w:t>recetas</w:t>
+      </w:r>
+      <w:proofErr w:type="spellEnd"/>
+      <w:r>
+        <w:rPr>
+          <w:rFonts w:ascii="Times New Roman" w:hAnsi="Times New Roman" w:cs="Times New Roman"/>
+          <w:sz w:val="24"/>
+          <w:szCs w:val="24"/>
+        </w:rPr>
+        <w:t>.</w:t>
+      </w:r>
+    </w:p>
+    <w:p>
+      <w:pPr>
+        <w:pStyle w:val="Listaconvietas"/>
+        <w:spacing w:line="480" w:lineRule="auto"/>
+        <w:rPr>
+          <w:rFonts w:ascii="Times New Roman" w:hAnsi="Times New Roman" w:cs="Times New Roman"/>
+          <w:sz w:val="24"/>
+          <w:szCs w:val="24"/>
+        </w:rPr>
+      </w:pPr>
+      <w:proofErr w:type="spellStart"/>
+      <w:r>
+        <w:rPr>
+          <w:rFonts w:ascii="Times New Roman" w:hAnsi="Times New Roman" w:cs="Times New Roman"/>
+          <w:sz w:val="24"/>
+          <w:szCs w:val="24"/>
+        </w:rPr>
+        <w:t>Gestión</w:t>
+      </w:r>
+      <w:proofErr w:type="spellEnd"/>
+      <w:r>
+        <w:rPr>
+          <w:rFonts w:ascii="Times New Roman" w:hAnsi="Times New Roman" w:cs="Times New Roman"/>
+          <w:sz w:val="24"/>
+          <w:szCs w:val="24"/>
+        </w:rPr>
+        <w:t xml:space="preserve"> de las </w:t>
+      </w:r>
+      <w:proofErr w:type="spellStart"/>
+      <w:r>
+        <w:rPr>
+          <w:rFonts w:ascii="Times New Roman" w:hAnsi="Times New Roman" w:cs="Times New Roman"/>
+          <w:sz w:val="24"/>
+          <w:szCs w:val="24"/>
+        </w:rPr>
+        <w:t>recetas</w:t>
+      </w:r>
+      <w:proofErr w:type="spellEnd"/>
+      <w:r>
+        <w:rPr>
+          <w:rFonts w:ascii="Times New Roman" w:hAnsi="Times New Roman" w:cs="Times New Roman"/>
+          <w:sz w:val="24"/>
+          <w:szCs w:val="24"/>
+        </w:rPr>
+        <w:t xml:space="preserve"> </w:t>
+      </w:r>
+      <w:proofErr w:type="spellStart"/>
+      <w:r>
+        <w:rPr>
+          <w:rFonts w:ascii="Times New Roman" w:hAnsi="Times New Roman" w:cs="Times New Roman"/>
+          <w:sz w:val="24"/>
+          <w:szCs w:val="24"/>
+        </w:rPr>
+        <w:t>favoritas</w:t>
+      </w:r>
+      <w:proofErr w:type="spellEnd"/>
+      <w:r>
+        <w:rPr>
+          <w:rFonts w:ascii="Times New Roman" w:hAnsi="Times New Roman" w:cs="Times New Roman"/>
+          <w:sz w:val="24"/>
+          <w:szCs w:val="24"/>
+        </w:rPr>
+        <w:t xml:space="preserve"> de cada </w:t>
+      </w:r>
+      <w:proofErr w:type="spellStart"/>
+      <w:r>
+        <w:rPr>
+          <w:rFonts w:ascii="Times New Roman" w:hAnsi="Times New Roman" w:cs="Times New Roman"/>
+          <w:sz w:val="24"/>
+          <w:szCs w:val="24"/>
+        </w:rPr>
+        <w:t>usuario</w:t>
+      </w:r>
+      <w:proofErr w:type="spellEnd"/>
+      <w:r>
+        <w:rPr>
+          <w:rFonts w:ascii="Times New Roman" w:hAnsi="Times New Roman" w:cs="Times New Roman"/>
+          <w:sz w:val="24"/>
+          <w:szCs w:val="24"/>
+        </w:rPr>
+        <w:t>.</w:t>
+      </w:r>
+    </w:p>
+    <w:p>
+      <w:pPr>
+        <w:pStyle w:val="Listaconvietas"/>
+        <w:spacing w:line="480" w:lineRule="auto"/>
+        <w:rPr>
+          <w:rFonts w:ascii="Times New Roman" w:hAnsi="Times New Roman" w:cs="Times New Roman"/>
+          <w:sz w:val="24"/>
+          <w:szCs w:val="24"/>
+        </w:rPr>
+      </w:pPr>
+      <w:proofErr w:type="spellStart"/>
+      <w:r>
+        <w:rPr>
+          <w:rFonts w:ascii="Times New Roman" w:hAnsi="Times New Roman" w:cs="Times New Roman"/>
+          <w:sz w:val="24"/>
+          <w:szCs w:val="24"/>
+        </w:rPr>
+        <w:t>Creación</w:t>
+      </w:r>
+      <w:proofErr w:type="spellEnd"/>
+      <w:r>
+        <w:rPr>
+          <w:rFonts w:ascii="Times New Roman" w:hAnsi="Times New Roman" w:cs="Times New Roman"/>
+          <w:sz w:val="24"/>
+          <w:szCs w:val="24"/>
+        </w:rPr>
+        <w:t xml:space="preserve"> y </w:t>
+      </w:r>
+      <w:proofErr w:type="spellStart"/>
+      <w:r>
+        <w:rPr>
+          <w:rFonts w:ascii="Times New Roman" w:hAnsi="Times New Roman" w:cs="Times New Roman"/>
+          <w:sz w:val="24"/>
+          <w:szCs w:val="24"/>
+        </w:rPr>
+        <w:t>organización</w:t>
+      </w:r>
+      <w:proofErr w:type="spellEnd"/>
+      <w:r>
+        <w:rPr>
+          <w:rFonts w:ascii="Times New Roman" w:hAnsi="Times New Roman" w:cs="Times New Roman"/>
+          <w:sz w:val="24"/>
+          <w:szCs w:val="24"/>
+        </w:rPr>
+        <w:t xml:space="preserve"> de </w:t>
+      </w:r>
+      <w:proofErr w:type="spellStart"/>
+      <w:r>
+        <w:rPr>
+          <w:rFonts w:ascii="Times New Roman" w:hAnsi="Times New Roman" w:cs="Times New Roman"/>
+          <w:sz w:val="24"/>
+          <w:szCs w:val="24"/>
+        </w:rPr>
+        <w:t>colecciones</w:t>
+      </w:r>
+      <w:proofErr w:type="spellEnd"/>
+      <w:r>
+        <w:rPr>
+          <w:rFonts w:ascii="Times New Roman" w:hAnsi="Times New Roman" w:cs="Times New Roman"/>
+          <w:sz w:val="24"/>
+          <w:szCs w:val="24"/>
+        </w:rPr>
+        <w:t xml:space="preserve"> de </w:t>
+      </w:r>
+      <w:proofErr w:type="spellStart"/>
+      <w:r>
+        <w:rPr>
+          <w:rFonts w:ascii="Times New Roman" w:hAnsi="Times New Roman" w:cs="Times New Roman"/>
+          <w:sz w:val="24"/>
+          <w:szCs w:val="24"/>
+        </w:rPr>
+        <w:t>recetas</w:t>
+      </w:r>
+      <w:proofErr w:type="spellEnd"/>
+      <w:r>
+        <w:rPr>
+          <w:rFonts w:ascii="Times New Roman" w:hAnsi="Times New Roman" w:cs="Times New Roman"/>
+          <w:sz w:val="24"/>
+          <w:szCs w:val="24"/>
+        </w:rPr>
+        <w:t>.</w:t>
+      </w:r>
+    </w:p>
+    <w:p>
+      <w:pPr>
+        <w:pStyle w:val="Listaconvietas"/>
+        <w:spacing w:line="480" w:lineRule="auto"/>
+        <w:rPr>
+          <w:rFonts w:ascii="Times New Roman" w:hAnsi="Times New Roman" w:cs="Times New Roman"/>
+          <w:sz w:val="24"/>
+          <w:szCs w:val="24"/>
+        </w:rPr>
+      </w:pPr>
+      <w:proofErr w:type="spellStart"/>
+      <w:r>
+        <w:rPr>
+          <w:rFonts w:ascii="Times New Roman" w:hAnsi="Times New Roman" w:cs="Times New Roman"/>
+          <w:sz w:val="24"/>
+          <w:szCs w:val="24"/>
+        </w:rPr>
+        <w:t>Relación</w:t>
+      </w:r>
+      <w:proofErr w:type="spellEnd"/>
+      <w:r>
+        <w:rPr>
+          <w:rFonts w:ascii="Times New Roman" w:hAnsi="Times New Roman" w:cs="Times New Roman"/>
+          <w:sz w:val="24"/>
+          <w:szCs w:val="24"/>
+        </w:rPr>
+        <w:t xml:space="preserve"> entre </w:t>
+      </w:r>
+      <w:proofErr w:type="spellStart"/>
+      <w:r>
+        <w:rPr>
+          <w:rFonts w:ascii="Times New Roman" w:hAnsi="Times New Roman" w:cs="Times New Roman"/>
+          <w:sz w:val="24"/>
+          <w:szCs w:val="24"/>
+        </w:rPr>
+        <w:t>favoritos</w:t>
+      </w:r>
+      <w:proofErr w:type="spellEnd"/>
+      <w:r>
+        <w:rPr>
+          <w:rFonts w:ascii="Times New Roman" w:hAnsi="Times New Roman" w:cs="Times New Roman"/>
+          <w:sz w:val="24"/>
+          <w:szCs w:val="24"/>
+        </w:rPr>
+        <w:t xml:space="preserve"> y </w:t>
+      </w:r>
+      <w:proofErr w:type="spellStart"/>
+      <w:r>
+        <w:rPr>
+          <w:rFonts w:ascii="Times New Roman" w:hAnsi="Times New Roman" w:cs="Times New Roman"/>
+          <w:sz w:val="24"/>
+          <w:szCs w:val="24"/>
+        </w:rPr>
+        <w:t>colecciones</w:t>
+      </w:r>
+      <w:proofErr w:type="spellEnd"/>
+      <w:r>
+        <w:rPr>
+          <w:rFonts w:ascii="Times New Roman" w:hAnsi="Times New Roman" w:cs="Times New Roman"/>
+          <w:sz w:val="24"/>
+          <w:szCs w:val="24"/>
+        </w:rPr>
+        <w:t xml:space="preserve"> </w:t>
+      </w:r>
+      <w:proofErr w:type="spellStart"/>
+      <w:r>
+        <w:rPr>
+          <w:rFonts w:ascii="Times New Roman" w:hAnsi="Times New Roman" w:cs="Times New Roman"/>
+          <w:sz w:val="24"/>
+          <w:szCs w:val="24"/>
+        </w:rPr>
+        <w:t>mediante</w:t>
+      </w:r>
+      <w:proofErr w:type="spellEnd"/>
+      <w:r>
+        <w:rPr>
+          <w:rFonts w:ascii="Times New Roman" w:hAnsi="Times New Roman" w:cs="Times New Roman"/>
+          <w:sz w:val="24"/>
+          <w:szCs w:val="24"/>
+        </w:rPr>
+        <w:t xml:space="preserve"> la </w:t>
+      </w:r>
+      <w:proofErr w:type="spellStart"/>
+      <w:r>
+        <w:rPr>
+          <w:rFonts w:ascii="Times New Roman" w:hAnsi="Times New Roman" w:cs="Times New Roman"/>
+          <w:sz w:val="24"/>
+          <w:szCs w:val="24"/>
+        </w:rPr>
+        <w:t>entidad</w:t>
+      </w:r>
+      <w:proofErr w:type="spellEnd"/>
+      <w:r>
+        <w:rPr>
+          <w:rFonts w:ascii="Times New Roman" w:hAnsi="Times New Roman" w:cs="Times New Roman"/>
+          <w:sz w:val="24"/>
+          <w:szCs w:val="24"/>
+        </w:rPr>
+        <w:t xml:space="preserve"> </w:t>
+      </w:r>
+      <w:proofErr w:type="spellStart"/>
+      <w:r>
+        <w:rPr>
+          <w:rFonts w:ascii="Times New Roman" w:hAnsi="Times New Roman" w:cs="Times New Roman"/>
+          <w:sz w:val="24"/>
+          <w:szCs w:val="24"/>
+        </w:rPr>
+        <w:t>Favoritos_colecciones</w:t>
+      </w:r>
+      <w:proofErr w:type="spellEnd"/>
+      <w:r>
+        <w:rPr>
+          <w:rFonts w:ascii="Times New Roman" w:hAnsi="Times New Roman" w:cs="Times New Roman"/>
+          <w:sz w:val="24"/>
+          <w:szCs w:val="24"/>
+        </w:rPr>
+        <w:t>.</w:t>
+      </w:r>
+    </w:p>
+    <w:p>
+      <w:pPr>
+        <w:pStyle w:val="Listaconvietas"/>
+        <w:spacing w:line="480" w:lineRule="auto"/>
+        <w:rPr>
+          <w:rFonts w:ascii="Times New Roman" w:hAnsi="Times New Roman" w:cs="Times New Roman"/>
+          <w:sz w:val="24"/>
+          <w:szCs w:val="24"/>
+        </w:rPr>
+      </w:pPr>
+      <w:proofErr w:type="spellStart"/>
+      <w:r>
+        <w:rPr>
+          <w:rFonts w:ascii="Times New Roman" w:hAnsi="Times New Roman" w:cs="Times New Roman"/>
+          <w:sz w:val="24"/>
+          <w:szCs w:val="24"/>
+        </w:rPr>
+        <w:t>Registro</w:t>
+      </w:r>
+      <w:proofErr w:type="spellEnd"/>
+      <w:r>
+        <w:rPr>
+          <w:rFonts w:ascii="Times New Roman" w:hAnsi="Times New Roman" w:cs="Times New Roman"/>
+          <w:sz w:val="24"/>
+          <w:szCs w:val="24"/>
+        </w:rPr>
+        <w:t xml:space="preserve"> y </w:t>
+      </w:r>
+      <w:proofErr w:type="spellStart"/>
+      <w:r>
+        <w:rPr>
+          <w:rFonts w:ascii="Times New Roman" w:hAnsi="Times New Roman" w:cs="Times New Roman"/>
+          <w:sz w:val="24"/>
+          <w:szCs w:val="24"/>
+        </w:rPr>
+        <w:t>gestión</w:t>
+      </w:r>
+      <w:proofErr w:type="spellEnd"/>
+      <w:r>
+        <w:rPr>
+          <w:rFonts w:ascii="Times New Roman" w:hAnsi="Times New Roman" w:cs="Times New Roman"/>
+          <w:sz w:val="24"/>
+          <w:szCs w:val="24"/>
+        </w:rPr>
+        <w:t xml:space="preserve"> de </w:t>
+      </w:r>
+      <w:proofErr w:type="spellStart"/>
+      <w:r>
+        <w:rPr>
+          <w:rFonts w:ascii="Times New Roman" w:hAnsi="Times New Roman" w:cs="Times New Roman"/>
+          <w:sz w:val="24"/>
+          <w:szCs w:val="24"/>
+        </w:rPr>
+        <w:t>reportes</w:t>
+      </w:r>
+      <w:proofErr w:type="spellEnd"/>
+      <w:r>
+        <w:rPr>
+          <w:rFonts w:ascii="Times New Roman" w:hAnsi="Times New Roman" w:cs="Times New Roman"/>
+          <w:sz w:val="24"/>
+          <w:szCs w:val="24"/>
+        </w:rPr>
+        <w:t xml:space="preserve"> </w:t>
+      </w:r>
+      <w:proofErr w:type="spellStart"/>
+      <w:r>
+        <w:rPr>
+          <w:rFonts w:ascii="Times New Roman" w:hAnsi="Times New Roman" w:cs="Times New Roman"/>
+          <w:sz w:val="24"/>
+          <w:szCs w:val="24"/>
+        </w:rPr>
+        <w:t>realizados</w:t>
+      </w:r>
+      <w:proofErr w:type="spellEnd"/>
+      <w:r>
+        <w:rPr>
+          <w:rFonts w:ascii="Times New Roman" w:hAnsi="Times New Roman" w:cs="Times New Roman"/>
+          <w:sz w:val="24"/>
+          <w:szCs w:val="24"/>
+        </w:rPr>
+        <w:t xml:space="preserve"> por los </w:t>
+      </w:r>
+      <w:proofErr w:type="spellStart"/>
+      <w:r>
+        <w:rPr>
+          <w:rFonts w:ascii="Times New Roman" w:hAnsi="Times New Roman" w:cs="Times New Roman"/>
+          <w:sz w:val="24"/>
+          <w:szCs w:val="24"/>
+        </w:rPr>
+        <w:t>usuarios</w:t>
+      </w:r>
+      <w:proofErr w:type="spellEnd"/>
+      <w:r>
+        <w:rPr>
+          <w:rFonts w:ascii="Times New Roman" w:hAnsi="Times New Roman" w:cs="Times New Roman"/>
+          <w:sz w:val="24"/>
+          <w:szCs w:val="24"/>
+        </w:rPr>
+        <w:t>.</w:t>
+      </w:r>
+    </w:p>
+    <w:p>
+      <w:pPr>
+        <w:pStyle w:val="Listaconvietas"/>
+        <w:spacing w:line="480" w:lineRule="auto"/>
+        <w:rPr>
+          <w:rFonts w:ascii="Times New Roman" w:hAnsi="Times New Roman" w:cs="Times New Roman"/>
+          <w:sz w:val="24"/>
+          <w:szCs w:val="24"/>
+        </w:rPr>
+      </w:pPr>
+      <w:proofErr w:type="spellStart"/>
+      <w:r>
+        <w:rPr>
+          <w:rFonts w:ascii="Times New Roman" w:hAnsi="Times New Roman" w:cs="Times New Roman"/>
+          <w:sz w:val="24"/>
+          <w:szCs w:val="24"/>
+        </w:rPr>
+        <w:t>Almacenamiento</w:t>
+      </w:r>
+      <w:proofErr w:type="spellEnd"/>
+      <w:r>
+        <w:rPr>
+          <w:rFonts w:ascii="Times New Roman" w:hAnsi="Times New Roman" w:cs="Times New Roman"/>
+          <w:sz w:val="24"/>
+          <w:szCs w:val="24"/>
+        </w:rPr>
+        <w:t xml:space="preserve"> de la </w:t>
+      </w:r>
+      <w:proofErr w:type="spellStart"/>
+      <w:r>
+        <w:rPr>
+          <w:rFonts w:ascii="Times New Roman" w:hAnsi="Times New Roman" w:cs="Times New Roman"/>
+          <w:sz w:val="24"/>
+          <w:szCs w:val="24"/>
+        </w:rPr>
+        <w:t>información</w:t>
+      </w:r>
+      <w:proofErr w:type="spellEnd"/>
+      <w:r>
+        <w:rPr>
+          <w:rFonts w:ascii="Times New Roman" w:hAnsi="Times New Roman" w:cs="Times New Roman"/>
+          <w:sz w:val="24"/>
+          <w:szCs w:val="24"/>
+        </w:rPr>
+        <w:t xml:space="preserve"> </w:t>
+      </w:r>
+      <w:proofErr w:type="spellStart"/>
+      <w:r>
+        <w:rPr>
+          <w:rFonts w:ascii="Times New Roman" w:hAnsi="Times New Roman" w:cs="Times New Roman"/>
+          <w:sz w:val="24"/>
+          <w:szCs w:val="24"/>
+        </w:rPr>
+        <w:t>necesaria</w:t>
+      </w:r>
+      <w:proofErr w:type="spellEnd"/>
+      <w:r>
+        <w:rPr>
+          <w:rFonts w:ascii="Times New Roman" w:hAnsi="Times New Roman" w:cs="Times New Roman"/>
+          <w:sz w:val="24"/>
+          <w:szCs w:val="24"/>
+        </w:rPr>
+        <w:t xml:space="preserve"> para </w:t>
+      </w:r>
+      <w:proofErr w:type="spellStart"/>
+      <w:r>
+        <w:rPr>
+          <w:rFonts w:ascii="Times New Roman" w:hAnsi="Times New Roman" w:cs="Times New Roman"/>
+          <w:sz w:val="24"/>
+          <w:szCs w:val="24"/>
+        </w:rPr>
+        <w:t>relacionar</w:t>
+      </w:r>
+      <w:proofErr w:type="spellEnd"/>
+      <w:r>
+        <w:rPr>
+          <w:rFonts w:ascii="Times New Roman" w:hAnsi="Times New Roman" w:cs="Times New Roman"/>
+          <w:sz w:val="24"/>
+          <w:szCs w:val="24"/>
+        </w:rPr>
+        <w:t xml:space="preserve"> las </w:t>
+      </w:r>
+      <w:proofErr w:type="spellStart"/>
+      <w:r>
+        <w:rPr>
+          <w:rFonts w:ascii="Times New Roman" w:hAnsi="Times New Roman" w:cs="Times New Roman"/>
+          <w:sz w:val="24"/>
+          <w:szCs w:val="24"/>
+        </w:rPr>
+        <w:t>acciones</w:t>
+      </w:r>
+      <w:proofErr w:type="spellEnd"/>
+      <w:r>
+        <w:rPr>
+          <w:rFonts w:ascii="Times New Roman" w:hAnsi="Times New Roman" w:cs="Times New Roman"/>
+          <w:sz w:val="24"/>
+          <w:szCs w:val="24"/>
+        </w:rPr>
+        <w:t xml:space="preserve"> de los </w:t>
+      </w:r>
+      <w:proofErr w:type="spellStart"/>
+      <w:r>
+        <w:rPr>
+          <w:rFonts w:ascii="Times New Roman" w:hAnsi="Times New Roman" w:cs="Times New Roman"/>
+          <w:sz w:val="24"/>
+          <w:szCs w:val="24"/>
+        </w:rPr>
+        <w:t>usuarios</w:t>
+      </w:r>
+      <w:proofErr w:type="spellEnd"/>
+      <w:r>
+        <w:rPr>
+          <w:rFonts w:ascii="Times New Roman" w:hAnsi="Times New Roman" w:cs="Times New Roman"/>
+          <w:sz w:val="24"/>
+          <w:szCs w:val="24"/>
+        </w:rPr>
+        <w:t xml:space="preserve"> con las </w:t>
+      </w:r>
+      <w:proofErr w:type="spellStart"/>
+      <w:r>
+        <w:rPr>
+          <w:rFonts w:ascii="Times New Roman" w:hAnsi="Times New Roman" w:cs="Times New Roman"/>
+          <w:sz w:val="24"/>
+          <w:szCs w:val="24"/>
+        </w:rPr>
+        <w:t>recetas</w:t>
+      </w:r>
+      <w:proofErr w:type="spellEnd"/>
+      <w:r>
+        <w:rPr>
+          <w:rFonts w:ascii="Times New Roman" w:hAnsi="Times New Roman" w:cs="Times New Roman"/>
+          <w:sz w:val="24"/>
+          <w:szCs w:val="24"/>
+        </w:rPr>
+        <w:t>.</w:t>
+      </w:r>
+    </w:p>
+    <w:p>
+      <w:pPr>
+        <w:pStyle w:val="Listaconvietas"/>
+        <w:spacing w:line="480" w:lineRule="auto"/>
+        <w:rPr>
+          <w:rFonts w:ascii="Times New Roman" w:hAnsi="Times New Roman" w:cs="Times New Roman"/>
+          <w:sz w:val="24"/>
+          <w:szCs w:val="24"/>
+        </w:rPr>
+      </w:pPr>
+      <w:proofErr w:type="spellStart"/>
+      <w:r>
+        <w:rPr>
+          <w:rFonts w:ascii="Times New Roman" w:hAnsi="Times New Roman" w:cs="Times New Roman"/>
+          <w:sz w:val="24"/>
+          <w:szCs w:val="24"/>
+        </w:rPr>
+        <w:t>Organización</w:t>
+      </w:r>
+      <w:proofErr w:type="spellEnd"/>
+      <w:r>
+        <w:rPr>
+          <w:rFonts w:ascii="Times New Roman" w:hAnsi="Times New Roman" w:cs="Times New Roman"/>
+          <w:sz w:val="24"/>
+          <w:szCs w:val="24"/>
+        </w:rPr>
+        <w:t xml:space="preserve"> de la </w:t>
+      </w:r>
+      <w:proofErr w:type="spellStart"/>
+      <w:r>
+        <w:rPr>
+          <w:rFonts w:ascii="Times New Roman" w:hAnsi="Times New Roman" w:cs="Times New Roman"/>
+          <w:sz w:val="24"/>
+          <w:szCs w:val="24"/>
+        </w:rPr>
+        <w:t>información</w:t>
+      </w:r>
+      <w:proofErr w:type="spellEnd"/>
+      <w:r>
+        <w:rPr>
+          <w:rFonts w:ascii="Times New Roman" w:hAnsi="Times New Roman" w:cs="Times New Roman"/>
+          <w:sz w:val="24"/>
+          <w:szCs w:val="24"/>
+        </w:rPr>
+        <w:t xml:space="preserve"> </w:t>
+      </w:r>
+      <w:proofErr w:type="spellStart"/>
+      <w:r>
+        <w:rPr>
+          <w:rFonts w:ascii="Times New Roman" w:hAnsi="Times New Roman" w:cs="Times New Roman"/>
+          <w:sz w:val="24"/>
+          <w:szCs w:val="24"/>
+        </w:rPr>
+        <w:t>mediante</w:t>
+      </w:r>
+      <w:proofErr w:type="spellEnd"/>
+      <w:r>
+        <w:rPr>
+          <w:rFonts w:ascii="Times New Roman" w:hAnsi="Times New Roman" w:cs="Times New Roman"/>
+          <w:sz w:val="24"/>
+          <w:szCs w:val="24"/>
+        </w:rPr>
+        <w:t xml:space="preserve"> las </w:t>
+      </w:r>
+      <w:proofErr w:type="spellStart"/>
+      <w:r>
+        <w:rPr>
+          <w:rFonts w:ascii="Times New Roman" w:hAnsi="Times New Roman" w:cs="Times New Roman"/>
+          <w:sz w:val="24"/>
+          <w:szCs w:val="24"/>
+        </w:rPr>
+        <w:t>entidades</w:t>
+      </w:r>
+      <w:proofErr w:type="spellEnd"/>
+      <w:r>
+        <w:rPr>
+          <w:rFonts w:ascii="Times New Roman" w:hAnsi="Times New Roman" w:cs="Times New Roman"/>
+          <w:sz w:val="24"/>
+          <w:szCs w:val="24"/>
+        </w:rPr>
+        <w:t xml:space="preserve"> y </w:t>
+      </w:r>
+      <w:proofErr w:type="spellStart"/>
+      <w:r>
+        <w:rPr>
+          <w:rFonts w:ascii="Times New Roman" w:hAnsi="Times New Roman" w:cs="Times New Roman"/>
+          <w:sz w:val="24"/>
+          <w:szCs w:val="24"/>
+        </w:rPr>
+        <w:t>relaciones</w:t>
+      </w:r>
+      <w:proofErr w:type="spellEnd"/>
+      <w:r>
+        <w:rPr>
+          <w:rFonts w:ascii="Times New Roman" w:hAnsi="Times New Roman" w:cs="Times New Roman"/>
+          <w:sz w:val="24"/>
+          <w:szCs w:val="24"/>
+        </w:rPr>
+        <w:t xml:space="preserve"> </w:t>
+      </w:r>
+      <w:proofErr w:type="spellStart"/>
+      <w:r>
+        <w:rPr>
+          <w:rFonts w:ascii="Times New Roman" w:hAnsi="Times New Roman" w:cs="Times New Roman"/>
+          <w:sz w:val="24"/>
+          <w:szCs w:val="24"/>
+        </w:rPr>
+        <w:t>definidas</w:t>
+      </w:r>
+      <w:proofErr w:type="spellEnd"/>
+      <w:r>
+        <w:rPr>
+          <w:rFonts w:ascii="Times New Roman" w:hAnsi="Times New Roman" w:cs="Times New Roman"/>
+          <w:sz w:val="24"/>
+          <w:szCs w:val="24"/>
+        </w:rPr>
+        <w:t xml:space="preserve"> para </w:t>
+      </w:r>
+      <w:proofErr w:type="spellStart"/>
+      <w:r>
+        <w:rPr>
+          <w:rFonts w:ascii="Times New Roman" w:hAnsi="Times New Roman" w:cs="Times New Roman"/>
+          <w:sz w:val="24"/>
+          <w:szCs w:val="24"/>
+        </w:rPr>
+        <w:t>el</w:t>
+      </w:r>
+      <w:proofErr w:type="spellEnd"/>
+      <w:r>
+        <w:rPr>
+          <w:rFonts w:ascii="Times New Roman" w:hAnsi="Times New Roman" w:cs="Times New Roman"/>
+          <w:sz w:val="24"/>
+          <w:szCs w:val="24"/>
+        </w:rPr>
+        <w:t xml:space="preserve"> </w:t>
+      </w:r>
+      <w:proofErr w:type="spellStart"/>
+      <w:r>
+        <w:rPr>
+          <w:rFonts w:ascii="Times New Roman" w:hAnsi="Times New Roman" w:cs="Times New Roman"/>
+          <w:sz w:val="24"/>
+          <w:szCs w:val="24"/>
+        </w:rPr>
+        <w:t>módulo</w:t>
+      </w:r>
+      <w:proofErr w:type="spellEnd"/>
+      <w:r>
+        <w:rPr>
+          <w:rFonts w:ascii="Times New Roman" w:hAnsi="Times New Roman" w:cs="Times New Roman"/>
+          <w:sz w:val="24"/>
+          <w:szCs w:val="24"/>
+        </w:rPr>
+        <w:t xml:space="preserve"> de </w:t>
+      </w:r>
+      <w:proofErr w:type="spellStart"/>
+      <w:r>
+        <w:rPr>
+          <w:rFonts w:ascii="Times New Roman" w:hAnsi="Times New Roman" w:cs="Times New Roman"/>
+          <w:sz w:val="24"/>
+          <w:szCs w:val="24"/>
+        </w:rPr>
+        <w:t>comunidad</w:t>
+      </w:r>
+      <w:proofErr w:type="spellEnd"/>
+      <w:r>
+        <w:rPr>
+          <w:rFonts w:ascii="Times New Roman" w:hAnsi="Times New Roman" w:cs="Times New Roman"/>
+          <w:sz w:val="24"/>
+          <w:szCs w:val="24"/>
+        </w:rPr>
+        <w:t>.</w:t>
+      </w:r>
+    </w:p>
+    <w:p>
+      <w:pPr>
+        <w:pStyle w:val="Listaconvietas"/>
+        <w:spacing w:line="480" w:lineRule="auto"/>
+        <w:rPr>
+          <w:rFonts w:ascii="Times New Roman" w:hAnsi="Times New Roman" w:cs="Times New Roman"/>
+          <w:sz w:val="24"/>
+          <w:szCs w:val="24"/>
+        </w:rPr>
+      </w:pPr>
+      <w:r>
+        <w:rPr>
+          <w:rFonts w:ascii="Times New Roman" w:hAnsi="Times New Roman" w:cs="Times New Roman"/>
+          <w:sz w:val="24"/>
+          <w:szCs w:val="24"/>
+        </w:rPr>
+        <w:t xml:space="preserve">Consulta de la </w:t>
+      </w:r>
+      <w:proofErr w:type="spellStart"/>
+      <w:r>
+        <w:rPr>
+          <w:rFonts w:ascii="Times New Roman" w:hAnsi="Times New Roman" w:cs="Times New Roman"/>
+          <w:sz w:val="24"/>
+          <w:szCs w:val="24"/>
+        </w:rPr>
+        <w:t>información</w:t>
+      </w:r>
+      <w:proofErr w:type="spellEnd"/>
+      <w:r>
+        <w:rPr>
+          <w:rFonts w:ascii="Times New Roman" w:hAnsi="Times New Roman" w:cs="Times New Roman"/>
+          <w:sz w:val="24"/>
+          <w:szCs w:val="24"/>
+        </w:rPr>
+        <w:t xml:space="preserve"> </w:t>
+      </w:r>
+      <w:proofErr w:type="spellStart"/>
+      <w:r>
+        <w:rPr>
+          <w:rFonts w:ascii="Times New Roman" w:hAnsi="Times New Roman" w:cs="Times New Roman"/>
+          <w:sz w:val="24"/>
+          <w:szCs w:val="24"/>
+        </w:rPr>
+        <w:t>generada</w:t>
+      </w:r>
+      <w:proofErr w:type="spellEnd"/>
+      <w:r>
+        <w:rPr>
+          <w:rFonts w:ascii="Times New Roman" w:hAnsi="Times New Roman" w:cs="Times New Roman"/>
+          <w:sz w:val="24"/>
+          <w:szCs w:val="24"/>
+        </w:rPr>
+        <w:t xml:space="preserve"> por las </w:t>
+      </w:r>
+      <w:proofErr w:type="spellStart"/>
+      <w:r>
+        <w:rPr>
+          <w:rFonts w:ascii="Times New Roman" w:hAnsi="Times New Roman" w:cs="Times New Roman"/>
+          <w:sz w:val="24"/>
+          <w:szCs w:val="24"/>
+        </w:rPr>
+        <w:t>diferentes</w:t>
+      </w:r>
+      <w:proofErr w:type="spellEnd"/>
+      <w:r>
+        <w:rPr>
+          <w:rFonts w:ascii="Times New Roman" w:hAnsi="Times New Roman" w:cs="Times New Roman"/>
+          <w:sz w:val="24"/>
+          <w:szCs w:val="24"/>
+        </w:rPr>
+        <w:t xml:space="preserve"> </w:t>
+      </w:r>
+      <w:proofErr w:type="spellStart"/>
+      <w:r>
+        <w:rPr>
+          <w:rFonts w:ascii="Times New Roman" w:hAnsi="Times New Roman" w:cs="Times New Roman"/>
+          <w:sz w:val="24"/>
+          <w:szCs w:val="24"/>
+        </w:rPr>
+        <w:t>acciones</w:t>
+      </w:r>
+      <w:proofErr w:type="spellEnd"/>
+      <w:r>
+        <w:rPr>
+          <w:rFonts w:ascii="Times New Roman" w:hAnsi="Times New Roman" w:cs="Times New Roman"/>
+          <w:sz w:val="24"/>
+          <w:szCs w:val="24"/>
+        </w:rPr>
+        <w:t xml:space="preserve"> </w:t>
+      </w:r>
+      <w:proofErr w:type="spellStart"/>
+      <w:r>
+        <w:rPr>
+          <w:rFonts w:ascii="Times New Roman" w:hAnsi="Times New Roman" w:cs="Times New Roman"/>
+          <w:sz w:val="24"/>
+          <w:szCs w:val="24"/>
+        </w:rPr>
+        <w:t>sociales</w:t>
+      </w:r>
+      <w:proofErr w:type="spellEnd"/>
+      <w:r>
+        <w:rPr>
+          <w:rFonts w:ascii="Times New Roman" w:hAnsi="Times New Roman" w:cs="Times New Roman"/>
+          <w:sz w:val="24"/>
+          <w:szCs w:val="24"/>
+        </w:rPr>
+        <w:t xml:space="preserve"> </w:t>
+      </w:r>
+      <w:proofErr w:type="spellStart"/>
+      <w:r>
+        <w:rPr>
+          <w:rFonts w:ascii="Times New Roman" w:hAnsi="Times New Roman" w:cs="Times New Roman"/>
+          <w:sz w:val="24"/>
+          <w:szCs w:val="24"/>
+        </w:rPr>
+        <w:t>realizadas</w:t>
+      </w:r>
+      <w:proofErr w:type="spellEnd"/>
+      <w:r>
+        <w:rPr>
+          <w:rFonts w:ascii="Times New Roman" w:hAnsi="Times New Roman" w:cs="Times New Roman"/>
+          <w:sz w:val="24"/>
+          <w:szCs w:val="24"/>
+        </w:rPr>
+        <w:t xml:space="preserve"> dentro del </w:t>
+      </w:r>
+      <w:proofErr w:type="spellStart"/>
+      <w:r>
+        <w:rPr>
+          <w:rFonts w:ascii="Times New Roman" w:hAnsi="Times New Roman" w:cs="Times New Roman"/>
+          <w:sz w:val="24"/>
+          <w:szCs w:val="24"/>
+        </w:rPr>
+        <w:t>sistema</w:t>
+      </w:r>
+      <w:proofErr w:type="spellEnd"/>
+      <w:r>
+        <w:rPr>
+          <w:rFonts w:ascii="Times New Roman" w:hAnsi="Times New Roman" w:cs="Times New Roman"/>
+          <w:sz w:val="24"/>
+          <w:szCs w:val="24"/>
+        </w:rPr>
+        <w:t>.</w:t>
+      </w:r>
+    </w:p>
+    <w:p>
+      <w:pPr>
+        <w:pStyle w:val="Ttulo2"/>
+        <w:rPr>
+          <w:rFonts w:cs="Times New Roman"/>
+          <w:szCs w:val="24"/>
+        </w:rPr>
+      </w:pPr>
+      <w:r>
+        <w:rPr>
+          <w:rFonts w:cs="Times New Roman"/>
+          <w:szCs w:val="24"/>
+        </w:rPr>
+        <w:t>2.2 Exclusiones</w:t>
+      </w:r>
+    </w:p>
+    <w:p>
+      <w:pPr>
+        <w:pStyle w:val="Listaconvietas"/>
+        <w:spacing w:line="480" w:lineRule="auto"/>
+        <w:rPr>
+          <w:rFonts w:ascii="Times New Roman" w:hAnsi="Times New Roman" w:cs="Times New Roman"/>
+          <w:sz w:val="24"/>
+          <w:szCs w:val="24"/>
+        </w:rPr>
+      </w:pPr>
+      <w:r>
+        <w:rPr>
+          <w:rFonts w:ascii="Times New Roman" w:hAnsi="Times New Roman" w:cs="Times New Roman"/>
+          <w:sz w:val="24"/>
+          <w:szCs w:val="24"/>
+        </w:rPr>
+        <w:t xml:space="preserve">Desarrollo de </w:t>
+      </w:r>
+      <w:proofErr w:type="spellStart"/>
+      <w:r>
+        <w:rPr>
+          <w:rFonts w:ascii="Times New Roman" w:hAnsi="Times New Roman" w:cs="Times New Roman"/>
+          <w:sz w:val="24"/>
+          <w:szCs w:val="24"/>
+        </w:rPr>
+        <w:t>funcionalidades</w:t>
+      </w:r>
+      <w:proofErr w:type="spellEnd"/>
+      <w:r>
+        <w:rPr>
+          <w:rFonts w:ascii="Times New Roman" w:hAnsi="Times New Roman" w:cs="Times New Roman"/>
+          <w:sz w:val="24"/>
+          <w:szCs w:val="24"/>
+        </w:rPr>
+        <w:t xml:space="preserve"> </w:t>
+      </w:r>
+      <w:proofErr w:type="spellStart"/>
+      <w:r>
+        <w:rPr>
+          <w:rFonts w:ascii="Times New Roman" w:hAnsi="Times New Roman" w:cs="Times New Roman"/>
+          <w:sz w:val="24"/>
+          <w:szCs w:val="24"/>
+        </w:rPr>
+        <w:t>relacionadas</w:t>
+      </w:r>
+      <w:proofErr w:type="spellEnd"/>
+      <w:r>
+        <w:rPr>
+          <w:rFonts w:ascii="Times New Roman" w:hAnsi="Times New Roman" w:cs="Times New Roman"/>
+          <w:sz w:val="24"/>
+          <w:szCs w:val="24"/>
+        </w:rPr>
+        <w:t xml:space="preserve"> con </w:t>
+      </w:r>
+      <w:proofErr w:type="spellStart"/>
+      <w:r>
+        <w:rPr>
+          <w:rFonts w:ascii="Times New Roman" w:hAnsi="Times New Roman" w:cs="Times New Roman"/>
+          <w:sz w:val="24"/>
+          <w:szCs w:val="24"/>
+        </w:rPr>
+        <w:t>nutrición</w:t>
+      </w:r>
+      <w:proofErr w:type="spellEnd"/>
+      <w:r>
+        <w:rPr>
+          <w:rFonts w:ascii="Times New Roman" w:hAnsi="Times New Roman" w:cs="Times New Roman"/>
+          <w:sz w:val="24"/>
+          <w:szCs w:val="24"/>
+        </w:rPr>
+        <w:t xml:space="preserve"> y </w:t>
+      </w:r>
+      <w:proofErr w:type="spellStart"/>
+      <w:r>
+        <w:rPr>
+          <w:rFonts w:ascii="Times New Roman" w:hAnsi="Times New Roman" w:cs="Times New Roman"/>
+          <w:sz w:val="24"/>
+          <w:szCs w:val="24"/>
+        </w:rPr>
+        <w:t>perfiles</w:t>
+      </w:r>
+      <w:proofErr w:type="spellEnd"/>
+      <w:r>
+        <w:rPr>
+          <w:rFonts w:ascii="Times New Roman" w:hAnsi="Times New Roman" w:cs="Times New Roman"/>
+          <w:sz w:val="24"/>
+          <w:szCs w:val="24"/>
+        </w:rPr>
+        <w:t xml:space="preserve"> </w:t>
+      </w:r>
+      <w:proofErr w:type="spellStart"/>
+      <w:r>
+        <w:rPr>
+          <w:rFonts w:ascii="Times New Roman" w:hAnsi="Times New Roman" w:cs="Times New Roman"/>
+          <w:sz w:val="24"/>
+          <w:szCs w:val="24"/>
+        </w:rPr>
+        <w:t>alimentarios</w:t>
+      </w:r>
+      <w:proofErr w:type="spellEnd"/>
+      <w:r>
+        <w:rPr>
+          <w:rFonts w:ascii="Times New Roman" w:hAnsi="Times New Roman" w:cs="Times New Roman"/>
+          <w:sz w:val="24"/>
+          <w:szCs w:val="24"/>
+        </w:rPr>
+        <w:t>.</w:t>
+      </w:r>
+    </w:p>
+    <w:p>
+      <w:pPr>
+        <w:pStyle w:val="Listaconvietas"/>
+        <w:spacing w:line="480" w:lineRule="auto"/>
+        <w:rPr>
+          <w:rFonts w:ascii="Times New Roman" w:hAnsi="Times New Roman" w:cs="Times New Roman"/>
+          <w:sz w:val="24"/>
+          <w:szCs w:val="24"/>
+        </w:rPr>
+      </w:pPr>
+      <w:r>
+        <w:rPr>
+          <w:rFonts w:ascii="Times New Roman" w:hAnsi="Times New Roman" w:cs="Times New Roman"/>
+          <w:sz w:val="24"/>
+          <w:szCs w:val="24"/>
+        </w:rPr>
+        <w:t xml:space="preserve">Desarrollo de </w:t>
+      </w:r>
+      <w:proofErr w:type="spellStart"/>
+      <w:r>
+        <w:rPr>
+          <w:rFonts w:ascii="Times New Roman" w:hAnsi="Times New Roman" w:cs="Times New Roman"/>
+          <w:sz w:val="24"/>
+          <w:szCs w:val="24"/>
+        </w:rPr>
+        <w:t>funcionalidades</w:t>
+      </w:r>
+      <w:proofErr w:type="spellEnd"/>
+      <w:r>
+        <w:rPr>
+          <w:rFonts w:ascii="Times New Roman" w:hAnsi="Times New Roman" w:cs="Times New Roman"/>
+          <w:sz w:val="24"/>
+          <w:szCs w:val="24"/>
+        </w:rPr>
+        <w:t xml:space="preserve"> </w:t>
+      </w:r>
+      <w:proofErr w:type="spellStart"/>
+      <w:r>
+        <w:rPr>
+          <w:rFonts w:ascii="Times New Roman" w:hAnsi="Times New Roman" w:cs="Times New Roman"/>
+          <w:sz w:val="24"/>
+          <w:szCs w:val="24"/>
+        </w:rPr>
+        <w:t>relacionadas</w:t>
+      </w:r>
+      <w:proofErr w:type="spellEnd"/>
+      <w:r>
+        <w:rPr>
+          <w:rFonts w:ascii="Times New Roman" w:hAnsi="Times New Roman" w:cs="Times New Roman"/>
+          <w:sz w:val="24"/>
+          <w:szCs w:val="24"/>
+        </w:rPr>
+        <w:t xml:space="preserve"> con </w:t>
+      </w:r>
+      <w:proofErr w:type="spellStart"/>
+      <w:r>
+        <w:rPr>
+          <w:rFonts w:ascii="Times New Roman" w:hAnsi="Times New Roman" w:cs="Times New Roman"/>
+          <w:sz w:val="24"/>
+          <w:szCs w:val="24"/>
+        </w:rPr>
+        <w:t>transporte</w:t>
+      </w:r>
+      <w:proofErr w:type="spellEnd"/>
+      <w:r>
+        <w:rPr>
+          <w:rFonts w:ascii="Times New Roman" w:hAnsi="Times New Roman" w:cs="Times New Roman"/>
+          <w:sz w:val="24"/>
+          <w:szCs w:val="24"/>
+        </w:rPr>
+        <w:t xml:space="preserve">, </w:t>
+      </w:r>
+      <w:proofErr w:type="spellStart"/>
+      <w:r>
+        <w:rPr>
+          <w:rFonts w:ascii="Times New Roman" w:hAnsi="Times New Roman" w:cs="Times New Roman"/>
+          <w:sz w:val="24"/>
+          <w:szCs w:val="24"/>
+        </w:rPr>
+        <w:t>pedidos</w:t>
+      </w:r>
+      <w:proofErr w:type="spellEnd"/>
+      <w:r>
+        <w:rPr>
+          <w:rFonts w:ascii="Times New Roman" w:hAnsi="Times New Roman" w:cs="Times New Roman"/>
+          <w:sz w:val="24"/>
+          <w:szCs w:val="24"/>
+        </w:rPr>
+        <w:t xml:space="preserve"> o </w:t>
+      </w:r>
+      <w:proofErr w:type="spellStart"/>
+      <w:r>
+        <w:rPr>
+          <w:rFonts w:ascii="Times New Roman" w:hAnsi="Times New Roman" w:cs="Times New Roman"/>
+          <w:sz w:val="24"/>
+          <w:szCs w:val="24"/>
+        </w:rPr>
+        <w:t>entrega</w:t>
+      </w:r>
+      <w:proofErr w:type="spellEnd"/>
+      <w:r>
+        <w:rPr>
+          <w:rFonts w:ascii="Times New Roman" w:hAnsi="Times New Roman" w:cs="Times New Roman"/>
+          <w:sz w:val="24"/>
+          <w:szCs w:val="24"/>
+        </w:rPr>
+        <w:t xml:space="preserve"> de </w:t>
+      </w:r>
+      <w:proofErr w:type="spellStart"/>
+      <w:r>
+        <w:rPr>
+          <w:rFonts w:ascii="Times New Roman" w:hAnsi="Times New Roman" w:cs="Times New Roman"/>
+          <w:sz w:val="24"/>
+          <w:szCs w:val="24"/>
+        </w:rPr>
+        <w:t>productos</w:t>
+      </w:r>
+      <w:proofErr w:type="spellEnd"/>
+      <w:r>
+        <w:rPr>
+          <w:rFonts w:ascii="Times New Roman" w:hAnsi="Times New Roman" w:cs="Times New Roman"/>
+          <w:sz w:val="24"/>
+          <w:szCs w:val="24"/>
+        </w:rPr>
+        <w:t>.</w:t>
+      </w:r>
+    </w:p>
+    <w:p>
+      <w:pPr>
+        <w:pStyle w:val="Listaconvietas"/>
+        <w:spacing w:line="480" w:lineRule="auto"/>
+        <w:rPr>
+          <w:rFonts w:ascii="Times New Roman" w:hAnsi="Times New Roman" w:cs="Times New Roman"/>
+          <w:sz w:val="24"/>
+          <w:szCs w:val="24"/>
+        </w:rPr>
+      </w:pPr>
+      <w:proofErr w:type="spellStart"/>
+      <w:r>
+        <w:rPr>
+          <w:rFonts w:ascii="Times New Roman" w:hAnsi="Times New Roman" w:cs="Times New Roman"/>
+          <w:sz w:val="24"/>
+          <w:szCs w:val="24"/>
         </w:rPr>
         <w:lastRenderedPageBreak/>
-        <w:t>Historial de atención:</w:t>
-      </w:r>
-      <w:r>
-        <w:rPr>
-          <w:rFonts w:cs="Times New Roman"/>
-        </w:rPr>
-        <w:t xml:space="preserve"> Acceso al perfil del cliente para revisar qué cortes se ha realizado anteriormente y cuáles son sus preferencias, permitiendo un servicio personalizado.</w:t>
-      </w:r>
-    </w:p>
-    <w:p>
-      <w:pPr>
-        <w:rPr>
-          <w:rFonts w:cs="Times New Roman"/>
-        </w:rPr>
-      </w:pPr>
-      <w:r>
-        <w:rPr>
-          <w:rFonts w:cs="Times New Roman"/>
-          <w:b/>
-          <w:bCs/>
-        </w:rPr>
-        <w:t>3. Funciones Internas del Sistema:</w:t>
-      </w:r>
-    </w:p>
-    <w:p>
-      <w:pPr>
-        <w:numPr>
-          <w:ilvl w:val="0"/>
-          <w:numId w:val="7"/>
-        </w:numPr>
-        <w:rPr>
-          <w:rFonts w:cs="Times New Roman"/>
-        </w:rPr>
-      </w:pPr>
-      <w:r>
-        <w:rPr>
-          <w:rFonts w:cs="Times New Roman"/>
-          <w:b/>
-          <w:bCs/>
-        </w:rPr>
-        <w:t>Prevención de solapamiento:</w:t>
-      </w:r>
-      <w:r>
-        <w:rPr>
-          <w:rFonts w:cs="Times New Roman"/>
-        </w:rPr>
-        <w:t xml:space="preserve"> Lógica en el </w:t>
-      </w:r>
-      <w:proofErr w:type="spellStart"/>
-      <w:r>
-        <w:rPr>
-          <w:rFonts w:cs="Times New Roman"/>
-        </w:rPr>
-        <w:t>backend</w:t>
-      </w:r>
-      <w:proofErr w:type="spellEnd"/>
-      <w:r>
-        <w:rPr>
-          <w:rFonts w:cs="Times New Roman"/>
-        </w:rPr>
-        <w:t xml:space="preserve"> que valida y bloquea los horarios ocupados, garantizando que no existan cruces de citas para un mismo barbero.</w:t>
-      </w:r>
-    </w:p>
-    <w:p>
-      <w:pPr>
-        <w:numPr>
-          <w:ilvl w:val="0"/>
-          <w:numId w:val="7"/>
-        </w:numPr>
-        <w:rPr>
-          <w:rFonts w:cs="Times New Roman"/>
-        </w:rPr>
-      </w:pPr>
-      <w:r>
-        <w:rPr>
-          <w:rFonts w:cs="Times New Roman"/>
-          <w:b/>
-          <w:bCs/>
-        </w:rPr>
-        <w:t>Sistema de recordatorios:</w:t>
-      </w:r>
-      <w:r>
-        <w:rPr>
-          <w:rFonts w:cs="Times New Roman"/>
-        </w:rPr>
-        <w:t xml:space="preserve"> Generación de notificaciones o alertas automáticas previas a la cita para mitigar el olvido por parte de los clientes.</w:t>
-      </w:r>
-    </w:p>
-    <w:p>
-      <w:pPr>
-        <w:rPr>
-          <w:rFonts w:cs="Times New Roman"/>
-        </w:rPr>
-      </w:pPr>
-    </w:p>
-    <w:p>
-      <w:pPr>
-        <w:pStyle w:val="Ttulo2"/>
-        <w:rPr>
-          <w:rFonts w:cs="Times New Roman"/>
-          <w:szCs w:val="24"/>
-        </w:rPr>
-      </w:pPr>
-      <w:bookmarkStart w:id="12" w:name="_Toc241702564"/>
-      <w:r>
-        <w:rPr>
-          <w:rFonts w:cs="Times New Roman"/>
-          <w:szCs w:val="24"/>
-        </w:rPr>
-        <w:t>Exclusiones</w:t>
-      </w:r>
-      <w:bookmarkEnd w:id="12"/>
-    </w:p>
-    <w:p>
-      <w:pPr>
-        <w:rPr>
-          <w:rFonts w:cs="Times New Roman"/>
-        </w:rPr>
-      </w:pPr>
-      <w:r>
-        <w:rPr>
-          <w:rFonts w:cs="Times New Roman"/>
-        </w:rPr>
-        <w:t xml:space="preserve">Para delimitar correctamente el desarrollo, esta versión de la aplicación </w:t>
-      </w:r>
-      <w:r>
-        <w:rPr>
-          <w:rFonts w:cs="Times New Roman"/>
-          <w:b/>
-          <w:bCs/>
-        </w:rPr>
-        <w:t>no</w:t>
-      </w:r>
-      <w:r>
-        <w:rPr>
-          <w:rFonts w:cs="Times New Roman"/>
-        </w:rPr>
-        <w:t xml:space="preserve"> contempla integraciones con pasarelas de pago en línea (los cobros se seguirán realizando en el local), no incluye módulos de facturación electrónica contable, y tampoco abarcará la gestión de inventario de productos físicos (como venta de ceras, lociones o cuchillas). El proyecto está enfocado estrictamente en la optimización operativa de los servicios y el tiempo.</w:t>
-      </w:r>
-    </w:p>
-    <w:p>
-      <w:pPr>
-        <w:rPr>
-          <w:rFonts w:cs="Times New Roman"/>
-        </w:rPr>
-      </w:pPr>
-    </w:p>
-    <w:p>
-      <w:pPr>
+        <w:t>Gestión</w:t>
+      </w:r>
+      <w:proofErr w:type="spellEnd"/>
+      <w:r>
+        <w:rPr>
+          <w:rFonts w:ascii="Times New Roman" w:hAnsi="Times New Roman" w:cs="Times New Roman"/>
+          <w:sz w:val="24"/>
+          <w:szCs w:val="24"/>
+        </w:rPr>
+        <w:t xml:space="preserve"> de </w:t>
+      </w:r>
+      <w:proofErr w:type="spellStart"/>
+      <w:r>
+        <w:rPr>
+          <w:rFonts w:ascii="Times New Roman" w:hAnsi="Times New Roman" w:cs="Times New Roman"/>
+          <w:sz w:val="24"/>
+          <w:szCs w:val="24"/>
+        </w:rPr>
+        <w:t>información</w:t>
+      </w:r>
+      <w:proofErr w:type="spellEnd"/>
+      <w:r>
+        <w:rPr>
+          <w:rFonts w:ascii="Times New Roman" w:hAnsi="Times New Roman" w:cs="Times New Roman"/>
+          <w:sz w:val="24"/>
+          <w:szCs w:val="24"/>
+        </w:rPr>
+        <w:t xml:space="preserve"> </w:t>
+      </w:r>
+      <w:proofErr w:type="spellStart"/>
+      <w:r>
+        <w:rPr>
+          <w:rFonts w:ascii="Times New Roman" w:hAnsi="Times New Roman" w:cs="Times New Roman"/>
+          <w:sz w:val="24"/>
+          <w:szCs w:val="24"/>
+        </w:rPr>
+        <w:t>correspondiente</w:t>
+      </w:r>
+      <w:proofErr w:type="spellEnd"/>
+      <w:r>
+        <w:rPr>
+          <w:rFonts w:ascii="Times New Roman" w:hAnsi="Times New Roman" w:cs="Times New Roman"/>
+          <w:sz w:val="24"/>
+          <w:szCs w:val="24"/>
+        </w:rPr>
+        <w:t xml:space="preserve"> a </w:t>
+      </w:r>
+      <w:proofErr w:type="spellStart"/>
+      <w:r>
+        <w:rPr>
+          <w:rFonts w:ascii="Times New Roman" w:hAnsi="Times New Roman" w:cs="Times New Roman"/>
+          <w:sz w:val="24"/>
+          <w:szCs w:val="24"/>
+        </w:rPr>
+        <w:t>módulos</w:t>
+      </w:r>
+      <w:proofErr w:type="spellEnd"/>
+      <w:r>
+        <w:rPr>
+          <w:rFonts w:ascii="Times New Roman" w:hAnsi="Times New Roman" w:cs="Times New Roman"/>
+          <w:sz w:val="24"/>
+          <w:szCs w:val="24"/>
+        </w:rPr>
+        <w:t xml:space="preserve"> </w:t>
+      </w:r>
+      <w:proofErr w:type="spellStart"/>
+      <w:r>
+        <w:rPr>
+          <w:rFonts w:ascii="Times New Roman" w:hAnsi="Times New Roman" w:cs="Times New Roman"/>
+          <w:sz w:val="24"/>
+          <w:szCs w:val="24"/>
+        </w:rPr>
+        <w:t>diferentes</w:t>
+      </w:r>
+      <w:proofErr w:type="spellEnd"/>
+      <w:r>
+        <w:rPr>
+          <w:rFonts w:ascii="Times New Roman" w:hAnsi="Times New Roman" w:cs="Times New Roman"/>
+          <w:sz w:val="24"/>
+          <w:szCs w:val="24"/>
+        </w:rPr>
+        <w:t xml:space="preserve"> al </w:t>
+      </w:r>
+      <w:proofErr w:type="spellStart"/>
+      <w:r>
+        <w:rPr>
+          <w:rFonts w:ascii="Times New Roman" w:hAnsi="Times New Roman" w:cs="Times New Roman"/>
+          <w:sz w:val="24"/>
+          <w:szCs w:val="24"/>
+        </w:rPr>
+        <w:t>componente</w:t>
+      </w:r>
+      <w:proofErr w:type="spellEnd"/>
+      <w:r>
+        <w:rPr>
+          <w:rFonts w:ascii="Times New Roman" w:hAnsi="Times New Roman" w:cs="Times New Roman"/>
+          <w:sz w:val="24"/>
+          <w:szCs w:val="24"/>
+        </w:rPr>
+        <w:t xml:space="preserve"> de </w:t>
+      </w:r>
+      <w:proofErr w:type="spellStart"/>
+      <w:r>
+        <w:rPr>
+          <w:rFonts w:ascii="Times New Roman" w:hAnsi="Times New Roman" w:cs="Times New Roman"/>
+          <w:sz w:val="24"/>
+          <w:szCs w:val="24"/>
+        </w:rPr>
+        <w:t>comunidad</w:t>
+      </w:r>
+      <w:proofErr w:type="spellEnd"/>
+      <w:r>
+        <w:rPr>
+          <w:rFonts w:ascii="Times New Roman" w:hAnsi="Times New Roman" w:cs="Times New Roman"/>
+          <w:sz w:val="24"/>
+          <w:szCs w:val="24"/>
+        </w:rPr>
+        <w:t>.</w:t>
+      </w:r>
+    </w:p>
+    <w:p>
+      <w:pPr>
+        <w:pStyle w:val="Listaconvietas"/>
+        <w:spacing w:line="480" w:lineRule="auto"/>
+        <w:rPr>
+          <w:rFonts w:ascii="Times New Roman" w:hAnsi="Times New Roman" w:cs="Times New Roman"/>
+          <w:sz w:val="24"/>
+          <w:szCs w:val="24"/>
+        </w:rPr>
+      </w:pPr>
+      <w:proofErr w:type="spellStart"/>
+      <w:r>
+        <w:rPr>
+          <w:rFonts w:ascii="Times New Roman" w:hAnsi="Times New Roman" w:cs="Times New Roman"/>
+          <w:sz w:val="24"/>
+          <w:szCs w:val="24"/>
+        </w:rPr>
+        <w:t>Administración</w:t>
+      </w:r>
+      <w:proofErr w:type="spellEnd"/>
+      <w:r>
+        <w:rPr>
+          <w:rFonts w:ascii="Times New Roman" w:hAnsi="Times New Roman" w:cs="Times New Roman"/>
+          <w:sz w:val="24"/>
+          <w:szCs w:val="24"/>
+        </w:rPr>
+        <w:t xml:space="preserve"> de </w:t>
+      </w:r>
+      <w:proofErr w:type="spellStart"/>
+      <w:r>
+        <w:rPr>
+          <w:rFonts w:ascii="Times New Roman" w:hAnsi="Times New Roman" w:cs="Times New Roman"/>
+          <w:sz w:val="24"/>
+          <w:szCs w:val="24"/>
+        </w:rPr>
+        <w:t>contenidos</w:t>
+      </w:r>
+      <w:proofErr w:type="spellEnd"/>
+      <w:r>
+        <w:rPr>
+          <w:rFonts w:ascii="Times New Roman" w:hAnsi="Times New Roman" w:cs="Times New Roman"/>
+          <w:sz w:val="24"/>
+          <w:szCs w:val="24"/>
+        </w:rPr>
+        <w:t xml:space="preserve"> que no </w:t>
+      </w:r>
+      <w:proofErr w:type="spellStart"/>
+      <w:r>
+        <w:rPr>
+          <w:rFonts w:ascii="Times New Roman" w:hAnsi="Times New Roman" w:cs="Times New Roman"/>
+          <w:sz w:val="24"/>
+          <w:szCs w:val="24"/>
+        </w:rPr>
+        <w:t>estén</w:t>
+      </w:r>
+      <w:proofErr w:type="spellEnd"/>
+      <w:r>
+        <w:rPr>
+          <w:rFonts w:ascii="Times New Roman" w:hAnsi="Times New Roman" w:cs="Times New Roman"/>
+          <w:sz w:val="24"/>
+          <w:szCs w:val="24"/>
+        </w:rPr>
+        <w:t xml:space="preserve"> </w:t>
+      </w:r>
+      <w:proofErr w:type="spellStart"/>
+      <w:r>
+        <w:rPr>
+          <w:rFonts w:ascii="Times New Roman" w:hAnsi="Times New Roman" w:cs="Times New Roman"/>
+          <w:sz w:val="24"/>
+          <w:szCs w:val="24"/>
+        </w:rPr>
+        <w:t>relacionados</w:t>
+      </w:r>
+      <w:proofErr w:type="spellEnd"/>
+      <w:r>
+        <w:rPr>
+          <w:rFonts w:ascii="Times New Roman" w:hAnsi="Times New Roman" w:cs="Times New Roman"/>
+          <w:sz w:val="24"/>
+          <w:szCs w:val="24"/>
+        </w:rPr>
+        <w:t xml:space="preserve"> con las </w:t>
+      </w:r>
+      <w:proofErr w:type="spellStart"/>
+      <w:r>
+        <w:rPr>
+          <w:rFonts w:ascii="Times New Roman" w:hAnsi="Times New Roman" w:cs="Times New Roman"/>
+          <w:sz w:val="24"/>
+          <w:szCs w:val="24"/>
+        </w:rPr>
+        <w:t>interacciones</w:t>
+      </w:r>
+      <w:proofErr w:type="spellEnd"/>
+      <w:r>
+        <w:rPr>
+          <w:rFonts w:ascii="Times New Roman" w:hAnsi="Times New Roman" w:cs="Times New Roman"/>
+          <w:sz w:val="24"/>
+          <w:szCs w:val="24"/>
+        </w:rPr>
+        <w:t xml:space="preserve"> </w:t>
+      </w:r>
+      <w:proofErr w:type="spellStart"/>
+      <w:r>
+        <w:rPr>
+          <w:rFonts w:ascii="Times New Roman" w:hAnsi="Times New Roman" w:cs="Times New Roman"/>
+          <w:sz w:val="24"/>
+          <w:szCs w:val="24"/>
+        </w:rPr>
+        <w:t>sociales</w:t>
+      </w:r>
+      <w:proofErr w:type="spellEnd"/>
+      <w:r>
+        <w:rPr>
+          <w:rFonts w:ascii="Times New Roman" w:hAnsi="Times New Roman" w:cs="Times New Roman"/>
+          <w:sz w:val="24"/>
+          <w:szCs w:val="24"/>
+        </w:rPr>
+        <w:t xml:space="preserve"> </w:t>
+      </w:r>
+      <w:proofErr w:type="spellStart"/>
+      <w:r>
+        <w:rPr>
+          <w:rFonts w:ascii="Times New Roman" w:hAnsi="Times New Roman" w:cs="Times New Roman"/>
+          <w:sz w:val="24"/>
+          <w:szCs w:val="24"/>
+        </w:rPr>
+        <w:t>definidas</w:t>
+      </w:r>
+      <w:proofErr w:type="spellEnd"/>
+      <w:r>
+        <w:rPr>
+          <w:rFonts w:ascii="Times New Roman" w:hAnsi="Times New Roman" w:cs="Times New Roman"/>
+          <w:sz w:val="24"/>
+          <w:szCs w:val="24"/>
+        </w:rPr>
+        <w:t xml:space="preserve"> para las </w:t>
+      </w:r>
+      <w:proofErr w:type="spellStart"/>
+      <w:r>
+        <w:rPr>
+          <w:rFonts w:ascii="Times New Roman" w:hAnsi="Times New Roman" w:cs="Times New Roman"/>
+          <w:sz w:val="24"/>
+          <w:szCs w:val="24"/>
+        </w:rPr>
+        <w:t>recetas</w:t>
+      </w:r>
+      <w:proofErr w:type="spellEnd"/>
+      <w:r>
+        <w:rPr>
+          <w:rFonts w:ascii="Times New Roman" w:hAnsi="Times New Roman" w:cs="Times New Roman"/>
+          <w:sz w:val="24"/>
+          <w:szCs w:val="24"/>
+        </w:rPr>
+        <w:t>.</w:t>
+      </w:r>
+    </w:p>
+    <w:p>
+      <w:pPr>
+        <w:pStyle w:val="Listaconvietas"/>
+        <w:spacing w:line="480" w:lineRule="auto"/>
+        <w:rPr>
+          <w:rFonts w:ascii="Times New Roman" w:hAnsi="Times New Roman" w:cs="Times New Roman"/>
+          <w:sz w:val="24"/>
+          <w:szCs w:val="24"/>
+        </w:rPr>
+      </w:pPr>
+      <w:proofErr w:type="spellStart"/>
+      <w:r>
+        <w:rPr>
+          <w:rFonts w:ascii="Times New Roman" w:hAnsi="Times New Roman" w:cs="Times New Roman"/>
+          <w:sz w:val="24"/>
+          <w:szCs w:val="24"/>
+        </w:rPr>
+        <w:t>Implementación</w:t>
+      </w:r>
+      <w:proofErr w:type="spellEnd"/>
+      <w:r>
+        <w:rPr>
+          <w:rFonts w:ascii="Times New Roman" w:hAnsi="Times New Roman" w:cs="Times New Roman"/>
+          <w:sz w:val="24"/>
+          <w:szCs w:val="24"/>
+        </w:rPr>
+        <w:t xml:space="preserve"> de </w:t>
+      </w:r>
+      <w:proofErr w:type="spellStart"/>
+      <w:r>
+        <w:rPr>
+          <w:rFonts w:ascii="Times New Roman" w:hAnsi="Times New Roman" w:cs="Times New Roman"/>
+          <w:sz w:val="24"/>
+          <w:szCs w:val="24"/>
+        </w:rPr>
+        <w:t>funcionalidades</w:t>
+      </w:r>
+      <w:proofErr w:type="spellEnd"/>
+      <w:r>
+        <w:rPr>
+          <w:rFonts w:ascii="Times New Roman" w:hAnsi="Times New Roman" w:cs="Times New Roman"/>
+          <w:sz w:val="24"/>
+          <w:szCs w:val="24"/>
+        </w:rPr>
+        <w:t xml:space="preserve"> </w:t>
+      </w:r>
+      <w:proofErr w:type="spellStart"/>
+      <w:r>
+        <w:rPr>
+          <w:rFonts w:ascii="Times New Roman" w:hAnsi="Times New Roman" w:cs="Times New Roman"/>
+          <w:sz w:val="24"/>
+          <w:szCs w:val="24"/>
+        </w:rPr>
+        <w:t>diferentes</w:t>
+      </w:r>
+      <w:proofErr w:type="spellEnd"/>
+      <w:r>
+        <w:rPr>
+          <w:rFonts w:ascii="Times New Roman" w:hAnsi="Times New Roman" w:cs="Times New Roman"/>
+          <w:sz w:val="24"/>
+          <w:szCs w:val="24"/>
+        </w:rPr>
+        <w:t xml:space="preserve"> a las </w:t>
+      </w:r>
+      <w:proofErr w:type="spellStart"/>
+      <w:r>
+        <w:rPr>
+          <w:rFonts w:ascii="Times New Roman" w:hAnsi="Times New Roman" w:cs="Times New Roman"/>
+          <w:sz w:val="24"/>
+          <w:szCs w:val="24"/>
+        </w:rPr>
+        <w:t>establecidas</w:t>
+      </w:r>
+      <w:proofErr w:type="spellEnd"/>
+      <w:r>
+        <w:rPr>
+          <w:rFonts w:ascii="Times New Roman" w:hAnsi="Times New Roman" w:cs="Times New Roman"/>
+          <w:sz w:val="24"/>
+          <w:szCs w:val="24"/>
+        </w:rPr>
+        <w:t xml:space="preserve"> dentro de las </w:t>
+      </w:r>
+      <w:proofErr w:type="spellStart"/>
+      <w:r>
+        <w:rPr>
+          <w:rFonts w:ascii="Times New Roman" w:hAnsi="Times New Roman" w:cs="Times New Roman"/>
+          <w:sz w:val="24"/>
+          <w:szCs w:val="24"/>
+        </w:rPr>
+        <w:t>entidades</w:t>
+      </w:r>
+      <w:proofErr w:type="spellEnd"/>
+      <w:r>
+        <w:rPr>
+          <w:rFonts w:ascii="Times New Roman" w:hAnsi="Times New Roman" w:cs="Times New Roman"/>
+          <w:sz w:val="24"/>
+          <w:szCs w:val="24"/>
+        </w:rPr>
+        <w:t xml:space="preserve"> y </w:t>
+      </w:r>
+      <w:proofErr w:type="spellStart"/>
+      <w:r>
+        <w:rPr>
+          <w:rFonts w:ascii="Times New Roman" w:hAnsi="Times New Roman" w:cs="Times New Roman"/>
+          <w:sz w:val="24"/>
+          <w:szCs w:val="24"/>
+        </w:rPr>
+        <w:t>relaciones</w:t>
+      </w:r>
+      <w:proofErr w:type="spellEnd"/>
+      <w:r>
+        <w:rPr>
+          <w:rFonts w:ascii="Times New Roman" w:hAnsi="Times New Roman" w:cs="Times New Roman"/>
+          <w:sz w:val="24"/>
+          <w:szCs w:val="24"/>
+        </w:rPr>
+        <w:t xml:space="preserve"> </w:t>
+      </w:r>
+      <w:proofErr w:type="spellStart"/>
+      <w:r>
+        <w:rPr>
+          <w:rFonts w:ascii="Times New Roman" w:hAnsi="Times New Roman" w:cs="Times New Roman"/>
+          <w:sz w:val="24"/>
+          <w:szCs w:val="24"/>
+        </w:rPr>
+        <w:t>correspondientes</w:t>
+      </w:r>
+      <w:proofErr w:type="spellEnd"/>
+      <w:r>
+        <w:rPr>
+          <w:rFonts w:ascii="Times New Roman" w:hAnsi="Times New Roman" w:cs="Times New Roman"/>
+          <w:sz w:val="24"/>
+          <w:szCs w:val="24"/>
+        </w:rPr>
+        <w:t xml:space="preserve"> al </w:t>
+      </w:r>
+      <w:proofErr w:type="spellStart"/>
+      <w:r>
+        <w:rPr>
+          <w:rFonts w:ascii="Times New Roman" w:hAnsi="Times New Roman" w:cs="Times New Roman"/>
+          <w:sz w:val="24"/>
+          <w:szCs w:val="24"/>
+        </w:rPr>
+        <w:t>módulo</w:t>
+      </w:r>
+      <w:proofErr w:type="spellEnd"/>
+      <w:r>
+        <w:rPr>
+          <w:rFonts w:ascii="Times New Roman" w:hAnsi="Times New Roman" w:cs="Times New Roman"/>
+          <w:sz w:val="24"/>
+          <w:szCs w:val="24"/>
+        </w:rPr>
+        <w:t>.</w:t>
+      </w:r>
+    </w:p>
+    <w:p>
+      <w:pPr>
+        <w:spacing w:after="160" w:line="278" w:lineRule="auto"/>
+        <w:ind w:firstLine="0"/>
         <w:rPr>
           <w:rFonts w:cs="Times New Roman"/>
         </w:rPr>
@@ -3011,31 +5114,7 @@
     </w:p>
     <w:p>
       <w:pPr>
-        <w:jc w:val="center"/>
-        <w:rPr>
-          <w:rFonts w:cs="Times New Roman"/>
-        </w:rPr>
-      </w:pPr>
-    </w:p>
-    <w:p>
-      <w:pPr>
-        <w:jc w:val="center"/>
-        <w:rPr>
-          <w:rFonts w:cs="Times New Roman"/>
-        </w:rPr>
-      </w:pPr>
-    </w:p>
-    <w:p>
-      <w:pPr>
-        <w:jc w:val="center"/>
-        <w:rPr>
-          <w:rFonts w:cs="Times New Roman"/>
-        </w:rPr>
-      </w:pPr>
-    </w:p>
-    <w:p>
-      <w:pPr>
-        <w:jc w:val="center"/>
+        <w:ind w:firstLine="0"/>
         <w:rPr>
           <w:rFonts w:cs="Times New Roman"/>
         </w:rPr>
@@ -3253,36 +5332,6 @@
           <w:rFonts w:cs="Times New Roman"/>
         </w:rPr>
       </w:pPr>
-    </w:p>
-    <w:p>
-      <w:pPr>
-        <w:jc w:val="center"/>
-        <w:rPr>
-          <w:rFonts w:cs="Times New Roman"/>
-        </w:rPr>
-      </w:pPr>
-    </w:p>
-    <w:p>
-      <w:pPr>
-        <w:jc w:val="center"/>
-        <w:rPr>
-          <w:rFonts w:cs="Times New Roman"/>
-        </w:rPr>
-      </w:pPr>
-      <w:r>
-        <w:rPr>
-          <w:rFonts w:cs="Times New Roman"/>
-        </w:rPr>
-        <w:br w:type="page"/>
-      </w:r>
-    </w:p>
-    <w:p>
-      <w:pPr>
-        <w:jc w:val="center"/>
-        <w:rPr>
-          <w:rFonts w:cs="Times New Roman"/>
-        </w:rPr>
-      </w:pPr>
       <w:r>
         <w:rPr>
           <w:rFonts w:cs="Times New Roman"/>
@@ -3466,44 +5515,6 @@
           <w:rFonts w:cs="Times New Roman"/>
         </w:rPr>
       </w:pPr>
-    </w:p>
-    <w:p>
-      <w:pPr>
-        <w:jc w:val="center"/>
-        <w:rPr>
-          <w:rFonts w:cs="Times New Roman"/>
-        </w:rPr>
-      </w:pPr>
-    </w:p>
-    <w:p>
-      <w:pPr>
-        <w:jc w:val="center"/>
-        <w:rPr>
-          <w:rFonts w:cs="Times New Roman"/>
-        </w:rPr>
-      </w:pPr>
-    </w:p>
-    <w:p>
-      <w:pPr>
-        <w:jc w:val="center"/>
-        <w:rPr>
-          <w:rFonts w:cs="Times New Roman"/>
-        </w:rPr>
-      </w:pPr>
-    </w:p>
-    <w:p>
-      <w:pPr>
-        <w:jc w:val="center"/>
-        <w:rPr>
-          <w:rFonts w:cs="Times New Roman"/>
-        </w:rPr>
-      </w:pPr>
-      <w:r>
-        <w:rPr>
-          <w:rFonts w:cs="Times New Roman"/>
-        </w:rPr>
-        <w:br w:type="page"/>
-      </w:r>
     </w:p>
     <w:p>
       <w:pPr>
@@ -3524,8 +5535,29 @@
 </file>
 
 <file path=word/numbering.xml><?xml version="1.0" encoding="utf-8"?>
-<w:numbering xmlns:wpc="http://schemas.microsoft.com/office/word/2010/wordprocessingCanvas" xmlns:cx="http://schemas.microsoft.com/office/drawing/2014/chartex" xmlns:cx1="http://schemas.microsoft.com/office/drawing/2015/9/8/chartex" xmlns:cx2="http://schemas.microsoft.com/office/drawing/2015/10/21/chartex" xmlns:cx3="http://schemas.microsoft.com/office/drawing/2016/5/9/chartex" xmlns:cx4="http://schemas.microsoft.com/office/drawing/2016/5/10/chartex" xmlns:cx5="http://schemas.microsoft.com/office/drawing/2016/5/11/chartex" xmlns:cx6="http://schemas.microsoft.com/office/drawing/2016/5/12/chartex" xmlns:cx7="http://schemas.microsoft.com/office/drawing/2016/5/13/chartex" xmlns:cx8="http://schemas.microsoft.com/office/drawing/2016/5/14/chartex" xmlns:mc="http://schemas.openxmlformats.org/markup-compatibility/2006" xmlns:aink="http://schemas.microsoft.com/office/drawing/2016/ink" xmlns:am3d="http://schemas.microsoft.com/office/drawing/2017/model3d" xmlns:o="urn:schemas-microsoft-com:office:office" xmlns:oel="http://schemas.microsoft.com/office/2019/extlst" xmlns:r="http://schemas.openxmlformats.org/officeDocument/2006/relationships" xmlns:m="http://schemas.openxmlformats.org/officeDocument/2006/math" xmlns:v="urn:schemas-microsoft-com:vml" xmlns:wp14="http://schemas.microsoft.com/office/word/2010/wordprocessingDrawing" xmlns:wp="http://schemas.openxmlformats.org/drawingml/2006/wordprocessingDrawing" xmlns:w10="urn:schemas-microsoft-com:office:word" xmlns:w="http://schemas.openxmlformats.org/wordprocessingml/2006/main" xmlns:w14="http://schemas.microsoft.com/office/word/2010/wordml" xmlns:w15="http://schemas.microsoft.com/office/word/2012/wordml" xmlns:w16cex="http://schemas.microsoft.com/office/word/2018/wordml/cex" xmlns:w16cid="http://schemas.microsoft.com/office/word/2016/wordml/cid" xmlns:w16="http://schemas.microsoft.com/office/word/2018/wordml" xmlns:w16du="http://schemas.microsoft.com/office/word/2023/wordml/word16du" xmlns:w16sdtdh="http://schemas.microsoft.com/office/word/2020/wordml/sdtdatahash" xmlns:w16se="http://schemas.microsoft.com/office/word/2015/wordml/symex" xmlns:wpg="http://schemas.microsoft.com/office/word/2010/wordprocessingGroup" xmlns:wpi="http://schemas.microsoft.com/office/word/2010/wordprocessingInk" xmlns:wne="http://schemas.microsoft.com/office/word/2006/wordml" xmlns:wps="http://schemas.microsoft.com/office/word/2010/wordprocessingShape" mc:Ignorable="w14 w15 w16se w16cid w16 w16cex w16sdtdh w16du wp14">
+<w:numbering xmlns:wpc="http://schemas.microsoft.com/office/word/2010/wordprocessingCanvas" xmlns:cx="http://schemas.microsoft.com/office/drawing/2014/chartex" xmlns:cx1="http://schemas.microsoft.com/office/drawing/2015/9/8/chartex" xmlns:cx2="http://schemas.microsoft.com/office/drawing/2015/10/21/chartex" xmlns:cx3="http://schemas.microsoft.com/office/drawing/2016/5/9/chartex" xmlns:cx4="http://schemas.microsoft.com/office/drawing/2016/5/10/chartex" xmlns:cx5="http://schemas.microsoft.com/office/drawing/2016/5/11/chartex" xmlns:cx6="http://schemas.microsoft.com/office/drawing/2016/5/12/chartex" xmlns:cx7="http://schemas.microsoft.com/office/drawing/2016/5/13/chartex" xmlns:cx8="http://schemas.microsoft.com/office/drawing/2016/5/14/chartex" xmlns:mc="http://schemas.openxmlformats.org/markup-compatibility/2006" xmlns:aink="http://schemas.microsoft.com/office/drawing/2016/ink" xmlns:am3d="http://schemas.microsoft.com/office/drawing/2017/model3d" xmlns:o="urn:schemas-microsoft-com:office:office" xmlns:r="http://schemas.openxmlformats.org/officeDocument/2006/relationships" xmlns:m="http://schemas.openxmlformats.org/officeDocument/2006/math" xmlns:v="urn:schemas-microsoft-com:vml" xmlns:wp14="http://schemas.microsoft.com/office/word/2010/wordprocessingDrawing" xmlns:wp="http://schemas.openxmlformats.org/drawingml/2006/wordprocessingDrawing" xmlns:w10="urn:schemas-microsoft-com:office:word" xmlns:w="http://schemas.openxmlformats.org/wordprocessingml/2006/main" xmlns:w14="http://schemas.microsoft.com/office/word/2010/wordml" xmlns:w15="http://schemas.microsoft.com/office/word/2012/wordml" xmlns:w16cex="http://schemas.microsoft.com/office/word/2018/wordml/cex" xmlns:w16cid="http://schemas.microsoft.com/office/word/2016/wordml/cid" xmlns:w16="http://schemas.microsoft.com/office/word/2018/wordml" xmlns:w16sdtdh="http://schemas.microsoft.com/office/word/2020/wordml/sdtdatahash" xmlns:w16se="http://schemas.microsoft.com/office/word/2015/wordml/symex" xmlns:wpg="http://schemas.microsoft.com/office/word/2010/wordprocessingGroup" xmlns:wpi="http://schemas.microsoft.com/office/word/2010/wordprocessingInk" xmlns:wne="http://schemas.microsoft.com/office/word/2006/wordml" xmlns:wps="http://schemas.microsoft.com/office/word/2010/wordprocessingShape" mc:Ignorable="w14 w15 w16se w16cid w16 w16cex w16sdtdh wp14">
   <w:abstractNum w:abstractNumId="0" w15:restartNumberingAfterBreak="0">
+    <w:nsid w:val="FFFFFF89"/>
+    <w:multiLevelType w:val="singleLevel"/>
+    <w:tmpl w:val="86D28790"/>
+    <w:lvl w:ilvl="0">
+      <w:start w:val="1"/>
+      <w:numFmt w:val="bullet"/>
+      <w:pStyle w:val="Listaconvietas"/>
+      <w:lvlText w:val=""/>
+      <w:lvlJc w:val="left"/>
+      <w:pPr>
+        <w:tabs>
+          <w:tab w:val="num" w:pos="360"/>
+        </w:tabs>
+        <w:ind w:left="360" w:hanging="360"/>
+      </w:pPr>
+      <w:rPr>
+        <w:rFonts w:ascii="Symbol" w:hAnsi="Symbol" w:hint="default"/>
+      </w:rPr>
+    </w:lvl>
+  </w:abstractNum>
+  <w:abstractNum w:abstractNumId="1" w15:restartNumberingAfterBreak="0">
     <w:nsid w:val="149E244F"/>
     <w:multiLevelType w:val="hybridMultilevel"/>
     <w:tmpl w:val="27288E86"/>
@@ -3637,7 +5669,7 @@
       </w:rPr>
     </w:lvl>
   </w:abstractNum>
-  <w:abstractNum w:abstractNumId="1" w15:restartNumberingAfterBreak="0">
+  <w:abstractNum w:abstractNumId="2" w15:restartNumberingAfterBreak="0">
     <w:nsid w:val="195915A6"/>
     <w:multiLevelType w:val="hybridMultilevel"/>
     <w:tmpl w:val="FA08BCDC"/>
@@ -3749,7 +5781,7 @@
       </w:rPr>
     </w:lvl>
   </w:abstractNum>
-  <w:abstractNum w:abstractNumId="2" w15:restartNumberingAfterBreak="0">
+  <w:abstractNum w:abstractNumId="3" w15:restartNumberingAfterBreak="0">
     <w:nsid w:val="1D697240"/>
     <w:multiLevelType w:val="hybridMultilevel"/>
     <w:tmpl w:val="8F46FBE4"/>
@@ -3835,7 +5867,7 @@
       </w:pPr>
     </w:lvl>
   </w:abstractNum>
-  <w:abstractNum w:abstractNumId="3" w15:restartNumberingAfterBreak="0">
+  <w:abstractNum w:abstractNumId="4" w15:restartNumberingAfterBreak="0">
     <w:nsid w:val="24870064"/>
     <w:multiLevelType w:val="hybridMultilevel"/>
     <w:tmpl w:val="52BA0B96"/>
@@ -3948,7 +5980,7 @@
       </w:rPr>
     </w:lvl>
   </w:abstractNum>
-  <w:abstractNum w:abstractNumId="4" w15:restartNumberingAfterBreak="0">
+  <w:abstractNum w:abstractNumId="5" w15:restartNumberingAfterBreak="0">
     <w:nsid w:val="2FF631EF"/>
     <w:multiLevelType w:val="multilevel"/>
     <w:tmpl w:val="BA60679A"/>
@@ -4097,7 +6129,7 @@
       </w:rPr>
     </w:lvl>
   </w:abstractNum>
-  <w:abstractNum w:abstractNumId="5" w15:restartNumberingAfterBreak="0">
+  <w:abstractNum w:abstractNumId="6" w15:restartNumberingAfterBreak="0">
     <w:nsid w:val="327D240E"/>
     <w:multiLevelType w:val="multilevel"/>
     <w:tmpl w:val="ECBA2908"/>
@@ -4246,7 +6278,7 @@
       </w:rPr>
     </w:lvl>
   </w:abstractNum>
-  <w:abstractNum w:abstractNumId="6" w15:restartNumberingAfterBreak="0">
+  <w:abstractNum w:abstractNumId="7" w15:restartNumberingAfterBreak="0">
     <w:nsid w:val="58B02F24"/>
     <w:multiLevelType w:val="multilevel"/>
     <w:tmpl w:val="57CA5B46"/>
@@ -4395,32 +6427,35 @@
       </w:rPr>
     </w:lvl>
   </w:abstractNum>
-  <w:num w:numId="1" w16cid:durableId="1782801061">
+  <w:num w:numId="1">
+    <w:abstractNumId w:val="4"/>
+  </w:num>
+  <w:num w:numId="2">
+    <w:abstractNumId w:val="2"/>
+  </w:num>
+  <w:num w:numId="3">
+    <w:abstractNumId w:val="1"/>
+  </w:num>
+  <w:num w:numId="4">
     <w:abstractNumId w:val="3"/>
   </w:num>
-  <w:num w:numId="2" w16cid:durableId="1047292899">
-    <w:abstractNumId w:val="1"/>
+  <w:num w:numId="5">
+    <w:abstractNumId w:val="5"/>
   </w:num>
-  <w:num w:numId="3" w16cid:durableId="1075739152">
-    <w:abstractNumId w:val="0"/>
+  <w:num w:numId="6">
+    <w:abstractNumId w:val="7"/>
   </w:num>
-  <w:num w:numId="4" w16cid:durableId="234827722">
-    <w:abstractNumId w:val="2"/>
-  </w:num>
-  <w:num w:numId="5" w16cid:durableId="1934781202">
-    <w:abstractNumId w:val="4"/>
-  </w:num>
-  <w:num w:numId="6" w16cid:durableId="50735537">
+  <w:num w:numId="7">
     <w:abstractNumId w:val="6"/>
   </w:num>
-  <w:num w:numId="7" w16cid:durableId="795369927">
-    <w:abstractNumId w:val="5"/>
+  <w:num w:numId="8">
+    <w:abstractNumId w:val="0"/>
   </w:num>
 </w:numbering>
 </file>
 
 <file path=word/styles.xml><?xml version="1.0" encoding="utf-8"?>
-<w:styles xmlns:mc="http://schemas.openxmlformats.org/markup-compatibility/2006" xmlns:r="http://schemas.openxmlformats.org/officeDocument/2006/relationships" xmlns:w="http://schemas.openxmlformats.org/wordprocessingml/2006/main" xmlns:w14="http://schemas.microsoft.com/office/word/2010/wordml" xmlns:w15="http://schemas.microsoft.com/office/word/2012/wordml" xmlns:w16cex="http://schemas.microsoft.com/office/word/2018/wordml/cex" xmlns:w16cid="http://schemas.microsoft.com/office/word/2016/wordml/cid" xmlns:w16="http://schemas.microsoft.com/office/word/2018/wordml" xmlns:w16du="http://schemas.microsoft.com/office/word/2023/wordml/word16du" xmlns:w16sdtdh="http://schemas.microsoft.com/office/word/2020/wordml/sdtdatahash" xmlns:w16se="http://schemas.microsoft.com/office/word/2015/wordml/symex" mc:Ignorable="w14 w15 w16se w16cid w16 w16cex w16sdtdh w16du">
+<w:styles xmlns:mc="http://schemas.openxmlformats.org/markup-compatibility/2006" xmlns:r="http://schemas.openxmlformats.org/officeDocument/2006/relationships" xmlns:w="http://schemas.openxmlformats.org/wordprocessingml/2006/main" xmlns:w14="http://schemas.microsoft.com/office/word/2010/wordml" xmlns:w15="http://schemas.microsoft.com/office/word/2012/wordml" xmlns:w16cex="http://schemas.microsoft.com/office/word/2018/wordml/cex" xmlns:w16cid="http://schemas.microsoft.com/office/word/2016/wordml/cid" xmlns:w16="http://schemas.microsoft.com/office/word/2018/wordml" xmlns:w16sdtdh="http://schemas.microsoft.com/office/word/2020/wordml/sdtdatahash" xmlns:w16se="http://schemas.microsoft.com/office/word/2015/wordml/symex" mc:Ignorable="w14 w15 w16se w16cid w16 w16cex w16sdtdh">
   <w:docDefaults>
     <w:rPrDefault>
       <w:rPr>
@@ -5540,6 +7575,29 @@
       <w14:ligatures w14:val="none"/>
     </w:rPr>
   </w:style>
+  <w:style w:type="paragraph" w:styleId="Listaconvietas">
+    <w:name w:val="List Bullet"/>
+    <w:basedOn w:val="Normal"/>
+    <w:uiPriority w:val="99"/>
+    <w:unhideWhenUsed/>
+    <w:rsid w:val="00F40242"/>
+    <w:pPr>
+      <w:numPr>
+        <w:numId w:val="8"/>
+      </w:numPr>
+      <w:spacing w:after="200" w:line="276" w:lineRule="auto"/>
+      <w:contextualSpacing/>
+    </w:pPr>
+    <w:rPr>
+      <w:rFonts w:ascii="Arial" w:eastAsiaTheme="minorEastAsia" w:hAnsi="Arial"/>
+      <w:color w:val="auto"/>
+      <w:kern w:val="0"/>
+      <w:sz w:val="22"/>
+      <w:szCs w:val="22"/>
+      <w:lang w:val="en-US"/>
+      <w14:ligatures w14:val="none"/>
+    </w:rPr>
+  </w:style>
 </w:styles>
 </file>
 

</xml_diff>

<commit_message>
docs: actualizar modelo relacional
</commit_message>
<xml_diff>
--- a/informe de requisitos.docx
+++ b/informe de requisitos.docx
@@ -5382,19 +5382,103 @@
     </w:p>
     <w:p>
       <w:pPr>
-        <w:jc w:val="center"/>
-        <w:rPr>
-          <w:rFonts w:cs="Times New Roman"/>
-        </w:rPr>
-      </w:pPr>
-    </w:p>
-    <w:p>
-      <w:pPr>
-        <w:jc w:val="center"/>
-        <w:rPr>
-          <w:rFonts w:cs="Times New Roman"/>
-        </w:rPr>
-      </w:pPr>
+        <w:spacing w:after="160" w:line="278" w:lineRule="auto"/>
+        <w:ind w:firstLine="0"/>
+        <w:rPr>
+          <w:rFonts w:cs="Times New Roman"/>
+        </w:rPr>
+      </w:pPr>
+      <w:r>
+        <w:rPr>
+          <w:rFonts w:cs="Times New Roman"/>
+        </w:rPr>
+        <w:br w:type="page"/>
+      </w:r>
+    </w:p>
+    <w:p>
+      <w:pPr>
+        <w:pStyle w:val="Ttulo1"/>
+      </w:pPr>
+      <w:r>
+        <w:lastRenderedPageBreak/>
+        <w:t>Diagrama UML</w:t>
+      </w:r>
+    </w:p>
+    <w:p>
+      <w:pPr>
+        <w:jc w:val="center"/>
+        <w:rPr>
+          <w:rFonts w:cs="Times New Roman"/>
+        </w:rPr>
+      </w:pPr>
+      <w:r>
+        <w:rPr>
+          <w:rFonts w:cs="Times New Roman"/>
+          <w:noProof/>
+        </w:rPr>
+        <w:drawing>
+          <wp:anchor distT="0" distB="0" distL="114300" distR="114300" simplePos="0" relativeHeight="251658240" behindDoc="1" locked="0" layoutInCell="1" allowOverlap="1" wp14:anchorId="1427A281" wp14:editId="3231FC7B">
+            <wp:simplePos x="0" y="0"/>
+            <wp:positionH relativeFrom="column">
+              <wp:posOffset>-769947</wp:posOffset>
+            </wp:positionH>
+            <wp:positionV relativeFrom="page">
+              <wp:posOffset>1600200</wp:posOffset>
+            </wp:positionV>
+            <wp:extent cx="6828482" cy="3867150"/>
+            <wp:effectExtent l="0" t="0" r="0" b="0"/>
+            <wp:wrapNone/>
+            <wp:docPr id="1" name="Imagen 1"/>
+            <wp:cNvGraphicFramePr>
+              <a:graphicFrameLocks xmlns:a="http://schemas.openxmlformats.org/drawingml/2006/main" noChangeAspect="1"/>
+            </wp:cNvGraphicFramePr>
+            <a:graphic xmlns:a="http://schemas.openxmlformats.org/drawingml/2006/main">
+              <a:graphicData uri="http://schemas.openxmlformats.org/drawingml/2006/picture">
+                <pic:pic xmlns:pic="http://schemas.openxmlformats.org/drawingml/2006/picture">
+                  <pic:nvPicPr>
+                    <pic:cNvPr id="0" name="Picture 1"/>
+                    <pic:cNvPicPr>
+                      <a:picLocks noChangeAspect="1" noChangeArrowheads="1"/>
+                    </pic:cNvPicPr>
+                  </pic:nvPicPr>
+                  <pic:blipFill>
+                    <a:blip r:embed="rId7">
+                      <a:extLst>
+                        <a:ext uri="{28A0092B-C50C-407E-A947-70E740481C1C}">
+                          <a14:useLocalDpi xmlns:a14="http://schemas.microsoft.com/office/drawing/2010/main" val="0"/>
+                        </a:ext>
+                      </a:extLst>
+                    </a:blip>
+                    <a:srcRect/>
+                    <a:stretch>
+                      <a:fillRect/>
+                    </a:stretch>
+                  </pic:blipFill>
+                  <pic:spPr bwMode="auto">
+                    <a:xfrm>
+                      <a:off x="0" y="0"/>
+                      <a:ext cx="6831769" cy="3869012"/>
+                    </a:xfrm>
+                    <a:prstGeom prst="rect">
+                      <a:avLst/>
+                    </a:prstGeom>
+                    <a:noFill/>
+                    <a:ln>
+                      <a:noFill/>
+                    </a:ln>
+                  </pic:spPr>
+                </pic:pic>
+              </a:graphicData>
+            </a:graphic>
+            <wp14:sizeRelH relativeFrom="margin">
+              <wp14:pctWidth>0</wp14:pctWidth>
+            </wp14:sizeRelH>
+            <wp14:sizeRelV relativeFrom="margin">
+              <wp14:pctHeight>0</wp14:pctHeight>
+            </wp14:sizeRelV>
+          </wp:anchor>
+        </w:drawing>
+      </w:r>
     </w:p>
     <w:p>
       <w:pPr>

</xml_diff>